<commit_message>
Add F-06 archive and condition research dossier
</commit_message>
<xml_diff>
--- a/reports/fashion_market_research_master_v0.docx
+++ b/reports/fashion_market_research_master_v0.docx
@@ -54,7 +54,7 @@
               <w:br/>
               <w:br/>
               <w:br/>
-              <w:t>نسخهٔ ۰٫۳ | سند زنده و محرمانه</w:t>
+              <w:t>نسخهٔ ۰٫۴ | سند زنده و محرمانه</w:t>
               <w:br/>
               <w:t>۱۲ مهر ۱۴۰۵  |  ۴ اکتبر ۲۰۲۶</w:t>
               <w:br/>
@@ -376,7 +376,7 @@
                 <w:color w:val="263238"/>
                 <w:sz w:val="17"/>
               </w:rPr>
-              <w:t>۰٫۳ — پنج پروندهٔ desk-research افزوده شد؛ پژوهش اولیه/پایلوت برای F-01 تا F-04 انجام نشده است.</w:t>
+              <w:t>۰٫۴ — شش پروندهٔ desk-research افزوده شد؛ پژوهش اولیه/پایلوت فقط برای F-01 تا F-04 باز است.</w:t>
             </w:r>
           </w:p>
         </w:tc>
@@ -650,7 +650,7 @@
                 <w:color w:val="1F7A70"/>
                 <w:sz w:val="21"/>
               </w:rPr>
-              <w:t>یادداشت اعتبار نسخهٔ ۰٫۳</w:t>
+              <w:t>یادداشت اعتبار نسخهٔ ۰٫۴</w:t>
             </w:r>
           </w:p>
           <w:p>
@@ -1570,9 +1570,7 @@
       </w:r>
     </w:p>
     <w:p>
-      <w:r>
-        <w:br w:type="page"/>
-      </w:r>
+      <w:r/>
     </w:p>
     <w:p>
       <w:pPr>
@@ -2924,7 +2922,7 @@
                 <w:color w:val="263238"/>
                 <w:sz w:val="19"/>
               </w:rPr>
-              <w:t>هیچ نمودار اندازهٔ بازار، سهم بازار، درآمد یا رضایت با دادهٔ نمونه یا عدد بی‌منبع وارد این گزارش نمی‌شود. نمودارهای نسخهٔ ۰٫۳ فقط وضعیت واقعی برنامهٔ پژوهش را نمایش می‌دهند. نمودارهای هر پرونده پس از ثبت منبع، تعریف، واحد و روش ایجاد می‌شوند.</w:t>
+              <w:t>هیچ نمودار اندازهٔ بازار، سهم بازار، درآمد یا رضایت با دادهٔ نمونه یا عدد بی‌منبع وارد این گزارش نمی‌شود. نمودارهای نسخهٔ ۰٫۴ فقط وضعیت واقعی برنامهٔ پژوهش را نمایش می‌دهند. نمودارهای هر پرونده پس از ثبت منبع، تعریف، واحد و روش ایجاد می‌شوند.</w:t>
             </w:r>
           </w:p>
         </w:tc>
@@ -3546,9 +3544,7 @@
     </w:tbl>
     <w:p/>
     <w:p>
-      <w:r>
-        <w:br w:type="page"/>
-      </w:r>
+      <w:r/>
     </w:p>
     <w:p>
       <w:pPr>
@@ -3973,22 +3969,22 @@
               <w:bottom w:val="single" w:sz="3" w:space="0" w:color="D9E0E7"/>
               <w:right w:val="single" w:sz="3" w:space="0" w:color="D9E0E7"/>
             </w:tcBorders>
-            <w:shd w:fill="F5F7FA"/>
-          </w:tcPr>
-          <w:p>
-            <w:pPr>
-              <w:spacing w:after="20" w:line="259" w:lineRule="auto"/>
-              <w:jc w:val="right"/>
-            </w:pPr>
-            <w:r/>
-            <w:r>
-              <w:rPr>
-                <w:rFonts w:ascii="B Zar" w:hAnsi="B Zar"/>
-                <w:b w:val="0"/>
-                <w:color w:val="263238"/>
-                <w:sz w:val="17"/>
-              </w:rPr>
-              <w:t>1</w:t>
+            <w:shd w:fill="FFFFFF"/>
+          </w:tcPr>
+          <w:p>
+            <w:pPr>
+              <w:spacing w:after="20" w:line="259" w:lineRule="auto"/>
+              <w:jc w:val="right"/>
+            </w:pPr>
+            <w:r/>
+            <w:r>
+              <w:rPr>
+                <w:rFonts w:ascii="B Zar" w:hAnsi="B Zar"/>
+                <w:b w:val="0"/>
+                <w:color w:val="263238"/>
+                <w:sz w:val="17"/>
+              </w:rPr>
+              <w:t>0</w:t>
             </w:r>
           </w:p>
         </w:tc>
@@ -4074,7 +4070,7 @@
                 <w:color w:val="263238"/>
                 <w:sz w:val="17"/>
               </w:rPr>
-              <w:t>31</w:t>
+              <w:t>32</w:t>
             </w:r>
           </w:p>
         </w:tc>
@@ -4213,40 +4209,7 @@
       <w:pPr>
         <w:jc w:val="center"/>
       </w:pPr>
-      <w:r>
-        <w:drawing>
-          <wp:inline xmlns:a="http://schemas.openxmlformats.org/drawingml/2006/main" xmlns:pic="http://schemas.openxmlformats.org/drawingml/2006/picture">
-            <wp:extent cx="5580000" cy="2999250"/>
-            <wp:docPr id="1" name="Picture 1"/>
-            <wp:cNvGraphicFramePr>
-              <a:graphicFrameLocks noChangeAspect="1"/>
-            </wp:cNvGraphicFramePr>
-            <a:graphic>
-              <a:graphicData uri="http://schemas.openxmlformats.org/drawingml/2006/picture">
-                <pic:pic>
-                  <pic:nvPicPr>
-                    <pic:cNvPr id="0" name="portfolio_status_template.png"/>
-                    <pic:cNvPicPr/>
-                  </pic:nvPicPr>
-                  <pic:blipFill>
-                    <a:blip r:embed="rId13"/>
-                    <a:stretch>
-                      <a:fillRect/>
-                    </a:stretch>
-                  </pic:blipFill>
-                  <pic:spPr>
-                    <a:xfrm>
-                      <a:off x="0" y="0"/>
-                      <a:ext cx="5580000" cy="2999250"/>
-                    </a:xfrm>
-                    <a:prstGeom prst="rect"/>
-                  </pic:spPr>
-                </pic:pic>
-              </a:graphicData>
-            </a:graphic>
-          </wp:inline>
-        </w:drawing>
-      </w:r>
+      <w:r/>
     </w:p>
     <w:p>
       <w:pPr>
@@ -5143,6 +5106,148 @@
           </w:p>
         </w:tc>
       </w:tr>
+      <w:tr>
+        <w:tc>
+          <w:tcPr>
+            <w:tcW w:type="dxa" w:w="1928"/>
+            <w:tcBorders>
+              <w:top w:val="single" w:sz="3" w:space="0" w:color="D9E0E7"/>
+              <w:left w:val="single" w:sz="3" w:space="0" w:color="D9E0E7"/>
+              <w:bottom w:val="single" w:sz="3" w:space="0" w:color="D9E0E7"/>
+              <w:right w:val="single" w:sz="3" w:space="0" w:color="D9E0E7"/>
+            </w:tcBorders>
+            <w:shd w:fill="FFFFFF"/>
+          </w:tcPr>
+          <w:p>
+            <w:pPr>
+              <w:spacing w:after="20" w:line="259" w:lineRule="auto"/>
+              <w:jc w:val="right"/>
+            </w:pPr>
+            <w:r/>
+            <w:r>
+              <w:rPr>
+                <w:rFonts w:ascii="B Zar" w:hAnsi="B Zar"/>
+                <w:b w:val="0"/>
+                <w:color w:val="263238"/>
+                <w:sz w:val="17"/>
+              </w:rPr>
+              <w:t>F-06</w:t>
+            </w:r>
+          </w:p>
+        </w:tc>
+        <w:tc>
+          <w:tcPr>
+            <w:tcW w:type="dxa" w:w="1928"/>
+            <w:tcBorders>
+              <w:top w:val="single" w:sz="3" w:space="0" w:color="D9E0E7"/>
+              <w:left w:val="single" w:sz="3" w:space="0" w:color="D9E0E7"/>
+              <w:bottom w:val="single" w:sz="3" w:space="0" w:color="D9E0E7"/>
+              <w:right w:val="single" w:sz="3" w:space="0" w:color="D9E0E7"/>
+            </w:tcBorders>
+            <w:shd w:fill="FFFFFF"/>
+          </w:tcPr>
+          <w:p>
+            <w:pPr>
+              <w:spacing w:after="20" w:line="259" w:lineRule="auto"/>
+              <w:jc w:val="right"/>
+            </w:pPr>
+            <w:r/>
+            <w:r>
+              <w:rPr>
+                <w:rFonts w:ascii="B Zar" w:hAnsi="B Zar"/>
+                <w:b w:val="0"/>
+                <w:color w:val="263238"/>
+                <w:sz w:val="17"/>
+              </w:rPr>
+              <w:t>آرشیو، امانت و condition report لباس</w:t>
+            </w:r>
+          </w:p>
+        </w:tc>
+        <w:tc>
+          <w:tcPr>
+            <w:tcW w:type="dxa" w:w="1928"/>
+            <w:tcBorders>
+              <w:top w:val="single" w:sz="3" w:space="0" w:color="D9E0E7"/>
+              <w:left w:val="single" w:sz="3" w:space="0" w:color="D9E0E7"/>
+              <w:bottom w:val="single" w:sz="3" w:space="0" w:color="D9E0E7"/>
+              <w:right w:val="single" w:sz="3" w:space="0" w:color="D9E0E7"/>
+            </w:tcBorders>
+            <w:shd w:fill="FFFFFF"/>
+          </w:tcPr>
+          <w:p>
+            <w:pPr>
+              <w:spacing w:after="20" w:line="259" w:lineRule="auto"/>
+              <w:jc w:val="right"/>
+            </w:pPr>
+            <w:r/>
+            <w:r>
+              <w:rPr>
+                <w:rFonts w:ascii="B Zar" w:hAnsi="B Zar"/>
+                <w:b w:val="0"/>
+                <w:color w:val="263238"/>
+                <w:sz w:val="17"/>
+              </w:rPr>
+              <w:t>B2B فرهنگی</w:t>
+            </w:r>
+          </w:p>
+        </w:tc>
+        <w:tc>
+          <w:tcPr>
+            <w:tcW w:type="dxa" w:w="1928"/>
+            <w:tcBorders>
+              <w:top w:val="single" w:sz="3" w:space="0" w:color="D9E0E7"/>
+              <w:left w:val="single" w:sz="3" w:space="0" w:color="D9E0E7"/>
+              <w:bottom w:val="single" w:sz="3" w:space="0" w:color="D9E0E7"/>
+              <w:right w:val="single" w:sz="3" w:space="0" w:color="D9E0E7"/>
+            </w:tcBorders>
+            <w:shd w:fill="FDE7E2"/>
+          </w:tcPr>
+          <w:p>
+            <w:pPr>
+              <w:spacing w:after="20" w:line="259" w:lineRule="auto"/>
+              <w:jc w:val="right"/>
+            </w:pPr>
+            <w:r/>
+            <w:r>
+              <w:rPr>
+                <w:rFonts w:ascii="B Zar" w:hAnsi="B Zar"/>
+                <w:b w:val="0"/>
+                <w:color w:val="263238"/>
+                <w:sz w:val="17"/>
+              </w:rPr>
+              <w:t>رد / آرشیوی (desk)</w:t>
+            </w:r>
+          </w:p>
+        </w:tc>
+        <w:tc>
+          <w:tcPr>
+            <w:tcW w:type="dxa" w:w="1928"/>
+            <w:tcBorders>
+              <w:top w:val="single" w:sz="3" w:space="0" w:color="D9E0E7"/>
+              <w:left w:val="single" w:sz="3" w:space="0" w:color="D9E0E7"/>
+              <w:bottom w:val="single" w:sz="3" w:space="0" w:color="D9E0E7"/>
+              <w:right w:val="single" w:sz="3" w:space="0" w:color="D9E0E7"/>
+            </w:tcBorders>
+            <w:shd w:fill="FFFFFF"/>
+          </w:tcPr>
+          <w:p>
+            <w:pPr>
+              <w:spacing w:after="20" w:line="259" w:lineRule="auto"/>
+              <w:jc w:val="right"/>
+            </w:pPr>
+            <w:r/>
+            <w:r>
+              <w:rPr>
+                <w:rFonts w:ascii="B Zar" w:hAnsi="B Zar"/>
+                <w:b w:val="0"/>
+                <w:color w:val="263238"/>
+                <w:sz w:val="17"/>
+              </w:rPr>
+              <w:t>پروندهٔ عمیق نسخهٔ ۰٫۴؛ sub-segment F-02 و خارج از pipeline فعال.</w:t>
+            </w:r>
+          </w:p>
+        </w:tc>
+      </w:tr>
     </w:tbl>
     <w:p/>
     <w:p>
@@ -10808,9 +10913,7 @@
     </w:tbl>
     <w:p/>
     <w:p>
-      <w:r>
-        <w:br w:type="page"/>
-      </w:r>
+      <w:r/>
     </w:p>
     <w:p>
       <w:pPr>
@@ -12507,22 +12610,22 @@
               <w:bottom w:val="single" w:sz="3" w:space="0" w:color="D9E0E7"/>
               <w:right w:val="single" w:sz="3" w:space="0" w:color="D9E0E7"/>
             </w:tcBorders>
-            <w:shd w:fill="F5F7FA"/>
-          </w:tcPr>
-          <w:p>
-            <w:pPr>
-              <w:spacing w:after="20" w:line="259" w:lineRule="auto"/>
-              <w:jc w:val="right"/>
-            </w:pPr>
-            <w:r/>
-            <w:r>
-              <w:rPr>
-                <w:rFonts w:ascii="B Zar" w:hAnsi="B Zar"/>
-                <w:b w:val="0"/>
-                <w:color w:val="263238"/>
-                <w:sz w:val="17"/>
-              </w:rPr>
-              <w:t>آرشیو/امانت/condition report لباس</w:t>
+            <w:shd w:fill="FFFFFF"/>
+          </w:tcPr>
+          <w:p>
+            <w:pPr>
+              <w:spacing w:after="20" w:line="259" w:lineRule="auto"/>
+              <w:jc w:val="right"/>
+            </w:pPr>
+            <w:r/>
+            <w:r>
+              <w:rPr>
+                <w:rFonts w:ascii="B Zar" w:hAnsi="B Zar"/>
+                <w:b w:val="0"/>
+                <w:color w:val="263238"/>
+                <w:sz w:val="17"/>
+              </w:rPr>
+              <w:t>آرشیو، امانت و condition report لباس</w:t>
             </w:r>
           </w:p>
         </w:tc>
@@ -12535,22 +12638,22 @@
               <w:bottom w:val="single" w:sz="3" w:space="0" w:color="D9E0E7"/>
               <w:right w:val="single" w:sz="3" w:space="0" w:color="D9E0E7"/>
             </w:tcBorders>
-            <w:shd w:fill="F5F7FA"/>
-          </w:tcPr>
-          <w:p>
-            <w:pPr>
-              <w:spacing w:after="20" w:line="259" w:lineRule="auto"/>
-              <w:jc w:val="right"/>
-            </w:pPr>
-            <w:r/>
-            <w:r>
-              <w:rPr>
-                <w:rFonts w:ascii="B Zar" w:hAnsi="B Zar"/>
-                <w:b w:val="0"/>
-                <w:color w:val="263238"/>
-                <w:sz w:val="17"/>
-              </w:rPr>
-              <w:t>زیربخش F-02؛ تا evidence مستقل buyer/market، پروندهٔ مستقل اولویت‌دار نیست.</w:t>
+            <w:shd w:fill="FFFFFF"/>
+          </w:tcPr>
+          <w:p>
+            <w:pPr>
+              <w:spacing w:after="20" w:line="259" w:lineRule="auto"/>
+              <w:jc w:val="right"/>
+            </w:pPr>
+            <w:r/>
+            <w:r>
+              <w:rPr>
+                <w:rFonts w:ascii="B Zar" w:hAnsi="B Zar"/>
+                <w:b w:val="0"/>
+                <w:color w:val="263238"/>
+                <w:sz w:val="17"/>
+              </w:rPr>
+              <w:t>desk-research تکمیل؛ CMSهای موزه‌ای و سامانه‌های ایران موجودند و scope با F-02 هم‌پوشان است. رد/آرشیوی؛ بازگشایی فقط با trigger مستند.</w:t>
             </w:r>
           </w:p>
         </w:tc>
@@ -13392,9 +13495,7 @@
       </w:r>
     </w:p>
     <w:p>
-      <w:r>
-        <w:br w:type="page"/>
-      </w:r>
+      <w:r/>
     </w:p>
     <w:p>
       <w:pPr>
@@ -14986,6 +15087,120 @@
           </w:p>
         </w:tc>
       </w:tr>
+      <w:tr>
+        <w:tc>
+          <w:tcPr>
+            <w:tcW w:type="dxa" w:w="2409"/>
+            <w:tcBorders>
+              <w:top w:val="single" w:sz="3" w:space="0" w:color="D9E0E7"/>
+              <w:left w:val="single" w:sz="3" w:space="0" w:color="D9E0E7"/>
+              <w:bottom w:val="single" w:sz="3" w:space="0" w:color="D9E0E7"/>
+              <w:right w:val="single" w:sz="3" w:space="0" w:color="D9E0E7"/>
+            </w:tcBorders>
+            <w:shd w:fill="FFFFFF"/>
+          </w:tcPr>
+          <w:p>
+            <w:pPr>
+              <w:spacing w:after="20" w:line="259" w:lineRule="auto"/>
+              <w:jc w:val="right"/>
+            </w:pPr>
+            <w:r/>
+            <w:r>
+              <w:rPr>
+                <w:rFonts w:ascii="B Zar" w:hAnsi="B Zar"/>
+                <w:b w:val="0"/>
+                <w:color w:val="263238"/>
+                <w:sz w:val="17"/>
+              </w:rPr>
+              <w:t>۰٫۴</w:t>
+            </w:r>
+          </w:p>
+        </w:tc>
+        <w:tc>
+          <w:tcPr>
+            <w:tcW w:type="dxa" w:w="2409"/>
+            <w:tcBorders>
+              <w:top w:val="single" w:sz="3" w:space="0" w:color="D9E0E7"/>
+              <w:left w:val="single" w:sz="3" w:space="0" w:color="D9E0E7"/>
+              <w:bottom w:val="single" w:sz="3" w:space="0" w:color="D9E0E7"/>
+              <w:right w:val="single" w:sz="3" w:space="0" w:color="D9E0E7"/>
+            </w:tcBorders>
+            <w:shd w:fill="FFFFFF"/>
+          </w:tcPr>
+          <w:p>
+            <w:pPr>
+              <w:spacing w:after="20" w:line="259" w:lineRule="auto"/>
+              <w:jc w:val="right"/>
+            </w:pPr>
+            <w:r/>
+            <w:r>
+              <w:rPr>
+                <w:rFonts w:ascii="B Zar" w:hAnsi="B Zar"/>
+                <w:b w:val="0"/>
+                <w:color w:val="263238"/>
+                <w:sz w:val="17"/>
+              </w:rPr>
+              <w:t>۱۲ مهر ۱۴۰۵</w:t>
+            </w:r>
+          </w:p>
+        </w:tc>
+        <w:tc>
+          <w:tcPr>
+            <w:tcW w:type="dxa" w:w="2409"/>
+            <w:tcBorders>
+              <w:top w:val="single" w:sz="3" w:space="0" w:color="D9E0E7"/>
+              <w:left w:val="single" w:sz="3" w:space="0" w:color="D9E0E7"/>
+              <w:bottom w:val="single" w:sz="3" w:space="0" w:color="D9E0E7"/>
+              <w:right w:val="single" w:sz="3" w:space="0" w:color="D9E0E7"/>
+            </w:tcBorders>
+            <w:shd w:fill="FFFFFF"/>
+          </w:tcPr>
+          <w:p>
+            <w:pPr>
+              <w:spacing w:after="20" w:line="259" w:lineRule="auto"/>
+              <w:jc w:val="right"/>
+            </w:pPr>
+            <w:r/>
+            <w:r>
+              <w:rPr>
+                <w:rFonts w:ascii="B Zar" w:hAnsi="B Zar"/>
+                <w:b w:val="0"/>
+                <w:color w:val="263238"/>
+                <w:sz w:val="17"/>
+              </w:rPr>
+              <w:t>افزودن F-06؛ ثبت مسیر به‌عنوان sub-segment F-02 و رد/آرشیوی پس از desk-research.</w:t>
+            </w:r>
+          </w:p>
+        </w:tc>
+        <w:tc>
+          <w:tcPr>
+            <w:tcW w:type="dxa" w:w="2409"/>
+            <w:tcBorders>
+              <w:top w:val="single" w:sz="3" w:space="0" w:color="D9E0E7"/>
+              <w:left w:val="single" w:sz="3" w:space="0" w:color="D9E0E7"/>
+              <w:bottom w:val="single" w:sz="3" w:space="0" w:color="D9E0E7"/>
+              <w:right w:val="single" w:sz="3" w:space="0" w:color="D9E0E7"/>
+            </w:tcBorders>
+            <w:shd w:fill="FFFFFF"/>
+          </w:tcPr>
+          <w:p>
+            <w:pPr>
+              <w:spacing w:after="20" w:line="259" w:lineRule="auto"/>
+              <w:jc w:val="right"/>
+            </w:pPr>
+            <w:r/>
+            <w:r>
+              <w:rPr>
+                <w:rFonts w:ascii="B Zar" w:hAnsi="B Zar"/>
+                <w:b w:val="0"/>
+                <w:color w:val="263238"/>
+                <w:sz w:val="17"/>
+              </w:rPr>
+              <w:t>منتشرشده</w:t>
+            </w:r>
+          </w:p>
+        </w:tc>
+      </w:tr>
     </w:tbl>
     <w:p/>
     <w:tbl>
@@ -15046,9 +15261,7 @@
     </w:tbl>
     <w:p/>
     <w:p>
-      <w:r>
-        <w:br w:type="page"/>
-      </w:r>
+      <w:r/>
     </w:p>
     <w:p>
       <w:pPr>
@@ -15137,9 +15350,7 @@
     </w:tbl>
     <w:p/>
     <w:p>
-      <w:r>
-        <w:br w:type="page"/>
-      </w:r>
+      <w:r/>
     </w:p>
     <w:p>
       <w:pPr>
@@ -18541,9 +18752,7 @@
     </w:tbl>
     <w:p/>
     <w:p>
-      <w:r>
-        <w:br w:type="page"/>
-      </w:r>
+      <w:r/>
     </w:p>
     <w:p>
       <w:pPr>
@@ -21803,9 +22012,7 @@
     </w:tbl>
     <w:p/>
     <w:p>
-      <w:r>
-        <w:br w:type="page"/>
-      </w:r>
+      <w:r/>
     </w:p>
     <w:p>
       <w:pPr>
@@ -25622,9 +25829,7 @@
     </w:tbl>
     <w:p/>
     <w:p>
-      <w:r>
-        <w:br w:type="page"/>
-      </w:r>
+      <w:r/>
     </w:p>
     <w:p>
       <w:pPr>
@@ -26147,7 +26352,7 @@
                 <w:color w:val="A23B22"/>
                 <w:sz w:val="21"/>
               </w:rPr>
-              <w:t>نتیجهٔ اجرایی این نوبت</w:t>
+              <w:t>نتیجه</w:t>
             </w:r>
           </w:p>
           <w:p>
@@ -26170,9 +26375,7 @@
     </w:tbl>
     <w:p/>
     <w:p>
-      <w:r>
-        <w:br w:type="page"/>
-      </w:r>
+      <w:r/>
     </w:p>
     <w:p>
       <w:pPr>
@@ -29531,9 +29734,7 @@
     </w:tbl>
     <w:p/>
     <w:p>
-      <w:r>
-        <w:br w:type="page"/>
-      </w:r>
+      <w:r/>
     </w:p>
     <w:p>
       <w:pPr>
@@ -32727,9 +32928,7 @@
     </w:tbl>
     <w:p/>
     <w:p>
-      <w:r>
-        <w:br w:type="page"/>
-      </w:r>
+      <w:r/>
     </w:p>
     <w:p>
       <w:pPr>
@@ -33725,7 +33924,7 @@
                 <w:color w:val="8A6100"/>
                 <w:sz w:val="21"/>
               </w:rPr>
-              <w:t>نتیجهٔ اجرایی این نوبت</w:t>
+              <w:t>نتیجه</w:t>
             </w:r>
           </w:p>
           <w:p>
@@ -33741,6 +33940,82 @@
                 <w:sz w:val="19"/>
               </w:rPr>
               <w:t>دو پرونده تا سطح desk-research کامل شدند. F-04 برای سنجش WTP، agreement کارشناسان و legal/liability design در Watch می‌ماند. F-05 به‌دلیل category overlap و substituteهای محلی از pipeline فعال خارج شد. هیچ عدد بازار یا verdict سرمایه‌گذاری بدون primary research ساخته نشده است.</w:t>
+            </w:r>
+          </w:p>
+        </w:tc>
+      </w:tr>
+    </w:tbl>
+    <w:p/>
+    <w:p>
+      <w:r>
+        <w:br w:type="page"/>
+      </w:r>
+    </w:p>
+    <w:p>
+      <w:pPr>
+        <w:pStyle w:val="Heading1"/>
+        <w:spacing w:before="280" w:after="160"/>
+        <w:jc w:val="right"/>
+      </w:pPr>
+      <w:r>
+        <w:rPr>
+          <w:rFonts w:ascii="B Zar" w:hAnsi="B Zar"/>
+          <w:color w:val="1F3A5F"/>
+          <w:sz w:val="32"/>
+        </w:rPr>
+        <w:t>F-06. آرشیو، امانت و Condition Report لباس</w:t>
+      </w:r>
+    </w:p>
+    <w:tbl>
+      <w:tblPr>
+        <w:bidiVisual w:val="1"/>
+        <w:tblW w:type="auto" w:w="0"/>
+        <w:tblLook w:firstColumn="1" w:firstRow="1" w:lastColumn="0" w:lastRow="0" w:noHBand="0" w:noVBand="1" w:val="04A0"/>
+      </w:tblPr>
+      <w:tblGrid>
+        <w:gridCol w:w="9638"/>
+      </w:tblGrid>
+      <w:tr>
+        <w:tc>
+          <w:tcPr>
+            <w:tcW w:type="dxa" w:w="9638"/>
+            <w:tcBorders>
+              <w:top w:val="single" w:sz="6" w:space="0" w:color="A23B22"/>
+              <w:left w:val="single" w:sz="6" w:space="0" w:color="A23B22"/>
+              <w:bottom w:val="single" w:sz="6" w:space="0" w:color="A23B22"/>
+              <w:right w:val="single" w:sz="6" w:space="0" w:color="A23B22"/>
+            </w:tcBorders>
+            <w:shd w:fill="FDE7E2"/>
+          </w:tcPr>
+          <w:p>
+            <w:pPr>
+              <w:spacing w:after="40"/>
+              <w:jc w:val="right"/>
+            </w:pPr>
+            <w:r/>
+            <w:r>
+              <w:rPr>
+                <w:rFonts w:ascii="B Zar" w:hAnsi="B Zar"/>
+                <w:b/>
+                <w:color w:val="A23B22"/>
+                <w:sz w:val="21"/>
+              </w:rPr>
+              <w:t>کارت تصمیم — وضعیت: رد / آرشیوی در desk-research</w:t>
+            </w:r>
+          </w:p>
+          <w:p>
+            <w:pPr>
+              <w:spacing w:after="40" w:line="288" w:lineRule="auto"/>
+              <w:jc w:val="right"/>
+            </w:pPr>
+            <w:r>
+              <w:rPr>
+                <w:rFonts w:ascii="B Zar" w:hAnsi="B Zar"/>
+                <w:b w:val="0"/>
+                <w:color w:val="263238"/>
+                <w:sz w:val="19"/>
+              </w:rPr>
+              <w:t>بازار مفهومی B2B فرهنگی/موزه‌ای است. تعریف اولیه شامل accession، شناسه/تصویر، provenance، محل، وضعیت/آسیب، انتقال، امانت و condition report بود. اما این به collection-management system موزه‌ای تبدیل می‌شود؛ برای costumeهای تولیدی نیز با F-02 overlap دارد. بنابراین فرصت مستقل platform-first نیست.</w:t>
             </w:r>
           </w:p>
         </w:tc>
@@ -33759,7 +34034,7 @@
           <w:color w:val="1F7A70"/>
           <w:sz w:val="26"/>
         </w:rPr>
-        <w:t>یادداشت سازگاری فایل</w:t>
+        <w:t>۱. مسئله و workflow</w:t>
       </w:r>
     </w:p>
     <w:p>
@@ -33773,9 +34048,3236 @@
           <w:color w:val="263238"/>
           <w:sz w:val="22"/>
         </w:rPr>
-        <w:t>این نسخه با بازسازی محافظه‌کارانهٔ استاندارد Word Open XML تولید شده است تا در Microsoft Word بدون نیاز به Repair باز شود. متن، جدول‌ها، منابع و پرونده‌های F-01 تا F-05 از نسخهٔ ۰٫۳ حفظ شده‌اند.</w:t>
+        <w:t>مسئول مجموعه هنگام ورود، انتقال، نمایش، امانت، مرمت و بازگشت یک قطعه باید بداند شیء چیست، کجاست، چه وضعیتی دارد، چه کسی آن را تحویل گرفته و چه صورت‌جلسه/تصویری به آن متصل است. workflow استاندارد category چنین است: accession/شناسه → catalog و provenance → location → condition baseline + media → move/loan request → approval/insurance/packing → hand-off → condition at destination → return/reconciliation → conservation history/audit.</w:t>
       </w:r>
     </w:p>
+    <w:tbl>
+      <w:tblPr>
+        <w:bidiVisual w:val="1"/>
+        <w:tblW w:type="auto" w:w="0"/>
+        <w:tblLayout w:type="autofit"/>
+        <w:tblLook w:firstColumn="1" w:firstRow="1" w:lastColumn="0" w:lastRow="0" w:noHBand="0" w:noVBand="1" w:val="04A0"/>
+      </w:tblPr>
+      <w:tblGrid>
+        <w:gridCol w:w="3213"/>
+        <w:gridCol w:w="3213"/>
+        <w:gridCol w:w="3213"/>
+      </w:tblGrid>
+      <w:tr>
+        <w:tc>
+          <w:tcPr>
+            <w:tcW w:type="dxa" w:w="1984"/>
+            <w:tcBorders>
+              <w:top w:val="single" w:sz="4" w:space="0" w:color="1F3A5F"/>
+              <w:left w:val="single" w:sz="4" w:space="0" w:color="1F3A5F"/>
+              <w:bottom w:val="single" w:sz="4" w:space="0" w:color="1F3A5F"/>
+              <w:right w:val="single" w:sz="4" w:space="0" w:color="1F3A5F"/>
+            </w:tcBorders>
+            <w:shd w:fill="1F3A5F"/>
+          </w:tcPr>
+          <w:p>
+            <w:pPr>
+              <w:spacing w:after="20" w:line="259" w:lineRule="auto"/>
+              <w:jc w:val="center"/>
+            </w:pPr>
+            <w:r/>
+            <w:r>
+              <w:rPr>
+                <w:rFonts w:ascii="B Zar" w:hAnsi="B Zar"/>
+                <w:b/>
+                <w:color w:val="FFFFFF"/>
+                <w:sz w:val="17"/>
+              </w:rPr>
+              <w:t>مرحله</w:t>
+            </w:r>
+          </w:p>
+        </w:tc>
+        <w:tc>
+          <w:tcPr>
+            <w:tcW w:type="dxa" w:w="4422"/>
+            <w:tcBorders>
+              <w:top w:val="single" w:sz="4" w:space="0" w:color="1F3A5F"/>
+              <w:left w:val="single" w:sz="4" w:space="0" w:color="1F3A5F"/>
+              <w:bottom w:val="single" w:sz="4" w:space="0" w:color="1F3A5F"/>
+              <w:right w:val="single" w:sz="4" w:space="0" w:color="1F3A5F"/>
+            </w:tcBorders>
+            <w:shd w:fill="1F3A5F"/>
+          </w:tcPr>
+          <w:p>
+            <w:pPr>
+              <w:spacing w:after="20" w:line="259" w:lineRule="auto"/>
+              <w:jc w:val="center"/>
+            </w:pPr>
+            <w:r/>
+            <w:r>
+              <w:rPr>
+                <w:rFonts w:ascii="B Zar" w:hAnsi="B Zar"/>
+                <w:b/>
+                <w:color w:val="FFFFFF"/>
+                <w:sz w:val="17"/>
+              </w:rPr>
+              <w:t>record لازم</w:t>
+            </w:r>
+          </w:p>
+        </w:tc>
+        <w:tc>
+          <w:tcPr>
+            <w:tcW w:type="dxa" w:w="3458"/>
+            <w:tcBorders>
+              <w:top w:val="single" w:sz="4" w:space="0" w:color="1F3A5F"/>
+              <w:left w:val="single" w:sz="4" w:space="0" w:color="1F3A5F"/>
+              <w:bottom w:val="single" w:sz="4" w:space="0" w:color="1F3A5F"/>
+              <w:right w:val="single" w:sz="4" w:space="0" w:color="1F3A5F"/>
+            </w:tcBorders>
+            <w:shd w:fill="1F3A5F"/>
+          </w:tcPr>
+          <w:p>
+            <w:pPr>
+              <w:spacing w:after="20" w:line="259" w:lineRule="auto"/>
+              <w:jc w:val="center"/>
+            </w:pPr>
+            <w:r/>
+            <w:r>
+              <w:rPr>
+                <w:rFonts w:ascii="B Zar" w:hAnsi="B Zar"/>
+                <w:b/>
+                <w:color w:val="FFFFFF"/>
+                <w:sz w:val="17"/>
+              </w:rPr>
+              <w:t>مرز و ریسک</w:t>
+            </w:r>
+          </w:p>
+        </w:tc>
+      </w:tr>
+      <w:tr>
+        <w:tc>
+          <w:tcPr>
+            <w:tcW w:type="dxa" w:w="1984"/>
+            <w:tcBorders>
+              <w:top w:val="single" w:sz="3" w:space="0" w:color="D9E0E7"/>
+              <w:left w:val="single" w:sz="3" w:space="0" w:color="D9E0E7"/>
+              <w:bottom w:val="single" w:sz="3" w:space="0" w:color="D9E0E7"/>
+              <w:right w:val="single" w:sz="3" w:space="0" w:color="D9E0E7"/>
+            </w:tcBorders>
+            <w:shd w:fill="FFFFFF"/>
+          </w:tcPr>
+          <w:p>
+            <w:pPr>
+              <w:spacing w:after="20" w:line="259" w:lineRule="auto"/>
+              <w:jc w:val="right"/>
+            </w:pPr>
+            <w:r/>
+            <w:r>
+              <w:rPr>
+                <w:rFonts w:ascii="B Zar" w:hAnsi="B Zar"/>
+                <w:b w:val="0"/>
+                <w:color w:val="263238"/>
+                <w:sz w:val="16"/>
+              </w:rPr>
+              <w:t>accession/catalog</w:t>
+            </w:r>
+          </w:p>
+        </w:tc>
+        <w:tc>
+          <w:tcPr>
+            <w:tcW w:type="dxa" w:w="4422"/>
+            <w:tcBorders>
+              <w:top w:val="single" w:sz="3" w:space="0" w:color="D9E0E7"/>
+              <w:left w:val="single" w:sz="3" w:space="0" w:color="D9E0E7"/>
+              <w:bottom w:val="single" w:sz="3" w:space="0" w:color="D9E0E7"/>
+              <w:right w:val="single" w:sz="3" w:space="0" w:color="D9E0E7"/>
+            </w:tcBorders>
+            <w:shd w:fill="FFFFFF"/>
+          </w:tcPr>
+          <w:p>
+            <w:pPr>
+              <w:spacing w:after="20" w:line="259" w:lineRule="auto"/>
+              <w:jc w:val="right"/>
+            </w:pPr>
+            <w:r/>
+            <w:r>
+              <w:rPr>
+                <w:rFonts w:ascii="B Zar" w:hAnsi="B Zar"/>
+                <w:b w:val="0"/>
+                <w:color w:val="263238"/>
+                <w:sz w:val="16"/>
+              </w:rPr>
+              <w:t>شناسه، نام، جنس، قدمت، مالکیت/provenance، عکس و classification.</w:t>
+            </w:r>
+          </w:p>
+        </w:tc>
+        <w:tc>
+          <w:tcPr>
+            <w:tcW w:type="dxa" w:w="3458"/>
+            <w:tcBorders>
+              <w:top w:val="single" w:sz="3" w:space="0" w:color="D9E0E7"/>
+              <w:left w:val="single" w:sz="3" w:space="0" w:color="D9E0E7"/>
+              <w:bottom w:val="single" w:sz="3" w:space="0" w:color="D9E0E7"/>
+              <w:right w:val="single" w:sz="3" w:space="0" w:color="D9E0E7"/>
+            </w:tcBorders>
+            <w:shd w:fill="FFFFFF"/>
+          </w:tcPr>
+          <w:p>
+            <w:pPr>
+              <w:spacing w:after="20" w:line="259" w:lineRule="auto"/>
+              <w:jc w:val="right"/>
+            </w:pPr>
+            <w:r/>
+            <w:r>
+              <w:rPr>
+                <w:rFonts w:ascii="B Zar" w:hAnsi="B Zar"/>
+                <w:b w:val="0"/>
+                <w:color w:val="263238"/>
+                <w:sz w:val="16"/>
+              </w:rPr>
+              <w:t>فرم ساده/فایل عکس بدون authority control، record قابل اتکا نمی‌سازد.</w:t>
+            </w:r>
+          </w:p>
+        </w:tc>
+      </w:tr>
+      <w:tr>
+        <w:tc>
+          <w:tcPr>
+            <w:tcW w:type="dxa" w:w="1984"/>
+            <w:tcBorders>
+              <w:top w:val="single" w:sz="3" w:space="0" w:color="D9E0E7"/>
+              <w:left w:val="single" w:sz="3" w:space="0" w:color="D9E0E7"/>
+              <w:bottom w:val="single" w:sz="3" w:space="0" w:color="D9E0E7"/>
+              <w:right w:val="single" w:sz="3" w:space="0" w:color="D9E0E7"/>
+            </w:tcBorders>
+            <w:shd w:fill="F5F7FA"/>
+          </w:tcPr>
+          <w:p>
+            <w:pPr>
+              <w:spacing w:after="20" w:line="259" w:lineRule="auto"/>
+              <w:jc w:val="right"/>
+            </w:pPr>
+            <w:r/>
+            <w:r>
+              <w:rPr>
+                <w:rFonts w:ascii="B Zar" w:hAnsi="B Zar"/>
+                <w:b w:val="0"/>
+                <w:color w:val="263238"/>
+                <w:sz w:val="16"/>
+              </w:rPr>
+              <w:t>location/condition</w:t>
+            </w:r>
+          </w:p>
+        </w:tc>
+        <w:tc>
+          <w:tcPr>
+            <w:tcW w:type="dxa" w:w="4422"/>
+            <w:tcBorders>
+              <w:top w:val="single" w:sz="3" w:space="0" w:color="D9E0E7"/>
+              <w:left w:val="single" w:sz="3" w:space="0" w:color="D9E0E7"/>
+              <w:bottom w:val="single" w:sz="3" w:space="0" w:color="D9E0E7"/>
+              <w:right w:val="single" w:sz="3" w:space="0" w:color="D9E0E7"/>
+            </w:tcBorders>
+            <w:shd w:fill="F5F7FA"/>
+          </w:tcPr>
+          <w:p>
+            <w:pPr>
+              <w:spacing w:after="20" w:line="259" w:lineRule="auto"/>
+              <w:jc w:val="right"/>
+            </w:pPr>
+            <w:r/>
+            <w:r>
+              <w:rPr>
+                <w:rFonts w:ascii="B Zar" w:hAnsi="B Zar"/>
+                <w:b w:val="0"/>
+                <w:color w:val="263238"/>
+                <w:sz w:val="16"/>
+              </w:rPr>
+              <w:t>مکان، custodian، baseline، آسیب/درمان و تصویر.</w:t>
+            </w:r>
+          </w:p>
+        </w:tc>
+        <w:tc>
+          <w:tcPr>
+            <w:tcW w:type="dxa" w:w="3458"/>
+            <w:tcBorders>
+              <w:top w:val="single" w:sz="3" w:space="0" w:color="D9E0E7"/>
+              <w:left w:val="single" w:sz="3" w:space="0" w:color="D9E0E7"/>
+              <w:bottom w:val="single" w:sz="3" w:space="0" w:color="D9E0E7"/>
+              <w:right w:val="single" w:sz="3" w:space="0" w:color="D9E0E7"/>
+            </w:tcBorders>
+            <w:shd w:fill="F5F7FA"/>
+          </w:tcPr>
+          <w:p>
+            <w:pPr>
+              <w:spacing w:after="20" w:line="259" w:lineRule="auto"/>
+              <w:jc w:val="right"/>
+            </w:pPr>
+            <w:r/>
+            <w:r>
+              <w:rPr>
+                <w:rFonts w:ascii="B Zar" w:hAnsi="B Zar"/>
+                <w:b w:val="0"/>
+                <w:color w:val="263238"/>
+                <w:sz w:val="16"/>
+              </w:rPr>
+              <w:t>condition assessment تخصصی است؛ نرم‌افزار نباید جای conservator تصمیم بگیرد.</w:t>
+            </w:r>
+          </w:p>
+        </w:tc>
+      </w:tr>
+      <w:tr>
+        <w:tc>
+          <w:tcPr>
+            <w:tcW w:type="dxa" w:w="1984"/>
+            <w:tcBorders>
+              <w:top w:val="single" w:sz="3" w:space="0" w:color="D9E0E7"/>
+              <w:left w:val="single" w:sz="3" w:space="0" w:color="D9E0E7"/>
+              <w:bottom w:val="single" w:sz="3" w:space="0" w:color="D9E0E7"/>
+              <w:right w:val="single" w:sz="3" w:space="0" w:color="D9E0E7"/>
+            </w:tcBorders>
+            <w:shd w:fill="FFFFFF"/>
+          </w:tcPr>
+          <w:p>
+            <w:pPr>
+              <w:spacing w:after="20" w:line="259" w:lineRule="auto"/>
+              <w:jc w:val="right"/>
+            </w:pPr>
+            <w:r/>
+            <w:r>
+              <w:rPr>
+                <w:rFonts w:ascii="B Zar" w:hAnsi="B Zar"/>
+                <w:b w:val="0"/>
+                <w:color w:val="263238"/>
+                <w:sz w:val="16"/>
+              </w:rPr>
+              <w:t>loan/movement</w:t>
+            </w:r>
+          </w:p>
+        </w:tc>
+        <w:tc>
+          <w:tcPr>
+            <w:tcW w:type="dxa" w:w="4422"/>
+            <w:tcBorders>
+              <w:top w:val="single" w:sz="3" w:space="0" w:color="D9E0E7"/>
+              <w:left w:val="single" w:sz="3" w:space="0" w:color="D9E0E7"/>
+              <w:bottom w:val="single" w:sz="3" w:space="0" w:color="D9E0E7"/>
+              <w:right w:val="single" w:sz="3" w:space="0" w:color="D9E0E7"/>
+            </w:tcBorders>
+            <w:shd w:fill="FFFFFF"/>
+          </w:tcPr>
+          <w:p>
+            <w:pPr>
+              <w:spacing w:after="20" w:line="259" w:lineRule="auto"/>
+              <w:jc w:val="right"/>
+            </w:pPr>
+            <w:r/>
+            <w:r>
+              <w:rPr>
+                <w:rFonts w:ascii="B Zar" w:hAnsi="B Zar"/>
+                <w:b w:val="0"/>
+                <w:color w:val="263238"/>
+                <w:sz w:val="16"/>
+              </w:rPr>
+              <w:t>درخواست، approval، قرارداد/بیمه، صورت‌جلسه، تحویل/بازگشت و reconciliation.</w:t>
+            </w:r>
+          </w:p>
+        </w:tc>
+        <w:tc>
+          <w:tcPr>
+            <w:tcW w:type="dxa" w:w="3458"/>
+            <w:tcBorders>
+              <w:top w:val="single" w:sz="3" w:space="0" w:color="D9E0E7"/>
+              <w:left w:val="single" w:sz="3" w:space="0" w:color="D9E0E7"/>
+              <w:bottom w:val="single" w:sz="3" w:space="0" w:color="D9E0E7"/>
+              <w:right w:val="single" w:sz="3" w:space="0" w:color="D9E0E7"/>
+            </w:tcBorders>
+            <w:shd w:fill="FFFFFF"/>
+          </w:tcPr>
+          <w:p>
+            <w:pPr>
+              <w:spacing w:after="20" w:line="259" w:lineRule="auto"/>
+              <w:jc w:val="right"/>
+            </w:pPr>
+            <w:r/>
+            <w:r>
+              <w:rPr>
+                <w:rFonts w:ascii="B Zar" w:hAnsi="B Zar"/>
+                <w:b w:val="0"/>
+                <w:color w:val="263238"/>
+                <w:sz w:val="16"/>
+              </w:rPr>
+              <w:t>به packing، حمل، بیمه و مسئولیت حقوقی متصل است؛ software-only باید record keeper بماند.</w:t>
+            </w:r>
+          </w:p>
+        </w:tc>
+      </w:tr>
+      <w:tr>
+        <w:tc>
+          <w:tcPr>
+            <w:tcW w:type="dxa" w:w="1984"/>
+            <w:tcBorders>
+              <w:top w:val="single" w:sz="3" w:space="0" w:color="D9E0E7"/>
+              <w:left w:val="single" w:sz="3" w:space="0" w:color="D9E0E7"/>
+              <w:bottom w:val="single" w:sz="3" w:space="0" w:color="D9E0E7"/>
+              <w:right w:val="single" w:sz="3" w:space="0" w:color="D9E0E7"/>
+            </w:tcBorders>
+            <w:shd w:fill="F5F7FA"/>
+          </w:tcPr>
+          <w:p>
+            <w:pPr>
+              <w:spacing w:after="20" w:line="259" w:lineRule="auto"/>
+              <w:jc w:val="right"/>
+            </w:pPr>
+            <w:r/>
+            <w:r>
+              <w:rPr>
+                <w:rFonts w:ascii="B Zar" w:hAnsi="B Zar"/>
+                <w:b w:val="0"/>
+                <w:color w:val="263238"/>
+                <w:sz w:val="16"/>
+              </w:rPr>
+              <w:t>audit/conservation</w:t>
+            </w:r>
+          </w:p>
+        </w:tc>
+        <w:tc>
+          <w:tcPr>
+            <w:tcW w:type="dxa" w:w="4422"/>
+            <w:tcBorders>
+              <w:top w:val="single" w:sz="3" w:space="0" w:color="D9E0E7"/>
+              <w:left w:val="single" w:sz="3" w:space="0" w:color="D9E0E7"/>
+              <w:bottom w:val="single" w:sz="3" w:space="0" w:color="D9E0E7"/>
+              <w:right w:val="single" w:sz="3" w:space="0" w:color="D9E0E7"/>
+            </w:tcBorders>
+            <w:shd w:fill="F5F7FA"/>
+          </w:tcPr>
+          <w:p>
+            <w:pPr>
+              <w:spacing w:after="20" w:line="259" w:lineRule="auto"/>
+              <w:jc w:val="right"/>
+            </w:pPr>
+            <w:r/>
+            <w:r>
+              <w:rPr>
+                <w:rFonts w:ascii="B Zar" w:hAnsi="B Zar"/>
+                <w:b w:val="0"/>
+                <w:color w:val="263238"/>
+                <w:sz w:val="16"/>
+              </w:rPr>
+              <w:t>تاریخچه تغییر، دسترسی، گزارش، treatment و evidence.</w:t>
+            </w:r>
+          </w:p>
+        </w:tc>
+        <w:tc>
+          <w:tcPr>
+            <w:tcW w:type="dxa" w:w="3458"/>
+            <w:tcBorders>
+              <w:top w:val="single" w:sz="3" w:space="0" w:color="D9E0E7"/>
+              <w:left w:val="single" w:sz="3" w:space="0" w:color="D9E0E7"/>
+              <w:bottom w:val="single" w:sz="3" w:space="0" w:color="D9E0E7"/>
+              <w:right w:val="single" w:sz="3" w:space="0" w:color="D9E0E7"/>
+            </w:tcBorders>
+            <w:shd w:fill="F5F7FA"/>
+          </w:tcPr>
+          <w:p>
+            <w:pPr>
+              <w:spacing w:after="20" w:line="259" w:lineRule="auto"/>
+              <w:jc w:val="right"/>
+            </w:pPr>
+            <w:r/>
+            <w:r>
+              <w:rPr>
+                <w:rFonts w:ascii="B Zar" w:hAnsi="B Zar"/>
+                <w:b w:val="0"/>
+                <w:color w:val="263238"/>
+                <w:sz w:val="16"/>
+              </w:rPr>
+              <w:t>بدون data governance و role authority، archive قابل دفاع نیست.</w:t>
+            </w:r>
+          </w:p>
+        </w:tc>
+      </w:tr>
+    </w:tbl>
+    <w:p/>
+    <w:p>
+      <w:pPr>
+        <w:pStyle w:val="Heading2"/>
+        <w:spacing w:before="200" w:after="120"/>
+        <w:jc w:val="right"/>
+      </w:pPr>
+      <w:r>
+        <w:rPr>
+          <w:rFonts w:ascii="B Zar" w:hAnsi="B Zar"/>
+          <w:color w:val="1F7A70"/>
+          <w:sz w:val="26"/>
+        </w:rPr>
+        <w:t>۲. شواهد جهانی و بلوغ category</w:t>
+      </w:r>
+    </w:p>
+    <w:p>
+      <w:pPr>
+        <w:spacing w:after="100" w:line="300" w:lineRule="auto"/>
+        <w:jc w:val="right"/>
+      </w:pPr>
+      <w:r>
+        <w:rPr>
+          <w:rFonts w:ascii="B Zar" w:hAnsi="B Zar"/>
+          <w:color w:val="263238"/>
+          <w:sz w:val="22"/>
+        </w:rPr>
+        <w:t>Axiell Collections طبق Collections Trust، audit trail، workflow loan، task، barcode-based location update، media ingest، rights و انتشار آنلاین را پوشش می‌دهد. [F06-S01] همان مرجع، Object Entry/Exit، acquisition، location/movement control، loans in/out، condition assessment، conservation، valuation/insurance و damage/loss را در procedureهای پوشش‌داده‌شده می‌آورد. [F06-S02] eHive و دیگر CMSهای موزه‌ای نیز location، condition report و loan management را در category عرضه می‌کنند. [F06-S03] این‌ها category proof هستند، نه شاهد تقاضا در ایران.</w:t>
+      </w:r>
+    </w:p>
+    <w:tbl>
+      <w:tblPr>
+        <w:bidiVisual w:val="1"/>
+        <w:tblW w:type="auto" w:w="0"/>
+        <w:tblLayout w:type="autofit"/>
+        <w:tblLook w:firstColumn="1" w:firstRow="1" w:lastColumn="0" w:lastRow="0" w:noHBand="0" w:noVBand="1" w:val="04A0"/>
+      </w:tblPr>
+      <w:tblGrid>
+        <w:gridCol w:w="3213"/>
+        <w:gridCol w:w="3213"/>
+        <w:gridCol w:w="3213"/>
+      </w:tblGrid>
+      <w:tr>
+        <w:tc>
+          <w:tcPr>
+            <w:tcW w:type="dxa" w:w="2381"/>
+            <w:tcBorders>
+              <w:top w:val="single" w:sz="4" w:space="0" w:color="1F3A5F"/>
+              <w:left w:val="single" w:sz="4" w:space="0" w:color="1F3A5F"/>
+              <w:bottom w:val="single" w:sz="4" w:space="0" w:color="1F3A5F"/>
+              <w:right w:val="single" w:sz="4" w:space="0" w:color="1F3A5F"/>
+            </w:tcBorders>
+            <w:shd w:fill="1F3A5F"/>
+          </w:tcPr>
+          <w:p>
+            <w:pPr>
+              <w:spacing w:after="20" w:line="259" w:lineRule="auto"/>
+              <w:jc w:val="center"/>
+            </w:pPr>
+            <w:r/>
+            <w:r>
+              <w:rPr>
+                <w:rFonts w:ascii="B Zar" w:hAnsi="B Zar"/>
+                <w:b/>
+                <w:color w:val="FFFFFF"/>
+                <w:sz w:val="17"/>
+              </w:rPr>
+              <w:t>الگو</w:t>
+            </w:r>
+          </w:p>
+        </w:tc>
+        <w:tc>
+          <w:tcPr>
+            <w:tcW w:type="dxa" w:w="4252"/>
+            <w:tcBorders>
+              <w:top w:val="single" w:sz="4" w:space="0" w:color="1F3A5F"/>
+              <w:left w:val="single" w:sz="4" w:space="0" w:color="1F3A5F"/>
+              <w:bottom w:val="single" w:sz="4" w:space="0" w:color="1F3A5F"/>
+              <w:right w:val="single" w:sz="4" w:space="0" w:color="1F3A5F"/>
+            </w:tcBorders>
+            <w:shd w:fill="1F3A5F"/>
+          </w:tcPr>
+          <w:p>
+            <w:pPr>
+              <w:spacing w:after="20" w:line="259" w:lineRule="auto"/>
+              <w:jc w:val="center"/>
+            </w:pPr>
+            <w:r/>
+            <w:r>
+              <w:rPr>
+                <w:rFonts w:ascii="B Zar" w:hAnsi="B Zar"/>
+                <w:b/>
+                <w:color w:val="FFFFFF"/>
+                <w:sz w:val="17"/>
+              </w:rPr>
+              <w:t>قابلیت مستند</w:t>
+            </w:r>
+          </w:p>
+        </w:tc>
+        <w:tc>
+          <w:tcPr>
+            <w:tcW w:type="dxa" w:w="3231"/>
+            <w:tcBorders>
+              <w:top w:val="single" w:sz="4" w:space="0" w:color="1F3A5F"/>
+              <w:left w:val="single" w:sz="4" w:space="0" w:color="1F3A5F"/>
+              <w:bottom w:val="single" w:sz="4" w:space="0" w:color="1F3A5F"/>
+              <w:right w:val="single" w:sz="4" w:space="0" w:color="1F3A5F"/>
+            </w:tcBorders>
+            <w:shd w:fill="1F3A5F"/>
+          </w:tcPr>
+          <w:p>
+            <w:pPr>
+              <w:spacing w:after="20" w:line="259" w:lineRule="auto"/>
+              <w:jc w:val="center"/>
+            </w:pPr>
+            <w:r/>
+            <w:r>
+              <w:rPr>
+                <w:rFonts w:ascii="B Zar" w:hAnsi="B Zar"/>
+                <w:b/>
+                <w:color w:val="FFFFFF"/>
+                <w:sz w:val="17"/>
+              </w:rPr>
+              <w:t>دلالت</w:t>
+            </w:r>
+          </w:p>
+        </w:tc>
+      </w:tr>
+      <w:tr>
+        <w:tc>
+          <w:tcPr>
+            <w:tcW w:type="dxa" w:w="2381"/>
+            <w:tcBorders>
+              <w:top w:val="single" w:sz="3" w:space="0" w:color="D9E0E7"/>
+              <w:left w:val="single" w:sz="3" w:space="0" w:color="D9E0E7"/>
+              <w:bottom w:val="single" w:sz="3" w:space="0" w:color="D9E0E7"/>
+              <w:right w:val="single" w:sz="3" w:space="0" w:color="D9E0E7"/>
+            </w:tcBorders>
+            <w:shd w:fill="FFFFFF"/>
+          </w:tcPr>
+          <w:p>
+            <w:pPr>
+              <w:spacing w:after="20" w:line="259" w:lineRule="auto"/>
+              <w:jc w:val="right"/>
+            </w:pPr>
+            <w:r/>
+            <w:r>
+              <w:rPr>
+                <w:rFonts w:ascii="B Zar" w:hAnsi="B Zar"/>
+                <w:b w:val="0"/>
+                <w:color w:val="263238"/>
+                <w:sz w:val="16"/>
+              </w:rPr>
+              <w:t>Axiell Collections</w:t>
+            </w:r>
+          </w:p>
+        </w:tc>
+        <w:tc>
+          <w:tcPr>
+            <w:tcW w:type="dxa" w:w="4252"/>
+            <w:tcBorders>
+              <w:top w:val="single" w:sz="3" w:space="0" w:color="D9E0E7"/>
+              <w:left w:val="single" w:sz="3" w:space="0" w:color="D9E0E7"/>
+              <w:bottom w:val="single" w:sz="3" w:space="0" w:color="D9E0E7"/>
+              <w:right w:val="single" w:sz="3" w:space="0" w:color="D9E0E7"/>
+            </w:tcBorders>
+            <w:shd w:fill="FFFFFF"/>
+          </w:tcPr>
+          <w:p>
+            <w:pPr>
+              <w:spacing w:after="20" w:line="259" w:lineRule="auto"/>
+              <w:jc w:val="right"/>
+            </w:pPr>
+            <w:r/>
+            <w:r>
+              <w:rPr>
+                <w:rFonts w:ascii="B Zar" w:hAnsi="B Zar"/>
+                <w:b w:val="0"/>
+                <w:color w:val="263238"/>
+                <w:sz w:val="16"/>
+              </w:rPr>
+              <w:t>loan workflow، Move/barcode، audit trail، media/DAMS، rights و standards. [F06-S01–S02]</w:t>
+            </w:r>
+          </w:p>
+        </w:tc>
+        <w:tc>
+          <w:tcPr>
+            <w:tcW w:type="dxa" w:w="3231"/>
+            <w:tcBorders>
+              <w:top w:val="single" w:sz="3" w:space="0" w:color="D9E0E7"/>
+              <w:left w:val="single" w:sz="3" w:space="0" w:color="D9E0E7"/>
+              <w:bottom w:val="single" w:sz="3" w:space="0" w:color="D9E0E7"/>
+              <w:right w:val="single" w:sz="3" w:space="0" w:color="D9E0E7"/>
+            </w:tcBorders>
+            <w:shd w:fill="FFFFFF"/>
+          </w:tcPr>
+          <w:p>
+            <w:pPr>
+              <w:spacing w:after="20" w:line="259" w:lineRule="auto"/>
+              <w:jc w:val="right"/>
+            </w:pPr>
+            <w:r/>
+            <w:r>
+              <w:rPr>
+                <w:rFonts w:ascii="B Zar" w:hAnsi="B Zar"/>
+                <w:b w:val="0"/>
+                <w:color w:val="263238"/>
+                <w:sz w:val="16"/>
+              </w:rPr>
+              <w:t>دیتامدل باید object-first و lifecycle-governed باشد؛ نه صرفاً عکس و QR.</w:t>
+            </w:r>
+          </w:p>
+        </w:tc>
+      </w:tr>
+      <w:tr>
+        <w:tc>
+          <w:tcPr>
+            <w:tcW w:type="dxa" w:w="2381"/>
+            <w:tcBorders>
+              <w:top w:val="single" w:sz="3" w:space="0" w:color="D9E0E7"/>
+              <w:left w:val="single" w:sz="3" w:space="0" w:color="D9E0E7"/>
+              <w:bottom w:val="single" w:sz="3" w:space="0" w:color="D9E0E7"/>
+              <w:right w:val="single" w:sz="3" w:space="0" w:color="D9E0E7"/>
+            </w:tcBorders>
+            <w:shd w:fill="F5F7FA"/>
+          </w:tcPr>
+          <w:p>
+            <w:pPr>
+              <w:spacing w:after="20" w:line="259" w:lineRule="auto"/>
+              <w:jc w:val="right"/>
+            </w:pPr>
+            <w:r/>
+            <w:r>
+              <w:rPr>
+                <w:rFonts w:ascii="B Zar" w:hAnsi="B Zar"/>
+                <w:b w:val="0"/>
+                <w:color w:val="263238"/>
+                <w:sz w:val="16"/>
+              </w:rPr>
+              <w:t>Museum CMS ecosystem</w:t>
+            </w:r>
+          </w:p>
+        </w:tc>
+        <w:tc>
+          <w:tcPr>
+            <w:tcW w:type="dxa" w:w="4252"/>
+            <w:tcBorders>
+              <w:top w:val="single" w:sz="3" w:space="0" w:color="D9E0E7"/>
+              <w:left w:val="single" w:sz="3" w:space="0" w:color="D9E0E7"/>
+              <w:bottom w:val="single" w:sz="3" w:space="0" w:color="D9E0E7"/>
+              <w:right w:val="single" w:sz="3" w:space="0" w:color="D9E0E7"/>
+            </w:tcBorders>
+            <w:shd w:fill="F5F7FA"/>
+          </w:tcPr>
+          <w:p>
+            <w:pPr>
+              <w:spacing w:after="20" w:line="259" w:lineRule="auto"/>
+              <w:jc w:val="right"/>
+            </w:pPr>
+            <w:r/>
+            <w:r>
+              <w:rPr>
+                <w:rFonts w:ascii="B Zar" w:hAnsi="B Zar"/>
+                <w:b w:val="0"/>
+                <w:color w:val="263238"/>
+                <w:sz w:val="16"/>
+              </w:rPr>
+              <w:t>catalog، provenance، location، exhibition، condition/conservation و loan در record واحد. [F06-S03–S04]</w:t>
+            </w:r>
+          </w:p>
+        </w:tc>
+        <w:tc>
+          <w:tcPr>
+            <w:tcW w:type="dxa" w:w="3231"/>
+            <w:tcBorders>
+              <w:top w:val="single" w:sz="3" w:space="0" w:color="D9E0E7"/>
+              <w:left w:val="single" w:sz="3" w:space="0" w:color="D9E0E7"/>
+              <w:bottom w:val="single" w:sz="3" w:space="0" w:color="D9E0E7"/>
+              <w:right w:val="single" w:sz="3" w:space="0" w:color="D9E0E7"/>
+            </w:tcBorders>
+            <w:shd w:fill="F5F7FA"/>
+          </w:tcPr>
+          <w:p>
+            <w:pPr>
+              <w:spacing w:after="20" w:line="259" w:lineRule="auto"/>
+              <w:jc w:val="right"/>
+            </w:pPr>
+            <w:r/>
+            <w:r>
+              <w:rPr>
+                <w:rFonts w:ascii="B Zar" w:hAnsi="B Zar"/>
+                <w:b w:val="0"/>
+                <w:color w:val="263238"/>
+                <w:sz w:val="16"/>
+              </w:rPr>
+              <w:t>condition report + loan log، wedge مستقل تازه نیست.</w:t>
+            </w:r>
+          </w:p>
+        </w:tc>
+      </w:tr>
+      <w:tr>
+        <w:tc>
+          <w:tcPr>
+            <w:tcW w:type="dxa" w:w="2381"/>
+            <w:tcBorders>
+              <w:top w:val="single" w:sz="3" w:space="0" w:color="D9E0E7"/>
+              <w:left w:val="single" w:sz="3" w:space="0" w:color="D9E0E7"/>
+              <w:bottom w:val="single" w:sz="3" w:space="0" w:color="D9E0E7"/>
+              <w:right w:val="single" w:sz="3" w:space="0" w:color="D9E0E7"/>
+            </w:tcBorders>
+            <w:shd w:fill="FFFFFF"/>
+          </w:tcPr>
+          <w:p>
+            <w:pPr>
+              <w:spacing w:after="20" w:line="259" w:lineRule="auto"/>
+              <w:jc w:val="right"/>
+            </w:pPr>
+            <w:r/>
+            <w:r>
+              <w:rPr>
+                <w:rFonts w:ascii="B Zar" w:hAnsi="B Zar"/>
+                <w:b w:val="0"/>
+                <w:color w:val="263238"/>
+                <w:sz w:val="16"/>
+              </w:rPr>
+              <w:t>Spectrum / CIDOC / CCO</w:t>
+            </w:r>
+          </w:p>
+        </w:tc>
+        <w:tc>
+          <w:tcPr>
+            <w:tcW w:type="dxa" w:w="4252"/>
+            <w:tcBorders>
+              <w:top w:val="single" w:sz="3" w:space="0" w:color="D9E0E7"/>
+              <w:left w:val="single" w:sz="3" w:space="0" w:color="D9E0E7"/>
+              <w:bottom w:val="single" w:sz="3" w:space="0" w:color="D9E0E7"/>
+              <w:right w:val="single" w:sz="3" w:space="0" w:color="D9E0E7"/>
+            </w:tcBorders>
+            <w:shd w:fill="FFFFFF"/>
+          </w:tcPr>
+          <w:p>
+            <w:pPr>
+              <w:spacing w:after="20" w:line="259" w:lineRule="auto"/>
+              <w:jc w:val="right"/>
+            </w:pPr>
+            <w:r/>
+            <w:r>
+              <w:rPr>
+                <w:rFonts w:ascii="B Zar" w:hAnsi="B Zar"/>
+                <w:b w:val="0"/>
+                <w:color w:val="263238"/>
+                <w:sz w:val="16"/>
+              </w:rPr>
+              <w:t>metadata، procedure و controlled terminology.</w:t>
+            </w:r>
+          </w:p>
+        </w:tc>
+        <w:tc>
+          <w:tcPr>
+            <w:tcW w:type="dxa" w:w="3231"/>
+            <w:tcBorders>
+              <w:top w:val="single" w:sz="3" w:space="0" w:color="D9E0E7"/>
+              <w:left w:val="single" w:sz="3" w:space="0" w:color="D9E0E7"/>
+              <w:bottom w:val="single" w:sz="3" w:space="0" w:color="D9E0E7"/>
+              <w:right w:val="single" w:sz="3" w:space="0" w:color="D9E0E7"/>
+            </w:tcBorders>
+            <w:shd w:fill="FFFFFF"/>
+          </w:tcPr>
+          <w:p>
+            <w:pPr>
+              <w:spacing w:after="20" w:line="259" w:lineRule="auto"/>
+              <w:jc w:val="right"/>
+            </w:pPr>
+            <w:r/>
+            <w:r>
+              <w:rPr>
+                <w:rFonts w:ascii="B Zar" w:hAnsi="B Zar"/>
+                <w:b w:val="0"/>
+                <w:color w:val="263238"/>
+                <w:sz w:val="16"/>
+              </w:rPr>
+              <w:t>پیاده‌سازی معتبر، تخصص heritage و governance می‌خواهد.</w:t>
+            </w:r>
+          </w:p>
+        </w:tc>
+      </w:tr>
+    </w:tbl>
+    <w:p/>
+    <w:p>
+      <w:pPr>
+        <w:pStyle w:val="Heading2"/>
+        <w:spacing w:before="200" w:after="120"/>
+        <w:jc w:val="right"/>
+      </w:pPr>
+      <w:r>
+        <w:rPr>
+          <w:rFonts w:ascii="B Zar" w:hAnsi="B Zar"/>
+          <w:color w:val="1F7A70"/>
+          <w:sz w:val="26"/>
+        </w:rPr>
+        <w:t>۳. ایران، رقابت و substituteهای واقعی</w:t>
+      </w:r>
+    </w:p>
+    <w:p>
+      <w:pPr>
+        <w:spacing w:after="100" w:line="300" w:lineRule="auto"/>
+        <w:jc w:val="right"/>
+      </w:pPr>
+      <w:r>
+        <w:rPr>
+          <w:rFonts w:ascii="B Zar" w:hAnsi="B Zar"/>
+          <w:color w:val="263238"/>
+          <w:sz w:val="22"/>
+        </w:rPr>
+        <w:t>اداره‌کل موزه‌ها برای ساماندهی اموال منقول فرهنگی، ثبت شماره اموالی، نام، جنس، قدمت، ابعاد، سلامت/آسیب، جایگاه، مالکیت، تاریخ تحویل و امین اموال و مکانیزه‌کردن/کنترل نقل‌وانتقال را شرح می‌دهد؛ همان منبع از نرم‌افزار گنجینه نام می‌برد. [F06-S05] برنا در اردیبهشت ۱۴۰۵ از ثبت ۲۳۸ هزار شیء در سامانه جام و وجود ۸۳۰ موزه گزارش داد. این اعداد زیرساخت/حجم ثبت را نشان می‌دهند، نه TAM/SAM نرم‌افزار جدید. [F06-S06]</w:t>
+      </w:r>
+    </w:p>
+    <w:tbl>
+      <w:tblPr>
+        <w:bidiVisual w:val="1"/>
+        <w:tblW w:type="auto" w:w="0"/>
+        <w:tblLayout w:type="autofit"/>
+        <w:tblLook w:firstColumn="1" w:firstRow="1" w:lastColumn="0" w:lastRow="0" w:noHBand="0" w:noVBand="1" w:val="04A0"/>
+      </w:tblPr>
+      <w:tblGrid>
+        <w:gridCol w:w="3213"/>
+        <w:gridCol w:w="3213"/>
+        <w:gridCol w:w="3213"/>
+      </w:tblGrid>
+      <w:tr>
+        <w:tc>
+          <w:tcPr>
+            <w:tcW w:type="dxa" w:w="2381"/>
+            <w:tcBorders>
+              <w:top w:val="single" w:sz="4" w:space="0" w:color="1F3A5F"/>
+              <w:left w:val="single" w:sz="4" w:space="0" w:color="1F3A5F"/>
+              <w:bottom w:val="single" w:sz="4" w:space="0" w:color="1F3A5F"/>
+              <w:right w:val="single" w:sz="4" w:space="0" w:color="1F3A5F"/>
+            </w:tcBorders>
+            <w:shd w:fill="1F3A5F"/>
+          </w:tcPr>
+          <w:p>
+            <w:pPr>
+              <w:spacing w:after="20" w:line="259" w:lineRule="auto"/>
+              <w:jc w:val="center"/>
+            </w:pPr>
+            <w:r/>
+            <w:r>
+              <w:rPr>
+                <w:rFonts w:ascii="B Zar" w:hAnsi="B Zar"/>
+                <w:b/>
+                <w:color w:val="FFFFFF"/>
+                <w:sz w:val="17"/>
+              </w:rPr>
+              <w:t>جایگزین</w:t>
+            </w:r>
+          </w:p>
+        </w:tc>
+        <w:tc>
+          <w:tcPr>
+            <w:tcW w:type="dxa" w:w="4139"/>
+            <w:tcBorders>
+              <w:top w:val="single" w:sz="4" w:space="0" w:color="1F3A5F"/>
+              <w:left w:val="single" w:sz="4" w:space="0" w:color="1F3A5F"/>
+              <w:bottom w:val="single" w:sz="4" w:space="0" w:color="1F3A5F"/>
+              <w:right w:val="single" w:sz="4" w:space="0" w:color="1F3A5F"/>
+            </w:tcBorders>
+            <w:shd w:fill="1F3A5F"/>
+          </w:tcPr>
+          <w:p>
+            <w:pPr>
+              <w:spacing w:after="20" w:line="259" w:lineRule="auto"/>
+              <w:jc w:val="center"/>
+            </w:pPr>
+            <w:r/>
+            <w:r>
+              <w:rPr>
+                <w:rFonts w:ascii="B Zar" w:hAnsi="B Zar"/>
+                <w:b/>
+                <w:color w:val="FFFFFF"/>
+                <w:sz w:val="17"/>
+              </w:rPr>
+              <w:t>کارکرد موجود</w:t>
+            </w:r>
+          </w:p>
+        </w:tc>
+        <w:tc>
+          <w:tcPr>
+            <w:tcW w:type="dxa" w:w="3345"/>
+            <w:tcBorders>
+              <w:top w:val="single" w:sz="4" w:space="0" w:color="1F3A5F"/>
+              <w:left w:val="single" w:sz="4" w:space="0" w:color="1F3A5F"/>
+              <w:bottom w:val="single" w:sz="4" w:space="0" w:color="1F3A5F"/>
+              <w:right w:val="single" w:sz="4" w:space="0" w:color="1F3A5F"/>
+            </w:tcBorders>
+            <w:shd w:fill="1F3A5F"/>
+          </w:tcPr>
+          <w:p>
+            <w:pPr>
+              <w:spacing w:after="20" w:line="259" w:lineRule="auto"/>
+              <w:jc w:val="center"/>
+            </w:pPr>
+            <w:r/>
+            <w:r>
+              <w:rPr>
+                <w:rFonts w:ascii="B Zar" w:hAnsi="B Zar"/>
+                <w:b/>
+                <w:color w:val="FFFFFF"/>
+                <w:sz w:val="17"/>
+              </w:rPr>
+              <w:t>اثر بر thesis</w:t>
+            </w:r>
+          </w:p>
+        </w:tc>
+      </w:tr>
+      <w:tr>
+        <w:tc>
+          <w:tcPr>
+            <w:tcW w:type="dxa" w:w="2381"/>
+            <w:tcBorders>
+              <w:top w:val="single" w:sz="3" w:space="0" w:color="D9E0E7"/>
+              <w:left w:val="single" w:sz="3" w:space="0" w:color="D9E0E7"/>
+              <w:bottom w:val="single" w:sz="3" w:space="0" w:color="D9E0E7"/>
+              <w:right w:val="single" w:sz="3" w:space="0" w:color="D9E0E7"/>
+            </w:tcBorders>
+            <w:shd w:fill="FFFFFF"/>
+          </w:tcPr>
+          <w:p>
+            <w:pPr>
+              <w:spacing w:after="20" w:line="259" w:lineRule="auto"/>
+              <w:jc w:val="right"/>
+            </w:pPr>
+            <w:r/>
+            <w:r>
+              <w:rPr>
+                <w:rFonts w:ascii="B Zar" w:hAnsi="B Zar"/>
+                <w:b w:val="0"/>
+                <w:color w:val="263238"/>
+                <w:sz w:val="16"/>
+              </w:rPr>
+              <w:t>جام/گنجینه و فرایند نهادی</w:t>
+            </w:r>
+          </w:p>
+        </w:tc>
+        <w:tc>
+          <w:tcPr>
+            <w:tcW w:type="dxa" w:w="4139"/>
+            <w:tcBorders>
+              <w:top w:val="single" w:sz="3" w:space="0" w:color="D9E0E7"/>
+              <w:left w:val="single" w:sz="3" w:space="0" w:color="D9E0E7"/>
+              <w:bottom w:val="single" w:sz="3" w:space="0" w:color="D9E0E7"/>
+              <w:right w:val="single" w:sz="3" w:space="0" w:color="D9E0E7"/>
+            </w:tcBorders>
+            <w:shd w:fill="FFFFFF"/>
+          </w:tcPr>
+          <w:p>
+            <w:pPr>
+              <w:spacing w:after="20" w:line="259" w:lineRule="auto"/>
+              <w:jc w:val="right"/>
+            </w:pPr>
+            <w:r/>
+            <w:r>
+              <w:rPr>
+                <w:rFonts w:ascii="B Zar" w:hAnsi="B Zar"/>
+                <w:b w:val="0"/>
+                <w:color w:val="263238"/>
+                <w:sz w:val="16"/>
+              </w:rPr>
+              <w:t>ثبت، شناسنامه، صورت‌جلسه انتقال و governance اموال فرهنگی.</w:t>
+            </w:r>
+          </w:p>
+        </w:tc>
+        <w:tc>
+          <w:tcPr>
+            <w:tcW w:type="dxa" w:w="3345"/>
+            <w:tcBorders>
+              <w:top w:val="single" w:sz="3" w:space="0" w:color="D9E0E7"/>
+              <w:left w:val="single" w:sz="3" w:space="0" w:color="D9E0E7"/>
+              <w:bottom w:val="single" w:sz="3" w:space="0" w:color="D9E0E7"/>
+              <w:right w:val="single" w:sz="3" w:space="0" w:color="D9E0E7"/>
+            </w:tcBorders>
+            <w:shd w:fill="FFFFFF"/>
+          </w:tcPr>
+          <w:p>
+            <w:pPr>
+              <w:spacing w:after="20" w:line="259" w:lineRule="auto"/>
+              <w:jc w:val="right"/>
+            </w:pPr>
+            <w:r/>
+            <w:r>
+              <w:rPr>
+                <w:rFonts w:ascii="B Zar" w:hAnsi="B Zar"/>
+                <w:b w:val="0"/>
+                <w:color w:val="263238"/>
+                <w:sz w:val="16"/>
+              </w:rPr>
+              <w:t>مسیر دولتی/رسمی را اشغال و integration/authority را حساس می‌کند.</w:t>
+            </w:r>
+          </w:p>
+        </w:tc>
+      </w:tr>
+      <w:tr>
+        <w:tc>
+          <w:tcPr>
+            <w:tcW w:type="dxa" w:w="2381"/>
+            <w:tcBorders>
+              <w:top w:val="single" w:sz="3" w:space="0" w:color="D9E0E7"/>
+              <w:left w:val="single" w:sz="3" w:space="0" w:color="D9E0E7"/>
+              <w:bottom w:val="single" w:sz="3" w:space="0" w:color="D9E0E7"/>
+              <w:right w:val="single" w:sz="3" w:space="0" w:color="D9E0E7"/>
+            </w:tcBorders>
+            <w:shd w:fill="F5F7FA"/>
+          </w:tcPr>
+          <w:p>
+            <w:pPr>
+              <w:spacing w:after="20" w:line="259" w:lineRule="auto"/>
+              <w:jc w:val="right"/>
+            </w:pPr>
+            <w:r/>
+            <w:r>
+              <w:rPr>
+                <w:rFonts w:ascii="B Zar" w:hAnsi="B Zar"/>
+                <w:b w:val="0"/>
+                <w:color w:val="263238"/>
+                <w:sz w:val="16"/>
+              </w:rPr>
+              <w:t>آثاره / CMS محلی</w:t>
+            </w:r>
+          </w:p>
+        </w:tc>
+        <w:tc>
+          <w:tcPr>
+            <w:tcW w:type="dxa" w:w="4139"/>
+            <w:tcBorders>
+              <w:top w:val="single" w:sz="3" w:space="0" w:color="D9E0E7"/>
+              <w:left w:val="single" w:sz="3" w:space="0" w:color="D9E0E7"/>
+              <w:bottom w:val="single" w:sz="3" w:space="0" w:color="D9E0E7"/>
+              <w:right w:val="single" w:sz="3" w:space="0" w:color="D9E0E7"/>
+            </w:tcBorders>
+            <w:shd w:fill="F5F7FA"/>
+          </w:tcPr>
+          <w:p>
+            <w:pPr>
+              <w:spacing w:after="20" w:line="259" w:lineRule="auto"/>
+              <w:jc w:val="right"/>
+            </w:pPr>
+            <w:r/>
+            <w:r>
+              <w:rPr>
+                <w:rFonts w:ascii="B Zar" w:hAnsi="B Zar"/>
+                <w:b w:val="0"/>
+                <w:color w:val="263238"/>
+                <w:sz w:val="16"/>
+              </w:rPr>
+              <w:t>استانداردهای SPECTRUM4/CIDOC/CCO، metadata، location/condition، access، report و QR؛ vendor claim. [F06-S07]</w:t>
+            </w:r>
+          </w:p>
+        </w:tc>
+        <w:tc>
+          <w:tcPr>
+            <w:tcW w:type="dxa" w:w="3345"/>
+            <w:tcBorders>
+              <w:top w:val="single" w:sz="3" w:space="0" w:color="D9E0E7"/>
+              <w:left w:val="single" w:sz="3" w:space="0" w:color="D9E0E7"/>
+              <w:bottom w:val="single" w:sz="3" w:space="0" w:color="D9E0E7"/>
+              <w:right w:val="single" w:sz="3" w:space="0" w:color="D9E0E7"/>
+            </w:tcBorders>
+            <w:shd w:fill="F5F7FA"/>
+          </w:tcPr>
+          <w:p>
+            <w:pPr>
+              <w:spacing w:after="20" w:line="259" w:lineRule="auto"/>
+              <w:jc w:val="right"/>
+            </w:pPr>
+            <w:r/>
+            <w:r>
+              <w:rPr>
+                <w:rFonts w:ascii="B Zar" w:hAnsi="B Zar"/>
+                <w:b w:val="0"/>
+                <w:color w:val="263238"/>
+                <w:sz w:val="16"/>
+              </w:rPr>
+              <w:t>بخش اصلی object record را مستقیم پوشش می‌دهد.</w:t>
+            </w:r>
+          </w:p>
+        </w:tc>
+      </w:tr>
+      <w:tr>
+        <w:tc>
+          <w:tcPr>
+            <w:tcW w:type="dxa" w:w="2381"/>
+            <w:tcBorders>
+              <w:top w:val="single" w:sz="3" w:space="0" w:color="D9E0E7"/>
+              <w:left w:val="single" w:sz="3" w:space="0" w:color="D9E0E7"/>
+              <w:bottom w:val="single" w:sz="3" w:space="0" w:color="D9E0E7"/>
+              <w:right w:val="single" w:sz="3" w:space="0" w:color="D9E0E7"/>
+            </w:tcBorders>
+            <w:shd w:fill="FFFFFF"/>
+          </w:tcPr>
+          <w:p>
+            <w:pPr>
+              <w:spacing w:after="20" w:line="259" w:lineRule="auto"/>
+              <w:jc w:val="right"/>
+            </w:pPr>
+            <w:r/>
+            <w:r>
+              <w:rPr>
+                <w:rFonts w:ascii="B Zar" w:hAnsi="B Zar"/>
+                <w:b w:val="0"/>
+                <w:color w:val="263238"/>
+                <w:sz w:val="16"/>
+              </w:rPr>
+              <w:t>CMSهای جهانی</w:t>
+            </w:r>
+          </w:p>
+        </w:tc>
+        <w:tc>
+          <w:tcPr>
+            <w:tcW w:type="dxa" w:w="4139"/>
+            <w:tcBorders>
+              <w:top w:val="single" w:sz="3" w:space="0" w:color="D9E0E7"/>
+              <w:left w:val="single" w:sz="3" w:space="0" w:color="D9E0E7"/>
+              <w:bottom w:val="single" w:sz="3" w:space="0" w:color="D9E0E7"/>
+              <w:right w:val="single" w:sz="3" w:space="0" w:color="D9E0E7"/>
+            </w:tcBorders>
+            <w:shd w:fill="FFFFFF"/>
+          </w:tcPr>
+          <w:p>
+            <w:pPr>
+              <w:spacing w:after="20" w:line="259" w:lineRule="auto"/>
+              <w:jc w:val="right"/>
+            </w:pPr>
+            <w:r/>
+            <w:r>
+              <w:rPr>
+                <w:rFonts w:ascii="B Zar" w:hAnsi="B Zar"/>
+                <w:b w:val="0"/>
+                <w:color w:val="263238"/>
+                <w:sz w:val="16"/>
+              </w:rPr>
+              <w:t>loan، condition، conservation و audit در suite بالغ.</w:t>
+            </w:r>
+          </w:p>
+        </w:tc>
+        <w:tc>
+          <w:tcPr>
+            <w:tcW w:type="dxa" w:w="3345"/>
+            <w:tcBorders>
+              <w:top w:val="single" w:sz="3" w:space="0" w:color="D9E0E7"/>
+              <w:left w:val="single" w:sz="3" w:space="0" w:color="D9E0E7"/>
+              <w:bottom w:val="single" w:sz="3" w:space="0" w:color="D9E0E7"/>
+              <w:right w:val="single" w:sz="3" w:space="0" w:color="D9E0E7"/>
+            </w:tcBorders>
+            <w:shd w:fill="FFFFFF"/>
+          </w:tcPr>
+          <w:p>
+            <w:pPr>
+              <w:spacing w:after="20" w:line="259" w:lineRule="auto"/>
+              <w:jc w:val="right"/>
+            </w:pPr>
+            <w:r/>
+            <w:r>
+              <w:rPr>
+                <w:rFonts w:ascii="B Zar" w:hAnsi="B Zar"/>
+                <w:b w:val="0"/>
+                <w:color w:val="263238"/>
+                <w:sz w:val="16"/>
+              </w:rPr>
+              <w:t>عمق category و procurement را بالا می‌برند.</w:t>
+            </w:r>
+          </w:p>
+        </w:tc>
+      </w:tr>
+      <w:tr>
+        <w:tc>
+          <w:tcPr>
+            <w:tcW w:type="dxa" w:w="2381"/>
+            <w:tcBorders>
+              <w:top w:val="single" w:sz="3" w:space="0" w:color="D9E0E7"/>
+              <w:left w:val="single" w:sz="3" w:space="0" w:color="D9E0E7"/>
+              <w:bottom w:val="single" w:sz="3" w:space="0" w:color="D9E0E7"/>
+              <w:right w:val="single" w:sz="3" w:space="0" w:color="D9E0E7"/>
+            </w:tcBorders>
+            <w:shd w:fill="F5F7FA"/>
+          </w:tcPr>
+          <w:p>
+            <w:pPr>
+              <w:spacing w:after="20" w:line="259" w:lineRule="auto"/>
+              <w:jc w:val="right"/>
+            </w:pPr>
+            <w:r/>
+            <w:r>
+              <w:rPr>
+                <w:rFonts w:ascii="B Zar" w:hAnsi="B Zar"/>
+                <w:b w:val="0"/>
+                <w:color w:val="263238"/>
+                <w:sz w:val="16"/>
+              </w:rPr>
+              <w:t>Excel/دفتر اموال/فرم عکس</w:t>
+            </w:r>
+          </w:p>
+        </w:tc>
+        <w:tc>
+          <w:tcPr>
+            <w:tcW w:type="dxa" w:w="4139"/>
+            <w:tcBorders>
+              <w:top w:val="single" w:sz="3" w:space="0" w:color="D9E0E7"/>
+              <w:left w:val="single" w:sz="3" w:space="0" w:color="D9E0E7"/>
+              <w:bottom w:val="single" w:sz="3" w:space="0" w:color="D9E0E7"/>
+              <w:right w:val="single" w:sz="3" w:space="0" w:color="D9E0E7"/>
+            </w:tcBorders>
+            <w:shd w:fill="F5F7FA"/>
+          </w:tcPr>
+          <w:p>
+            <w:pPr>
+              <w:spacing w:after="20" w:line="259" w:lineRule="auto"/>
+              <w:jc w:val="right"/>
+            </w:pPr>
+            <w:r/>
+            <w:r>
+              <w:rPr>
+                <w:rFonts w:ascii="B Zar" w:hAnsi="B Zar"/>
+                <w:b w:val="0"/>
+                <w:color w:val="263238"/>
+                <w:sz w:val="16"/>
+              </w:rPr>
+              <w:t>راه‌حل کم‌هزینه مجموعه کوچک.</w:t>
+            </w:r>
+          </w:p>
+        </w:tc>
+        <w:tc>
+          <w:tcPr>
+            <w:tcW w:type="dxa" w:w="3345"/>
+            <w:tcBorders>
+              <w:top w:val="single" w:sz="3" w:space="0" w:color="D9E0E7"/>
+              <w:left w:val="single" w:sz="3" w:space="0" w:color="D9E0E7"/>
+              <w:bottom w:val="single" w:sz="3" w:space="0" w:color="D9E0E7"/>
+              <w:right w:val="single" w:sz="3" w:space="0" w:color="D9E0E7"/>
+            </w:tcBorders>
+            <w:shd w:fill="F5F7FA"/>
+          </w:tcPr>
+          <w:p>
+            <w:pPr>
+              <w:spacing w:after="20" w:line="259" w:lineRule="auto"/>
+              <w:jc w:val="right"/>
+            </w:pPr>
+            <w:r/>
+            <w:r>
+              <w:rPr>
+                <w:rFonts w:ascii="B Zar" w:hAnsi="B Zar"/>
+                <w:b w:val="0"/>
+                <w:color w:val="263238"/>
+                <w:sz w:val="16"/>
+              </w:rPr>
+              <w:t>تا حجم/تکرار اثبات نشود، WTP برای محصول مستقل ضعیف است.</w:t>
+            </w:r>
+          </w:p>
+        </w:tc>
+      </w:tr>
+      <w:tr>
+        <w:tc>
+          <w:tcPr>
+            <w:tcW w:type="dxa" w:w="2381"/>
+            <w:tcBorders>
+              <w:top w:val="single" w:sz="3" w:space="0" w:color="D9E0E7"/>
+              <w:left w:val="single" w:sz="3" w:space="0" w:color="D9E0E7"/>
+              <w:bottom w:val="single" w:sz="3" w:space="0" w:color="D9E0E7"/>
+              <w:right w:val="single" w:sz="3" w:space="0" w:color="D9E0E7"/>
+            </w:tcBorders>
+            <w:shd w:fill="FFFFFF"/>
+          </w:tcPr>
+          <w:p>
+            <w:pPr>
+              <w:spacing w:after="20" w:line="259" w:lineRule="auto"/>
+              <w:jc w:val="right"/>
+            </w:pPr>
+            <w:r/>
+            <w:r>
+              <w:rPr>
+                <w:rFonts w:ascii="B Zar" w:hAnsi="B Zar"/>
+                <w:b w:val="0"/>
+                <w:color w:val="263238"/>
+                <w:sz w:val="16"/>
+              </w:rPr>
+              <w:t>F-02 Costume Continuity</w:t>
+            </w:r>
+          </w:p>
+        </w:tc>
+        <w:tc>
+          <w:tcPr>
+            <w:tcW w:type="dxa" w:w="4139"/>
+            <w:tcBorders>
+              <w:top w:val="single" w:sz="3" w:space="0" w:color="D9E0E7"/>
+              <w:left w:val="single" w:sz="3" w:space="0" w:color="D9E0E7"/>
+              <w:bottom w:val="single" w:sz="3" w:space="0" w:color="D9E0E7"/>
+              <w:right w:val="single" w:sz="3" w:space="0" w:color="D9E0E7"/>
+            </w:tcBorders>
+            <w:shd w:fill="FFFFFF"/>
+          </w:tcPr>
+          <w:p>
+            <w:pPr>
+              <w:spacing w:after="20" w:line="259" w:lineRule="auto"/>
+              <w:jc w:val="right"/>
+            </w:pPr>
+            <w:r/>
+            <w:r>
+              <w:rPr>
+                <w:rFonts w:ascii="B Zar" w:hAnsi="B Zar"/>
+                <w:b w:val="0"/>
+                <w:color w:val="263238"/>
+                <w:sz w:val="16"/>
+              </w:rPr>
+              <w:t>look/item، وضعیت، location، repair/laundry/return برای production.</w:t>
+            </w:r>
+          </w:p>
+        </w:tc>
+        <w:tc>
+          <w:tcPr>
+            <w:tcW w:type="dxa" w:w="3345"/>
+            <w:tcBorders>
+              <w:top w:val="single" w:sz="3" w:space="0" w:color="D9E0E7"/>
+              <w:left w:val="single" w:sz="3" w:space="0" w:color="D9E0E7"/>
+              <w:bottom w:val="single" w:sz="3" w:space="0" w:color="D9E0E7"/>
+              <w:right w:val="single" w:sz="3" w:space="0" w:color="D9E0E7"/>
+            </w:tcBorders>
+            <w:shd w:fill="FFFFFF"/>
+          </w:tcPr>
+          <w:p>
+            <w:pPr>
+              <w:spacing w:after="20" w:line="259" w:lineRule="auto"/>
+              <w:jc w:val="right"/>
+            </w:pPr>
+            <w:r/>
+            <w:r>
+              <w:rPr>
+                <w:rFonts w:ascii="B Zar" w:hAnsi="B Zar"/>
+                <w:b w:val="0"/>
+                <w:color w:val="263238"/>
+                <w:sz w:val="16"/>
+              </w:rPr>
+              <w:t>segment costume با F-02 overlap دارد.</w:t>
+            </w:r>
+          </w:p>
+        </w:tc>
+      </w:tr>
+    </w:tbl>
+    <w:p/>
+    <w:p>
+      <w:pPr>
+        <w:pStyle w:val="Heading2"/>
+        <w:spacing w:before="200" w:after="120"/>
+        <w:jc w:val="right"/>
+      </w:pPr>
+      <w:r>
+        <w:rPr>
+          <w:rFonts w:ascii="B Zar" w:hAnsi="B Zar"/>
+          <w:color w:val="1F7A70"/>
+          <w:sz w:val="26"/>
+        </w:rPr>
+        <w:t>۴. مشتری، بازار و مدل</w:t>
+      </w:r>
+    </w:p>
+    <w:p>
+      <w:pPr>
+        <w:spacing w:after="100" w:line="300" w:lineRule="auto"/>
+        <w:jc w:val="right"/>
+      </w:pPr>
+      <w:r>
+        <w:rPr>
+          <w:rFonts w:ascii="B Zar" w:hAnsi="B Zar"/>
+          <w:color w:val="263238"/>
+          <w:sz w:val="22"/>
+        </w:rPr>
+        <w:t>مشتری فرضی شامل موزه/نهاد دارای اموال ثبت‌شده، موزه خصوصی یا دانشگاهی، گالری/مجموعه‌دار با collection ثابت و archive لباس/costume است. B2C مناسب مشاهده نشد؛ catalog شخصی یا ابزار فردی است یا به marketplace/ارزیابی/فروش نزدیک می‌شود. عدد ۸۳۰ موزه، ownership، اندازه، budget، بلوغ دیجیتال یا امکان خرید را مشخص نمی‌کند و ۲۳۸ هزار شیء نیز addressable software spend نیست؛ بنابراین TAM/SAM/SOM و قیمت‌گذاری نوشته نمی‌شود.</w:t>
+      </w:r>
+    </w:p>
+    <w:p>
+      <w:pPr>
+        <w:spacing w:after="100" w:line="300" w:lineRule="auto"/>
+        <w:jc w:val="right"/>
+      </w:pPr>
+      <w:r>
+        <w:rPr>
+          <w:rFonts w:ascii="B Zar" w:hAnsi="B Zar"/>
+          <w:color w:val="263238"/>
+          <w:sz w:val="22"/>
+        </w:rPr>
+        <w:t>subscription نهادی بر اساس workspace/object tier، migration/onboarding و support قراردادی فقط در صورت بازگشایی قابل تصور است، اما اقتصاد آن با governance، migration، آموزش، قرارداد و گاه integration سامانه رسمی گره دارد؛ با SaaS باریک و کم‌عملیات portfolio سازگار نیست.</w:t>
+      </w:r>
+    </w:p>
+    <w:p>
+      <w:pPr>
+        <w:pStyle w:val="Heading2"/>
+        <w:spacing w:before="200" w:after="120"/>
+        <w:jc w:val="right"/>
+      </w:pPr>
+      <w:r>
+        <w:rPr>
+          <w:rFonts w:ascii="B Zar" w:hAnsi="B Zar"/>
+          <w:color w:val="1F7A70"/>
+          <w:sz w:val="26"/>
+        </w:rPr>
+        <w:t>۵. عملیات، ریسک و گیت‌های رد</w:t>
+      </w:r>
+    </w:p>
+    <w:tbl>
+      <w:tblPr>
+        <w:bidiVisual w:val="1"/>
+        <w:tblW w:type="auto" w:w="0"/>
+        <w:tblLayout w:type="autofit"/>
+        <w:tblLook w:firstColumn="1" w:firstRow="1" w:lastColumn="0" w:lastRow="0" w:noHBand="0" w:noVBand="1" w:val="04A0"/>
+      </w:tblPr>
+      <w:tblGrid>
+        <w:gridCol w:w="3213"/>
+        <w:gridCol w:w="3213"/>
+        <w:gridCol w:w="3213"/>
+      </w:tblGrid>
+      <w:tr>
+        <w:tc>
+          <w:tcPr>
+            <w:tcW w:type="dxa" w:w="2665"/>
+            <w:tcBorders>
+              <w:top w:val="single" w:sz="4" w:space="0" w:color="1F3A5F"/>
+              <w:left w:val="single" w:sz="4" w:space="0" w:color="1F3A5F"/>
+              <w:bottom w:val="single" w:sz="4" w:space="0" w:color="1F3A5F"/>
+              <w:right w:val="single" w:sz="4" w:space="0" w:color="1F3A5F"/>
+            </w:tcBorders>
+            <w:shd w:fill="1F3A5F"/>
+          </w:tcPr>
+          <w:p>
+            <w:pPr>
+              <w:spacing w:after="20" w:line="259" w:lineRule="auto"/>
+              <w:jc w:val="center"/>
+            </w:pPr>
+            <w:r/>
+            <w:r>
+              <w:rPr>
+                <w:rFonts w:ascii="B Zar" w:hAnsi="B Zar"/>
+                <w:b/>
+                <w:color w:val="FFFFFF"/>
+                <w:sz w:val="17"/>
+              </w:rPr>
+              <w:t>ریسک</w:t>
+            </w:r>
+          </w:p>
+        </w:tc>
+        <w:tc>
+          <w:tcPr>
+            <w:tcW w:type="dxa" w:w="3175"/>
+            <w:tcBorders>
+              <w:top w:val="single" w:sz="4" w:space="0" w:color="1F3A5F"/>
+              <w:left w:val="single" w:sz="4" w:space="0" w:color="1F3A5F"/>
+              <w:bottom w:val="single" w:sz="4" w:space="0" w:color="1F3A5F"/>
+              <w:right w:val="single" w:sz="4" w:space="0" w:color="1F3A5F"/>
+            </w:tcBorders>
+            <w:shd w:fill="1F3A5F"/>
+          </w:tcPr>
+          <w:p>
+            <w:pPr>
+              <w:spacing w:after="20" w:line="259" w:lineRule="auto"/>
+              <w:jc w:val="center"/>
+            </w:pPr>
+            <w:r/>
+            <w:r>
+              <w:rPr>
+                <w:rFonts w:ascii="B Zar" w:hAnsi="B Zar"/>
+                <w:b/>
+                <w:color w:val="FFFFFF"/>
+                <w:sz w:val="17"/>
+              </w:rPr>
+              <w:t>اثر</w:t>
+            </w:r>
+          </w:p>
+        </w:tc>
+        <w:tc>
+          <w:tcPr>
+            <w:tcW w:type="dxa" w:w="4025"/>
+            <w:tcBorders>
+              <w:top w:val="single" w:sz="4" w:space="0" w:color="1F3A5F"/>
+              <w:left w:val="single" w:sz="4" w:space="0" w:color="1F3A5F"/>
+              <w:bottom w:val="single" w:sz="4" w:space="0" w:color="1F3A5F"/>
+              <w:right w:val="single" w:sz="4" w:space="0" w:color="1F3A5F"/>
+            </w:tcBorders>
+            <w:shd w:fill="1F3A5F"/>
+          </w:tcPr>
+          <w:p>
+            <w:pPr>
+              <w:spacing w:after="20" w:line="259" w:lineRule="auto"/>
+              <w:jc w:val="center"/>
+            </w:pPr>
+            <w:r/>
+            <w:r>
+              <w:rPr>
+                <w:rFonts w:ascii="B Zar" w:hAnsi="B Zar"/>
+                <w:b/>
+                <w:color w:val="FFFFFF"/>
+                <w:sz w:val="17"/>
+              </w:rPr>
+              <w:t>گیت/کاهش</w:t>
+            </w:r>
+          </w:p>
+        </w:tc>
+      </w:tr>
+      <w:tr>
+        <w:tc>
+          <w:tcPr>
+            <w:tcW w:type="dxa" w:w="2665"/>
+            <w:tcBorders>
+              <w:top w:val="single" w:sz="3" w:space="0" w:color="D9E0E7"/>
+              <w:left w:val="single" w:sz="3" w:space="0" w:color="D9E0E7"/>
+              <w:bottom w:val="single" w:sz="3" w:space="0" w:color="D9E0E7"/>
+              <w:right w:val="single" w:sz="3" w:space="0" w:color="D9E0E7"/>
+            </w:tcBorders>
+            <w:shd w:fill="FFFFFF"/>
+          </w:tcPr>
+          <w:p>
+            <w:pPr>
+              <w:spacing w:after="20" w:line="259" w:lineRule="auto"/>
+              <w:jc w:val="right"/>
+            </w:pPr>
+            <w:r/>
+            <w:r>
+              <w:rPr>
+                <w:rFonts w:ascii="B Zar" w:hAnsi="B Zar"/>
+                <w:b w:val="0"/>
+                <w:color w:val="263238"/>
+                <w:sz w:val="16"/>
+              </w:rPr>
+              <w:t>overlap با F-02</w:t>
+            </w:r>
+          </w:p>
+        </w:tc>
+        <w:tc>
+          <w:tcPr>
+            <w:tcW w:type="dxa" w:w="3175"/>
+            <w:tcBorders>
+              <w:top w:val="single" w:sz="3" w:space="0" w:color="D9E0E7"/>
+              <w:left w:val="single" w:sz="3" w:space="0" w:color="D9E0E7"/>
+              <w:bottom w:val="single" w:sz="3" w:space="0" w:color="D9E0E7"/>
+              <w:right w:val="single" w:sz="3" w:space="0" w:color="D9E0E7"/>
+            </w:tcBorders>
+            <w:shd w:fill="FFFFFF"/>
+          </w:tcPr>
+          <w:p>
+            <w:pPr>
+              <w:spacing w:after="20" w:line="259" w:lineRule="auto"/>
+              <w:jc w:val="right"/>
+            </w:pPr>
+            <w:r/>
+            <w:r>
+              <w:rPr>
+                <w:rFonts w:ascii="B Zar" w:hAnsi="B Zar"/>
+                <w:b w:val="0"/>
+                <w:color w:val="263238"/>
+                <w:sz w:val="16"/>
+              </w:rPr>
+              <w:t>portfolio به محصولات مشابه تقسیم می‌شود.</w:t>
+            </w:r>
+          </w:p>
+        </w:tc>
+        <w:tc>
+          <w:tcPr>
+            <w:tcW w:type="dxa" w:w="4025"/>
+            <w:tcBorders>
+              <w:top w:val="single" w:sz="3" w:space="0" w:color="D9E0E7"/>
+              <w:left w:val="single" w:sz="3" w:space="0" w:color="D9E0E7"/>
+              <w:bottom w:val="single" w:sz="3" w:space="0" w:color="D9E0E7"/>
+              <w:right w:val="single" w:sz="3" w:space="0" w:color="D9E0E7"/>
+            </w:tcBorders>
+            <w:shd w:fill="FFFFFF"/>
+          </w:tcPr>
+          <w:p>
+            <w:pPr>
+              <w:spacing w:after="20" w:line="259" w:lineRule="auto"/>
+              <w:jc w:val="right"/>
+            </w:pPr>
+            <w:r/>
+            <w:r>
+              <w:rPr>
+                <w:rFonts w:ascii="B Zar" w:hAnsi="B Zar"/>
+                <w:b w:val="0"/>
+                <w:color w:val="263238"/>
+                <w:sz w:val="16"/>
+              </w:rPr>
+              <w:t>تمام use caseهای production/costume در F-02 بماند؛ F-06 فقط evidence موزه‌ای مستقل داشته باشد.</w:t>
+            </w:r>
+          </w:p>
+        </w:tc>
+      </w:tr>
+      <w:tr>
+        <w:tc>
+          <w:tcPr>
+            <w:tcW w:type="dxa" w:w="2665"/>
+            <w:tcBorders>
+              <w:top w:val="single" w:sz="3" w:space="0" w:color="D9E0E7"/>
+              <w:left w:val="single" w:sz="3" w:space="0" w:color="D9E0E7"/>
+              <w:bottom w:val="single" w:sz="3" w:space="0" w:color="D9E0E7"/>
+              <w:right w:val="single" w:sz="3" w:space="0" w:color="D9E0E7"/>
+            </w:tcBorders>
+            <w:shd w:fill="F5F7FA"/>
+          </w:tcPr>
+          <w:p>
+            <w:pPr>
+              <w:spacing w:after="20" w:line="259" w:lineRule="auto"/>
+              <w:jc w:val="right"/>
+            </w:pPr>
+            <w:r/>
+            <w:r>
+              <w:rPr>
+                <w:rFonts w:ascii="B Zar" w:hAnsi="B Zar"/>
+                <w:b w:val="0"/>
+                <w:color w:val="263238"/>
+                <w:sz w:val="16"/>
+              </w:rPr>
+              <w:t>CMS و سامانه موجود</w:t>
+            </w:r>
+          </w:p>
+        </w:tc>
+        <w:tc>
+          <w:tcPr>
+            <w:tcW w:type="dxa" w:w="3175"/>
+            <w:tcBorders>
+              <w:top w:val="single" w:sz="3" w:space="0" w:color="D9E0E7"/>
+              <w:left w:val="single" w:sz="3" w:space="0" w:color="D9E0E7"/>
+              <w:bottom w:val="single" w:sz="3" w:space="0" w:color="D9E0E7"/>
+              <w:right w:val="single" w:sz="3" w:space="0" w:color="D9E0E7"/>
+            </w:tcBorders>
+            <w:shd w:fill="F5F7FA"/>
+          </w:tcPr>
+          <w:p>
+            <w:pPr>
+              <w:spacing w:after="20" w:line="259" w:lineRule="auto"/>
+              <w:jc w:val="right"/>
+            </w:pPr>
+            <w:r/>
+            <w:r>
+              <w:rPr>
+                <w:rFonts w:ascii="B Zar" w:hAnsi="B Zar"/>
+                <w:b w:val="0"/>
+                <w:color w:val="263238"/>
+                <w:sz w:val="16"/>
+              </w:rPr>
+              <w:t>تمایز platform-level فرو می‌ریزد.</w:t>
+            </w:r>
+          </w:p>
+        </w:tc>
+        <w:tc>
+          <w:tcPr>
+            <w:tcW w:type="dxa" w:w="4025"/>
+            <w:tcBorders>
+              <w:top w:val="single" w:sz="3" w:space="0" w:color="D9E0E7"/>
+              <w:left w:val="single" w:sz="3" w:space="0" w:color="D9E0E7"/>
+              <w:bottom w:val="single" w:sz="3" w:space="0" w:color="D9E0E7"/>
+              <w:right w:val="single" w:sz="3" w:space="0" w:color="D9E0E7"/>
+            </w:tcBorders>
+            <w:shd w:fill="F5F7FA"/>
+          </w:tcPr>
+          <w:p>
+            <w:pPr>
+              <w:spacing w:after="20" w:line="259" w:lineRule="auto"/>
+              <w:jc w:val="right"/>
+            </w:pPr>
+            <w:r/>
+            <w:r>
+              <w:rPr>
+                <w:rFonts w:ascii="B Zar" w:hAnsi="B Zar"/>
+                <w:b w:val="0"/>
+                <w:color w:val="263238"/>
+                <w:sz w:val="16"/>
+              </w:rPr>
+              <w:t>failure mode مشخصی که جام/آثاره/Excel/CMS جهانی نمی‌پوشانند اثبات شود.</w:t>
+            </w:r>
+          </w:p>
+        </w:tc>
+      </w:tr>
+      <w:tr>
+        <w:tc>
+          <w:tcPr>
+            <w:tcW w:type="dxa" w:w="2665"/>
+            <w:tcBorders>
+              <w:top w:val="single" w:sz="3" w:space="0" w:color="D9E0E7"/>
+              <w:left w:val="single" w:sz="3" w:space="0" w:color="D9E0E7"/>
+              <w:bottom w:val="single" w:sz="3" w:space="0" w:color="D9E0E7"/>
+              <w:right w:val="single" w:sz="3" w:space="0" w:color="D9E0E7"/>
+            </w:tcBorders>
+            <w:shd w:fill="FFFFFF"/>
+          </w:tcPr>
+          <w:p>
+            <w:pPr>
+              <w:spacing w:after="20" w:line="259" w:lineRule="auto"/>
+              <w:jc w:val="right"/>
+            </w:pPr>
+            <w:r/>
+            <w:r>
+              <w:rPr>
+                <w:rFonts w:ascii="B Zar" w:hAnsi="B Zar"/>
+                <w:b w:val="0"/>
+                <w:color w:val="263238"/>
+                <w:sz w:val="16"/>
+              </w:rPr>
+              <w:t>custody/condition فیزیکی</w:t>
+            </w:r>
+          </w:p>
+        </w:tc>
+        <w:tc>
+          <w:tcPr>
+            <w:tcW w:type="dxa" w:w="3175"/>
+            <w:tcBorders>
+              <w:top w:val="single" w:sz="3" w:space="0" w:color="D9E0E7"/>
+              <w:left w:val="single" w:sz="3" w:space="0" w:color="D9E0E7"/>
+              <w:bottom w:val="single" w:sz="3" w:space="0" w:color="D9E0E7"/>
+              <w:right w:val="single" w:sz="3" w:space="0" w:color="D9E0E7"/>
+            </w:tcBorders>
+            <w:shd w:fill="FFFFFF"/>
+          </w:tcPr>
+          <w:p>
+            <w:pPr>
+              <w:spacing w:after="20" w:line="259" w:lineRule="auto"/>
+              <w:jc w:val="right"/>
+            </w:pPr>
+            <w:r/>
+            <w:r>
+              <w:rPr>
+                <w:rFonts w:ascii="B Zar" w:hAnsi="B Zar"/>
+                <w:b w:val="0"/>
+                <w:color w:val="263238"/>
+                <w:sz w:val="16"/>
+              </w:rPr>
+              <w:t>liability و عملیات میدانی وارد مدل می‌شود.</w:t>
+            </w:r>
+          </w:p>
+        </w:tc>
+        <w:tc>
+          <w:tcPr>
+            <w:tcW w:type="dxa" w:w="4025"/>
+            <w:tcBorders>
+              <w:top w:val="single" w:sz="3" w:space="0" w:color="D9E0E7"/>
+              <w:left w:val="single" w:sz="3" w:space="0" w:color="D9E0E7"/>
+              <w:bottom w:val="single" w:sz="3" w:space="0" w:color="D9E0E7"/>
+              <w:right w:val="single" w:sz="3" w:space="0" w:color="D9E0E7"/>
+            </w:tcBorders>
+            <w:shd w:fill="FFFFFF"/>
+          </w:tcPr>
+          <w:p>
+            <w:pPr>
+              <w:spacing w:after="20" w:line="259" w:lineRule="auto"/>
+              <w:jc w:val="right"/>
+            </w:pPr>
+            <w:r/>
+            <w:r>
+              <w:rPr>
+                <w:rFonts w:ascii="B Zar" w:hAnsi="B Zar"/>
+                <w:b w:val="0"/>
+                <w:color w:val="263238"/>
+                <w:sz w:val="16"/>
+              </w:rPr>
+              <w:t>software record-only؛ تشخیص، packing، transport و بیمه با نهاد/کارشناس بماند.</w:t>
+            </w:r>
+          </w:p>
+        </w:tc>
+      </w:tr>
+      <w:tr>
+        <w:tc>
+          <w:tcPr>
+            <w:tcW w:type="dxa" w:w="2665"/>
+            <w:tcBorders>
+              <w:top w:val="single" w:sz="3" w:space="0" w:color="D9E0E7"/>
+              <w:left w:val="single" w:sz="3" w:space="0" w:color="D9E0E7"/>
+              <w:bottom w:val="single" w:sz="3" w:space="0" w:color="D9E0E7"/>
+              <w:right w:val="single" w:sz="3" w:space="0" w:color="D9E0E7"/>
+            </w:tcBorders>
+            <w:shd w:fill="F5F7FA"/>
+          </w:tcPr>
+          <w:p>
+            <w:pPr>
+              <w:spacing w:after="20" w:line="259" w:lineRule="auto"/>
+              <w:jc w:val="right"/>
+            </w:pPr>
+            <w:r/>
+            <w:r>
+              <w:rPr>
+                <w:rFonts w:ascii="B Zar" w:hAnsi="B Zar"/>
+                <w:b w:val="0"/>
+                <w:color w:val="263238"/>
+                <w:sz w:val="16"/>
+              </w:rPr>
+              <w:t>procurement/مالکیت داده</w:t>
+            </w:r>
+          </w:p>
+        </w:tc>
+        <w:tc>
+          <w:tcPr>
+            <w:tcW w:type="dxa" w:w="3175"/>
+            <w:tcBorders>
+              <w:top w:val="single" w:sz="3" w:space="0" w:color="D9E0E7"/>
+              <w:left w:val="single" w:sz="3" w:space="0" w:color="D9E0E7"/>
+              <w:bottom w:val="single" w:sz="3" w:space="0" w:color="D9E0E7"/>
+              <w:right w:val="single" w:sz="3" w:space="0" w:color="D9E0E7"/>
+            </w:tcBorders>
+            <w:shd w:fill="F5F7FA"/>
+          </w:tcPr>
+          <w:p>
+            <w:pPr>
+              <w:spacing w:after="20" w:line="259" w:lineRule="auto"/>
+              <w:jc w:val="right"/>
+            </w:pPr>
+            <w:r/>
+            <w:r>
+              <w:rPr>
+                <w:rFonts w:ascii="B Zar" w:hAnsi="B Zar"/>
+                <w:b w:val="0"/>
+                <w:color w:val="263238"/>
+                <w:sz w:val="16"/>
+              </w:rPr>
+              <w:t>فروش طولانی و migration/integration حساس است.</w:t>
+            </w:r>
+          </w:p>
+        </w:tc>
+        <w:tc>
+          <w:tcPr>
+            <w:tcW w:type="dxa" w:w="4025"/>
+            <w:tcBorders>
+              <w:top w:val="single" w:sz="3" w:space="0" w:color="D9E0E7"/>
+              <w:left w:val="single" w:sz="3" w:space="0" w:color="D9E0E7"/>
+              <w:bottom w:val="single" w:sz="3" w:space="0" w:color="D9E0E7"/>
+              <w:right w:val="single" w:sz="3" w:space="0" w:color="D9E0E7"/>
+            </w:tcBorders>
+            <w:shd w:fill="F5F7FA"/>
+          </w:tcPr>
+          <w:p>
+            <w:pPr>
+              <w:spacing w:after="20" w:line="259" w:lineRule="auto"/>
+              <w:jc w:val="right"/>
+            </w:pPr>
+            <w:r/>
+            <w:r>
+              <w:rPr>
+                <w:rFonts w:ascii="B Zar" w:hAnsi="B Zar"/>
+                <w:b w:val="0"/>
+                <w:color w:val="263238"/>
+                <w:sz w:val="16"/>
+              </w:rPr>
+              <w:t>budget owner، permission و hosting پیش از build روشن شود.</w:t>
+            </w:r>
+          </w:p>
+        </w:tc>
+      </w:tr>
+      <w:tr>
+        <w:tc>
+          <w:tcPr>
+            <w:tcW w:type="dxa" w:w="2665"/>
+            <w:tcBorders>
+              <w:top w:val="single" w:sz="3" w:space="0" w:color="D9E0E7"/>
+              <w:left w:val="single" w:sz="3" w:space="0" w:color="D9E0E7"/>
+              <w:bottom w:val="single" w:sz="3" w:space="0" w:color="D9E0E7"/>
+              <w:right w:val="single" w:sz="3" w:space="0" w:color="D9E0E7"/>
+            </w:tcBorders>
+            <w:shd w:fill="FFFFFF"/>
+          </w:tcPr>
+          <w:p>
+            <w:pPr>
+              <w:spacing w:after="20" w:line="259" w:lineRule="auto"/>
+              <w:jc w:val="right"/>
+            </w:pPr>
+            <w:r/>
+            <w:r>
+              <w:rPr>
+                <w:rFonts w:ascii="B Zar" w:hAnsi="B Zar"/>
+                <w:b w:val="0"/>
+                <w:color w:val="263238"/>
+                <w:sz w:val="16"/>
+              </w:rPr>
+              <w:t>market کوچک/enterprise-heavy</w:t>
+            </w:r>
+          </w:p>
+        </w:tc>
+        <w:tc>
+          <w:tcPr>
+            <w:tcW w:type="dxa" w:w="3175"/>
+            <w:tcBorders>
+              <w:top w:val="single" w:sz="3" w:space="0" w:color="D9E0E7"/>
+              <w:left w:val="single" w:sz="3" w:space="0" w:color="D9E0E7"/>
+              <w:bottom w:val="single" w:sz="3" w:space="0" w:color="D9E0E7"/>
+              <w:right w:val="single" w:sz="3" w:space="0" w:color="D9E0E7"/>
+            </w:tcBorders>
+            <w:shd w:fill="FFFFFF"/>
+          </w:tcPr>
+          <w:p>
+            <w:pPr>
+              <w:spacing w:after="20" w:line="259" w:lineRule="auto"/>
+              <w:jc w:val="right"/>
+            </w:pPr>
+            <w:r/>
+            <w:r>
+              <w:rPr>
+                <w:rFonts w:ascii="B Zar" w:hAnsi="B Zar"/>
+                <w:b w:val="0"/>
+                <w:color w:val="263238"/>
+                <w:sz w:val="16"/>
+              </w:rPr>
+              <w:t>CAC و onboarding با ACV متناسب نیست.</w:t>
+            </w:r>
+          </w:p>
+        </w:tc>
+        <w:tc>
+          <w:tcPr>
+            <w:tcW w:type="dxa" w:w="4025"/>
+            <w:tcBorders>
+              <w:top w:val="single" w:sz="3" w:space="0" w:color="D9E0E7"/>
+              <w:left w:val="single" w:sz="3" w:space="0" w:color="D9E0E7"/>
+              <w:bottom w:val="single" w:sz="3" w:space="0" w:color="D9E0E7"/>
+              <w:right w:val="single" w:sz="3" w:space="0" w:color="D9E0E7"/>
+            </w:tcBorders>
+            <w:shd w:fill="FFFFFF"/>
+          </w:tcPr>
+          <w:p>
+            <w:pPr>
+              <w:spacing w:after="20" w:line="259" w:lineRule="auto"/>
+              <w:jc w:val="right"/>
+            </w:pPr>
+            <w:r/>
+            <w:r>
+              <w:rPr>
+                <w:rFonts w:ascii="B Zar" w:hAnsi="B Zar"/>
+                <w:b w:val="0"/>
+                <w:color w:val="263238"/>
+                <w:sz w:val="16"/>
+              </w:rPr>
+              <w:t>account map و LOI/paid discovery قبل از توسعه.</w:t>
+            </w:r>
+          </w:p>
+        </w:tc>
+      </w:tr>
+    </w:tbl>
+    <w:p/>
+    <w:p>
+      <w:pPr>
+        <w:pStyle w:val="Heading2"/>
+        <w:spacing w:before="200" w:after="120"/>
+        <w:jc w:val="right"/>
+      </w:pPr>
+      <w:r>
+        <w:rPr>
+          <w:rFonts w:ascii="B Zar" w:hAnsi="B Zar"/>
+          <w:color w:val="1F7A70"/>
+          <w:sz w:val="26"/>
+        </w:rPr>
+        <w:t>۶. validation فقط برای trigger بازگشایی</w:t>
+      </w:r>
+    </w:p>
+    <w:p>
+      <w:pPr>
+        <w:spacing w:after="100" w:line="300" w:lineRule="auto"/>
+        <w:jc w:val="right"/>
+      </w:pPr>
+      <w:r>
+        <w:rPr>
+          <w:rFonts w:ascii="B Zar" w:hAnsi="B Zar"/>
+          <w:color w:val="263238"/>
+          <w:sz w:val="22"/>
+        </w:rPr>
+        <w:t>هیچ pilot ساخت محصول توصیه نمی‌شود. تنها در صورت یافتن cohort مستقلِ حداقل ۶ مجموعه با ۵۰۰+ قطعه، loan/condition تکرارشونده و budget owner قابل دسترس، discovery artifact-based مجاز است: یک پرونده accession/loan و condition pre/post، ابزار فعلی، data migration، approval، هزینه/frequency failure و willingness-to-pay software record-only بررسی شود.</w:t>
+      </w:r>
+    </w:p>
+    <w:tbl>
+      <w:tblPr>
+        <w:bidiVisual w:val="1"/>
+        <w:tblW w:type="auto" w:w="0"/>
+        <w:tblLook w:firstColumn="1" w:firstRow="1" w:lastColumn="0" w:lastRow="0" w:noHBand="0" w:noVBand="1" w:val="04A0"/>
+      </w:tblPr>
+      <w:tblGrid>
+        <w:gridCol w:w="9638"/>
+      </w:tblGrid>
+      <w:tr>
+        <w:tc>
+          <w:tcPr>
+            <w:tcW w:type="dxa" w:w="9638"/>
+            <w:tcBorders>
+              <w:top w:val="single" w:sz="6" w:space="0" w:color="A23B22"/>
+              <w:left w:val="single" w:sz="6" w:space="0" w:color="A23B22"/>
+              <w:bottom w:val="single" w:sz="6" w:space="0" w:color="A23B22"/>
+              <w:right w:val="single" w:sz="6" w:space="0" w:color="A23B22"/>
+            </w:tcBorders>
+            <w:shd w:fill="FDE7E2"/>
+          </w:tcPr>
+          <w:p>
+            <w:pPr>
+              <w:spacing w:after="40"/>
+              <w:jc w:val="right"/>
+            </w:pPr>
+            <w:r/>
+            <w:r>
+              <w:rPr>
+                <w:rFonts w:ascii="B Zar" w:hAnsi="B Zar"/>
+                <w:b/>
+                <w:color w:val="A23B22"/>
+                <w:sz w:val="21"/>
+              </w:rPr>
+              <w:t>نتیجه</w:t>
+            </w:r>
+          </w:p>
+          <w:p>
+            <w:pPr>
+              <w:spacing w:after="40" w:line="288" w:lineRule="auto"/>
+              <w:jc w:val="right"/>
+            </w:pPr>
+            <w:r>
+              <w:rPr>
+                <w:rFonts w:ascii="B Zar" w:hAnsi="B Zar"/>
+                <w:b w:val="0"/>
+                <w:color w:val="263238"/>
+                <w:sz w:val="19"/>
+              </w:rPr>
+              <w:t>F-06 رد / آرشیوی است و opportunity مستقل ادامه نمی‌یابد. category جهانی بالغ است؛ در ایران infrastructure ثبت دولتی و CMS محلی نزدیک وجود دارد و segment costume با F-02 overlap دارد. hard kill اگر درد با جام/آثاره/Excel/F-02 حل شود، payment به managed service/integration دولتی نیاز داشته باشد یا عملیات فیزیکی/بیمه‌ای وارد مدل شود. بازگشایی فقط با triggerهای مستند بالا ممکن است.</w:t>
+            </w:r>
+          </w:p>
+        </w:tc>
+      </w:tr>
+    </w:tbl>
+    <w:p/>
+    <w:p>
+      <w:pPr>
+        <w:pStyle w:val="Heading2"/>
+        <w:spacing w:before="200" w:after="120"/>
+        <w:jc w:val="right"/>
+      </w:pPr>
+      <w:r>
+        <w:rPr>
+          <w:rFonts w:ascii="B Zar" w:hAnsi="B Zar"/>
+          <w:color w:val="1F7A70"/>
+          <w:sz w:val="26"/>
+        </w:rPr>
+        <w:t>منابع پرونده F-06</w:t>
+      </w:r>
+    </w:p>
+    <w:tbl>
+      <w:tblPr>
+        <w:bidiVisual w:val="1"/>
+        <w:tblW w:type="auto" w:w="0"/>
+        <w:tblLayout w:type="autofit"/>
+        <w:tblLook w:firstColumn="1" w:firstRow="1" w:lastColumn="0" w:lastRow="0" w:noHBand="0" w:noVBand="1" w:val="04A0"/>
+      </w:tblPr>
+      <w:tblGrid>
+        <w:gridCol w:w="3213"/>
+        <w:gridCol w:w="3213"/>
+        <w:gridCol w:w="3213"/>
+      </w:tblGrid>
+      <w:tr>
+        <w:tc>
+          <w:tcPr>
+            <w:tcW w:type="dxa" w:w="1191"/>
+            <w:tcBorders>
+              <w:top w:val="single" w:sz="4" w:space="0" w:color="1F3A5F"/>
+              <w:left w:val="single" w:sz="4" w:space="0" w:color="1F3A5F"/>
+              <w:bottom w:val="single" w:sz="4" w:space="0" w:color="1F3A5F"/>
+              <w:right w:val="single" w:sz="4" w:space="0" w:color="1F3A5F"/>
+            </w:tcBorders>
+            <w:shd w:fill="1F3A5F"/>
+          </w:tcPr>
+          <w:p>
+            <w:pPr>
+              <w:spacing w:after="20" w:line="259" w:lineRule="auto"/>
+              <w:jc w:val="center"/>
+            </w:pPr>
+            <w:r/>
+            <w:r>
+              <w:rPr>
+                <w:rFonts w:ascii="B Zar" w:hAnsi="B Zar"/>
+                <w:b/>
+                <w:color w:val="FFFFFF"/>
+                <w:sz w:val="17"/>
+              </w:rPr>
+              <w:t>کد</w:t>
+            </w:r>
+          </w:p>
+        </w:tc>
+        <w:tc>
+          <w:tcPr>
+            <w:tcW w:type="dxa" w:w="1531"/>
+            <w:tcBorders>
+              <w:top w:val="single" w:sz="4" w:space="0" w:color="1F3A5F"/>
+              <w:left w:val="single" w:sz="4" w:space="0" w:color="1F3A5F"/>
+              <w:bottom w:val="single" w:sz="4" w:space="0" w:color="1F3A5F"/>
+              <w:right w:val="single" w:sz="4" w:space="0" w:color="1F3A5F"/>
+            </w:tcBorders>
+            <w:shd w:fill="1F3A5F"/>
+          </w:tcPr>
+          <w:p>
+            <w:pPr>
+              <w:spacing w:after="20" w:line="259" w:lineRule="auto"/>
+              <w:jc w:val="center"/>
+            </w:pPr>
+            <w:r/>
+            <w:r>
+              <w:rPr>
+                <w:rFonts w:ascii="B Zar" w:hAnsi="B Zar"/>
+                <w:b/>
+                <w:color w:val="FFFFFF"/>
+                <w:sz w:val="17"/>
+              </w:rPr>
+              <w:t>رتبه</w:t>
+            </w:r>
+          </w:p>
+        </w:tc>
+        <w:tc>
+          <w:tcPr>
+            <w:tcW w:type="dxa" w:w="7143"/>
+            <w:tcBorders>
+              <w:top w:val="single" w:sz="4" w:space="0" w:color="1F3A5F"/>
+              <w:left w:val="single" w:sz="4" w:space="0" w:color="1F3A5F"/>
+              <w:bottom w:val="single" w:sz="4" w:space="0" w:color="1F3A5F"/>
+              <w:right w:val="single" w:sz="4" w:space="0" w:color="1F3A5F"/>
+            </w:tcBorders>
+            <w:shd w:fill="1F3A5F"/>
+          </w:tcPr>
+          <w:p>
+            <w:pPr>
+              <w:spacing w:after="20" w:line="259" w:lineRule="auto"/>
+              <w:jc w:val="center"/>
+            </w:pPr>
+            <w:r/>
+            <w:r>
+              <w:rPr>
+                <w:rFonts w:ascii="B Zar" w:hAnsi="B Zar"/>
+                <w:b/>
+                <w:color w:val="FFFFFF"/>
+                <w:sz w:val="17"/>
+              </w:rPr>
+              <w:t>منبع و پیوند</w:t>
+            </w:r>
+          </w:p>
+        </w:tc>
+      </w:tr>
+      <w:tr>
+        <w:tc>
+          <w:tcPr>
+            <w:tcW w:type="dxa" w:w="1191"/>
+            <w:tcBorders>
+              <w:top w:val="single" w:sz="3" w:space="0" w:color="D9E0E7"/>
+              <w:left w:val="single" w:sz="3" w:space="0" w:color="D9E0E7"/>
+              <w:bottom w:val="single" w:sz="3" w:space="0" w:color="D9E0E7"/>
+              <w:right w:val="single" w:sz="3" w:space="0" w:color="D9E0E7"/>
+            </w:tcBorders>
+            <w:shd w:fill="FFFFFF"/>
+          </w:tcPr>
+          <w:p>
+            <w:pPr>
+              <w:spacing w:after="20" w:line="259" w:lineRule="auto"/>
+              <w:jc w:val="right"/>
+            </w:pPr>
+            <w:r/>
+            <w:r>
+              <w:rPr>
+                <w:rFonts w:ascii="B Zar" w:hAnsi="B Zar"/>
+                <w:b w:val="0"/>
+                <w:color w:val="263238"/>
+                <w:sz w:val="16"/>
+              </w:rPr>
+              <w:t>F06-S01</w:t>
+            </w:r>
+          </w:p>
+        </w:tc>
+        <w:tc>
+          <w:tcPr>
+            <w:tcW w:type="dxa" w:w="1531"/>
+            <w:tcBorders>
+              <w:top w:val="single" w:sz="3" w:space="0" w:color="D9E0E7"/>
+              <w:left w:val="single" w:sz="3" w:space="0" w:color="D9E0E7"/>
+              <w:bottom w:val="single" w:sz="3" w:space="0" w:color="D9E0E7"/>
+              <w:right w:val="single" w:sz="3" w:space="0" w:color="D9E0E7"/>
+            </w:tcBorders>
+            <w:shd w:fill="FFFFFF"/>
+          </w:tcPr>
+          <w:p>
+            <w:pPr>
+              <w:spacing w:after="20" w:line="259" w:lineRule="auto"/>
+              <w:jc w:val="right"/>
+            </w:pPr>
+            <w:r/>
+            <w:r>
+              <w:rPr>
+                <w:rFonts w:ascii="B Zar" w:hAnsi="B Zar"/>
+                <w:b w:val="0"/>
+                <w:color w:val="263238"/>
+                <w:sz w:val="16"/>
+              </w:rPr>
+              <w:t>B / sector directory + vendor</w:t>
+            </w:r>
+          </w:p>
+        </w:tc>
+        <w:tc>
+          <w:tcPr>
+            <w:tcW w:type="dxa" w:w="7143"/>
+            <w:tcBorders>
+              <w:top w:val="single" w:sz="3" w:space="0" w:color="D9E0E7"/>
+              <w:left w:val="single" w:sz="3" w:space="0" w:color="D9E0E7"/>
+              <w:bottom w:val="single" w:sz="3" w:space="0" w:color="D9E0E7"/>
+              <w:right w:val="single" w:sz="3" w:space="0" w:color="D9E0E7"/>
+            </w:tcBorders>
+            <w:shd w:fill="FFFFFF"/>
+          </w:tcPr>
+          <w:p>
+            <w:pPr>
+              <w:spacing w:after="20" w:line="259" w:lineRule="auto"/>
+              <w:jc w:val="right"/>
+            </w:pPr>
+            <w:r/>
+            <w:r>
+              <w:rPr>
+                <w:rFonts w:ascii="B Zar" w:hAnsi="B Zar"/>
+                <w:b w:val="0"/>
+                <w:color w:val="263238"/>
+                <w:sz w:val="16"/>
+              </w:rPr>
+              <w:t>Collections Trust — Axiell Collections: audit/workflow/Move/media — https://collectionstrust.org.uk/software/axiell-collections/</w:t>
+            </w:r>
+          </w:p>
+        </w:tc>
+      </w:tr>
+      <w:tr>
+        <w:tc>
+          <w:tcPr>
+            <w:tcW w:type="dxa" w:w="1191"/>
+            <w:tcBorders>
+              <w:top w:val="single" w:sz="3" w:space="0" w:color="D9E0E7"/>
+              <w:left w:val="single" w:sz="3" w:space="0" w:color="D9E0E7"/>
+              <w:bottom w:val="single" w:sz="3" w:space="0" w:color="D9E0E7"/>
+              <w:right w:val="single" w:sz="3" w:space="0" w:color="D9E0E7"/>
+            </w:tcBorders>
+            <w:shd w:fill="F5F7FA"/>
+          </w:tcPr>
+          <w:p>
+            <w:pPr>
+              <w:spacing w:after="20" w:line="259" w:lineRule="auto"/>
+              <w:jc w:val="right"/>
+            </w:pPr>
+            <w:r/>
+            <w:r>
+              <w:rPr>
+                <w:rFonts w:ascii="B Zar" w:hAnsi="B Zar"/>
+                <w:b w:val="0"/>
+                <w:color w:val="263238"/>
+                <w:sz w:val="16"/>
+              </w:rPr>
+              <w:t>F06-S02</w:t>
+            </w:r>
+          </w:p>
+        </w:tc>
+        <w:tc>
+          <w:tcPr>
+            <w:tcW w:type="dxa" w:w="1531"/>
+            <w:tcBorders>
+              <w:top w:val="single" w:sz="3" w:space="0" w:color="D9E0E7"/>
+              <w:left w:val="single" w:sz="3" w:space="0" w:color="D9E0E7"/>
+              <w:bottom w:val="single" w:sz="3" w:space="0" w:color="D9E0E7"/>
+              <w:right w:val="single" w:sz="3" w:space="0" w:color="D9E0E7"/>
+            </w:tcBorders>
+            <w:shd w:fill="F5F7FA"/>
+          </w:tcPr>
+          <w:p>
+            <w:pPr>
+              <w:spacing w:after="20" w:line="259" w:lineRule="auto"/>
+              <w:jc w:val="right"/>
+            </w:pPr>
+            <w:r/>
+            <w:r>
+              <w:rPr>
+                <w:rFonts w:ascii="B Zar" w:hAnsi="B Zar"/>
+                <w:b w:val="0"/>
+                <w:color w:val="263238"/>
+                <w:sz w:val="16"/>
+              </w:rPr>
+              <w:t>B / sector directory</w:t>
+            </w:r>
+          </w:p>
+        </w:tc>
+        <w:tc>
+          <w:tcPr>
+            <w:tcW w:type="dxa" w:w="7143"/>
+            <w:tcBorders>
+              <w:top w:val="single" w:sz="3" w:space="0" w:color="D9E0E7"/>
+              <w:left w:val="single" w:sz="3" w:space="0" w:color="D9E0E7"/>
+              <w:bottom w:val="single" w:sz="3" w:space="0" w:color="D9E0E7"/>
+              <w:right w:val="single" w:sz="3" w:space="0" w:color="D9E0E7"/>
+            </w:tcBorders>
+            <w:shd w:fill="F5F7FA"/>
+          </w:tcPr>
+          <w:p>
+            <w:pPr>
+              <w:spacing w:after="20" w:line="259" w:lineRule="auto"/>
+              <w:jc w:val="right"/>
+            </w:pPr>
+            <w:r/>
+            <w:r>
+              <w:rPr>
+                <w:rFonts w:ascii="B Zar" w:hAnsi="B Zar"/>
+                <w:b w:val="0"/>
+                <w:color w:val="263238"/>
+                <w:sz w:val="16"/>
+              </w:rPr>
+              <w:t>Collections Trust — Spectrum procedures: entry/exit, loans, movement, condition/conservation — https://collectionstrust.org.uk/software/axiell-collections/</w:t>
+            </w:r>
+          </w:p>
+        </w:tc>
+      </w:tr>
+      <w:tr>
+        <w:tc>
+          <w:tcPr>
+            <w:tcW w:type="dxa" w:w="1191"/>
+            <w:tcBorders>
+              <w:top w:val="single" w:sz="3" w:space="0" w:color="D9E0E7"/>
+              <w:left w:val="single" w:sz="3" w:space="0" w:color="D9E0E7"/>
+              <w:bottom w:val="single" w:sz="3" w:space="0" w:color="D9E0E7"/>
+              <w:right w:val="single" w:sz="3" w:space="0" w:color="D9E0E7"/>
+            </w:tcBorders>
+            <w:shd w:fill="FFFFFF"/>
+          </w:tcPr>
+          <w:p>
+            <w:pPr>
+              <w:spacing w:after="20" w:line="259" w:lineRule="auto"/>
+              <w:jc w:val="right"/>
+            </w:pPr>
+            <w:r/>
+            <w:r>
+              <w:rPr>
+                <w:rFonts w:ascii="B Zar" w:hAnsi="B Zar"/>
+                <w:b w:val="0"/>
+                <w:color w:val="263238"/>
+                <w:sz w:val="16"/>
+              </w:rPr>
+              <w:t>F06-S03</w:t>
+            </w:r>
+          </w:p>
+        </w:tc>
+        <w:tc>
+          <w:tcPr>
+            <w:tcW w:type="dxa" w:w="1531"/>
+            <w:tcBorders>
+              <w:top w:val="single" w:sz="3" w:space="0" w:color="D9E0E7"/>
+              <w:left w:val="single" w:sz="3" w:space="0" w:color="D9E0E7"/>
+              <w:bottom w:val="single" w:sz="3" w:space="0" w:color="D9E0E7"/>
+              <w:right w:val="single" w:sz="3" w:space="0" w:color="D9E0E7"/>
+            </w:tcBorders>
+            <w:shd w:fill="FFFFFF"/>
+          </w:tcPr>
+          <w:p>
+            <w:pPr>
+              <w:spacing w:after="20" w:line="259" w:lineRule="auto"/>
+              <w:jc w:val="right"/>
+            </w:pPr>
+            <w:r/>
+            <w:r>
+              <w:rPr>
+                <w:rFonts w:ascii="B Zar" w:hAnsi="B Zar"/>
+                <w:b w:val="0"/>
+                <w:color w:val="263238"/>
+                <w:sz w:val="16"/>
+              </w:rPr>
+              <w:t>C / ecosystem comparison</w:t>
+            </w:r>
+          </w:p>
+        </w:tc>
+        <w:tc>
+          <w:tcPr>
+            <w:tcW w:type="dxa" w:w="7143"/>
+            <w:tcBorders>
+              <w:top w:val="single" w:sz="3" w:space="0" w:color="D9E0E7"/>
+              <w:left w:val="single" w:sz="3" w:space="0" w:color="D9E0E7"/>
+              <w:bottom w:val="single" w:sz="3" w:space="0" w:color="D9E0E7"/>
+              <w:right w:val="single" w:sz="3" w:space="0" w:color="D9E0E7"/>
+            </w:tcBorders>
+            <w:shd w:fill="FFFFFF"/>
+          </w:tcPr>
+          <w:p>
+            <w:pPr>
+              <w:spacing w:after="20" w:line="259" w:lineRule="auto"/>
+              <w:jc w:val="right"/>
+            </w:pPr>
+            <w:r/>
+            <w:r>
+              <w:rPr>
+                <w:rFonts w:ascii="B Zar" w:hAnsi="B Zar"/>
+                <w:b w:val="0"/>
+                <w:color w:val="263238"/>
+                <w:sz w:val="16"/>
+              </w:rPr>
+              <w:t>SoftwareAdvice Museum Software / eHive feature listing — https://www.softwareadvice.com/museum/</w:t>
+            </w:r>
+          </w:p>
+        </w:tc>
+      </w:tr>
+      <w:tr>
+        <w:tc>
+          <w:tcPr>
+            <w:tcW w:type="dxa" w:w="1191"/>
+            <w:tcBorders>
+              <w:top w:val="single" w:sz="3" w:space="0" w:color="D9E0E7"/>
+              <w:left w:val="single" w:sz="3" w:space="0" w:color="D9E0E7"/>
+              <w:bottom w:val="single" w:sz="3" w:space="0" w:color="D9E0E7"/>
+              <w:right w:val="single" w:sz="3" w:space="0" w:color="D9E0E7"/>
+            </w:tcBorders>
+            <w:shd w:fill="F5F7FA"/>
+          </w:tcPr>
+          <w:p>
+            <w:pPr>
+              <w:spacing w:after="20" w:line="259" w:lineRule="auto"/>
+              <w:jc w:val="right"/>
+            </w:pPr>
+            <w:r/>
+            <w:r>
+              <w:rPr>
+                <w:rFonts w:ascii="B Zar" w:hAnsi="B Zar"/>
+                <w:b w:val="0"/>
+                <w:color w:val="263238"/>
+                <w:sz w:val="16"/>
+              </w:rPr>
+              <w:t>F06-S04</w:t>
+            </w:r>
+          </w:p>
+        </w:tc>
+        <w:tc>
+          <w:tcPr>
+            <w:tcW w:type="dxa" w:w="1531"/>
+            <w:tcBorders>
+              <w:top w:val="single" w:sz="3" w:space="0" w:color="D9E0E7"/>
+              <w:left w:val="single" w:sz="3" w:space="0" w:color="D9E0E7"/>
+              <w:bottom w:val="single" w:sz="3" w:space="0" w:color="D9E0E7"/>
+              <w:right w:val="single" w:sz="3" w:space="0" w:color="D9E0E7"/>
+            </w:tcBorders>
+            <w:shd w:fill="F5F7FA"/>
+          </w:tcPr>
+          <w:p>
+            <w:pPr>
+              <w:spacing w:after="20" w:line="259" w:lineRule="auto"/>
+              <w:jc w:val="right"/>
+            </w:pPr>
+            <w:r/>
+            <w:r>
+              <w:rPr>
+                <w:rFonts w:ascii="B Zar" w:hAnsi="B Zar"/>
+                <w:b w:val="0"/>
+                <w:color w:val="263238"/>
+                <w:sz w:val="16"/>
+              </w:rPr>
+              <w:t>C / ecosystem comparison</w:t>
+            </w:r>
+          </w:p>
+        </w:tc>
+        <w:tc>
+          <w:tcPr>
+            <w:tcW w:type="dxa" w:w="7143"/>
+            <w:tcBorders>
+              <w:top w:val="single" w:sz="3" w:space="0" w:color="D9E0E7"/>
+              <w:left w:val="single" w:sz="3" w:space="0" w:color="D9E0E7"/>
+              <w:bottom w:val="single" w:sz="3" w:space="0" w:color="D9E0E7"/>
+              <w:right w:val="single" w:sz="3" w:space="0" w:color="D9E0E7"/>
+            </w:tcBorders>
+            <w:shd w:fill="F5F7FA"/>
+          </w:tcPr>
+          <w:p>
+            <w:pPr>
+              <w:spacing w:after="20" w:line="259" w:lineRule="auto"/>
+              <w:jc w:val="right"/>
+            </w:pPr>
+            <w:r/>
+            <w:r>
+              <w:rPr>
+                <w:rFonts w:ascii="B Zar" w:hAnsi="B Zar"/>
+                <w:b w:val="0"/>
+                <w:color w:val="263238"/>
+                <w:sz w:val="16"/>
+              </w:rPr>
+              <w:t>Collection-management software comparison; category breadth only — https://worldmetrics.org/best/collection-management-software/</w:t>
+            </w:r>
+          </w:p>
+        </w:tc>
+      </w:tr>
+      <w:tr>
+        <w:tc>
+          <w:tcPr>
+            <w:tcW w:type="dxa" w:w="1191"/>
+            <w:tcBorders>
+              <w:top w:val="single" w:sz="3" w:space="0" w:color="D9E0E7"/>
+              <w:left w:val="single" w:sz="3" w:space="0" w:color="D9E0E7"/>
+              <w:bottom w:val="single" w:sz="3" w:space="0" w:color="D9E0E7"/>
+              <w:right w:val="single" w:sz="3" w:space="0" w:color="D9E0E7"/>
+            </w:tcBorders>
+            <w:shd w:fill="FFFFFF"/>
+          </w:tcPr>
+          <w:p>
+            <w:pPr>
+              <w:spacing w:after="20" w:line="259" w:lineRule="auto"/>
+              <w:jc w:val="right"/>
+            </w:pPr>
+            <w:r/>
+            <w:r>
+              <w:rPr>
+                <w:rFonts w:ascii="B Zar" w:hAnsi="B Zar"/>
+                <w:b w:val="0"/>
+                <w:color w:val="263238"/>
+                <w:sz w:val="16"/>
+              </w:rPr>
+              <w:t>F06-S05</w:t>
+            </w:r>
+          </w:p>
+        </w:tc>
+        <w:tc>
+          <w:tcPr>
+            <w:tcW w:type="dxa" w:w="1531"/>
+            <w:tcBorders>
+              <w:top w:val="single" w:sz="3" w:space="0" w:color="D9E0E7"/>
+              <w:left w:val="single" w:sz="3" w:space="0" w:color="D9E0E7"/>
+              <w:bottom w:val="single" w:sz="3" w:space="0" w:color="D9E0E7"/>
+              <w:right w:val="single" w:sz="3" w:space="0" w:color="D9E0E7"/>
+            </w:tcBorders>
+            <w:shd w:fill="FFFFFF"/>
+          </w:tcPr>
+          <w:p>
+            <w:pPr>
+              <w:spacing w:after="20" w:line="259" w:lineRule="auto"/>
+              <w:jc w:val="right"/>
+            </w:pPr>
+            <w:r/>
+            <w:r>
+              <w:rPr>
+                <w:rFonts w:ascii="B Zar" w:hAnsi="B Zar"/>
+                <w:b w:val="0"/>
+                <w:color w:val="263238"/>
+                <w:sz w:val="16"/>
+              </w:rPr>
+              <w:t>B / نهاد تخصصی</w:t>
+            </w:r>
+          </w:p>
+        </w:tc>
+        <w:tc>
+          <w:tcPr>
+            <w:tcW w:type="dxa" w:w="7143"/>
+            <w:tcBorders>
+              <w:top w:val="single" w:sz="3" w:space="0" w:color="D9E0E7"/>
+              <w:left w:val="single" w:sz="3" w:space="0" w:color="D9E0E7"/>
+              <w:bottom w:val="single" w:sz="3" w:space="0" w:color="D9E0E7"/>
+              <w:right w:val="single" w:sz="3" w:space="0" w:color="D9E0E7"/>
+            </w:tcBorders>
+            <w:shd w:fill="FFFFFF"/>
+          </w:tcPr>
+          <w:p>
+            <w:pPr>
+              <w:spacing w:after="20" w:line="259" w:lineRule="auto"/>
+              <w:jc w:val="right"/>
+            </w:pPr>
+            <w:r/>
+            <w:r>
+              <w:rPr>
+                <w:rFonts w:ascii="B Zar" w:hAnsi="B Zar"/>
+                <w:b w:val="0"/>
+                <w:color w:val="263238"/>
+                <w:sz w:val="16"/>
+              </w:rPr>
+              <w:t>اداره کل موزه‌ها، اموال فرهنگی/تاریخی/هنری — http://www.gomchto.ir/moarefi%20amval.html</w:t>
+            </w:r>
+          </w:p>
+        </w:tc>
+      </w:tr>
+      <w:tr>
+        <w:tc>
+          <w:tcPr>
+            <w:tcW w:type="dxa" w:w="1191"/>
+            <w:tcBorders>
+              <w:top w:val="single" w:sz="3" w:space="0" w:color="D9E0E7"/>
+              <w:left w:val="single" w:sz="3" w:space="0" w:color="D9E0E7"/>
+              <w:bottom w:val="single" w:sz="3" w:space="0" w:color="D9E0E7"/>
+              <w:right w:val="single" w:sz="3" w:space="0" w:color="D9E0E7"/>
+            </w:tcBorders>
+            <w:shd w:fill="F5F7FA"/>
+          </w:tcPr>
+          <w:p>
+            <w:pPr>
+              <w:spacing w:after="20" w:line="259" w:lineRule="auto"/>
+              <w:jc w:val="right"/>
+            </w:pPr>
+            <w:r/>
+            <w:r>
+              <w:rPr>
+                <w:rFonts w:ascii="B Zar" w:hAnsi="B Zar"/>
+                <w:b w:val="0"/>
+                <w:color w:val="263238"/>
+                <w:sz w:val="16"/>
+              </w:rPr>
+              <w:t>F06-S06</w:t>
+            </w:r>
+          </w:p>
+        </w:tc>
+        <w:tc>
+          <w:tcPr>
+            <w:tcW w:type="dxa" w:w="1531"/>
+            <w:tcBorders>
+              <w:top w:val="single" w:sz="3" w:space="0" w:color="D9E0E7"/>
+              <w:left w:val="single" w:sz="3" w:space="0" w:color="D9E0E7"/>
+              <w:bottom w:val="single" w:sz="3" w:space="0" w:color="D9E0E7"/>
+              <w:right w:val="single" w:sz="3" w:space="0" w:color="D9E0E7"/>
+            </w:tcBorders>
+            <w:shd w:fill="F5F7FA"/>
+          </w:tcPr>
+          <w:p>
+            <w:pPr>
+              <w:spacing w:after="20" w:line="259" w:lineRule="auto"/>
+              <w:jc w:val="right"/>
+            </w:pPr>
+            <w:r/>
+            <w:r>
+              <w:rPr>
+                <w:rFonts w:ascii="B Zar" w:hAnsi="B Zar"/>
+                <w:b w:val="0"/>
+                <w:color w:val="263238"/>
+                <w:sz w:val="16"/>
+              </w:rPr>
+              <w:t>C / خبر رسمی</w:t>
+            </w:r>
+          </w:p>
+        </w:tc>
+        <w:tc>
+          <w:tcPr>
+            <w:tcW w:type="dxa" w:w="7143"/>
+            <w:tcBorders>
+              <w:top w:val="single" w:sz="3" w:space="0" w:color="D9E0E7"/>
+              <w:left w:val="single" w:sz="3" w:space="0" w:color="D9E0E7"/>
+              <w:bottom w:val="single" w:sz="3" w:space="0" w:color="D9E0E7"/>
+              <w:right w:val="single" w:sz="3" w:space="0" w:color="D9E0E7"/>
+            </w:tcBorders>
+            <w:shd w:fill="F5F7FA"/>
+          </w:tcPr>
+          <w:p>
+            <w:pPr>
+              <w:spacing w:after="20" w:line="259" w:lineRule="auto"/>
+              <w:jc w:val="right"/>
+            </w:pPr>
+            <w:r/>
+            <w:r>
+              <w:rPr>
+                <w:rFonts w:ascii="B Zar" w:hAnsi="B Zar"/>
+                <w:b w:val="0"/>
+                <w:color w:val="263238"/>
+                <w:sz w:val="16"/>
+              </w:rPr>
+              <w:t>برنا، ۲۸ اردیبهشت ۱۴۰۵؛ ۲۳۸هزار شیء در جام و ۸۳۰ موزه — https://borna.news/fa/news/2343263/</w:t>
+            </w:r>
+          </w:p>
+        </w:tc>
+      </w:tr>
+      <w:tr>
+        <w:tc>
+          <w:tcPr>
+            <w:tcW w:type="dxa" w:w="1191"/>
+            <w:tcBorders>
+              <w:top w:val="single" w:sz="3" w:space="0" w:color="D9E0E7"/>
+              <w:left w:val="single" w:sz="3" w:space="0" w:color="D9E0E7"/>
+              <w:bottom w:val="single" w:sz="3" w:space="0" w:color="D9E0E7"/>
+              <w:right w:val="single" w:sz="3" w:space="0" w:color="D9E0E7"/>
+            </w:tcBorders>
+            <w:shd w:fill="FFFFFF"/>
+          </w:tcPr>
+          <w:p>
+            <w:pPr>
+              <w:spacing w:after="20" w:line="259" w:lineRule="auto"/>
+              <w:jc w:val="right"/>
+            </w:pPr>
+            <w:r/>
+            <w:r>
+              <w:rPr>
+                <w:rFonts w:ascii="B Zar" w:hAnsi="B Zar"/>
+                <w:b w:val="0"/>
+                <w:color w:val="263238"/>
+                <w:sz w:val="16"/>
+              </w:rPr>
+              <w:t>F06-S07</w:t>
+            </w:r>
+          </w:p>
+        </w:tc>
+        <w:tc>
+          <w:tcPr>
+            <w:tcW w:type="dxa" w:w="1531"/>
+            <w:tcBorders>
+              <w:top w:val="single" w:sz="3" w:space="0" w:color="D9E0E7"/>
+              <w:left w:val="single" w:sz="3" w:space="0" w:color="D9E0E7"/>
+              <w:bottom w:val="single" w:sz="3" w:space="0" w:color="D9E0E7"/>
+              <w:right w:val="single" w:sz="3" w:space="0" w:color="D9E0E7"/>
+            </w:tcBorders>
+            <w:shd w:fill="FFFFFF"/>
+          </w:tcPr>
+          <w:p>
+            <w:pPr>
+              <w:spacing w:after="20" w:line="259" w:lineRule="auto"/>
+              <w:jc w:val="right"/>
+            </w:pPr>
+            <w:r/>
+            <w:r>
+              <w:rPr>
+                <w:rFonts w:ascii="B Zar" w:hAnsi="B Zar"/>
+                <w:b w:val="0"/>
+                <w:color w:val="263238"/>
+                <w:sz w:val="16"/>
+              </w:rPr>
+              <w:t>C / vendor</w:t>
+            </w:r>
+          </w:p>
+        </w:tc>
+        <w:tc>
+          <w:tcPr>
+            <w:tcW w:type="dxa" w:w="7143"/>
+            <w:tcBorders>
+              <w:top w:val="single" w:sz="3" w:space="0" w:color="D9E0E7"/>
+              <w:left w:val="single" w:sz="3" w:space="0" w:color="D9E0E7"/>
+              <w:bottom w:val="single" w:sz="3" w:space="0" w:color="D9E0E7"/>
+              <w:right w:val="single" w:sz="3" w:space="0" w:color="D9E0E7"/>
+            </w:tcBorders>
+            <w:shd w:fill="FFFFFF"/>
+          </w:tcPr>
+          <w:p>
+            <w:pPr>
+              <w:spacing w:after="20" w:line="259" w:lineRule="auto"/>
+              <w:jc w:val="right"/>
+            </w:pPr>
+            <w:r/>
+            <w:r>
+              <w:rPr>
+                <w:rFonts w:ascii="B Zar" w:hAnsi="B Zar"/>
+                <w:b w:val="0"/>
+                <w:color w:val="263238"/>
+                <w:sz w:val="16"/>
+              </w:rPr>
+              <w:t>آثاره / معماران عصر ارتباط، CMS آثار موزه‌ای — https://www.aca.ir/products/museum-collections-management-system/</w:t>
+            </w:r>
+          </w:p>
+        </w:tc>
+      </w:tr>
+    </w:tbl>
+    <w:p/>
+    <w:p>
+      <w:r>
+        <w:br w:type="page"/>
+      </w:r>
+    </w:p>
+    <w:p>
+      <w:pPr>
+        <w:pStyle w:val="Heading1"/>
+        <w:spacing w:before="280" w:after="160"/>
+        <w:jc w:val="right"/>
+      </w:pPr>
+      <w:r>
+        <w:rPr>
+          <w:rFonts w:ascii="B Zar" w:hAnsi="B Zar"/>
+          <w:color w:val="1F3A5F"/>
+          <w:sz w:val="32"/>
+        </w:rPr>
+        <w:t>به‌روزرسانی نسخه و وضعیت ادامهٔ برنامه</w:t>
+      </w:r>
+    </w:p>
+    <w:p>
+      <w:pPr>
+        <w:spacing w:after="100" w:line="300" w:lineRule="auto"/>
+        <w:jc w:val="right"/>
+      </w:pPr>
+      <w:r>
+        <w:rPr>
+          <w:rFonts w:ascii="B Zar" w:hAnsi="B Zar"/>
+          <w:color w:val="263238"/>
+          <w:sz w:val="22"/>
+        </w:rPr>
+        <w:t>نسخهٔ ۰٫۴ پروندهٔ F-06 را نیز ثبت می‌کند. با اینکه F-06 در سطح desk-research کامل است، رد/آرشیوی محسوب می‌شود و به علت overlap با F-02 و وجود category/بازیگران موجود، به مسیر ساخت محصول تبدیل نمی‌شود. F-01 تا F-04 همچنان تنها مسیرهای دارای گیت پژوهش اولیه یا pilot هستند.</w:t>
+      </w:r>
+    </w:p>
+    <w:tbl>
+      <w:tblPr>
+        <w:bidiVisual w:val="1"/>
+        <w:tblW w:type="auto" w:w="0"/>
+        <w:tblLayout w:type="autofit"/>
+        <w:tblLook w:firstColumn="1" w:firstRow="1" w:lastColumn="0" w:lastRow="0" w:noHBand="0" w:noVBand="1" w:val="04A0"/>
+      </w:tblPr>
+      <w:tblGrid>
+        <w:gridCol w:w="2409"/>
+        <w:gridCol w:w="2409"/>
+        <w:gridCol w:w="2409"/>
+        <w:gridCol w:w="2409"/>
+      </w:tblGrid>
+      <w:tr>
+        <w:tc>
+          <w:tcPr>
+            <w:tcW w:type="dxa" w:w="1361"/>
+            <w:tcBorders>
+              <w:top w:val="single" w:sz="4" w:space="0" w:color="1F3A5F"/>
+              <w:left w:val="single" w:sz="4" w:space="0" w:color="1F3A5F"/>
+              <w:bottom w:val="single" w:sz="4" w:space="0" w:color="1F3A5F"/>
+              <w:right w:val="single" w:sz="4" w:space="0" w:color="1F3A5F"/>
+            </w:tcBorders>
+            <w:shd w:fill="1F3A5F"/>
+          </w:tcPr>
+          <w:p>
+            <w:pPr>
+              <w:spacing w:after="20" w:line="259" w:lineRule="auto"/>
+              <w:jc w:val="center"/>
+            </w:pPr>
+            <w:r/>
+            <w:r>
+              <w:rPr>
+                <w:rFonts w:ascii="B Zar" w:hAnsi="B Zar"/>
+                <w:b/>
+                <w:color w:val="FFFFFF"/>
+                <w:sz w:val="17"/>
+              </w:rPr>
+              <w:t>نسخه</w:t>
+            </w:r>
+          </w:p>
+        </w:tc>
+        <w:tc>
+          <w:tcPr>
+            <w:tcW w:type="dxa" w:w="1701"/>
+            <w:tcBorders>
+              <w:top w:val="single" w:sz="4" w:space="0" w:color="1F3A5F"/>
+              <w:left w:val="single" w:sz="4" w:space="0" w:color="1F3A5F"/>
+              <w:bottom w:val="single" w:sz="4" w:space="0" w:color="1F3A5F"/>
+              <w:right w:val="single" w:sz="4" w:space="0" w:color="1F3A5F"/>
+            </w:tcBorders>
+            <w:shd w:fill="1F3A5F"/>
+          </w:tcPr>
+          <w:p>
+            <w:pPr>
+              <w:spacing w:after="20" w:line="259" w:lineRule="auto"/>
+              <w:jc w:val="center"/>
+            </w:pPr>
+            <w:r/>
+            <w:r>
+              <w:rPr>
+                <w:rFonts w:ascii="B Zar" w:hAnsi="B Zar"/>
+                <w:b/>
+                <w:color w:val="FFFFFF"/>
+                <w:sz w:val="17"/>
+              </w:rPr>
+              <w:t>تاریخ</w:t>
+            </w:r>
+          </w:p>
+        </w:tc>
+        <w:tc>
+          <w:tcPr>
+            <w:tcW w:type="dxa" w:w="5669"/>
+            <w:tcBorders>
+              <w:top w:val="single" w:sz="4" w:space="0" w:color="1F3A5F"/>
+              <w:left w:val="single" w:sz="4" w:space="0" w:color="1F3A5F"/>
+              <w:bottom w:val="single" w:sz="4" w:space="0" w:color="1F3A5F"/>
+              <w:right w:val="single" w:sz="4" w:space="0" w:color="1F3A5F"/>
+            </w:tcBorders>
+            <w:shd w:fill="1F3A5F"/>
+          </w:tcPr>
+          <w:p>
+            <w:pPr>
+              <w:spacing w:after="20" w:line="259" w:lineRule="auto"/>
+              <w:jc w:val="center"/>
+            </w:pPr>
+            <w:r/>
+            <w:r>
+              <w:rPr>
+                <w:rFonts w:ascii="B Zar" w:hAnsi="B Zar"/>
+                <w:b/>
+                <w:color w:val="FFFFFF"/>
+                <w:sz w:val="17"/>
+              </w:rPr>
+              <w:t>افزوده‌شده</w:t>
+            </w:r>
+          </w:p>
+        </w:tc>
+        <w:tc>
+          <w:tcPr>
+            <w:tcW w:type="dxa" w:w="1701"/>
+            <w:tcBorders>
+              <w:top w:val="single" w:sz="4" w:space="0" w:color="1F3A5F"/>
+              <w:left w:val="single" w:sz="4" w:space="0" w:color="1F3A5F"/>
+              <w:bottom w:val="single" w:sz="4" w:space="0" w:color="1F3A5F"/>
+              <w:right w:val="single" w:sz="4" w:space="0" w:color="1F3A5F"/>
+            </w:tcBorders>
+            <w:shd w:fill="1F3A5F"/>
+          </w:tcPr>
+          <w:p>
+            <w:pPr>
+              <w:spacing w:after="20" w:line="259" w:lineRule="auto"/>
+              <w:jc w:val="center"/>
+            </w:pPr>
+            <w:r/>
+            <w:r>
+              <w:rPr>
+                <w:rFonts w:ascii="B Zar" w:hAnsi="B Zar"/>
+                <w:b/>
+                <w:color w:val="FFFFFF"/>
+                <w:sz w:val="17"/>
+              </w:rPr>
+              <w:t>وضعیت</w:t>
+            </w:r>
+          </w:p>
+        </w:tc>
+      </w:tr>
+      <w:tr>
+        <w:tc>
+          <w:tcPr>
+            <w:tcW w:type="dxa" w:w="1361"/>
+            <w:tcBorders>
+              <w:top w:val="single" w:sz="3" w:space="0" w:color="D9E0E7"/>
+              <w:left w:val="single" w:sz="3" w:space="0" w:color="D9E0E7"/>
+              <w:bottom w:val="single" w:sz="3" w:space="0" w:color="D9E0E7"/>
+              <w:right w:val="single" w:sz="3" w:space="0" w:color="D9E0E7"/>
+            </w:tcBorders>
+            <w:shd w:fill="FFFFFF"/>
+          </w:tcPr>
+          <w:p>
+            <w:pPr>
+              <w:spacing w:after="20" w:line="259" w:lineRule="auto"/>
+              <w:jc w:val="right"/>
+            </w:pPr>
+            <w:r/>
+            <w:r>
+              <w:rPr>
+                <w:rFonts w:ascii="B Zar" w:hAnsi="B Zar"/>
+                <w:b w:val="0"/>
+                <w:color w:val="263238"/>
+                <w:sz w:val="16"/>
+              </w:rPr>
+              <w:t>۰٫۴</w:t>
+            </w:r>
+          </w:p>
+        </w:tc>
+        <w:tc>
+          <w:tcPr>
+            <w:tcW w:type="dxa" w:w="1701"/>
+            <w:tcBorders>
+              <w:top w:val="single" w:sz="3" w:space="0" w:color="D9E0E7"/>
+              <w:left w:val="single" w:sz="3" w:space="0" w:color="D9E0E7"/>
+              <w:bottom w:val="single" w:sz="3" w:space="0" w:color="D9E0E7"/>
+              <w:right w:val="single" w:sz="3" w:space="0" w:color="D9E0E7"/>
+            </w:tcBorders>
+            <w:shd w:fill="FFFFFF"/>
+          </w:tcPr>
+          <w:p>
+            <w:pPr>
+              <w:spacing w:after="20" w:line="259" w:lineRule="auto"/>
+              <w:jc w:val="right"/>
+            </w:pPr>
+            <w:r/>
+            <w:r>
+              <w:rPr>
+                <w:rFonts w:ascii="B Zar" w:hAnsi="B Zar"/>
+                <w:b w:val="0"/>
+                <w:color w:val="263238"/>
+                <w:sz w:val="16"/>
+              </w:rPr>
+              <w:t>۱۲ مهر ۱۴۰۵</w:t>
+            </w:r>
+          </w:p>
+        </w:tc>
+        <w:tc>
+          <w:tcPr>
+            <w:tcW w:type="dxa" w:w="5669"/>
+            <w:tcBorders>
+              <w:top w:val="single" w:sz="3" w:space="0" w:color="D9E0E7"/>
+              <w:left w:val="single" w:sz="3" w:space="0" w:color="D9E0E7"/>
+              <w:bottom w:val="single" w:sz="3" w:space="0" w:color="D9E0E7"/>
+              <w:right w:val="single" w:sz="3" w:space="0" w:color="D9E0E7"/>
+            </w:tcBorders>
+            <w:shd w:fill="FFFFFF"/>
+          </w:tcPr>
+          <w:p>
+            <w:pPr>
+              <w:spacing w:after="20" w:line="259" w:lineRule="auto"/>
+              <w:jc w:val="right"/>
+            </w:pPr>
+            <w:r/>
+            <w:r>
+              <w:rPr>
+                <w:rFonts w:ascii="B Zar" w:hAnsi="B Zar"/>
+                <w:b w:val="0"/>
+                <w:color w:val="263238"/>
+                <w:sz w:val="16"/>
+              </w:rPr>
+              <w:t>F-06: آرشیو، امانت و condition report لباس؛ evidence ledger، رقابت ایران، ریسک و hard kill ثبت شد.</w:t>
+            </w:r>
+          </w:p>
+        </w:tc>
+        <w:tc>
+          <w:tcPr>
+            <w:tcW w:type="dxa" w:w="1701"/>
+            <w:tcBorders>
+              <w:top w:val="single" w:sz="3" w:space="0" w:color="D9E0E7"/>
+              <w:left w:val="single" w:sz="3" w:space="0" w:color="D9E0E7"/>
+              <w:bottom w:val="single" w:sz="3" w:space="0" w:color="D9E0E7"/>
+              <w:right w:val="single" w:sz="3" w:space="0" w:color="D9E0E7"/>
+            </w:tcBorders>
+            <w:shd w:fill="FFFFFF"/>
+          </w:tcPr>
+          <w:p>
+            <w:pPr>
+              <w:spacing w:after="20" w:line="259" w:lineRule="auto"/>
+              <w:jc w:val="right"/>
+            </w:pPr>
+            <w:r/>
+            <w:r>
+              <w:rPr>
+                <w:rFonts w:ascii="B Zar" w:hAnsi="B Zar"/>
+                <w:b w:val="0"/>
+                <w:color w:val="263238"/>
+                <w:sz w:val="16"/>
+              </w:rPr>
+              <w:t>منتشرشده</w:t>
+            </w:r>
+          </w:p>
+        </w:tc>
+      </w:tr>
+      <w:tr>
+        <w:tc>
+          <w:tcPr>
+            <w:tcW w:type="dxa" w:w="1361"/>
+            <w:tcBorders>
+              <w:top w:val="single" w:sz="3" w:space="0" w:color="D9E0E7"/>
+              <w:left w:val="single" w:sz="3" w:space="0" w:color="D9E0E7"/>
+              <w:bottom w:val="single" w:sz="3" w:space="0" w:color="D9E0E7"/>
+              <w:right w:val="single" w:sz="3" w:space="0" w:color="D9E0E7"/>
+            </w:tcBorders>
+            <w:shd w:fill="F5F7FA"/>
+          </w:tcPr>
+          <w:p>
+            <w:pPr>
+              <w:spacing w:after="20" w:line="259" w:lineRule="auto"/>
+              <w:jc w:val="right"/>
+            </w:pPr>
+            <w:r/>
+            <w:r>
+              <w:rPr>
+                <w:rFonts w:ascii="B Zar" w:hAnsi="B Zar"/>
+                <w:b w:val="0"/>
+                <w:color w:val="263238"/>
+                <w:sz w:val="16"/>
+              </w:rPr>
+              <w:t>۰٫۵</w:t>
+            </w:r>
+          </w:p>
+        </w:tc>
+        <w:tc>
+          <w:tcPr>
+            <w:tcW w:type="dxa" w:w="1701"/>
+            <w:tcBorders>
+              <w:top w:val="single" w:sz="3" w:space="0" w:color="D9E0E7"/>
+              <w:left w:val="single" w:sz="3" w:space="0" w:color="D9E0E7"/>
+              <w:bottom w:val="single" w:sz="3" w:space="0" w:color="D9E0E7"/>
+              <w:right w:val="single" w:sz="3" w:space="0" w:color="D9E0E7"/>
+            </w:tcBorders>
+            <w:shd w:fill="F5F7FA"/>
+          </w:tcPr>
+          <w:p>
+            <w:pPr>
+              <w:spacing w:after="20" w:line="259" w:lineRule="auto"/>
+              <w:jc w:val="right"/>
+            </w:pPr>
+            <w:r/>
+            <w:r>
+              <w:rPr>
+                <w:rFonts w:ascii="B Zar" w:hAnsi="B Zar"/>
+                <w:b w:val="0"/>
+                <w:color w:val="263238"/>
+                <w:sz w:val="16"/>
+              </w:rPr>
+              <w:t>پس از پژوهش بعدی</w:t>
+            </w:r>
+          </w:p>
+        </w:tc>
+        <w:tc>
+          <w:tcPr>
+            <w:tcW w:type="dxa" w:w="5669"/>
+            <w:tcBorders>
+              <w:top w:val="single" w:sz="3" w:space="0" w:color="D9E0E7"/>
+              <w:left w:val="single" w:sz="3" w:space="0" w:color="D9E0E7"/>
+              <w:bottom w:val="single" w:sz="3" w:space="0" w:color="D9E0E7"/>
+              <w:right w:val="single" w:sz="3" w:space="0" w:color="D9E0E7"/>
+            </w:tcBorders>
+            <w:shd w:fill="F5F7FA"/>
+          </w:tcPr>
+          <w:p>
+            <w:pPr>
+              <w:spacing w:after="20" w:line="259" w:lineRule="auto"/>
+              <w:jc w:val="right"/>
+            </w:pPr>
+            <w:r/>
+            <w:r>
+              <w:rPr>
+                <w:rFonts w:ascii="B Zar" w:hAnsi="B Zar"/>
+                <w:b w:val="0"/>
+                <w:color w:val="263238"/>
+                <w:sz w:val="16"/>
+              </w:rPr>
+              <w:t>پروندهٔ بعدی یا نتایج primary research/pilot بر مبنای شواهد واقعی.</w:t>
+            </w:r>
+          </w:p>
+        </w:tc>
+        <w:tc>
+          <w:tcPr>
+            <w:tcW w:type="dxa" w:w="1701"/>
+            <w:tcBorders>
+              <w:top w:val="single" w:sz="3" w:space="0" w:color="D9E0E7"/>
+              <w:left w:val="single" w:sz="3" w:space="0" w:color="D9E0E7"/>
+              <w:bottom w:val="single" w:sz="3" w:space="0" w:color="D9E0E7"/>
+              <w:right w:val="single" w:sz="3" w:space="0" w:color="D9E0E7"/>
+            </w:tcBorders>
+            <w:shd w:fill="F5F7FA"/>
+          </w:tcPr>
+          <w:p>
+            <w:pPr>
+              <w:spacing w:after="20" w:line="259" w:lineRule="auto"/>
+              <w:jc w:val="right"/>
+            </w:pPr>
+            <w:r/>
+            <w:r>
+              <w:rPr>
+                <w:rFonts w:ascii="B Zar" w:hAnsi="B Zar"/>
+                <w:b w:val="0"/>
+                <w:color w:val="263238"/>
+                <w:sz w:val="16"/>
+              </w:rPr>
+              <w:t>برنامه‌ریزی‌شده</w:t>
+            </w:r>
+          </w:p>
+        </w:tc>
+      </w:tr>
+    </w:tbl>
+    <w:p/>
+    <w:tbl>
+      <w:tblPr>
+        <w:bidiVisual w:val="1"/>
+        <w:tblW w:type="auto" w:w="0"/>
+        <w:tblLook w:firstColumn="1" w:firstRow="1" w:lastColumn="0" w:lastRow="0" w:noHBand="0" w:noVBand="1" w:val="04A0"/>
+      </w:tblPr>
+      <w:tblGrid>
+        <w:gridCol w:w="9638"/>
+      </w:tblGrid>
+      <w:tr>
+        <w:tc>
+          <w:tcPr>
+            <w:tcW w:type="dxa" w:w="9638"/>
+            <w:tcBorders>
+              <w:top w:val="single" w:sz="6" w:space="0" w:color="A23B22"/>
+              <w:left w:val="single" w:sz="6" w:space="0" w:color="A23B22"/>
+              <w:bottom w:val="single" w:sz="6" w:space="0" w:color="A23B22"/>
+              <w:right w:val="single" w:sz="6" w:space="0" w:color="A23B22"/>
+            </w:tcBorders>
+            <w:shd w:fill="FDE7E2"/>
+          </w:tcPr>
+          <w:p>
+            <w:pPr>
+              <w:spacing w:after="40"/>
+              <w:jc w:val="right"/>
+            </w:pPr>
+            <w:r/>
+            <w:r>
+              <w:rPr>
+                <w:rFonts w:ascii="B Zar" w:hAnsi="B Zar"/>
+                <w:b/>
+                <w:color w:val="A23B22"/>
+                <w:sz w:val="21"/>
+              </w:rPr>
+              <w:t>نتیجه</w:t>
+            </w:r>
+          </w:p>
+          <w:p>
+            <w:pPr>
+              <w:spacing w:after="40" w:line="288" w:lineRule="auto"/>
+              <w:jc w:val="right"/>
+            </w:pPr>
+            <w:r>
+              <w:rPr>
+                <w:rFonts w:ascii="B Zar" w:hAnsi="B Zar"/>
+                <w:b w:val="0"/>
+                <w:color w:val="263238"/>
+                <w:sz w:val="19"/>
+              </w:rPr>
+              <w:t>F-06 به‌عنوان دانش آرشیوی حفظ شد اما از pipeline فعال خارج است. در این نسخه هیچ مسیر جدیدی Pass نشده و primary research/pilot برای F-01 تا F-04 همچنان باز است.</w:t>
+            </w:r>
+          </w:p>
+        </w:tc>
+      </w:tr>
+    </w:tbl>
+    <w:p/>
     <w:sectPr>
       <w:headerReference w:type="default" r:id="rId7"/>
       <w:footerReference w:type="default" r:id="rId8"/>

</xml_diff>

<commit_message>
Add F-07 social fashion game research dossier
</commit_message>
<xml_diff>
--- a/reports/fashion_market_research_master_v0.docx
+++ b/reports/fashion_market_research_master_v0.docx
@@ -54,7 +54,7 @@
               <w:br/>
               <w:br/>
               <w:br/>
-              <w:t>نسخهٔ ۰٫۴ | سند زنده و محرمانه</w:t>
+              <w:t>نسخهٔ ۰٫۵ | سند زنده و محرمانه</w:t>
               <w:br/>
               <w:t>۱۲ مهر ۱۴۰۵  |  ۴ اکتبر ۲۰۲۶</w:t>
               <w:br/>
@@ -376,7 +376,7 @@
                 <w:color w:val="263238"/>
                 <w:sz w:val="17"/>
               </w:rPr>
-              <w:t>۰٫۴ — شش پروندهٔ desk-research افزوده شد؛ پژوهش اولیه/پایلوت فقط برای F-01 تا F-04 باز است.</w:t>
+              <w:t>۰٫۵ — هفت پروندهٔ desk-research افزوده شد؛ F-07 به درخواست کاربر Pause است و پژوهش اولیه/پایلوت فقط برای F-01 تا F-04 باز است.</w:t>
             </w:r>
           </w:p>
         </w:tc>
@@ -650,7 +650,7 @@
                 <w:color w:val="1F7A70"/>
                 <w:sz w:val="21"/>
               </w:rPr>
-              <w:t>یادداشت اعتبار نسخهٔ ۰٫۴</w:t>
+              <w:t>یادداشت اعتبار نسخهٔ ۰٫۵</w:t>
             </w:r>
           </w:p>
           <w:p>
@@ -2922,7 +2922,7 @@
                 <w:color w:val="263238"/>
                 <w:sz w:val="19"/>
               </w:rPr>
-              <w:t>هیچ نمودار اندازهٔ بازار، سهم بازار، درآمد یا رضایت با دادهٔ نمونه یا عدد بی‌منبع وارد این گزارش نمی‌شود. نمودارهای نسخهٔ ۰٫۴ فقط وضعیت واقعی برنامهٔ پژوهش را نمایش می‌دهند. نمودارهای هر پرونده پس از ثبت منبع، تعریف، واحد و روش ایجاد می‌شوند.</w:t>
+              <w:t>هیچ نمودار اندازهٔ بازار، سهم بازار، درآمد یا رضایت با دادهٔ نمونه یا عدد بی‌منبع وارد این گزارش نمی‌شود. نمودارهای نسخهٔ ۰٫۵ فقط وضعیت واقعی برنامهٔ پژوهش را نمایش می‌دهند. نمودارهای هر پرونده پس از ثبت منبع، تعریف، واحد و روش ایجاد می‌شوند.</w:t>
             </w:r>
           </w:p>
         </w:tc>
@@ -5244,6 +5244,148 @@
                 <w:sz w:val="17"/>
               </w:rPr>
               <w:t>پروندهٔ عمیق نسخهٔ ۰٫۴؛ sub-segment F-02 و خارج از pipeline فعال.</w:t>
+            </w:r>
+          </w:p>
+        </w:tc>
+      </w:tr>
+      <w:tr>
+        <w:tc>
+          <w:tcPr>
+            <w:tcW w:type="dxa" w:w="1928"/>
+            <w:tcBorders>
+              <w:top w:val="single" w:sz="3" w:space="0" w:color="D9E0E7"/>
+              <w:left w:val="single" w:sz="3" w:space="0" w:color="D9E0E7"/>
+              <w:bottom w:val="single" w:sz="3" w:space="0" w:color="D9E0E7"/>
+              <w:right w:val="single" w:sz="3" w:space="0" w:color="D9E0E7"/>
+            </w:tcBorders>
+            <w:shd w:fill="FFFFFF"/>
+          </w:tcPr>
+          <w:p>
+            <w:pPr>
+              <w:spacing w:after="20" w:line="259" w:lineRule="auto"/>
+              <w:jc w:val="right"/>
+            </w:pPr>
+            <w:r/>
+            <w:r>
+              <w:rPr>
+                <w:rFonts w:ascii="B Zar" w:hAnsi="B Zar"/>
+                <w:b w:val="0"/>
+                <w:color w:val="263238"/>
+                <w:sz w:val="17"/>
+              </w:rPr>
+              <w:t>F-07</w:t>
+            </w:r>
+          </w:p>
+        </w:tc>
+        <w:tc>
+          <w:tcPr>
+            <w:tcW w:type="dxa" w:w="1928"/>
+            <w:tcBorders>
+              <w:top w:val="single" w:sz="3" w:space="0" w:color="D9E0E7"/>
+              <w:left w:val="single" w:sz="3" w:space="0" w:color="D9E0E7"/>
+              <w:bottom w:val="single" w:sz="3" w:space="0" w:color="D9E0E7"/>
+              <w:right w:val="single" w:sz="3" w:space="0" w:color="D9E0E7"/>
+            </w:tcBorders>
+            <w:shd w:fill="FFFFFF"/>
+          </w:tcPr>
+          <w:p>
+            <w:pPr>
+              <w:spacing w:after="20" w:line="259" w:lineRule="auto"/>
+              <w:jc w:val="right"/>
+            </w:pPr>
+            <w:r/>
+            <w:r>
+              <w:rPr>
+                <w:rFonts w:ascii="B Zar" w:hAnsi="B Zar"/>
+                <w:b w:val="0"/>
+                <w:color w:val="263238"/>
+                <w:sz w:val="17"/>
+              </w:rPr>
+              <w:t>فشن‌گیم اجتماعی بومی</w:t>
+            </w:r>
+          </w:p>
+        </w:tc>
+        <w:tc>
+          <w:tcPr>
+            <w:tcW w:type="dxa" w:w="1928"/>
+            <w:tcBorders>
+              <w:top w:val="single" w:sz="3" w:space="0" w:color="D9E0E7"/>
+              <w:left w:val="single" w:sz="3" w:space="0" w:color="D9E0E7"/>
+              <w:bottom w:val="single" w:sz="3" w:space="0" w:color="D9E0E7"/>
+              <w:right w:val="single" w:sz="3" w:space="0" w:color="D9E0E7"/>
+            </w:tcBorders>
+            <w:shd w:fill="FFFFFF"/>
+          </w:tcPr>
+          <w:p>
+            <w:pPr>
+              <w:spacing w:after="20" w:line="259" w:lineRule="auto"/>
+              <w:jc w:val="right"/>
+            </w:pPr>
+            <w:r/>
+            <w:r>
+              <w:rPr>
+                <w:rFonts w:ascii="B Zar" w:hAnsi="B Zar"/>
+                <w:b w:val="0"/>
+                <w:color w:val="263238"/>
+                <w:sz w:val="17"/>
+              </w:rPr>
+              <w:t>B2C</w:t>
+            </w:r>
+          </w:p>
+        </w:tc>
+        <w:tc>
+          <w:tcPr>
+            <w:tcW w:type="dxa" w:w="1928"/>
+            <w:tcBorders>
+              <w:top w:val="single" w:sz="3" w:space="0" w:color="D9E0E7"/>
+              <w:left w:val="single" w:sz="3" w:space="0" w:color="D9E0E7"/>
+              <w:bottom w:val="single" w:sz="3" w:space="0" w:color="D9E0E7"/>
+              <w:right w:val="single" w:sz="3" w:space="0" w:color="D9E0E7"/>
+            </w:tcBorders>
+            <w:shd w:fill="FFF3D6"/>
+          </w:tcPr>
+          <w:p>
+            <w:pPr>
+              <w:spacing w:after="20" w:line="259" w:lineRule="auto"/>
+              <w:jc w:val="right"/>
+            </w:pPr>
+            <w:r/>
+            <w:r>
+              <w:rPr>
+                <w:rFonts w:ascii="B Zar" w:hAnsi="B Zar"/>
+                <w:b w:val="0"/>
+                <w:color w:val="263238"/>
+                <w:sz w:val="17"/>
+              </w:rPr>
+              <w:t>Pause به درخواست کاربر</w:t>
+            </w:r>
+          </w:p>
+        </w:tc>
+        <w:tc>
+          <w:tcPr>
+            <w:tcW w:type="dxa" w:w="1928"/>
+            <w:tcBorders>
+              <w:top w:val="single" w:sz="3" w:space="0" w:color="D9E0E7"/>
+              <w:left w:val="single" w:sz="3" w:space="0" w:color="D9E0E7"/>
+              <w:bottom w:val="single" w:sz="3" w:space="0" w:color="D9E0E7"/>
+              <w:right w:val="single" w:sz="3" w:space="0" w:color="D9E0E7"/>
+            </w:tcBorders>
+            <w:shd w:fill="FFFFFF"/>
+          </w:tcPr>
+          <w:p>
+            <w:pPr>
+              <w:spacing w:after="20" w:line="259" w:lineRule="auto"/>
+              <w:jc w:val="right"/>
+            </w:pPr>
+            <w:r/>
+            <w:r>
+              <w:rPr>
+                <w:rFonts w:ascii="B Zar" w:hAnsi="B Zar"/>
+                <w:b w:val="0"/>
+                <w:color w:val="263238"/>
+                <w:sz w:val="17"/>
+              </w:rPr>
+              <w:t>پروندهٔ عمیق نسخهٔ ۰٫۵؛ بازگشایی فقط با درخواست صریح.</w:t>
             </w:r>
           </w:p>
         </w:tc>
@@ -15201,6 +15343,120 @@
           </w:p>
         </w:tc>
       </w:tr>
+      <w:tr>
+        <w:tc>
+          <w:tcPr>
+            <w:tcW w:type="dxa" w:w="2409"/>
+            <w:tcBorders>
+              <w:top w:val="single" w:sz="3" w:space="0" w:color="D9E0E7"/>
+              <w:left w:val="single" w:sz="3" w:space="0" w:color="D9E0E7"/>
+              <w:bottom w:val="single" w:sz="3" w:space="0" w:color="D9E0E7"/>
+              <w:right w:val="single" w:sz="3" w:space="0" w:color="D9E0E7"/>
+            </w:tcBorders>
+            <w:shd w:fill="FFFFFF"/>
+          </w:tcPr>
+          <w:p>
+            <w:pPr>
+              <w:spacing w:after="20" w:line="259" w:lineRule="auto"/>
+              <w:jc w:val="right"/>
+            </w:pPr>
+            <w:r/>
+            <w:r>
+              <w:rPr>
+                <w:rFonts w:ascii="B Zar" w:hAnsi="B Zar"/>
+                <w:b w:val="0"/>
+                <w:color w:val="263238"/>
+                <w:sz w:val="17"/>
+              </w:rPr>
+              <w:t>۰٫۵</w:t>
+            </w:r>
+          </w:p>
+        </w:tc>
+        <w:tc>
+          <w:tcPr>
+            <w:tcW w:type="dxa" w:w="2409"/>
+            <w:tcBorders>
+              <w:top w:val="single" w:sz="3" w:space="0" w:color="D9E0E7"/>
+              <w:left w:val="single" w:sz="3" w:space="0" w:color="D9E0E7"/>
+              <w:bottom w:val="single" w:sz="3" w:space="0" w:color="D9E0E7"/>
+              <w:right w:val="single" w:sz="3" w:space="0" w:color="D9E0E7"/>
+            </w:tcBorders>
+            <w:shd w:fill="FFFFFF"/>
+          </w:tcPr>
+          <w:p>
+            <w:pPr>
+              <w:spacing w:after="20" w:line="259" w:lineRule="auto"/>
+              <w:jc w:val="right"/>
+            </w:pPr>
+            <w:r/>
+            <w:r>
+              <w:rPr>
+                <w:rFonts w:ascii="B Zar" w:hAnsi="B Zar"/>
+                <w:b w:val="0"/>
+                <w:color w:val="263238"/>
+                <w:sz w:val="17"/>
+              </w:rPr>
+              <w:t>۱۲ مهر ۱۴۰۵</w:t>
+            </w:r>
+          </w:p>
+        </w:tc>
+        <w:tc>
+          <w:tcPr>
+            <w:tcW w:type="dxa" w:w="2409"/>
+            <w:tcBorders>
+              <w:top w:val="single" w:sz="3" w:space="0" w:color="D9E0E7"/>
+              <w:left w:val="single" w:sz="3" w:space="0" w:color="D9E0E7"/>
+              <w:bottom w:val="single" w:sz="3" w:space="0" w:color="D9E0E7"/>
+              <w:right w:val="single" w:sz="3" w:space="0" w:color="D9E0E7"/>
+            </w:tcBorders>
+            <w:shd w:fill="FFFFFF"/>
+          </w:tcPr>
+          <w:p>
+            <w:pPr>
+              <w:spacing w:after="20" w:line="259" w:lineRule="auto"/>
+              <w:jc w:val="right"/>
+            </w:pPr>
+            <w:r/>
+            <w:r>
+              <w:rPr>
+                <w:rFonts w:ascii="B Zar" w:hAnsi="B Zar"/>
+                <w:b w:val="0"/>
+                <w:color w:val="263238"/>
+                <w:sz w:val="17"/>
+              </w:rPr>
+              <w:t>افزودن dossier F-07؛ وضعیت Pause به درخواست کاربر بدون تبدیل به candidate فعال حفظ شد.</w:t>
+            </w:r>
+          </w:p>
+        </w:tc>
+        <w:tc>
+          <w:tcPr>
+            <w:tcW w:type="dxa" w:w="2409"/>
+            <w:tcBorders>
+              <w:top w:val="single" w:sz="3" w:space="0" w:color="D9E0E7"/>
+              <w:left w:val="single" w:sz="3" w:space="0" w:color="D9E0E7"/>
+              <w:bottom w:val="single" w:sz="3" w:space="0" w:color="D9E0E7"/>
+              <w:right w:val="single" w:sz="3" w:space="0" w:color="D9E0E7"/>
+            </w:tcBorders>
+            <w:shd w:fill="FFFFFF"/>
+          </w:tcPr>
+          <w:p>
+            <w:pPr>
+              <w:spacing w:after="20" w:line="259" w:lineRule="auto"/>
+              <w:jc w:val="right"/>
+            </w:pPr>
+            <w:r/>
+            <w:r>
+              <w:rPr>
+                <w:rFonts w:ascii="B Zar" w:hAnsi="B Zar"/>
+                <w:b w:val="0"/>
+                <w:color w:val="263238"/>
+                <w:sz w:val="17"/>
+              </w:rPr>
+              <w:t>منتشرشده</w:t>
+            </w:r>
+          </w:p>
+        </w:tc>
+      </w:tr>
     </w:tbl>
     <w:p/>
     <w:tbl>
@@ -37272,6 +37528,3321 @@
                 <w:sz w:val="19"/>
               </w:rPr>
               <w:t>F-06 به‌عنوان دانش آرشیوی حفظ شد اما از pipeline فعال خارج است. در این نسخه هیچ مسیر جدیدی Pass نشده و primary research/pilot برای F-01 تا F-04 همچنان باز است.</w:t>
+            </w:r>
+          </w:p>
+        </w:tc>
+      </w:tr>
+    </w:tbl>
+    <w:p/>
+    <w:p>
+      <w:r>
+        <w:br w:type="page"/>
+      </w:r>
+    </w:p>
+    <w:p>
+      <w:pPr>
+        <w:pStyle w:val="Heading1"/>
+        <w:spacing w:before="280" w:after="160"/>
+        <w:jc w:val="right"/>
+      </w:pPr>
+      <w:r>
+        <w:rPr>
+          <w:rFonts w:ascii="B Zar" w:hAnsi="B Zar"/>
+          <w:color w:val="1F3A5F"/>
+          <w:sz w:val="32"/>
+        </w:rPr>
+        <w:t>F-07. فشن‌گیم اجتماعی بومی</w:t>
+      </w:r>
+    </w:p>
+    <w:tbl>
+      <w:tblPr>
+        <w:bidiVisual w:val="1"/>
+        <w:tblW w:type="auto" w:w="0"/>
+        <w:tblLook w:firstColumn="1" w:firstRow="1" w:lastColumn="0" w:lastRow="0" w:noHBand="0" w:noVBand="1" w:val="04A0"/>
+      </w:tblPr>
+      <w:tblGrid>
+        <w:gridCol w:w="9638"/>
+      </w:tblGrid>
+      <w:tr>
+        <w:tc>
+          <w:tcPr>
+            <w:tcW w:type="dxa" w:w="9638"/>
+            <w:tcBorders>
+              <w:top w:val="single" w:sz="6" w:space="0" w:color="8A6100"/>
+              <w:left w:val="single" w:sz="6" w:space="0" w:color="8A6100"/>
+              <w:bottom w:val="single" w:sz="6" w:space="0" w:color="8A6100"/>
+              <w:right w:val="single" w:sz="6" w:space="0" w:color="8A6100"/>
+            </w:tcBorders>
+            <w:shd w:fill="FFF3D6"/>
+          </w:tcPr>
+          <w:p>
+            <w:pPr>
+              <w:jc w:val="right"/>
+            </w:pPr>
+            <w:r/>
+            <w:r>
+              <w:rPr>
+                <w:rFonts w:ascii="B Zar" w:hAnsi="B Zar"/>
+                <w:b/>
+                <w:color w:val="8A6100"/>
+                <w:sz w:val="21"/>
+              </w:rPr>
+              <w:t>کارت تصمیم — وضعیت: Pause به درخواست کاربر</w:t>
+            </w:r>
+          </w:p>
+          <w:p>
+            <w:pPr>
+              <w:spacing w:line="288" w:lineRule="auto"/>
+              <w:jc w:val="right"/>
+            </w:pPr>
+            <w:r>
+              <w:rPr>
+                <w:rFonts w:ascii="B Zar" w:hAnsi="B Zar"/>
+                <w:b w:val="0"/>
+                <w:color w:val="263238"/>
+                <w:sz w:val="19"/>
+              </w:rPr>
+              <w:t>محصول فرضی یک B2C mobile social fashion game با آواتار، asset دیجیتال، prompt، challenge، رأی community، reward و Live Ops است. فروشگاه لباس، marketplace، AI photo/modeling یا virtual try-on نیست. این مسیر به دلیل تصمیم صریح کاربر فعال نیست و این پرونده فقط دانش/گیت بازگشایی را ثبت می‌کند.</w:t>
+            </w:r>
+          </w:p>
+        </w:tc>
+      </w:tr>
+    </w:tbl>
+    <w:p/>
+    <w:p>
+      <w:pPr>
+        <w:pStyle w:val="Heading2"/>
+        <w:spacing w:before="200" w:after="120"/>
+        <w:jc w:val="right"/>
+      </w:pPr>
+      <w:r>
+        <w:rPr>
+          <w:rFonts w:ascii="B Zar" w:hAnsi="B Zar"/>
+          <w:color w:val="1F7A70"/>
+          <w:sz w:val="26"/>
+        </w:rPr>
+        <w:t>۱. مسئله، JTBD و core loop</w:t>
+      </w:r>
+    </w:p>
+    <w:p>
+      <w:pPr>
+        <w:spacing w:after="100" w:line="300" w:lineRule="auto"/>
+        <w:jc w:val="right"/>
+      </w:pPr>
+      <w:r>
+        <w:rPr>
+          <w:rFonts w:ascii="B Zar" w:hAnsi="B Zar"/>
+          <w:color w:val="263238"/>
+          <w:sz w:val="22"/>
+        </w:rPr>
+        <w:t>کاربر می‌خواهد بدون خرید پوشاک واقعی یا افشای تصویر بدن خود، استایل بسازد، بازخورد و اعتبار بگیرد و هر هفته دلیل تازه‌ای برای بازگشت داشته باشد. loop محصول: prompt → انتخاب outfit/avatar → submit → رأی/بازخورد → reward/rank → unlock/collection → recognition → challenge بعدی. اگر Live Ops، رأی باکیفیت، اقتصاد آیتم دیجیتال و social safety وجود نداشته باشد، محصول به dress-up یک‌بارمصرف تقلیل می‌یابد.</w:t>
+      </w:r>
+    </w:p>
+    <w:tbl>
+      <w:tblPr>
+        <w:bidiVisual w:val="1"/>
+        <w:tblW w:type="auto" w:w="0"/>
+        <w:tblLayout w:type="autofit"/>
+        <w:tblLook w:firstColumn="1" w:firstRow="1" w:lastColumn="0" w:lastRow="0" w:noHBand="0" w:noVBand="1" w:val="04A0"/>
+      </w:tblPr>
+      <w:tblGrid>
+        <w:gridCol w:w="3213"/>
+        <w:gridCol w:w="3213"/>
+        <w:gridCol w:w="3213"/>
+      </w:tblGrid>
+      <w:tr>
+        <w:tc>
+          <w:tcPr>
+            <w:tcW w:type="dxa" w:w="1984"/>
+            <w:tcBorders>
+              <w:top w:val="single" w:sz="4" w:space="0" w:color="1F3A5F"/>
+              <w:left w:val="single" w:sz="4" w:space="0" w:color="1F3A5F"/>
+              <w:bottom w:val="single" w:sz="4" w:space="0" w:color="1F3A5F"/>
+              <w:right w:val="single" w:sz="4" w:space="0" w:color="1F3A5F"/>
+            </w:tcBorders>
+            <w:shd w:fill="1F3A5F"/>
+          </w:tcPr>
+          <w:p>
+            <w:pPr>
+              <w:spacing w:after="20" w:line="259" w:lineRule="auto"/>
+              <w:jc w:val="center"/>
+            </w:pPr>
+            <w:r/>
+            <w:r>
+              <w:rPr>
+                <w:rFonts w:ascii="B Zar" w:hAnsi="B Zar"/>
+                <w:b/>
+                <w:color w:val="FFFFFF"/>
+                <w:sz w:val="17"/>
+              </w:rPr>
+              <w:t>جزء loop</w:t>
+            </w:r>
+          </w:p>
+        </w:tc>
+        <w:tc>
+          <w:tcPr>
+            <w:tcW w:type="dxa" w:w="4195"/>
+            <w:tcBorders>
+              <w:top w:val="single" w:sz="4" w:space="0" w:color="1F3A5F"/>
+              <w:left w:val="single" w:sz="4" w:space="0" w:color="1F3A5F"/>
+              <w:bottom w:val="single" w:sz="4" w:space="0" w:color="1F3A5F"/>
+              <w:right w:val="single" w:sz="4" w:space="0" w:color="1F3A5F"/>
+            </w:tcBorders>
+            <w:shd w:fill="1F3A5F"/>
+          </w:tcPr>
+          <w:p>
+            <w:pPr>
+              <w:spacing w:after="20" w:line="259" w:lineRule="auto"/>
+              <w:jc w:val="center"/>
+            </w:pPr>
+            <w:r/>
+            <w:r>
+              <w:rPr>
+                <w:rFonts w:ascii="B Zar" w:hAnsi="B Zar"/>
+                <w:b/>
+                <w:color w:val="FFFFFF"/>
+                <w:sz w:val="17"/>
+              </w:rPr>
+              <w:t>کارکرد</w:t>
+            </w:r>
+          </w:p>
+        </w:tc>
+        <w:tc>
+          <w:tcPr>
+            <w:tcW w:type="dxa" w:w="3685"/>
+            <w:tcBorders>
+              <w:top w:val="single" w:sz="4" w:space="0" w:color="1F3A5F"/>
+              <w:left w:val="single" w:sz="4" w:space="0" w:color="1F3A5F"/>
+              <w:bottom w:val="single" w:sz="4" w:space="0" w:color="1F3A5F"/>
+              <w:right w:val="single" w:sz="4" w:space="0" w:color="1F3A5F"/>
+            </w:tcBorders>
+            <w:shd w:fill="1F3A5F"/>
+          </w:tcPr>
+          <w:p>
+            <w:pPr>
+              <w:spacing w:after="20" w:line="259" w:lineRule="auto"/>
+              <w:jc w:val="center"/>
+            </w:pPr>
+            <w:r/>
+            <w:r>
+              <w:rPr>
+                <w:rFonts w:ascii="B Zar" w:hAnsi="B Zar"/>
+                <w:b/>
+                <w:color w:val="FFFFFF"/>
+                <w:sz w:val="17"/>
+              </w:rPr>
+              <w:t>گیت</w:t>
+            </w:r>
+          </w:p>
+        </w:tc>
+      </w:tr>
+      <w:tr>
+        <w:tc>
+          <w:tcPr>
+            <w:tcW w:type="dxa" w:w="1984"/>
+            <w:tcBorders>
+              <w:top w:val="single" w:sz="3" w:space="0" w:color="D9E0E7"/>
+              <w:left w:val="single" w:sz="3" w:space="0" w:color="D9E0E7"/>
+              <w:bottom w:val="single" w:sz="3" w:space="0" w:color="D9E0E7"/>
+              <w:right w:val="single" w:sz="3" w:space="0" w:color="D9E0E7"/>
+            </w:tcBorders>
+            <w:shd w:fill="FFFFFF"/>
+          </w:tcPr>
+          <w:p>
+            <w:pPr>
+              <w:spacing w:after="20" w:line="259" w:lineRule="auto"/>
+              <w:jc w:val="right"/>
+            </w:pPr>
+            <w:r/>
+            <w:r>
+              <w:rPr>
+                <w:rFonts w:ascii="B Zar" w:hAnsi="B Zar"/>
+                <w:b w:val="0"/>
+                <w:color w:val="263238"/>
+                <w:sz w:val="17"/>
+              </w:rPr>
+              <w:t>prompt/event</w:t>
+            </w:r>
+          </w:p>
+        </w:tc>
+        <w:tc>
+          <w:tcPr>
+            <w:tcW w:type="dxa" w:w="4195"/>
+            <w:tcBorders>
+              <w:top w:val="single" w:sz="3" w:space="0" w:color="D9E0E7"/>
+              <w:left w:val="single" w:sz="3" w:space="0" w:color="D9E0E7"/>
+              <w:bottom w:val="single" w:sz="3" w:space="0" w:color="D9E0E7"/>
+              <w:right w:val="single" w:sz="3" w:space="0" w:color="D9E0E7"/>
+            </w:tcBorders>
+            <w:shd w:fill="FFFFFF"/>
+          </w:tcPr>
+          <w:p>
+            <w:pPr>
+              <w:spacing w:after="20" w:line="259" w:lineRule="auto"/>
+              <w:jc w:val="right"/>
+            </w:pPr>
+            <w:r/>
+            <w:r>
+              <w:rPr>
+                <w:rFonts w:ascii="B Zar" w:hAnsi="B Zar"/>
+                <w:b w:val="0"/>
+                <w:color w:val="263238"/>
+                <w:sz w:val="17"/>
+              </w:rPr>
+              <w:t>موقعیت و محدودیت خلاقیت را می‌سازد.</w:t>
+            </w:r>
+          </w:p>
+        </w:tc>
+        <w:tc>
+          <w:tcPr>
+            <w:tcW w:type="dxa" w:w="3685"/>
+            <w:tcBorders>
+              <w:top w:val="single" w:sz="3" w:space="0" w:color="D9E0E7"/>
+              <w:left w:val="single" w:sz="3" w:space="0" w:color="D9E0E7"/>
+              <w:bottom w:val="single" w:sz="3" w:space="0" w:color="D9E0E7"/>
+              <w:right w:val="single" w:sz="3" w:space="0" w:color="D9E0E7"/>
+            </w:tcBorders>
+            <w:shd w:fill="FFFFFF"/>
+          </w:tcPr>
+          <w:p>
+            <w:pPr>
+              <w:spacing w:after="20" w:line="259" w:lineRule="auto"/>
+              <w:jc w:val="right"/>
+            </w:pPr>
+            <w:r/>
+            <w:r>
+              <w:rPr>
+                <w:rFonts w:ascii="B Zar" w:hAnsi="B Zar"/>
+                <w:b w:val="0"/>
+                <w:color w:val="263238"/>
+                <w:sz w:val="17"/>
+              </w:rPr>
+              <w:t>cadence محتوای تازه باید پیش از launch قابل تولید باشد.</w:t>
+            </w:r>
+          </w:p>
+        </w:tc>
+      </w:tr>
+      <w:tr>
+        <w:tc>
+          <w:tcPr>
+            <w:tcW w:type="dxa" w:w="1984"/>
+            <w:tcBorders>
+              <w:top w:val="single" w:sz="3" w:space="0" w:color="D9E0E7"/>
+              <w:left w:val="single" w:sz="3" w:space="0" w:color="D9E0E7"/>
+              <w:bottom w:val="single" w:sz="3" w:space="0" w:color="D9E0E7"/>
+              <w:right w:val="single" w:sz="3" w:space="0" w:color="D9E0E7"/>
+            </w:tcBorders>
+            <w:shd w:fill="F5F7FA"/>
+          </w:tcPr>
+          <w:p>
+            <w:pPr>
+              <w:spacing w:after="20" w:line="259" w:lineRule="auto"/>
+              <w:jc w:val="right"/>
+            </w:pPr>
+            <w:r/>
+            <w:r>
+              <w:rPr>
+                <w:rFonts w:ascii="B Zar" w:hAnsi="B Zar"/>
+                <w:b w:val="0"/>
+                <w:color w:val="263238"/>
+                <w:sz w:val="17"/>
+              </w:rPr>
+              <w:t>creation + submit</w:t>
+            </w:r>
+          </w:p>
+        </w:tc>
+        <w:tc>
+          <w:tcPr>
+            <w:tcW w:type="dxa" w:w="4195"/>
+            <w:tcBorders>
+              <w:top w:val="single" w:sz="3" w:space="0" w:color="D9E0E7"/>
+              <w:left w:val="single" w:sz="3" w:space="0" w:color="D9E0E7"/>
+              <w:bottom w:val="single" w:sz="3" w:space="0" w:color="D9E0E7"/>
+              <w:right w:val="single" w:sz="3" w:space="0" w:color="D9E0E7"/>
+            </w:tcBorders>
+            <w:shd w:fill="F5F7FA"/>
+          </w:tcPr>
+          <w:p>
+            <w:pPr>
+              <w:spacing w:after="20" w:line="259" w:lineRule="auto"/>
+              <w:jc w:val="right"/>
+            </w:pPr>
+            <w:r/>
+            <w:r>
+              <w:rPr>
+                <w:rFonts w:ascii="B Zar" w:hAnsi="B Zar"/>
+                <w:b w:val="0"/>
+                <w:color w:val="263238"/>
+                <w:sz w:val="17"/>
+              </w:rPr>
+              <w:t>کاربر outfit/ظاهر را می‌سازد و وارد رقابت می‌کند.</w:t>
+            </w:r>
+          </w:p>
+        </w:tc>
+        <w:tc>
+          <w:tcPr>
+            <w:tcW w:type="dxa" w:w="3685"/>
+            <w:tcBorders>
+              <w:top w:val="single" w:sz="3" w:space="0" w:color="D9E0E7"/>
+              <w:left w:val="single" w:sz="3" w:space="0" w:color="D9E0E7"/>
+              <w:bottom w:val="single" w:sz="3" w:space="0" w:color="D9E0E7"/>
+              <w:right w:val="single" w:sz="3" w:space="0" w:color="D9E0E7"/>
+            </w:tcBorders>
+            <w:shd w:fill="F5F7FA"/>
+          </w:tcPr>
+          <w:p>
+            <w:pPr>
+              <w:spacing w:after="20" w:line="259" w:lineRule="auto"/>
+              <w:jc w:val="right"/>
+            </w:pPr>
+            <w:r/>
+            <w:r>
+              <w:rPr>
+                <w:rFonts w:ascii="B Zar" w:hAnsi="B Zar"/>
+                <w:b w:val="0"/>
+                <w:color w:val="263238"/>
+                <w:sz w:val="17"/>
+              </w:rPr>
+              <w:t>onboarding و asset depth باید completion را ممکن کند.</w:t>
+            </w:r>
+          </w:p>
+        </w:tc>
+      </w:tr>
+      <w:tr>
+        <w:tc>
+          <w:tcPr>
+            <w:tcW w:type="dxa" w:w="1984"/>
+            <w:tcBorders>
+              <w:top w:val="single" w:sz="3" w:space="0" w:color="D9E0E7"/>
+              <w:left w:val="single" w:sz="3" w:space="0" w:color="D9E0E7"/>
+              <w:bottom w:val="single" w:sz="3" w:space="0" w:color="D9E0E7"/>
+              <w:right w:val="single" w:sz="3" w:space="0" w:color="D9E0E7"/>
+            </w:tcBorders>
+            <w:shd w:fill="FFFFFF"/>
+          </w:tcPr>
+          <w:p>
+            <w:pPr>
+              <w:spacing w:after="20" w:line="259" w:lineRule="auto"/>
+              <w:jc w:val="right"/>
+            </w:pPr>
+            <w:r/>
+            <w:r>
+              <w:rPr>
+                <w:rFonts w:ascii="B Zar" w:hAnsi="B Zar"/>
+                <w:b w:val="0"/>
+                <w:color w:val="263238"/>
+                <w:sz w:val="17"/>
+              </w:rPr>
+              <w:t>voting/social</w:t>
+            </w:r>
+          </w:p>
+        </w:tc>
+        <w:tc>
+          <w:tcPr>
+            <w:tcW w:type="dxa" w:w="4195"/>
+            <w:tcBorders>
+              <w:top w:val="single" w:sz="3" w:space="0" w:color="D9E0E7"/>
+              <w:left w:val="single" w:sz="3" w:space="0" w:color="D9E0E7"/>
+              <w:bottom w:val="single" w:sz="3" w:space="0" w:color="D9E0E7"/>
+              <w:right w:val="single" w:sz="3" w:space="0" w:color="D9E0E7"/>
+            </w:tcBorders>
+            <w:shd w:fill="FFFFFF"/>
+          </w:tcPr>
+          <w:p>
+            <w:pPr>
+              <w:spacing w:after="20" w:line="259" w:lineRule="auto"/>
+              <w:jc w:val="right"/>
+            </w:pPr>
+            <w:r/>
+            <w:r>
+              <w:rPr>
+                <w:rFonts w:ascii="B Zar" w:hAnsi="B Zar"/>
+                <w:b w:val="0"/>
+                <w:color w:val="263238"/>
+                <w:sz w:val="17"/>
+              </w:rPr>
+              <w:t>بازخورد، ranking و recognition می‌دهد.</w:t>
+            </w:r>
+          </w:p>
+        </w:tc>
+        <w:tc>
+          <w:tcPr>
+            <w:tcW w:type="dxa" w:w="3685"/>
+            <w:tcBorders>
+              <w:top w:val="single" w:sz="3" w:space="0" w:color="D9E0E7"/>
+              <w:left w:val="single" w:sz="3" w:space="0" w:color="D9E0E7"/>
+              <w:bottom w:val="single" w:sz="3" w:space="0" w:color="D9E0E7"/>
+              <w:right w:val="single" w:sz="3" w:space="0" w:color="D9E0E7"/>
+            </w:tcBorders>
+            <w:shd w:fill="FFFFFF"/>
+          </w:tcPr>
+          <w:p>
+            <w:pPr>
+              <w:spacing w:after="20" w:line="259" w:lineRule="auto"/>
+              <w:jc w:val="right"/>
+            </w:pPr>
+            <w:r/>
+            <w:r>
+              <w:rPr>
+                <w:rFonts w:ascii="B Zar" w:hAnsi="B Zar"/>
+                <w:b w:val="0"/>
+                <w:color w:val="263238"/>
+                <w:sz w:val="17"/>
+              </w:rPr>
+              <w:t>anti-abuse، fairness و safety ضروری است.</w:t>
+            </w:r>
+          </w:p>
+        </w:tc>
+      </w:tr>
+      <w:tr>
+        <w:tc>
+          <w:tcPr>
+            <w:tcW w:type="dxa" w:w="1984"/>
+            <w:tcBorders>
+              <w:top w:val="single" w:sz="3" w:space="0" w:color="D9E0E7"/>
+              <w:left w:val="single" w:sz="3" w:space="0" w:color="D9E0E7"/>
+              <w:bottom w:val="single" w:sz="3" w:space="0" w:color="D9E0E7"/>
+              <w:right w:val="single" w:sz="3" w:space="0" w:color="D9E0E7"/>
+            </w:tcBorders>
+            <w:shd w:fill="F5F7FA"/>
+          </w:tcPr>
+          <w:p>
+            <w:pPr>
+              <w:spacing w:after="20" w:line="259" w:lineRule="auto"/>
+              <w:jc w:val="right"/>
+            </w:pPr>
+            <w:r/>
+            <w:r>
+              <w:rPr>
+                <w:rFonts w:ascii="B Zar" w:hAnsi="B Zar"/>
+                <w:b w:val="0"/>
+                <w:color w:val="263238"/>
+                <w:sz w:val="17"/>
+              </w:rPr>
+              <w:t>reward/economy</w:t>
+            </w:r>
+          </w:p>
+        </w:tc>
+        <w:tc>
+          <w:tcPr>
+            <w:tcW w:type="dxa" w:w="4195"/>
+            <w:tcBorders>
+              <w:top w:val="single" w:sz="3" w:space="0" w:color="D9E0E7"/>
+              <w:left w:val="single" w:sz="3" w:space="0" w:color="D9E0E7"/>
+              <w:bottom w:val="single" w:sz="3" w:space="0" w:color="D9E0E7"/>
+              <w:right w:val="single" w:sz="3" w:space="0" w:color="D9E0E7"/>
+            </w:tcBorders>
+            <w:shd w:fill="F5F7FA"/>
+          </w:tcPr>
+          <w:p>
+            <w:pPr>
+              <w:spacing w:after="20" w:line="259" w:lineRule="auto"/>
+              <w:jc w:val="right"/>
+            </w:pPr>
+            <w:r/>
+            <w:r>
+              <w:rPr>
+                <w:rFonts w:ascii="B Zar" w:hAnsi="B Zar"/>
+                <w:b w:val="0"/>
+                <w:color w:val="263238"/>
+                <w:sz w:val="17"/>
+              </w:rPr>
+              <w:t>unlock و انگیزه بازگشت.</w:t>
+            </w:r>
+          </w:p>
+        </w:tc>
+        <w:tc>
+          <w:tcPr>
+            <w:tcW w:type="dxa" w:w="3685"/>
+            <w:tcBorders>
+              <w:top w:val="single" w:sz="3" w:space="0" w:color="D9E0E7"/>
+              <w:left w:val="single" w:sz="3" w:space="0" w:color="D9E0E7"/>
+              <w:bottom w:val="single" w:sz="3" w:space="0" w:color="D9E0E7"/>
+              <w:right w:val="single" w:sz="3" w:space="0" w:color="D9E0E7"/>
+            </w:tcBorders>
+            <w:shd w:fill="F5F7FA"/>
+          </w:tcPr>
+          <w:p>
+            <w:pPr>
+              <w:spacing w:after="20" w:line="259" w:lineRule="auto"/>
+              <w:jc w:val="right"/>
+            </w:pPr>
+            <w:r/>
+            <w:r>
+              <w:rPr>
+                <w:rFonts w:ascii="B Zar" w:hAnsi="B Zar"/>
+                <w:b w:val="0"/>
+                <w:color w:val="263238"/>
+                <w:sz w:val="17"/>
+              </w:rPr>
+              <w:t>cosmetic-first؛ pay-to-win و gacha بی‌حفاظ ممنوع.</w:t>
+            </w:r>
+          </w:p>
+        </w:tc>
+      </w:tr>
+    </w:tbl>
+    <w:p/>
+    <w:p>
+      <w:pPr>
+        <w:pStyle w:val="Heading2"/>
+        <w:spacing w:before="200" w:after="120"/>
+        <w:jc w:val="right"/>
+      </w:pPr>
+      <w:r>
+        <w:rPr>
+          <w:rFonts w:ascii="B Zar" w:hAnsi="B Zar"/>
+          <w:color w:val="1F7A70"/>
+          <w:sz w:val="26"/>
+        </w:rPr>
+        <w:t>۲. شواهد جهانی</w:t>
+      </w:r>
+    </w:p>
+    <w:p>
+      <w:pPr>
+        <w:spacing w:after="100" w:line="300" w:lineRule="auto"/>
+        <w:jc w:val="right"/>
+      </w:pPr>
+      <w:r>
+        <w:rPr>
+          <w:rFonts w:ascii="B Zar" w:hAnsi="B Zar"/>
+          <w:color w:val="263238"/>
+          <w:sz w:val="22"/>
+        </w:rPr>
+        <w:t>Covet Fashion در Google Play ۵۰M+ download، challenge، competition، رأی و virtual-currency IAP را نمایش می‌دهد. [F07-S01] SuitU در App Store، customization، competition/voting، feed، chat/social، OOTD sharing و disclosureهای IAP/UGC/loot box را معرفی می‌کند. [F07-S02] Nikki category را با story، collection و dress-up ادامه‌دار نشان می‌دهد. [F07-S03][F07-S04] این‌ها category proof هستند؛ دانلود/درآمد/مقیاس آنها به ایران تعمیم داده نمی‌شود.</w:t>
+      </w:r>
+    </w:p>
+    <w:tbl>
+      <w:tblPr>
+        <w:bidiVisual w:val="1"/>
+        <w:tblW w:type="auto" w:w="0"/>
+        <w:tblLayout w:type="autofit"/>
+        <w:tblLook w:firstColumn="1" w:firstRow="1" w:lastColumn="0" w:lastRow="0" w:noHBand="0" w:noVBand="1" w:val="04A0"/>
+      </w:tblPr>
+      <w:tblGrid>
+        <w:gridCol w:w="3213"/>
+        <w:gridCol w:w="3213"/>
+        <w:gridCol w:w="3213"/>
+      </w:tblGrid>
+      <w:tr>
+        <w:tc>
+          <w:tcPr>
+            <w:tcW w:type="dxa" w:w="2268"/>
+            <w:tcBorders>
+              <w:top w:val="single" w:sz="4" w:space="0" w:color="1F3A5F"/>
+              <w:left w:val="single" w:sz="4" w:space="0" w:color="1F3A5F"/>
+              <w:bottom w:val="single" w:sz="4" w:space="0" w:color="1F3A5F"/>
+              <w:right w:val="single" w:sz="4" w:space="0" w:color="1F3A5F"/>
+            </w:tcBorders>
+            <w:shd w:fill="1F3A5F"/>
+          </w:tcPr>
+          <w:p>
+            <w:pPr>
+              <w:spacing w:after="20" w:line="259" w:lineRule="auto"/>
+              <w:jc w:val="center"/>
+            </w:pPr>
+            <w:r/>
+            <w:r>
+              <w:rPr>
+                <w:rFonts w:ascii="B Zar" w:hAnsi="B Zar"/>
+                <w:b/>
+                <w:color w:val="FFFFFF"/>
+                <w:sz w:val="17"/>
+              </w:rPr>
+              <w:t>benchmark</w:t>
+            </w:r>
+          </w:p>
+        </w:tc>
+        <w:tc>
+          <w:tcPr>
+            <w:tcW w:type="dxa" w:w="3855"/>
+            <w:tcBorders>
+              <w:top w:val="single" w:sz="4" w:space="0" w:color="1F3A5F"/>
+              <w:left w:val="single" w:sz="4" w:space="0" w:color="1F3A5F"/>
+              <w:bottom w:val="single" w:sz="4" w:space="0" w:color="1F3A5F"/>
+              <w:right w:val="single" w:sz="4" w:space="0" w:color="1F3A5F"/>
+            </w:tcBorders>
+            <w:shd w:fill="1F3A5F"/>
+          </w:tcPr>
+          <w:p>
+            <w:pPr>
+              <w:spacing w:after="20" w:line="259" w:lineRule="auto"/>
+              <w:jc w:val="center"/>
+            </w:pPr>
+            <w:r/>
+            <w:r>
+              <w:rPr>
+                <w:rFonts w:ascii="B Zar" w:hAnsi="B Zar"/>
+                <w:b/>
+                <w:color w:val="FFFFFF"/>
+                <w:sz w:val="17"/>
+              </w:rPr>
+              <w:t>مکانیک</w:t>
+            </w:r>
+          </w:p>
+        </w:tc>
+        <w:tc>
+          <w:tcPr>
+            <w:tcW w:type="dxa" w:w="3742"/>
+            <w:tcBorders>
+              <w:top w:val="single" w:sz="4" w:space="0" w:color="1F3A5F"/>
+              <w:left w:val="single" w:sz="4" w:space="0" w:color="1F3A5F"/>
+              <w:bottom w:val="single" w:sz="4" w:space="0" w:color="1F3A5F"/>
+              <w:right w:val="single" w:sz="4" w:space="0" w:color="1F3A5F"/>
+            </w:tcBorders>
+            <w:shd w:fill="1F3A5F"/>
+          </w:tcPr>
+          <w:p>
+            <w:pPr>
+              <w:spacing w:after="20" w:line="259" w:lineRule="auto"/>
+              <w:jc w:val="center"/>
+            </w:pPr>
+            <w:r/>
+            <w:r>
+              <w:rPr>
+                <w:rFonts w:ascii="B Zar" w:hAnsi="B Zar"/>
+                <w:b/>
+                <w:color w:val="FFFFFF"/>
+                <w:sz w:val="17"/>
+              </w:rPr>
+              <w:t>درس</w:t>
+            </w:r>
+          </w:p>
+        </w:tc>
+      </w:tr>
+      <w:tr>
+        <w:tc>
+          <w:tcPr>
+            <w:tcW w:type="dxa" w:w="2268"/>
+            <w:tcBorders>
+              <w:top w:val="single" w:sz="3" w:space="0" w:color="D9E0E7"/>
+              <w:left w:val="single" w:sz="3" w:space="0" w:color="D9E0E7"/>
+              <w:bottom w:val="single" w:sz="3" w:space="0" w:color="D9E0E7"/>
+              <w:right w:val="single" w:sz="3" w:space="0" w:color="D9E0E7"/>
+            </w:tcBorders>
+            <w:shd w:fill="FFFFFF"/>
+          </w:tcPr>
+          <w:p>
+            <w:pPr>
+              <w:spacing w:after="20" w:line="259" w:lineRule="auto"/>
+              <w:jc w:val="right"/>
+            </w:pPr>
+            <w:r/>
+            <w:r>
+              <w:rPr>
+                <w:rFonts w:ascii="B Zar" w:hAnsi="B Zar"/>
+                <w:b w:val="0"/>
+                <w:color w:val="263238"/>
+                <w:sz w:val="17"/>
+              </w:rPr>
+              <w:t>Covet Fashion</w:t>
+            </w:r>
+          </w:p>
+        </w:tc>
+        <w:tc>
+          <w:tcPr>
+            <w:tcW w:type="dxa" w:w="3855"/>
+            <w:tcBorders>
+              <w:top w:val="single" w:sz="3" w:space="0" w:color="D9E0E7"/>
+              <w:left w:val="single" w:sz="3" w:space="0" w:color="D9E0E7"/>
+              <w:bottom w:val="single" w:sz="3" w:space="0" w:color="D9E0E7"/>
+              <w:right w:val="single" w:sz="3" w:space="0" w:color="D9E0E7"/>
+            </w:tcBorders>
+            <w:shd w:fill="FFFFFF"/>
+          </w:tcPr>
+          <w:p>
+            <w:pPr>
+              <w:spacing w:after="20" w:line="259" w:lineRule="auto"/>
+              <w:jc w:val="right"/>
+            </w:pPr>
+            <w:r/>
+            <w:r>
+              <w:rPr>
+                <w:rFonts w:ascii="B Zar" w:hAnsi="B Zar"/>
+                <w:b w:val="0"/>
+                <w:color w:val="263238"/>
+                <w:sz w:val="17"/>
+              </w:rPr>
+              <w:t>challenge، vote، reward و currency.</w:t>
+            </w:r>
+          </w:p>
+        </w:tc>
+        <w:tc>
+          <w:tcPr>
+            <w:tcW w:type="dxa" w:w="3742"/>
+            <w:tcBorders>
+              <w:top w:val="single" w:sz="3" w:space="0" w:color="D9E0E7"/>
+              <w:left w:val="single" w:sz="3" w:space="0" w:color="D9E0E7"/>
+              <w:bottom w:val="single" w:sz="3" w:space="0" w:color="D9E0E7"/>
+              <w:right w:val="single" w:sz="3" w:space="0" w:color="D9E0E7"/>
+            </w:tcBorders>
+            <w:shd w:fill="FFFFFF"/>
+          </w:tcPr>
+          <w:p>
+            <w:pPr>
+              <w:spacing w:after="20" w:line="259" w:lineRule="auto"/>
+              <w:jc w:val="right"/>
+            </w:pPr>
+            <w:r/>
+            <w:r>
+              <w:rPr>
+                <w:rFonts w:ascii="B Zar" w:hAnsi="B Zar"/>
+                <w:b w:val="0"/>
+                <w:color w:val="263238"/>
+                <w:sz w:val="17"/>
+              </w:rPr>
+              <w:t>creation و consumption رأی باید هم‌زمان loop بسازند.</w:t>
+            </w:r>
+          </w:p>
+        </w:tc>
+      </w:tr>
+      <w:tr>
+        <w:tc>
+          <w:tcPr>
+            <w:tcW w:type="dxa" w:w="2268"/>
+            <w:tcBorders>
+              <w:top w:val="single" w:sz="3" w:space="0" w:color="D9E0E7"/>
+              <w:left w:val="single" w:sz="3" w:space="0" w:color="D9E0E7"/>
+              <w:bottom w:val="single" w:sz="3" w:space="0" w:color="D9E0E7"/>
+              <w:right w:val="single" w:sz="3" w:space="0" w:color="D9E0E7"/>
+            </w:tcBorders>
+            <w:shd w:fill="F5F7FA"/>
+          </w:tcPr>
+          <w:p>
+            <w:pPr>
+              <w:spacing w:after="20" w:line="259" w:lineRule="auto"/>
+              <w:jc w:val="right"/>
+            </w:pPr>
+            <w:r/>
+            <w:r>
+              <w:rPr>
+                <w:rFonts w:ascii="B Zar" w:hAnsi="B Zar"/>
+                <w:b w:val="0"/>
+                <w:color w:val="263238"/>
+                <w:sz w:val="17"/>
+              </w:rPr>
+              <w:t>SuitU</w:t>
+            </w:r>
+          </w:p>
+        </w:tc>
+        <w:tc>
+          <w:tcPr>
+            <w:tcW w:type="dxa" w:w="3855"/>
+            <w:tcBorders>
+              <w:top w:val="single" w:sz="3" w:space="0" w:color="D9E0E7"/>
+              <w:left w:val="single" w:sz="3" w:space="0" w:color="D9E0E7"/>
+              <w:bottom w:val="single" w:sz="3" w:space="0" w:color="D9E0E7"/>
+              <w:right w:val="single" w:sz="3" w:space="0" w:color="D9E0E7"/>
+            </w:tcBorders>
+            <w:shd w:fill="F5F7FA"/>
+          </w:tcPr>
+          <w:p>
+            <w:pPr>
+              <w:spacing w:after="20" w:line="259" w:lineRule="auto"/>
+              <w:jc w:val="right"/>
+            </w:pPr>
+            <w:r/>
+            <w:r>
+              <w:rPr>
+                <w:rFonts w:ascii="B Zar" w:hAnsi="B Zar"/>
+                <w:b w:val="0"/>
+                <w:color w:val="263238"/>
+                <w:sz w:val="17"/>
+              </w:rPr>
+              <w:t>competition، feed/chat، follow، event و avatar.</w:t>
+            </w:r>
+          </w:p>
+        </w:tc>
+        <w:tc>
+          <w:tcPr>
+            <w:tcW w:type="dxa" w:w="3742"/>
+            <w:tcBorders>
+              <w:top w:val="single" w:sz="3" w:space="0" w:color="D9E0E7"/>
+              <w:left w:val="single" w:sz="3" w:space="0" w:color="D9E0E7"/>
+              <w:bottom w:val="single" w:sz="3" w:space="0" w:color="D9E0E7"/>
+              <w:right w:val="single" w:sz="3" w:space="0" w:color="D9E0E7"/>
+            </w:tcBorders>
+            <w:shd w:fill="F5F7FA"/>
+          </w:tcPr>
+          <w:p>
+            <w:pPr>
+              <w:spacing w:after="20" w:line="259" w:lineRule="auto"/>
+              <w:jc w:val="right"/>
+            </w:pPr>
+            <w:r/>
+            <w:r>
+              <w:rPr>
+                <w:rFonts w:ascii="B Zar" w:hAnsi="B Zar"/>
+                <w:b w:val="0"/>
+                <w:color w:val="263238"/>
+                <w:sz w:val="17"/>
+              </w:rPr>
+              <w:t>social layer و safety/Live Ops از wardrobe مهم‌ترند.</w:t>
+            </w:r>
+          </w:p>
+        </w:tc>
+      </w:tr>
+      <w:tr>
+        <w:tc>
+          <w:tcPr>
+            <w:tcW w:type="dxa" w:w="2268"/>
+            <w:tcBorders>
+              <w:top w:val="single" w:sz="3" w:space="0" w:color="D9E0E7"/>
+              <w:left w:val="single" w:sz="3" w:space="0" w:color="D9E0E7"/>
+              <w:bottom w:val="single" w:sz="3" w:space="0" w:color="D9E0E7"/>
+              <w:right w:val="single" w:sz="3" w:space="0" w:color="D9E0E7"/>
+            </w:tcBorders>
+            <w:shd w:fill="FFFFFF"/>
+          </w:tcPr>
+          <w:p>
+            <w:pPr>
+              <w:spacing w:after="20" w:line="259" w:lineRule="auto"/>
+              <w:jc w:val="right"/>
+            </w:pPr>
+            <w:r/>
+            <w:r>
+              <w:rPr>
+                <w:rFonts w:ascii="B Zar" w:hAnsi="B Zar"/>
+                <w:b w:val="0"/>
+                <w:color w:val="263238"/>
+                <w:sz w:val="17"/>
+              </w:rPr>
+              <w:t>Nikki family</w:t>
+            </w:r>
+          </w:p>
+        </w:tc>
+        <w:tc>
+          <w:tcPr>
+            <w:tcW w:type="dxa" w:w="3855"/>
+            <w:tcBorders>
+              <w:top w:val="single" w:sz="3" w:space="0" w:color="D9E0E7"/>
+              <w:left w:val="single" w:sz="3" w:space="0" w:color="D9E0E7"/>
+              <w:bottom w:val="single" w:sz="3" w:space="0" w:color="D9E0E7"/>
+              <w:right w:val="single" w:sz="3" w:space="0" w:color="D9E0E7"/>
+            </w:tcBorders>
+            <w:shd w:fill="FFFFFF"/>
+          </w:tcPr>
+          <w:p>
+            <w:pPr>
+              <w:spacing w:after="20" w:line="259" w:lineRule="auto"/>
+              <w:jc w:val="right"/>
+            </w:pPr>
+            <w:r/>
+            <w:r>
+              <w:rPr>
+                <w:rFonts w:ascii="B Zar" w:hAnsi="B Zar"/>
+                <w:b w:val="0"/>
+                <w:color w:val="263238"/>
+                <w:sz w:val="17"/>
+              </w:rPr>
+              <w:t>story، collection، crafting و art pipeline.</w:t>
+            </w:r>
+          </w:p>
+        </w:tc>
+        <w:tc>
+          <w:tcPr>
+            <w:tcW w:type="dxa" w:w="3742"/>
+            <w:tcBorders>
+              <w:top w:val="single" w:sz="3" w:space="0" w:color="D9E0E7"/>
+              <w:left w:val="single" w:sz="3" w:space="0" w:color="D9E0E7"/>
+              <w:bottom w:val="single" w:sz="3" w:space="0" w:color="D9E0E7"/>
+              <w:right w:val="single" w:sz="3" w:space="0" w:color="D9E0E7"/>
+            </w:tcBorders>
+            <w:shd w:fill="FFFFFF"/>
+          </w:tcPr>
+          <w:p>
+            <w:pPr>
+              <w:spacing w:after="20" w:line="259" w:lineRule="auto"/>
+              <w:jc w:val="right"/>
+            </w:pPr>
+            <w:r/>
+            <w:r>
+              <w:rPr>
+                <w:rFonts w:ascii="B Zar" w:hAnsi="B Zar"/>
+                <w:b w:val="0"/>
+                <w:color w:val="263238"/>
+                <w:sz w:val="17"/>
+              </w:rPr>
+              <w:t>retention به content production بلندمدت وابسته است.</w:t>
+            </w:r>
+          </w:p>
+        </w:tc>
+      </w:tr>
+    </w:tbl>
+    <w:p/>
+    <w:p>
+      <w:pPr>
+        <w:pStyle w:val="Heading2"/>
+        <w:spacing w:before="200" w:after="120"/>
+        <w:jc w:val="right"/>
+      </w:pPr>
+      <w:r>
+        <w:rPr>
+          <w:rFonts w:ascii="B Zar" w:hAnsi="B Zar"/>
+          <w:color w:val="1F7A70"/>
+          <w:sz w:val="26"/>
+        </w:rPr>
+        <w:t>۳. ایران و substituteهای واقعی</w:t>
+      </w:r>
+    </w:p>
+    <w:p>
+      <w:pPr>
+        <w:spacing w:after="100" w:line="300" w:lineRule="auto"/>
+        <w:jc w:val="right"/>
+      </w:pPr>
+      <w:r>
+        <w:rPr>
+          <w:rFonts w:ascii="B Zar" w:hAnsi="B Zar"/>
+          <w:color w:val="263238"/>
+          <w:sz w:val="22"/>
+        </w:rPr>
+        <w:t>پرداخت ریالی درون‌برنامه‌ای برای بازی در فروشگاه‌های داخلی وجود دارد؛ این صرفاً rail پرداخت است. [F07-S05] بازی ایرانی مُدا در ۱۳۹۵/۲۰۱۷ با dress-up تم ایرانی/اسلامی و اشتراک تصویر معرفی شد. [F07-S06] listingهای جاری Myket برای Fashion Star (۲۰۰هزار download claim) و Fashion Quest، dress-up، challenge، competition و social scoring را نشان می‌دهند. [F07-S07][F07-S08] بنابراین «بازی لباس با رنگ محلی» white space اثبات‌شده نیست.</w:t>
+      </w:r>
+    </w:p>
+    <w:tbl>
+      <w:tblPr>
+        <w:bidiVisual w:val="1"/>
+        <w:tblW w:type="auto" w:w="0"/>
+        <w:tblLayout w:type="autofit"/>
+        <w:tblLook w:firstColumn="1" w:firstRow="1" w:lastColumn="0" w:lastRow="0" w:noHBand="0" w:noVBand="1" w:val="04A0"/>
+      </w:tblPr>
+      <w:tblGrid>
+        <w:gridCol w:w="3213"/>
+        <w:gridCol w:w="3213"/>
+        <w:gridCol w:w="3213"/>
+      </w:tblGrid>
+      <w:tr>
+        <w:tc>
+          <w:tcPr>
+            <w:tcW w:type="dxa" w:w="2268"/>
+            <w:tcBorders>
+              <w:top w:val="single" w:sz="4" w:space="0" w:color="1F3A5F"/>
+              <w:left w:val="single" w:sz="4" w:space="0" w:color="1F3A5F"/>
+              <w:bottom w:val="single" w:sz="4" w:space="0" w:color="1F3A5F"/>
+              <w:right w:val="single" w:sz="4" w:space="0" w:color="1F3A5F"/>
+            </w:tcBorders>
+            <w:shd w:fill="1F3A5F"/>
+          </w:tcPr>
+          <w:p>
+            <w:pPr>
+              <w:spacing w:after="20" w:line="259" w:lineRule="auto"/>
+              <w:jc w:val="center"/>
+            </w:pPr>
+            <w:r/>
+            <w:r>
+              <w:rPr>
+                <w:rFonts w:ascii="B Zar" w:hAnsi="B Zar"/>
+                <w:b/>
+                <w:color w:val="FFFFFF"/>
+                <w:sz w:val="17"/>
+              </w:rPr>
+              <w:t>جایگزین</w:t>
+            </w:r>
+          </w:p>
+        </w:tc>
+        <w:tc>
+          <w:tcPr>
+            <w:tcW w:type="dxa" w:w="3855"/>
+            <w:tcBorders>
+              <w:top w:val="single" w:sz="4" w:space="0" w:color="1F3A5F"/>
+              <w:left w:val="single" w:sz="4" w:space="0" w:color="1F3A5F"/>
+              <w:bottom w:val="single" w:sz="4" w:space="0" w:color="1F3A5F"/>
+              <w:right w:val="single" w:sz="4" w:space="0" w:color="1F3A5F"/>
+            </w:tcBorders>
+            <w:shd w:fill="1F3A5F"/>
+          </w:tcPr>
+          <w:p>
+            <w:pPr>
+              <w:spacing w:after="20" w:line="259" w:lineRule="auto"/>
+              <w:jc w:val="center"/>
+            </w:pPr>
+            <w:r/>
+            <w:r>
+              <w:rPr>
+                <w:rFonts w:ascii="B Zar" w:hAnsi="B Zar"/>
+                <w:b/>
+                <w:color w:val="FFFFFF"/>
+                <w:sz w:val="17"/>
+              </w:rPr>
+              <w:t>ارزش فعلی</w:t>
+            </w:r>
+          </w:p>
+        </w:tc>
+        <w:tc>
+          <w:tcPr>
+            <w:tcW w:type="dxa" w:w="3742"/>
+            <w:tcBorders>
+              <w:top w:val="single" w:sz="4" w:space="0" w:color="1F3A5F"/>
+              <w:left w:val="single" w:sz="4" w:space="0" w:color="1F3A5F"/>
+              <w:bottom w:val="single" w:sz="4" w:space="0" w:color="1F3A5F"/>
+              <w:right w:val="single" w:sz="4" w:space="0" w:color="1F3A5F"/>
+            </w:tcBorders>
+            <w:shd w:fill="1F3A5F"/>
+          </w:tcPr>
+          <w:p>
+            <w:pPr>
+              <w:spacing w:after="20" w:line="259" w:lineRule="auto"/>
+              <w:jc w:val="center"/>
+            </w:pPr>
+            <w:r/>
+            <w:r>
+              <w:rPr>
+                <w:rFonts w:ascii="B Zar" w:hAnsi="B Zar"/>
+                <w:b/>
+                <w:color w:val="FFFFFF"/>
+                <w:sz w:val="17"/>
+              </w:rPr>
+              <w:t>اثر</w:t>
+            </w:r>
+          </w:p>
+        </w:tc>
+      </w:tr>
+      <w:tr>
+        <w:tc>
+          <w:tcPr>
+            <w:tcW w:type="dxa" w:w="2268"/>
+            <w:tcBorders>
+              <w:top w:val="single" w:sz="3" w:space="0" w:color="D9E0E7"/>
+              <w:left w:val="single" w:sz="3" w:space="0" w:color="D9E0E7"/>
+              <w:bottom w:val="single" w:sz="3" w:space="0" w:color="D9E0E7"/>
+              <w:right w:val="single" w:sz="3" w:space="0" w:color="D9E0E7"/>
+            </w:tcBorders>
+            <w:shd w:fill="FFFFFF"/>
+          </w:tcPr>
+          <w:p>
+            <w:pPr>
+              <w:spacing w:after="20" w:line="259" w:lineRule="auto"/>
+              <w:jc w:val="right"/>
+            </w:pPr>
+            <w:r/>
+            <w:r>
+              <w:rPr>
+                <w:rFonts w:ascii="B Zar" w:hAnsi="B Zar"/>
+                <w:b w:val="0"/>
+                <w:color w:val="263238"/>
+                <w:sz w:val="17"/>
+              </w:rPr>
+              <w:t>dress-up/makeup gameها</w:t>
+            </w:r>
+          </w:p>
+        </w:tc>
+        <w:tc>
+          <w:tcPr>
+            <w:tcW w:type="dxa" w:w="3855"/>
+            <w:tcBorders>
+              <w:top w:val="single" w:sz="3" w:space="0" w:color="D9E0E7"/>
+              <w:left w:val="single" w:sz="3" w:space="0" w:color="D9E0E7"/>
+              <w:bottom w:val="single" w:sz="3" w:space="0" w:color="D9E0E7"/>
+              <w:right w:val="single" w:sz="3" w:space="0" w:color="D9E0E7"/>
+            </w:tcBorders>
+            <w:shd w:fill="FFFFFF"/>
+          </w:tcPr>
+          <w:p>
+            <w:pPr>
+              <w:spacing w:after="20" w:line="259" w:lineRule="auto"/>
+              <w:jc w:val="right"/>
+            </w:pPr>
+            <w:r/>
+            <w:r>
+              <w:rPr>
+                <w:rFonts w:ascii="B Zar" w:hAnsi="B Zar"/>
+                <w:b w:val="0"/>
+                <w:color w:val="263238"/>
+                <w:sz w:val="17"/>
+              </w:rPr>
+              <w:t>آواتار، لباس، collection و گاه competition.</w:t>
+            </w:r>
+          </w:p>
+        </w:tc>
+        <w:tc>
+          <w:tcPr>
+            <w:tcW w:type="dxa" w:w="3742"/>
+            <w:tcBorders>
+              <w:top w:val="single" w:sz="3" w:space="0" w:color="D9E0E7"/>
+              <w:left w:val="single" w:sz="3" w:space="0" w:color="D9E0E7"/>
+              <w:bottom w:val="single" w:sz="3" w:space="0" w:color="D9E0E7"/>
+              <w:right w:val="single" w:sz="3" w:space="0" w:color="D9E0E7"/>
+            </w:tcBorders>
+            <w:shd w:fill="FFFFFF"/>
+          </w:tcPr>
+          <w:p>
+            <w:pPr>
+              <w:spacing w:after="20" w:line="259" w:lineRule="auto"/>
+              <w:jc w:val="right"/>
+            </w:pPr>
+            <w:r/>
+            <w:r>
+              <w:rPr>
+                <w:rFonts w:ascii="B Zar" w:hAnsi="B Zar"/>
+                <w:b w:val="0"/>
+                <w:color w:val="263238"/>
+                <w:sz w:val="17"/>
+              </w:rPr>
+              <w:t>novelty لباس پوشاندن به‌تنهایی moat نیست.</w:t>
+            </w:r>
+          </w:p>
+        </w:tc>
+      </w:tr>
+      <w:tr>
+        <w:tc>
+          <w:tcPr>
+            <w:tcW w:type="dxa" w:w="2268"/>
+            <w:tcBorders>
+              <w:top w:val="single" w:sz="3" w:space="0" w:color="D9E0E7"/>
+              <w:left w:val="single" w:sz="3" w:space="0" w:color="D9E0E7"/>
+              <w:bottom w:val="single" w:sz="3" w:space="0" w:color="D9E0E7"/>
+              <w:right w:val="single" w:sz="3" w:space="0" w:color="D9E0E7"/>
+            </w:tcBorders>
+            <w:shd w:fill="F5F7FA"/>
+          </w:tcPr>
+          <w:p>
+            <w:pPr>
+              <w:spacing w:after="20" w:line="259" w:lineRule="auto"/>
+              <w:jc w:val="right"/>
+            </w:pPr>
+            <w:r/>
+            <w:r>
+              <w:rPr>
+                <w:rFonts w:ascii="B Zar" w:hAnsi="B Zar"/>
+                <w:b w:val="0"/>
+                <w:color w:val="263238"/>
+                <w:sz w:val="17"/>
+              </w:rPr>
+              <w:t>مُدا/بازی‌های بومی</w:t>
+            </w:r>
+          </w:p>
+        </w:tc>
+        <w:tc>
+          <w:tcPr>
+            <w:tcW w:type="dxa" w:w="3855"/>
+            <w:tcBorders>
+              <w:top w:val="single" w:sz="3" w:space="0" w:color="D9E0E7"/>
+              <w:left w:val="single" w:sz="3" w:space="0" w:color="D9E0E7"/>
+              <w:bottom w:val="single" w:sz="3" w:space="0" w:color="D9E0E7"/>
+              <w:right w:val="single" w:sz="3" w:space="0" w:color="D9E0E7"/>
+            </w:tcBorders>
+            <w:shd w:fill="F5F7FA"/>
+          </w:tcPr>
+          <w:p>
+            <w:pPr>
+              <w:spacing w:after="20" w:line="259" w:lineRule="auto"/>
+              <w:jc w:val="right"/>
+            </w:pPr>
+            <w:r/>
+            <w:r>
+              <w:rPr>
+                <w:rFonts w:ascii="B Zar" w:hAnsi="B Zar"/>
+                <w:b w:val="0"/>
+                <w:color w:val="263238"/>
+                <w:sz w:val="17"/>
+              </w:rPr>
+              <w:t>theme محلی و اشتراک اجتماعی.</w:t>
+            </w:r>
+          </w:p>
+        </w:tc>
+        <w:tc>
+          <w:tcPr>
+            <w:tcW w:type="dxa" w:w="3742"/>
+            <w:tcBorders>
+              <w:top w:val="single" w:sz="3" w:space="0" w:color="D9E0E7"/>
+              <w:left w:val="single" w:sz="3" w:space="0" w:color="D9E0E7"/>
+              <w:bottom w:val="single" w:sz="3" w:space="0" w:color="D9E0E7"/>
+              <w:right w:val="single" w:sz="3" w:space="0" w:color="D9E0E7"/>
+            </w:tcBorders>
+            <w:shd w:fill="F5F7FA"/>
+          </w:tcPr>
+          <w:p>
+            <w:pPr>
+              <w:spacing w:after="20" w:line="259" w:lineRule="auto"/>
+              <w:jc w:val="right"/>
+            </w:pPr>
+            <w:r/>
+            <w:r>
+              <w:rPr>
+                <w:rFonts w:ascii="B Zar" w:hAnsi="B Zar"/>
+                <w:b w:val="0"/>
+                <w:color w:val="263238"/>
+                <w:sz w:val="17"/>
+              </w:rPr>
+              <w:t>نبود نمونه بومیِ فعال و بزرگ به‌تنهایی gap نیست.</w:t>
+            </w:r>
+          </w:p>
+        </w:tc>
+      </w:tr>
+      <w:tr>
+        <w:tc>
+          <w:tcPr>
+            <w:tcW w:type="dxa" w:w="2268"/>
+            <w:tcBorders>
+              <w:top w:val="single" w:sz="3" w:space="0" w:color="D9E0E7"/>
+              <w:left w:val="single" w:sz="3" w:space="0" w:color="D9E0E7"/>
+              <w:bottom w:val="single" w:sz="3" w:space="0" w:color="D9E0E7"/>
+              <w:right w:val="single" w:sz="3" w:space="0" w:color="D9E0E7"/>
+            </w:tcBorders>
+            <w:shd w:fill="FFFFFF"/>
+          </w:tcPr>
+          <w:p>
+            <w:pPr>
+              <w:spacing w:after="20" w:line="259" w:lineRule="auto"/>
+              <w:jc w:val="right"/>
+            </w:pPr>
+            <w:r/>
+            <w:r>
+              <w:rPr>
+                <w:rFonts w:ascii="B Zar" w:hAnsi="B Zar"/>
+                <w:b w:val="0"/>
+                <w:color w:val="263238"/>
+                <w:sz w:val="17"/>
+              </w:rPr>
+              <w:t>شبکه‌های اجتماعی</w:t>
+            </w:r>
+          </w:p>
+        </w:tc>
+        <w:tc>
+          <w:tcPr>
+            <w:tcW w:type="dxa" w:w="3855"/>
+            <w:tcBorders>
+              <w:top w:val="single" w:sz="3" w:space="0" w:color="D9E0E7"/>
+              <w:left w:val="single" w:sz="3" w:space="0" w:color="D9E0E7"/>
+              <w:bottom w:val="single" w:sz="3" w:space="0" w:color="D9E0E7"/>
+              <w:right w:val="single" w:sz="3" w:space="0" w:color="D9E0E7"/>
+            </w:tcBorders>
+            <w:shd w:fill="FFFFFF"/>
+          </w:tcPr>
+          <w:p>
+            <w:pPr>
+              <w:spacing w:after="20" w:line="259" w:lineRule="auto"/>
+              <w:jc w:val="right"/>
+            </w:pPr>
+            <w:r/>
+            <w:r>
+              <w:rPr>
+                <w:rFonts w:ascii="B Zar" w:hAnsi="B Zar"/>
+                <w:b w:val="0"/>
+                <w:color w:val="263238"/>
+                <w:sz w:val="17"/>
+              </w:rPr>
+              <w:t>نمایش استایل، feedback و status.</w:t>
+            </w:r>
+          </w:p>
+        </w:tc>
+        <w:tc>
+          <w:tcPr>
+            <w:tcW w:type="dxa" w:w="3742"/>
+            <w:tcBorders>
+              <w:top w:val="single" w:sz="3" w:space="0" w:color="D9E0E7"/>
+              <w:left w:val="single" w:sz="3" w:space="0" w:color="D9E0E7"/>
+              <w:bottom w:val="single" w:sz="3" w:space="0" w:color="D9E0E7"/>
+              <w:right w:val="single" w:sz="3" w:space="0" w:color="D9E0E7"/>
+            </w:tcBorders>
+            <w:shd w:fill="FFFFFF"/>
+          </w:tcPr>
+          <w:p>
+            <w:pPr>
+              <w:spacing w:after="20" w:line="259" w:lineRule="auto"/>
+              <w:jc w:val="right"/>
+            </w:pPr>
+            <w:r/>
+            <w:r>
+              <w:rPr>
+                <w:rFonts w:ascii="B Zar" w:hAnsi="B Zar"/>
+                <w:b w:val="0"/>
+                <w:color w:val="263238"/>
+                <w:sz w:val="17"/>
+              </w:rPr>
+              <w:t>برای UGC و attention substitute بسیار قوی‌اند.</w:t>
+            </w:r>
+          </w:p>
+        </w:tc>
+      </w:tr>
+      <w:tr>
+        <w:tc>
+          <w:tcPr>
+            <w:tcW w:type="dxa" w:w="2268"/>
+            <w:tcBorders>
+              <w:top w:val="single" w:sz="3" w:space="0" w:color="D9E0E7"/>
+              <w:left w:val="single" w:sz="3" w:space="0" w:color="D9E0E7"/>
+              <w:bottom w:val="single" w:sz="3" w:space="0" w:color="D9E0E7"/>
+              <w:right w:val="single" w:sz="3" w:space="0" w:color="D9E0E7"/>
+            </w:tcBorders>
+            <w:shd w:fill="F5F7FA"/>
+          </w:tcPr>
+          <w:p>
+            <w:pPr>
+              <w:spacing w:after="20" w:line="259" w:lineRule="auto"/>
+              <w:jc w:val="right"/>
+            </w:pPr>
+            <w:r/>
+            <w:r>
+              <w:rPr>
+                <w:rFonts w:ascii="B Zar" w:hAnsi="B Zar"/>
+                <w:b w:val="0"/>
+                <w:color w:val="263238"/>
+                <w:sz w:val="17"/>
+              </w:rPr>
+              <w:t>بازی‌های casual/community</w:t>
+            </w:r>
+          </w:p>
+        </w:tc>
+        <w:tc>
+          <w:tcPr>
+            <w:tcW w:type="dxa" w:w="3855"/>
+            <w:tcBorders>
+              <w:top w:val="single" w:sz="3" w:space="0" w:color="D9E0E7"/>
+              <w:left w:val="single" w:sz="3" w:space="0" w:color="D9E0E7"/>
+              <w:bottom w:val="single" w:sz="3" w:space="0" w:color="D9E0E7"/>
+              <w:right w:val="single" w:sz="3" w:space="0" w:color="D9E0E7"/>
+            </w:tcBorders>
+            <w:shd w:fill="F5F7FA"/>
+          </w:tcPr>
+          <w:p>
+            <w:pPr>
+              <w:spacing w:after="20" w:line="259" w:lineRule="auto"/>
+              <w:jc w:val="right"/>
+            </w:pPr>
+            <w:r/>
+            <w:r>
+              <w:rPr>
+                <w:rFonts w:ascii="B Zar" w:hAnsi="B Zar"/>
+                <w:b w:val="0"/>
+                <w:color w:val="263238"/>
+                <w:sz w:val="17"/>
+              </w:rPr>
+              <w:t>event، rank، reward و IAP.</w:t>
+            </w:r>
+          </w:p>
+        </w:tc>
+        <w:tc>
+          <w:tcPr>
+            <w:tcW w:type="dxa" w:w="3742"/>
+            <w:tcBorders>
+              <w:top w:val="single" w:sz="3" w:space="0" w:color="D9E0E7"/>
+              <w:left w:val="single" w:sz="3" w:space="0" w:color="D9E0E7"/>
+              <w:bottom w:val="single" w:sz="3" w:space="0" w:color="D9E0E7"/>
+              <w:right w:val="single" w:sz="3" w:space="0" w:color="D9E0E7"/>
+            </w:tcBorders>
+            <w:shd w:fill="F5F7FA"/>
+          </w:tcPr>
+          <w:p>
+            <w:pPr>
+              <w:spacing w:after="20" w:line="259" w:lineRule="auto"/>
+              <w:jc w:val="right"/>
+            </w:pPr>
+            <w:r/>
+            <w:r>
+              <w:rPr>
+                <w:rFonts w:ascii="B Zar" w:hAnsi="B Zar"/>
+                <w:b w:val="0"/>
+                <w:color w:val="263238"/>
+                <w:sz w:val="17"/>
+              </w:rPr>
+              <w:t>مدل با کل بودجه توجه/پرداخت بازی رقابت می‌کند.</w:t>
+            </w:r>
+          </w:p>
+        </w:tc>
+      </w:tr>
+    </w:tbl>
+    <w:p/>
+    <w:p>
+      <w:pPr>
+        <w:pStyle w:val="Heading2"/>
+        <w:spacing w:before="200" w:after="120"/>
+        <w:jc w:val="right"/>
+      </w:pPr>
+      <w:r>
+        <w:rPr>
+          <w:rFonts w:ascii="B Zar" w:hAnsi="B Zar"/>
+          <w:color w:val="1F7A70"/>
+          <w:sz w:val="26"/>
+        </w:rPr>
+        <w:t>۴. مشتری، بازار و مدل</w:t>
+      </w:r>
+    </w:p>
+    <w:p>
+      <w:pPr>
+        <w:spacing w:after="100" w:line="300" w:lineRule="auto"/>
+        <w:jc w:val="right"/>
+      </w:pPr>
+      <w:r>
+        <w:rPr>
+          <w:rFonts w:ascii="B Zar" w:hAnsi="B Zar"/>
+          <w:color w:val="263238"/>
+          <w:sz w:val="22"/>
+        </w:rPr>
+        <w:t>بازار مفهومی B2C mobile game است؛ buyer و user یکی‌اند، اما safety برای کاربر کم‌سن، اختیار پرداخت و سیاست محتوا باید جدا طراحی شود. مدل مشروط، free-to-play با cosmetics/currency/pass دیجیتال است؛ فروش پوشاک واقعی و marketplace خارج از مرز می‌مانند. دادهٔ قابل دفاع برای TAM/SAM/SOM، CPI، D1/D7/D30 retention، payer conversion، ARPDAU یا willingness-to-pay ایران پیدا نشد؛ دانلود listing یا وجود IAP جایگزین این داده‌ها نیست.</w:t>
+      </w:r>
+    </w:p>
+    <w:p>
+      <w:pPr>
+        <w:pStyle w:val="Heading2"/>
+        <w:spacing w:before="200" w:after="120"/>
+        <w:jc w:val="right"/>
+      </w:pPr>
+      <w:r>
+        <w:rPr>
+          <w:rFonts w:ascii="B Zar" w:hAnsi="B Zar"/>
+          <w:color w:val="1F7A70"/>
+          <w:sz w:val="26"/>
+        </w:rPr>
+        <w:t>۵. عملیات، ریسک و گیت بازگشایی</w:t>
+      </w:r>
+    </w:p>
+    <w:tbl>
+      <w:tblPr>
+        <w:bidiVisual w:val="1"/>
+        <w:tblW w:type="auto" w:w="0"/>
+        <w:tblLayout w:type="autofit"/>
+        <w:tblLook w:firstColumn="1" w:firstRow="1" w:lastColumn="0" w:lastRow="0" w:noHBand="0" w:noVBand="1" w:val="04A0"/>
+      </w:tblPr>
+      <w:tblGrid>
+        <w:gridCol w:w="3213"/>
+        <w:gridCol w:w="3213"/>
+        <w:gridCol w:w="3213"/>
+      </w:tblGrid>
+      <w:tr>
+        <w:tc>
+          <w:tcPr>
+            <w:tcW w:type="dxa" w:w="2665"/>
+            <w:tcBorders>
+              <w:top w:val="single" w:sz="4" w:space="0" w:color="1F3A5F"/>
+              <w:left w:val="single" w:sz="4" w:space="0" w:color="1F3A5F"/>
+              <w:bottom w:val="single" w:sz="4" w:space="0" w:color="1F3A5F"/>
+              <w:right w:val="single" w:sz="4" w:space="0" w:color="1F3A5F"/>
+            </w:tcBorders>
+            <w:shd w:fill="1F3A5F"/>
+          </w:tcPr>
+          <w:p>
+            <w:pPr>
+              <w:spacing w:after="20" w:line="259" w:lineRule="auto"/>
+              <w:jc w:val="center"/>
+            </w:pPr>
+            <w:r/>
+            <w:r>
+              <w:rPr>
+                <w:rFonts w:ascii="B Zar" w:hAnsi="B Zar"/>
+                <w:b/>
+                <w:color w:val="FFFFFF"/>
+                <w:sz w:val="17"/>
+              </w:rPr>
+              <w:t>ریسک</w:t>
+            </w:r>
+          </w:p>
+        </w:tc>
+        <w:tc>
+          <w:tcPr>
+            <w:tcW w:type="dxa" w:w="3005"/>
+            <w:tcBorders>
+              <w:top w:val="single" w:sz="4" w:space="0" w:color="1F3A5F"/>
+              <w:left w:val="single" w:sz="4" w:space="0" w:color="1F3A5F"/>
+              <w:bottom w:val="single" w:sz="4" w:space="0" w:color="1F3A5F"/>
+              <w:right w:val="single" w:sz="4" w:space="0" w:color="1F3A5F"/>
+            </w:tcBorders>
+            <w:shd w:fill="1F3A5F"/>
+          </w:tcPr>
+          <w:p>
+            <w:pPr>
+              <w:spacing w:after="20" w:line="259" w:lineRule="auto"/>
+              <w:jc w:val="center"/>
+            </w:pPr>
+            <w:r/>
+            <w:r>
+              <w:rPr>
+                <w:rFonts w:ascii="B Zar" w:hAnsi="B Zar"/>
+                <w:b/>
+                <w:color w:val="FFFFFF"/>
+                <w:sz w:val="17"/>
+              </w:rPr>
+              <w:t>اثر</w:t>
+            </w:r>
+          </w:p>
+        </w:tc>
+        <w:tc>
+          <w:tcPr>
+            <w:tcW w:type="dxa" w:w="4195"/>
+            <w:tcBorders>
+              <w:top w:val="single" w:sz="4" w:space="0" w:color="1F3A5F"/>
+              <w:left w:val="single" w:sz="4" w:space="0" w:color="1F3A5F"/>
+              <w:bottom w:val="single" w:sz="4" w:space="0" w:color="1F3A5F"/>
+              <w:right w:val="single" w:sz="4" w:space="0" w:color="1F3A5F"/>
+            </w:tcBorders>
+            <w:shd w:fill="1F3A5F"/>
+          </w:tcPr>
+          <w:p>
+            <w:pPr>
+              <w:spacing w:after="20" w:line="259" w:lineRule="auto"/>
+              <w:jc w:val="center"/>
+            </w:pPr>
+            <w:r/>
+            <w:r>
+              <w:rPr>
+                <w:rFonts w:ascii="B Zar" w:hAnsi="B Zar"/>
+                <w:b/>
+                <w:color w:val="FFFFFF"/>
+                <w:sz w:val="17"/>
+              </w:rPr>
+              <w:t>گیت/کاهش</w:t>
+            </w:r>
+          </w:p>
+        </w:tc>
+      </w:tr>
+      <w:tr>
+        <w:tc>
+          <w:tcPr>
+            <w:tcW w:type="dxa" w:w="2665"/>
+            <w:tcBorders>
+              <w:top w:val="single" w:sz="3" w:space="0" w:color="D9E0E7"/>
+              <w:left w:val="single" w:sz="3" w:space="0" w:color="D9E0E7"/>
+              <w:bottom w:val="single" w:sz="3" w:space="0" w:color="D9E0E7"/>
+              <w:right w:val="single" w:sz="3" w:space="0" w:color="D9E0E7"/>
+            </w:tcBorders>
+            <w:shd w:fill="FFFFFF"/>
+          </w:tcPr>
+          <w:p>
+            <w:pPr>
+              <w:spacing w:after="20" w:line="259" w:lineRule="auto"/>
+              <w:jc w:val="right"/>
+            </w:pPr>
+            <w:r/>
+            <w:r>
+              <w:rPr>
+                <w:rFonts w:ascii="B Zar" w:hAnsi="B Zar"/>
+                <w:b w:val="0"/>
+                <w:color w:val="263238"/>
+                <w:sz w:val="17"/>
+              </w:rPr>
+              <w:t>content treadmill</w:t>
+            </w:r>
+          </w:p>
+        </w:tc>
+        <w:tc>
+          <w:tcPr>
+            <w:tcW w:type="dxa" w:w="3005"/>
+            <w:tcBorders>
+              <w:top w:val="single" w:sz="3" w:space="0" w:color="D9E0E7"/>
+              <w:left w:val="single" w:sz="3" w:space="0" w:color="D9E0E7"/>
+              <w:bottom w:val="single" w:sz="3" w:space="0" w:color="D9E0E7"/>
+              <w:right w:val="single" w:sz="3" w:space="0" w:color="D9E0E7"/>
+            </w:tcBorders>
+            <w:shd w:fill="FFFFFF"/>
+          </w:tcPr>
+          <w:p>
+            <w:pPr>
+              <w:spacing w:after="20" w:line="259" w:lineRule="auto"/>
+              <w:jc w:val="right"/>
+            </w:pPr>
+            <w:r/>
+            <w:r>
+              <w:rPr>
+                <w:rFonts w:ascii="B Zar" w:hAnsi="B Zar"/>
+                <w:b w:val="0"/>
+                <w:color w:val="263238"/>
+                <w:sz w:val="17"/>
+              </w:rPr>
+              <w:t>بدون asset/event تازه retention می‌افتد.</w:t>
+            </w:r>
+          </w:p>
+        </w:tc>
+        <w:tc>
+          <w:tcPr>
+            <w:tcW w:type="dxa" w:w="4195"/>
+            <w:tcBorders>
+              <w:top w:val="single" w:sz="3" w:space="0" w:color="D9E0E7"/>
+              <w:left w:val="single" w:sz="3" w:space="0" w:color="D9E0E7"/>
+              <w:bottom w:val="single" w:sz="3" w:space="0" w:color="D9E0E7"/>
+              <w:right w:val="single" w:sz="3" w:space="0" w:color="D9E0E7"/>
+            </w:tcBorders>
+            <w:shd w:fill="FFFFFF"/>
+          </w:tcPr>
+          <w:p>
+            <w:pPr>
+              <w:spacing w:after="20" w:line="259" w:lineRule="auto"/>
+              <w:jc w:val="right"/>
+            </w:pPr>
+            <w:r/>
+            <w:r>
+              <w:rPr>
+                <w:rFonts w:ascii="B Zar" w:hAnsi="B Zar"/>
+                <w:b w:val="0"/>
+                <w:color w:val="263238"/>
+                <w:sz w:val="17"/>
+              </w:rPr>
+              <w:t>content pipeline با هزینه/زمان واقعی، پیش از scale.</w:t>
+            </w:r>
+          </w:p>
+        </w:tc>
+      </w:tr>
+      <w:tr>
+        <w:tc>
+          <w:tcPr>
+            <w:tcW w:type="dxa" w:w="2665"/>
+            <w:tcBorders>
+              <w:top w:val="single" w:sz="3" w:space="0" w:color="D9E0E7"/>
+              <w:left w:val="single" w:sz="3" w:space="0" w:color="D9E0E7"/>
+              <w:bottom w:val="single" w:sz="3" w:space="0" w:color="D9E0E7"/>
+              <w:right w:val="single" w:sz="3" w:space="0" w:color="D9E0E7"/>
+            </w:tcBorders>
+            <w:shd w:fill="F5F7FA"/>
+          </w:tcPr>
+          <w:p>
+            <w:pPr>
+              <w:spacing w:after="20" w:line="259" w:lineRule="auto"/>
+              <w:jc w:val="right"/>
+            </w:pPr>
+            <w:r/>
+            <w:r>
+              <w:rPr>
+                <w:rFonts w:ascii="B Zar" w:hAnsi="B Zar"/>
+                <w:b w:val="0"/>
+                <w:color w:val="263238"/>
+                <w:sz w:val="17"/>
+              </w:rPr>
+              <w:t>moderation/safety</w:t>
+            </w:r>
+          </w:p>
+        </w:tc>
+        <w:tc>
+          <w:tcPr>
+            <w:tcW w:type="dxa" w:w="3005"/>
+            <w:tcBorders>
+              <w:top w:val="single" w:sz="3" w:space="0" w:color="D9E0E7"/>
+              <w:left w:val="single" w:sz="3" w:space="0" w:color="D9E0E7"/>
+              <w:bottom w:val="single" w:sz="3" w:space="0" w:color="D9E0E7"/>
+              <w:right w:val="single" w:sz="3" w:space="0" w:color="D9E0E7"/>
+            </w:tcBorders>
+            <w:shd w:fill="F5F7FA"/>
+          </w:tcPr>
+          <w:p>
+            <w:pPr>
+              <w:spacing w:after="20" w:line="259" w:lineRule="auto"/>
+              <w:jc w:val="right"/>
+            </w:pPr>
+            <w:r/>
+            <w:r>
+              <w:rPr>
+                <w:rFonts w:ascii="B Zar" w:hAnsi="B Zar"/>
+                <w:b w:val="0"/>
+                <w:color w:val="263238"/>
+                <w:sz w:val="17"/>
+              </w:rPr>
+              <w:t>chat/UGC/rating می‌تواند harm و harassment بسازد.</w:t>
+            </w:r>
+          </w:p>
+        </w:tc>
+        <w:tc>
+          <w:tcPr>
+            <w:tcW w:type="dxa" w:w="4195"/>
+            <w:tcBorders>
+              <w:top w:val="single" w:sz="3" w:space="0" w:color="D9E0E7"/>
+              <w:left w:val="single" w:sz="3" w:space="0" w:color="D9E0E7"/>
+              <w:bottom w:val="single" w:sz="3" w:space="0" w:color="D9E0E7"/>
+              <w:right w:val="single" w:sz="3" w:space="0" w:color="D9E0E7"/>
+            </w:tcBorders>
+            <w:shd w:fill="F5F7FA"/>
+          </w:tcPr>
+          <w:p>
+            <w:pPr>
+              <w:spacing w:after="20" w:line="259" w:lineRule="auto"/>
+              <w:jc w:val="right"/>
+            </w:pPr>
+            <w:r/>
+            <w:r>
+              <w:rPr>
+                <w:rFonts w:ascii="B Zar" w:hAnsi="B Zar"/>
+                <w:b w:val="0"/>
+                <w:color w:val="263238"/>
+                <w:sz w:val="17"/>
+              </w:rPr>
+              <w:t>MVP بدون DM/public chat؛ report/block، age gate و escalation.</w:t>
+            </w:r>
+          </w:p>
+        </w:tc>
+      </w:tr>
+      <w:tr>
+        <w:tc>
+          <w:tcPr>
+            <w:tcW w:type="dxa" w:w="2665"/>
+            <w:tcBorders>
+              <w:top w:val="single" w:sz="3" w:space="0" w:color="D9E0E7"/>
+              <w:left w:val="single" w:sz="3" w:space="0" w:color="D9E0E7"/>
+              <w:bottom w:val="single" w:sz="3" w:space="0" w:color="D9E0E7"/>
+              <w:right w:val="single" w:sz="3" w:space="0" w:color="D9E0E7"/>
+            </w:tcBorders>
+            <w:shd w:fill="FFFFFF"/>
+          </w:tcPr>
+          <w:p>
+            <w:pPr>
+              <w:spacing w:after="20" w:line="259" w:lineRule="auto"/>
+              <w:jc w:val="right"/>
+            </w:pPr>
+            <w:r/>
+            <w:r>
+              <w:rPr>
+                <w:rFonts w:ascii="B Zar" w:hAnsi="B Zar"/>
+                <w:b w:val="0"/>
+                <w:color w:val="263238"/>
+                <w:sz w:val="17"/>
+              </w:rPr>
+              <w:t>رأی manipulated یا بی‌کیفیت</w:t>
+            </w:r>
+          </w:p>
+        </w:tc>
+        <w:tc>
+          <w:tcPr>
+            <w:tcW w:type="dxa" w:w="3005"/>
+            <w:tcBorders>
+              <w:top w:val="single" w:sz="3" w:space="0" w:color="D9E0E7"/>
+              <w:left w:val="single" w:sz="3" w:space="0" w:color="D9E0E7"/>
+              <w:bottom w:val="single" w:sz="3" w:space="0" w:color="D9E0E7"/>
+              <w:right w:val="single" w:sz="3" w:space="0" w:color="D9E0E7"/>
+            </w:tcBorders>
+            <w:shd w:fill="FFFFFF"/>
+          </w:tcPr>
+          <w:p>
+            <w:pPr>
+              <w:spacing w:after="20" w:line="259" w:lineRule="auto"/>
+              <w:jc w:val="right"/>
+            </w:pPr>
+            <w:r/>
+            <w:r>
+              <w:rPr>
+                <w:rFonts w:ascii="B Zar" w:hAnsi="B Zar"/>
+                <w:b w:val="0"/>
+                <w:color w:val="263238"/>
+                <w:sz w:val="17"/>
+              </w:rPr>
+              <w:t>fairness و churn آسیب می‌بیند.</w:t>
+            </w:r>
+          </w:p>
+        </w:tc>
+        <w:tc>
+          <w:tcPr>
+            <w:tcW w:type="dxa" w:w="4195"/>
+            <w:tcBorders>
+              <w:top w:val="single" w:sz="3" w:space="0" w:color="D9E0E7"/>
+              <w:left w:val="single" w:sz="3" w:space="0" w:color="D9E0E7"/>
+              <w:bottom w:val="single" w:sz="3" w:space="0" w:color="D9E0E7"/>
+              <w:right w:val="single" w:sz="3" w:space="0" w:color="D9E0E7"/>
+            </w:tcBorders>
+            <w:shd w:fill="FFFFFF"/>
+          </w:tcPr>
+          <w:p>
+            <w:pPr>
+              <w:spacing w:after="20" w:line="259" w:lineRule="auto"/>
+              <w:jc w:val="right"/>
+            </w:pPr>
+            <w:r/>
+            <w:r>
+              <w:rPr>
+                <w:rFonts w:ascii="B Zar" w:hAnsi="B Zar"/>
+                <w:b w:val="0"/>
+                <w:color w:val="263238"/>
+                <w:sz w:val="17"/>
+              </w:rPr>
+              <w:t>paired voting، anti-abuse و transparency reward.</w:t>
+            </w:r>
+          </w:p>
+        </w:tc>
+      </w:tr>
+      <w:tr>
+        <w:tc>
+          <w:tcPr>
+            <w:tcW w:type="dxa" w:w="2665"/>
+            <w:tcBorders>
+              <w:top w:val="single" w:sz="3" w:space="0" w:color="D9E0E7"/>
+              <w:left w:val="single" w:sz="3" w:space="0" w:color="D9E0E7"/>
+              <w:bottom w:val="single" w:sz="3" w:space="0" w:color="D9E0E7"/>
+              <w:right w:val="single" w:sz="3" w:space="0" w:color="D9E0E7"/>
+            </w:tcBorders>
+            <w:shd w:fill="F5F7FA"/>
+          </w:tcPr>
+          <w:p>
+            <w:pPr>
+              <w:spacing w:after="20" w:line="259" w:lineRule="auto"/>
+              <w:jc w:val="right"/>
+            </w:pPr>
+            <w:r/>
+            <w:r>
+              <w:rPr>
+                <w:rFonts w:ascii="B Zar" w:hAnsi="B Zar"/>
+                <w:b w:val="0"/>
+                <w:color w:val="263238"/>
+                <w:sz w:val="17"/>
+              </w:rPr>
+              <w:t>pay-to-win</w:t>
+            </w:r>
+          </w:p>
+        </w:tc>
+        <w:tc>
+          <w:tcPr>
+            <w:tcW w:type="dxa" w:w="3005"/>
+            <w:tcBorders>
+              <w:top w:val="single" w:sz="3" w:space="0" w:color="D9E0E7"/>
+              <w:left w:val="single" w:sz="3" w:space="0" w:color="D9E0E7"/>
+              <w:bottom w:val="single" w:sz="3" w:space="0" w:color="D9E0E7"/>
+              <w:right w:val="single" w:sz="3" w:space="0" w:color="D9E0E7"/>
+            </w:tcBorders>
+            <w:shd w:fill="F5F7FA"/>
+          </w:tcPr>
+          <w:p>
+            <w:pPr>
+              <w:spacing w:after="20" w:line="259" w:lineRule="auto"/>
+              <w:jc w:val="right"/>
+            </w:pPr>
+            <w:r/>
+            <w:r>
+              <w:rPr>
+                <w:rFonts w:ascii="B Zar" w:hAnsi="B Zar"/>
+                <w:b w:val="0"/>
+                <w:color w:val="263238"/>
+                <w:sz w:val="17"/>
+              </w:rPr>
+              <w:t>اعتماد و participation می‌ریزد.</w:t>
+            </w:r>
+          </w:p>
+        </w:tc>
+        <w:tc>
+          <w:tcPr>
+            <w:tcW w:type="dxa" w:w="4195"/>
+            <w:tcBorders>
+              <w:top w:val="single" w:sz="3" w:space="0" w:color="D9E0E7"/>
+              <w:left w:val="single" w:sz="3" w:space="0" w:color="D9E0E7"/>
+              <w:bottom w:val="single" w:sz="3" w:space="0" w:color="D9E0E7"/>
+              <w:right w:val="single" w:sz="3" w:space="0" w:color="D9E0E7"/>
+            </w:tcBorders>
+            <w:shd w:fill="F5F7FA"/>
+          </w:tcPr>
+          <w:p>
+            <w:pPr>
+              <w:spacing w:after="20" w:line="259" w:lineRule="auto"/>
+              <w:jc w:val="right"/>
+            </w:pPr>
+            <w:r/>
+            <w:r>
+              <w:rPr>
+                <w:rFonts w:ascii="B Zar" w:hAnsi="B Zar"/>
+                <w:b w:val="0"/>
+                <w:color w:val="263238"/>
+                <w:sz w:val="17"/>
+              </w:rPr>
+              <w:t>cosmetic-first economy و spend safeguards.</w:t>
+            </w:r>
+          </w:p>
+        </w:tc>
+      </w:tr>
+      <w:tr>
+        <w:tc>
+          <w:tcPr>
+            <w:tcW w:type="dxa" w:w="2665"/>
+            <w:tcBorders>
+              <w:top w:val="single" w:sz="3" w:space="0" w:color="D9E0E7"/>
+              <w:left w:val="single" w:sz="3" w:space="0" w:color="D9E0E7"/>
+              <w:bottom w:val="single" w:sz="3" w:space="0" w:color="D9E0E7"/>
+              <w:right w:val="single" w:sz="3" w:space="0" w:color="D9E0E7"/>
+            </w:tcBorders>
+            <w:shd w:fill="FFFFFF"/>
+          </w:tcPr>
+          <w:p>
+            <w:pPr>
+              <w:spacing w:after="20" w:line="259" w:lineRule="auto"/>
+              <w:jc w:val="right"/>
+            </w:pPr>
+            <w:r/>
+            <w:r>
+              <w:rPr>
+                <w:rFonts w:ascii="B Zar" w:hAnsi="B Zar"/>
+                <w:b w:val="0"/>
+                <w:color w:val="263238"/>
+                <w:sz w:val="17"/>
+              </w:rPr>
+              <w:t>pause صریح کاربر</w:t>
+            </w:r>
+          </w:p>
+        </w:tc>
+        <w:tc>
+          <w:tcPr>
+            <w:tcW w:type="dxa" w:w="3005"/>
+            <w:tcBorders>
+              <w:top w:val="single" w:sz="3" w:space="0" w:color="D9E0E7"/>
+              <w:left w:val="single" w:sz="3" w:space="0" w:color="D9E0E7"/>
+              <w:bottom w:val="single" w:sz="3" w:space="0" w:color="D9E0E7"/>
+              <w:right w:val="single" w:sz="3" w:space="0" w:color="D9E0E7"/>
+            </w:tcBorders>
+            <w:shd w:fill="FFFFFF"/>
+          </w:tcPr>
+          <w:p>
+            <w:pPr>
+              <w:spacing w:after="20" w:line="259" w:lineRule="auto"/>
+              <w:jc w:val="right"/>
+            </w:pPr>
+            <w:r/>
+            <w:r>
+              <w:rPr>
+                <w:rFonts w:ascii="B Zar" w:hAnsi="B Zar"/>
+                <w:b w:val="0"/>
+                <w:color w:val="263238"/>
+                <w:sz w:val="17"/>
+              </w:rPr>
+              <w:t>ساخت/پیشنهاد خلاف scope است.</w:t>
+            </w:r>
+          </w:p>
+        </w:tc>
+        <w:tc>
+          <w:tcPr>
+            <w:tcW w:type="dxa" w:w="4195"/>
+            <w:tcBorders>
+              <w:top w:val="single" w:sz="3" w:space="0" w:color="D9E0E7"/>
+              <w:left w:val="single" w:sz="3" w:space="0" w:color="D9E0E7"/>
+              <w:bottom w:val="single" w:sz="3" w:space="0" w:color="D9E0E7"/>
+              <w:right w:val="single" w:sz="3" w:space="0" w:color="D9E0E7"/>
+            </w:tcBorders>
+            <w:shd w:fill="FFFFFF"/>
+          </w:tcPr>
+          <w:p>
+            <w:pPr>
+              <w:spacing w:after="20" w:line="259" w:lineRule="auto"/>
+              <w:jc w:val="right"/>
+            </w:pPr>
+            <w:r/>
+            <w:r>
+              <w:rPr>
+                <w:rFonts w:ascii="B Zar" w:hAnsi="B Zar"/>
+                <w:b w:val="0"/>
+                <w:color w:val="263238"/>
+                <w:sz w:val="17"/>
+              </w:rPr>
+              <w:t>هیچ build، UA یا pilot بدون reversal صریح.</w:t>
+            </w:r>
+          </w:p>
+        </w:tc>
+      </w:tr>
+    </w:tbl>
+    <w:p/>
+    <w:p>
+      <w:pPr>
+        <w:pStyle w:val="Heading2"/>
+        <w:spacing w:before="200" w:after="120"/>
+        <w:jc w:val="right"/>
+      </w:pPr>
+      <w:r>
+        <w:rPr>
+          <w:rFonts w:ascii="B Zar" w:hAnsi="B Zar"/>
+          <w:color w:val="1F7A70"/>
+          <w:sz w:val="26"/>
+        </w:rPr>
+        <w:t>۶. validation فقط پس از reversal صریح</w:t>
+      </w:r>
+    </w:p>
+    <w:p>
+      <w:pPr>
+        <w:spacing w:after="100" w:line="300" w:lineRule="auto"/>
+        <w:jc w:val="right"/>
+      </w:pPr>
+      <w:r>
+        <w:rPr>
+          <w:rFonts w:ascii="B Zar" w:hAnsi="B Zar"/>
+          <w:color w:val="263238"/>
+          <w:sz w:val="22"/>
+        </w:rPr>
+        <w:t>در صورت بازگشایی: ۱۲ مصاحبه diary-based با بازیکن واقعی؛ prototype با ۴۰–۶۰ asset، سه prompt، submit و paired voting ــ بدون chat/DM عمومی ــ؛ سپس cohort opt-in کوچک با completion، دوباره‌سازی، vote rate، D1/D7 retention، invitation، report rate و پرداخت اختیاری. hard kill اگر retention/creation/voting تکرارشونده، پرداخت asset دیجیتال یا moderation economics قابل قبول شکل نگیرد.</w:t>
+      </w:r>
+    </w:p>
+    <w:tbl>
+      <w:tblPr>
+        <w:bidiVisual w:val="1"/>
+        <w:tblW w:type="auto" w:w="0"/>
+        <w:tblLook w:firstColumn="1" w:firstRow="1" w:lastColumn="0" w:lastRow="0" w:noHBand="0" w:noVBand="1" w:val="04A0"/>
+      </w:tblPr>
+      <w:tblGrid>
+        <w:gridCol w:w="9638"/>
+      </w:tblGrid>
+      <w:tr>
+        <w:tc>
+          <w:tcPr>
+            <w:tcW w:type="dxa" w:w="9638"/>
+            <w:tcBorders>
+              <w:top w:val="single" w:sz="6" w:space="0" w:color="8A6100"/>
+              <w:left w:val="single" w:sz="6" w:space="0" w:color="8A6100"/>
+              <w:bottom w:val="single" w:sz="6" w:space="0" w:color="8A6100"/>
+              <w:right w:val="single" w:sz="6" w:space="0" w:color="8A6100"/>
+            </w:tcBorders>
+            <w:shd w:fill="FFF3D6"/>
+          </w:tcPr>
+          <w:p>
+            <w:pPr>
+              <w:jc w:val="right"/>
+            </w:pPr>
+            <w:r/>
+            <w:r>
+              <w:rPr>
+                <w:rFonts w:ascii="B Zar" w:hAnsi="B Zar"/>
+                <w:b/>
+                <w:color w:val="8A6100"/>
+                <w:sz w:val="21"/>
+              </w:rPr>
+              <w:t>نتیجه</w:t>
+            </w:r>
+          </w:p>
+          <w:p>
+            <w:pPr>
+              <w:spacing w:line="288" w:lineRule="auto"/>
+              <w:jc w:val="right"/>
+            </w:pPr>
+            <w:r>
+              <w:rPr>
+                <w:rFonts w:ascii="B Zar" w:hAnsi="B Zar"/>
+                <w:b w:val="0"/>
+                <w:color w:val="263238"/>
+                <w:sz w:val="19"/>
+              </w:rPr>
+              <w:t>F-07 در Pause باقی می‌ماند. category جهانی و loopهای موفق واقعی‌اند و جایگزین‌های ایران نیز وجود دارند؛ اما این مسیر فقط با درخواست صریح کاربر و با معیارهای game company شامل retention، economy، Live Ops و safety باز می‌شود، نه با یک app لباس‌پوشاندن.</w:t>
+            </w:r>
+          </w:p>
+        </w:tc>
+      </w:tr>
+    </w:tbl>
+    <w:p/>
+    <w:p>
+      <w:pPr>
+        <w:pStyle w:val="Heading2"/>
+        <w:spacing w:before="200" w:after="120"/>
+        <w:jc w:val="right"/>
+      </w:pPr>
+      <w:r>
+        <w:rPr>
+          <w:rFonts w:ascii="B Zar" w:hAnsi="B Zar"/>
+          <w:color w:val="1F7A70"/>
+          <w:sz w:val="26"/>
+        </w:rPr>
+        <w:t>منابع پرونده F-07</w:t>
+      </w:r>
+    </w:p>
+    <w:tbl>
+      <w:tblPr>
+        <w:bidiVisual w:val="1"/>
+        <w:tblW w:type="auto" w:w="0"/>
+        <w:tblLayout w:type="autofit"/>
+        <w:tblLook w:firstColumn="1" w:firstRow="1" w:lastColumn="0" w:lastRow="0" w:noHBand="0" w:noVBand="1" w:val="04A0"/>
+      </w:tblPr>
+      <w:tblGrid>
+        <w:gridCol w:w="3213"/>
+        <w:gridCol w:w="3213"/>
+        <w:gridCol w:w="3213"/>
+      </w:tblGrid>
+      <w:tr>
+        <w:tc>
+          <w:tcPr>
+            <w:tcW w:type="dxa" w:w="1191"/>
+            <w:tcBorders>
+              <w:top w:val="single" w:sz="4" w:space="0" w:color="1F3A5F"/>
+              <w:left w:val="single" w:sz="4" w:space="0" w:color="1F3A5F"/>
+              <w:bottom w:val="single" w:sz="4" w:space="0" w:color="1F3A5F"/>
+              <w:right w:val="single" w:sz="4" w:space="0" w:color="1F3A5F"/>
+            </w:tcBorders>
+            <w:shd w:fill="1F3A5F"/>
+          </w:tcPr>
+          <w:p>
+            <w:pPr>
+              <w:spacing w:after="20" w:line="259" w:lineRule="auto"/>
+              <w:jc w:val="center"/>
+            </w:pPr>
+            <w:r/>
+            <w:r>
+              <w:rPr>
+                <w:rFonts w:ascii="B Zar" w:hAnsi="B Zar"/>
+                <w:b/>
+                <w:color w:val="FFFFFF"/>
+                <w:sz w:val="17"/>
+              </w:rPr>
+              <w:t>کد</w:t>
+            </w:r>
+          </w:p>
+        </w:tc>
+        <w:tc>
+          <w:tcPr>
+            <w:tcW w:type="dxa" w:w="1531"/>
+            <w:tcBorders>
+              <w:top w:val="single" w:sz="4" w:space="0" w:color="1F3A5F"/>
+              <w:left w:val="single" w:sz="4" w:space="0" w:color="1F3A5F"/>
+              <w:bottom w:val="single" w:sz="4" w:space="0" w:color="1F3A5F"/>
+              <w:right w:val="single" w:sz="4" w:space="0" w:color="1F3A5F"/>
+            </w:tcBorders>
+            <w:shd w:fill="1F3A5F"/>
+          </w:tcPr>
+          <w:p>
+            <w:pPr>
+              <w:spacing w:after="20" w:line="259" w:lineRule="auto"/>
+              <w:jc w:val="center"/>
+            </w:pPr>
+            <w:r/>
+            <w:r>
+              <w:rPr>
+                <w:rFonts w:ascii="B Zar" w:hAnsi="B Zar"/>
+                <w:b/>
+                <w:color w:val="FFFFFF"/>
+                <w:sz w:val="17"/>
+              </w:rPr>
+              <w:t>رتبه</w:t>
+            </w:r>
+          </w:p>
+        </w:tc>
+        <w:tc>
+          <w:tcPr>
+            <w:tcW w:type="dxa" w:w="7143"/>
+            <w:tcBorders>
+              <w:top w:val="single" w:sz="4" w:space="0" w:color="1F3A5F"/>
+              <w:left w:val="single" w:sz="4" w:space="0" w:color="1F3A5F"/>
+              <w:bottom w:val="single" w:sz="4" w:space="0" w:color="1F3A5F"/>
+              <w:right w:val="single" w:sz="4" w:space="0" w:color="1F3A5F"/>
+            </w:tcBorders>
+            <w:shd w:fill="1F3A5F"/>
+          </w:tcPr>
+          <w:p>
+            <w:pPr>
+              <w:spacing w:after="20" w:line="259" w:lineRule="auto"/>
+              <w:jc w:val="center"/>
+            </w:pPr>
+            <w:r/>
+            <w:r>
+              <w:rPr>
+                <w:rFonts w:ascii="B Zar" w:hAnsi="B Zar"/>
+                <w:b/>
+                <w:color w:val="FFFFFF"/>
+                <w:sz w:val="17"/>
+              </w:rPr>
+              <w:t>منبع و پیوند</w:t>
+            </w:r>
+          </w:p>
+        </w:tc>
+      </w:tr>
+      <w:tr>
+        <w:tc>
+          <w:tcPr>
+            <w:tcW w:type="dxa" w:w="1191"/>
+            <w:tcBorders>
+              <w:top w:val="single" w:sz="3" w:space="0" w:color="D9E0E7"/>
+              <w:left w:val="single" w:sz="3" w:space="0" w:color="D9E0E7"/>
+              <w:bottom w:val="single" w:sz="3" w:space="0" w:color="D9E0E7"/>
+              <w:right w:val="single" w:sz="3" w:space="0" w:color="D9E0E7"/>
+            </w:tcBorders>
+            <w:shd w:fill="FFFFFF"/>
+          </w:tcPr>
+          <w:p>
+            <w:pPr>
+              <w:spacing w:after="20" w:line="259" w:lineRule="auto"/>
+              <w:jc w:val="right"/>
+            </w:pPr>
+            <w:r/>
+            <w:r>
+              <w:rPr>
+                <w:rFonts w:ascii="B Zar" w:hAnsi="B Zar"/>
+                <w:b w:val="0"/>
+                <w:color w:val="263238"/>
+                <w:sz w:val="17"/>
+              </w:rPr>
+              <w:t>F07-S01</w:t>
+            </w:r>
+          </w:p>
+        </w:tc>
+        <w:tc>
+          <w:tcPr>
+            <w:tcW w:type="dxa" w:w="1531"/>
+            <w:tcBorders>
+              <w:top w:val="single" w:sz="3" w:space="0" w:color="D9E0E7"/>
+              <w:left w:val="single" w:sz="3" w:space="0" w:color="D9E0E7"/>
+              <w:bottom w:val="single" w:sz="3" w:space="0" w:color="D9E0E7"/>
+              <w:right w:val="single" w:sz="3" w:space="0" w:color="D9E0E7"/>
+            </w:tcBorders>
+            <w:shd w:fill="FFFFFF"/>
+          </w:tcPr>
+          <w:p>
+            <w:pPr>
+              <w:spacing w:after="20" w:line="259" w:lineRule="auto"/>
+              <w:jc w:val="right"/>
+            </w:pPr>
+            <w:r/>
+            <w:r>
+              <w:rPr>
+                <w:rFonts w:ascii="B Zar" w:hAnsi="B Zar"/>
+                <w:b w:val="0"/>
+                <w:color w:val="263238"/>
+                <w:sz w:val="17"/>
+              </w:rPr>
+              <w:t>B / app store</w:t>
+            </w:r>
+          </w:p>
+        </w:tc>
+        <w:tc>
+          <w:tcPr>
+            <w:tcW w:type="dxa" w:w="7143"/>
+            <w:tcBorders>
+              <w:top w:val="single" w:sz="3" w:space="0" w:color="D9E0E7"/>
+              <w:left w:val="single" w:sz="3" w:space="0" w:color="D9E0E7"/>
+              <w:bottom w:val="single" w:sz="3" w:space="0" w:color="D9E0E7"/>
+              <w:right w:val="single" w:sz="3" w:space="0" w:color="D9E0E7"/>
+            </w:tcBorders>
+            <w:shd w:fill="FFFFFF"/>
+          </w:tcPr>
+          <w:p>
+            <w:pPr>
+              <w:spacing w:after="20" w:line="259" w:lineRule="auto"/>
+              <w:jc w:val="right"/>
+            </w:pPr>
+            <w:r/>
+            <w:r>
+              <w:rPr>
+                <w:rFonts w:ascii="B Zar" w:hAnsi="B Zar"/>
+                <w:b w:val="0"/>
+                <w:color w:val="263238"/>
+                <w:sz w:val="17"/>
+              </w:rPr>
+              <w:t>Google Play — Covet Fashion: https://play.google.com/store/apps/details?id=com.crowdstar.covetfashion</w:t>
+            </w:r>
+          </w:p>
+        </w:tc>
+      </w:tr>
+      <w:tr>
+        <w:tc>
+          <w:tcPr>
+            <w:tcW w:type="dxa" w:w="1191"/>
+            <w:tcBorders>
+              <w:top w:val="single" w:sz="3" w:space="0" w:color="D9E0E7"/>
+              <w:left w:val="single" w:sz="3" w:space="0" w:color="D9E0E7"/>
+              <w:bottom w:val="single" w:sz="3" w:space="0" w:color="D9E0E7"/>
+              <w:right w:val="single" w:sz="3" w:space="0" w:color="D9E0E7"/>
+            </w:tcBorders>
+            <w:shd w:fill="F5F7FA"/>
+          </w:tcPr>
+          <w:p>
+            <w:pPr>
+              <w:spacing w:after="20" w:line="259" w:lineRule="auto"/>
+              <w:jc w:val="right"/>
+            </w:pPr>
+            <w:r/>
+            <w:r>
+              <w:rPr>
+                <w:rFonts w:ascii="B Zar" w:hAnsi="B Zar"/>
+                <w:b w:val="0"/>
+                <w:color w:val="263238"/>
+                <w:sz w:val="17"/>
+              </w:rPr>
+              <w:t>F07-S02</w:t>
+            </w:r>
+          </w:p>
+        </w:tc>
+        <w:tc>
+          <w:tcPr>
+            <w:tcW w:type="dxa" w:w="1531"/>
+            <w:tcBorders>
+              <w:top w:val="single" w:sz="3" w:space="0" w:color="D9E0E7"/>
+              <w:left w:val="single" w:sz="3" w:space="0" w:color="D9E0E7"/>
+              <w:bottom w:val="single" w:sz="3" w:space="0" w:color="D9E0E7"/>
+              <w:right w:val="single" w:sz="3" w:space="0" w:color="D9E0E7"/>
+            </w:tcBorders>
+            <w:shd w:fill="F5F7FA"/>
+          </w:tcPr>
+          <w:p>
+            <w:pPr>
+              <w:spacing w:after="20" w:line="259" w:lineRule="auto"/>
+              <w:jc w:val="right"/>
+            </w:pPr>
+            <w:r/>
+            <w:r>
+              <w:rPr>
+                <w:rFonts w:ascii="B Zar" w:hAnsi="B Zar"/>
+                <w:b w:val="0"/>
+                <w:color w:val="263238"/>
+                <w:sz w:val="17"/>
+              </w:rPr>
+              <w:t>A / app store</w:t>
+            </w:r>
+          </w:p>
+        </w:tc>
+        <w:tc>
+          <w:tcPr>
+            <w:tcW w:type="dxa" w:w="7143"/>
+            <w:tcBorders>
+              <w:top w:val="single" w:sz="3" w:space="0" w:color="D9E0E7"/>
+              <w:left w:val="single" w:sz="3" w:space="0" w:color="D9E0E7"/>
+              <w:bottom w:val="single" w:sz="3" w:space="0" w:color="D9E0E7"/>
+              <w:right w:val="single" w:sz="3" w:space="0" w:color="D9E0E7"/>
+            </w:tcBorders>
+            <w:shd w:fill="F5F7FA"/>
+          </w:tcPr>
+          <w:p>
+            <w:pPr>
+              <w:spacing w:after="20" w:line="259" w:lineRule="auto"/>
+              <w:jc w:val="right"/>
+            </w:pPr>
+            <w:r/>
+            <w:r>
+              <w:rPr>
+                <w:rFonts w:ascii="B Zar" w:hAnsi="B Zar"/>
+                <w:b w:val="0"/>
+                <w:color w:val="263238"/>
+                <w:sz w:val="17"/>
+              </w:rPr>
+              <w:t>Apple App Store — SuitU: https://apps.apple.com/us/app/suitu-fashion-avatar-dress-up/id1663749627</w:t>
+            </w:r>
+          </w:p>
+        </w:tc>
+      </w:tr>
+      <w:tr>
+        <w:tc>
+          <w:tcPr>
+            <w:tcW w:type="dxa" w:w="1191"/>
+            <w:tcBorders>
+              <w:top w:val="single" w:sz="3" w:space="0" w:color="D9E0E7"/>
+              <w:left w:val="single" w:sz="3" w:space="0" w:color="D9E0E7"/>
+              <w:bottom w:val="single" w:sz="3" w:space="0" w:color="D9E0E7"/>
+              <w:right w:val="single" w:sz="3" w:space="0" w:color="D9E0E7"/>
+            </w:tcBorders>
+            <w:shd w:fill="FFFFFF"/>
+          </w:tcPr>
+          <w:p>
+            <w:pPr>
+              <w:spacing w:after="20" w:line="259" w:lineRule="auto"/>
+              <w:jc w:val="right"/>
+            </w:pPr>
+            <w:r/>
+            <w:r>
+              <w:rPr>
+                <w:rFonts w:ascii="B Zar" w:hAnsi="B Zar"/>
+                <w:b w:val="0"/>
+                <w:color w:val="263238"/>
+                <w:sz w:val="17"/>
+              </w:rPr>
+              <w:t>F07-S03</w:t>
+            </w:r>
+          </w:p>
+        </w:tc>
+        <w:tc>
+          <w:tcPr>
+            <w:tcW w:type="dxa" w:w="1531"/>
+            <w:tcBorders>
+              <w:top w:val="single" w:sz="3" w:space="0" w:color="D9E0E7"/>
+              <w:left w:val="single" w:sz="3" w:space="0" w:color="D9E0E7"/>
+              <w:bottom w:val="single" w:sz="3" w:space="0" w:color="D9E0E7"/>
+              <w:right w:val="single" w:sz="3" w:space="0" w:color="D9E0E7"/>
+            </w:tcBorders>
+            <w:shd w:fill="FFFFFF"/>
+          </w:tcPr>
+          <w:p>
+            <w:pPr>
+              <w:spacing w:after="20" w:line="259" w:lineRule="auto"/>
+              <w:jc w:val="right"/>
+            </w:pPr>
+            <w:r/>
+            <w:r>
+              <w:rPr>
+                <w:rFonts w:ascii="B Zar" w:hAnsi="B Zar"/>
+                <w:b w:val="0"/>
+                <w:color w:val="263238"/>
+                <w:sz w:val="17"/>
+              </w:rPr>
+              <w:t>C / third-party listing</w:t>
+            </w:r>
+          </w:p>
+        </w:tc>
+        <w:tc>
+          <w:tcPr>
+            <w:tcW w:type="dxa" w:w="7143"/>
+            <w:tcBorders>
+              <w:top w:val="single" w:sz="3" w:space="0" w:color="D9E0E7"/>
+              <w:left w:val="single" w:sz="3" w:space="0" w:color="D9E0E7"/>
+              <w:bottom w:val="single" w:sz="3" w:space="0" w:color="D9E0E7"/>
+              <w:right w:val="single" w:sz="3" w:space="0" w:color="D9E0E7"/>
+            </w:tcBorders>
+            <w:shd w:fill="FFFFFF"/>
+          </w:tcPr>
+          <w:p>
+            <w:pPr>
+              <w:spacing w:after="20" w:line="259" w:lineRule="auto"/>
+              <w:jc w:val="right"/>
+            </w:pPr>
+            <w:r/>
+            <w:r>
+              <w:rPr>
+                <w:rFonts w:ascii="B Zar" w:hAnsi="B Zar"/>
+                <w:b w:val="0"/>
+                <w:color w:val="263238"/>
+                <w:sz w:val="17"/>
+              </w:rPr>
+              <w:t>Aptoide — Love Nikki: https://love-nikki.en.aptoide.com/app</w:t>
+            </w:r>
+          </w:p>
+        </w:tc>
+      </w:tr>
+      <w:tr>
+        <w:tc>
+          <w:tcPr>
+            <w:tcW w:type="dxa" w:w="1191"/>
+            <w:tcBorders>
+              <w:top w:val="single" w:sz="3" w:space="0" w:color="D9E0E7"/>
+              <w:left w:val="single" w:sz="3" w:space="0" w:color="D9E0E7"/>
+              <w:bottom w:val="single" w:sz="3" w:space="0" w:color="D9E0E7"/>
+              <w:right w:val="single" w:sz="3" w:space="0" w:color="D9E0E7"/>
+            </w:tcBorders>
+            <w:shd w:fill="F5F7FA"/>
+          </w:tcPr>
+          <w:p>
+            <w:pPr>
+              <w:spacing w:after="20" w:line="259" w:lineRule="auto"/>
+              <w:jc w:val="right"/>
+            </w:pPr>
+            <w:r/>
+            <w:r>
+              <w:rPr>
+                <w:rFonts w:ascii="B Zar" w:hAnsi="B Zar"/>
+                <w:b w:val="0"/>
+                <w:color w:val="263238"/>
+                <w:sz w:val="17"/>
+              </w:rPr>
+              <w:t>F07-S04</w:t>
+            </w:r>
+          </w:p>
+        </w:tc>
+        <w:tc>
+          <w:tcPr>
+            <w:tcW w:type="dxa" w:w="1531"/>
+            <w:tcBorders>
+              <w:top w:val="single" w:sz="3" w:space="0" w:color="D9E0E7"/>
+              <w:left w:val="single" w:sz="3" w:space="0" w:color="D9E0E7"/>
+              <w:bottom w:val="single" w:sz="3" w:space="0" w:color="D9E0E7"/>
+              <w:right w:val="single" w:sz="3" w:space="0" w:color="D9E0E7"/>
+            </w:tcBorders>
+            <w:shd w:fill="F5F7FA"/>
+          </w:tcPr>
+          <w:p>
+            <w:pPr>
+              <w:spacing w:after="20" w:line="259" w:lineRule="auto"/>
+              <w:jc w:val="right"/>
+            </w:pPr>
+            <w:r/>
+            <w:r>
+              <w:rPr>
+                <w:rFonts w:ascii="B Zar" w:hAnsi="B Zar"/>
+                <w:b w:val="0"/>
+                <w:color w:val="263238"/>
+                <w:sz w:val="17"/>
+              </w:rPr>
+              <w:t>C / official publisher</w:t>
+            </w:r>
+          </w:p>
+        </w:tc>
+        <w:tc>
+          <w:tcPr>
+            <w:tcW w:type="dxa" w:w="7143"/>
+            <w:tcBorders>
+              <w:top w:val="single" w:sz="3" w:space="0" w:color="D9E0E7"/>
+              <w:left w:val="single" w:sz="3" w:space="0" w:color="D9E0E7"/>
+              <w:bottom w:val="single" w:sz="3" w:space="0" w:color="D9E0E7"/>
+              <w:right w:val="single" w:sz="3" w:space="0" w:color="D9E0E7"/>
+            </w:tcBorders>
+            <w:shd w:fill="F5F7FA"/>
+          </w:tcPr>
+          <w:p>
+            <w:pPr>
+              <w:spacing w:after="20" w:line="259" w:lineRule="auto"/>
+              <w:jc w:val="right"/>
+            </w:pPr>
+            <w:r/>
+            <w:r>
+              <w:rPr>
+                <w:rFonts w:ascii="B Zar" w:hAnsi="B Zar"/>
+                <w:b w:val="0"/>
+                <w:color w:val="263238"/>
+                <w:sz w:val="17"/>
+              </w:rPr>
+              <w:t>Shining Nikki / Papergames: https://nikki4.playpapergames.com/news/100206</w:t>
+            </w:r>
+          </w:p>
+        </w:tc>
+      </w:tr>
+      <w:tr>
+        <w:tc>
+          <w:tcPr>
+            <w:tcW w:type="dxa" w:w="1191"/>
+            <w:tcBorders>
+              <w:top w:val="single" w:sz="3" w:space="0" w:color="D9E0E7"/>
+              <w:left w:val="single" w:sz="3" w:space="0" w:color="D9E0E7"/>
+              <w:bottom w:val="single" w:sz="3" w:space="0" w:color="D9E0E7"/>
+              <w:right w:val="single" w:sz="3" w:space="0" w:color="D9E0E7"/>
+            </w:tcBorders>
+            <w:shd w:fill="FFFFFF"/>
+          </w:tcPr>
+          <w:p>
+            <w:pPr>
+              <w:spacing w:after="20" w:line="259" w:lineRule="auto"/>
+              <w:jc w:val="right"/>
+            </w:pPr>
+            <w:r/>
+            <w:r>
+              <w:rPr>
+                <w:rFonts w:ascii="B Zar" w:hAnsi="B Zar"/>
+                <w:b w:val="0"/>
+                <w:color w:val="263238"/>
+                <w:sz w:val="17"/>
+              </w:rPr>
+              <w:t>F07-S05</w:t>
+            </w:r>
+          </w:p>
+        </w:tc>
+        <w:tc>
+          <w:tcPr>
+            <w:tcW w:type="dxa" w:w="1531"/>
+            <w:tcBorders>
+              <w:top w:val="single" w:sz="3" w:space="0" w:color="D9E0E7"/>
+              <w:left w:val="single" w:sz="3" w:space="0" w:color="D9E0E7"/>
+              <w:bottom w:val="single" w:sz="3" w:space="0" w:color="D9E0E7"/>
+              <w:right w:val="single" w:sz="3" w:space="0" w:color="D9E0E7"/>
+            </w:tcBorders>
+            <w:shd w:fill="FFFFFF"/>
+          </w:tcPr>
+          <w:p>
+            <w:pPr>
+              <w:spacing w:after="20" w:line="259" w:lineRule="auto"/>
+              <w:jc w:val="right"/>
+            </w:pPr>
+            <w:r/>
+            <w:r>
+              <w:rPr>
+                <w:rFonts w:ascii="B Zar" w:hAnsi="B Zar"/>
+                <w:b w:val="0"/>
+                <w:color w:val="263238"/>
+                <w:sz w:val="17"/>
+              </w:rPr>
+              <w:t>C / app-store vendor</w:t>
+            </w:r>
+          </w:p>
+        </w:tc>
+        <w:tc>
+          <w:tcPr>
+            <w:tcW w:type="dxa" w:w="7143"/>
+            <w:tcBorders>
+              <w:top w:val="single" w:sz="3" w:space="0" w:color="D9E0E7"/>
+              <w:left w:val="single" w:sz="3" w:space="0" w:color="D9E0E7"/>
+              <w:bottom w:val="single" w:sz="3" w:space="0" w:color="D9E0E7"/>
+              <w:right w:val="single" w:sz="3" w:space="0" w:color="D9E0E7"/>
+            </w:tcBorders>
+            <w:shd w:fill="FFFFFF"/>
+          </w:tcPr>
+          <w:p>
+            <w:pPr>
+              <w:spacing w:after="20" w:line="259" w:lineRule="auto"/>
+              <w:jc w:val="right"/>
+            </w:pPr>
+            <w:r/>
+            <w:r>
+              <w:rPr>
+                <w:rFonts w:ascii="B Zar" w:hAnsi="B Zar"/>
+                <w:b w:val="0"/>
+                <w:color w:val="263238"/>
+                <w:sz w:val="17"/>
+              </w:rPr>
+              <w:t>کافه‌بازار، پرداخت درون‌برنامه‌ای: https://cafebazaar.ir/app/com.farsitel.bazaar</w:t>
+            </w:r>
+          </w:p>
+        </w:tc>
+      </w:tr>
+      <w:tr>
+        <w:tc>
+          <w:tcPr>
+            <w:tcW w:type="dxa" w:w="1191"/>
+            <w:tcBorders>
+              <w:top w:val="single" w:sz="3" w:space="0" w:color="D9E0E7"/>
+              <w:left w:val="single" w:sz="3" w:space="0" w:color="D9E0E7"/>
+              <w:bottom w:val="single" w:sz="3" w:space="0" w:color="D9E0E7"/>
+              <w:right w:val="single" w:sz="3" w:space="0" w:color="D9E0E7"/>
+            </w:tcBorders>
+            <w:shd w:fill="F5F7FA"/>
+          </w:tcPr>
+          <w:p>
+            <w:pPr>
+              <w:spacing w:after="20" w:line="259" w:lineRule="auto"/>
+              <w:jc w:val="right"/>
+            </w:pPr>
+            <w:r/>
+            <w:r>
+              <w:rPr>
+                <w:rFonts w:ascii="B Zar" w:hAnsi="B Zar"/>
+                <w:b w:val="0"/>
+                <w:color w:val="263238"/>
+                <w:sz w:val="17"/>
+              </w:rPr>
+              <w:t>F07-S06</w:t>
+            </w:r>
+          </w:p>
+        </w:tc>
+        <w:tc>
+          <w:tcPr>
+            <w:tcW w:type="dxa" w:w="1531"/>
+            <w:tcBorders>
+              <w:top w:val="single" w:sz="3" w:space="0" w:color="D9E0E7"/>
+              <w:left w:val="single" w:sz="3" w:space="0" w:color="D9E0E7"/>
+              <w:bottom w:val="single" w:sz="3" w:space="0" w:color="D9E0E7"/>
+              <w:right w:val="single" w:sz="3" w:space="0" w:color="D9E0E7"/>
+            </w:tcBorders>
+            <w:shd w:fill="F5F7FA"/>
+          </w:tcPr>
+          <w:p>
+            <w:pPr>
+              <w:spacing w:after="20" w:line="259" w:lineRule="auto"/>
+              <w:jc w:val="right"/>
+            </w:pPr>
+            <w:r/>
+            <w:r>
+              <w:rPr>
+                <w:rFonts w:ascii="B Zar" w:hAnsi="B Zar"/>
+                <w:b w:val="0"/>
+                <w:color w:val="263238"/>
+                <w:sz w:val="17"/>
+              </w:rPr>
+              <w:t>C / media</w:t>
+            </w:r>
+          </w:p>
+        </w:tc>
+        <w:tc>
+          <w:tcPr>
+            <w:tcW w:type="dxa" w:w="7143"/>
+            <w:tcBorders>
+              <w:top w:val="single" w:sz="3" w:space="0" w:color="D9E0E7"/>
+              <w:left w:val="single" w:sz="3" w:space="0" w:color="D9E0E7"/>
+              <w:bottom w:val="single" w:sz="3" w:space="0" w:color="D9E0E7"/>
+              <w:right w:val="single" w:sz="3" w:space="0" w:color="D9E0E7"/>
+            </w:tcBorders>
+            <w:shd w:fill="F5F7FA"/>
+          </w:tcPr>
+          <w:p>
+            <w:pPr>
+              <w:spacing w:after="20" w:line="259" w:lineRule="auto"/>
+              <w:jc w:val="right"/>
+            </w:pPr>
+            <w:r/>
+            <w:r>
+              <w:rPr>
+                <w:rFonts w:ascii="B Zar" w:hAnsi="B Zar"/>
+                <w:b w:val="0"/>
+                <w:color w:val="263238"/>
+                <w:sz w:val="17"/>
+              </w:rPr>
+              <w:t>مهر — بازی مُدا: https://www.mehrnews.com/news/3919533/</w:t>
+            </w:r>
+          </w:p>
+        </w:tc>
+      </w:tr>
+      <w:tr>
+        <w:tc>
+          <w:tcPr>
+            <w:tcW w:type="dxa" w:w="1191"/>
+            <w:tcBorders>
+              <w:top w:val="single" w:sz="3" w:space="0" w:color="D9E0E7"/>
+              <w:left w:val="single" w:sz="3" w:space="0" w:color="D9E0E7"/>
+              <w:bottom w:val="single" w:sz="3" w:space="0" w:color="D9E0E7"/>
+              <w:right w:val="single" w:sz="3" w:space="0" w:color="D9E0E7"/>
+            </w:tcBorders>
+            <w:shd w:fill="FFFFFF"/>
+          </w:tcPr>
+          <w:p>
+            <w:pPr>
+              <w:spacing w:after="20" w:line="259" w:lineRule="auto"/>
+              <w:jc w:val="right"/>
+            </w:pPr>
+            <w:r/>
+            <w:r>
+              <w:rPr>
+                <w:rFonts w:ascii="B Zar" w:hAnsi="B Zar"/>
+                <w:b w:val="0"/>
+                <w:color w:val="263238"/>
+                <w:sz w:val="17"/>
+              </w:rPr>
+              <w:t>F07-S07</w:t>
+            </w:r>
+          </w:p>
+        </w:tc>
+        <w:tc>
+          <w:tcPr>
+            <w:tcW w:type="dxa" w:w="1531"/>
+            <w:tcBorders>
+              <w:top w:val="single" w:sz="3" w:space="0" w:color="D9E0E7"/>
+              <w:left w:val="single" w:sz="3" w:space="0" w:color="D9E0E7"/>
+              <w:bottom w:val="single" w:sz="3" w:space="0" w:color="D9E0E7"/>
+              <w:right w:val="single" w:sz="3" w:space="0" w:color="D9E0E7"/>
+            </w:tcBorders>
+            <w:shd w:fill="FFFFFF"/>
+          </w:tcPr>
+          <w:p>
+            <w:pPr>
+              <w:spacing w:after="20" w:line="259" w:lineRule="auto"/>
+              <w:jc w:val="right"/>
+            </w:pPr>
+            <w:r/>
+            <w:r>
+              <w:rPr>
+                <w:rFonts w:ascii="B Zar" w:hAnsi="B Zar"/>
+                <w:b w:val="0"/>
+                <w:color w:val="263238"/>
+                <w:sz w:val="17"/>
+              </w:rPr>
+              <w:t>C / app-store listing</w:t>
+            </w:r>
+          </w:p>
+        </w:tc>
+        <w:tc>
+          <w:tcPr>
+            <w:tcW w:type="dxa" w:w="7143"/>
+            <w:tcBorders>
+              <w:top w:val="single" w:sz="3" w:space="0" w:color="D9E0E7"/>
+              <w:left w:val="single" w:sz="3" w:space="0" w:color="D9E0E7"/>
+              <w:bottom w:val="single" w:sz="3" w:space="0" w:color="D9E0E7"/>
+              <w:right w:val="single" w:sz="3" w:space="0" w:color="D9E0E7"/>
+            </w:tcBorders>
+            <w:shd w:fill="FFFFFF"/>
+          </w:tcPr>
+          <w:p>
+            <w:pPr>
+              <w:spacing w:after="20" w:line="259" w:lineRule="auto"/>
+              <w:jc w:val="right"/>
+            </w:pPr>
+            <w:r/>
+            <w:r>
+              <w:rPr>
+                <w:rFonts w:ascii="B Zar" w:hAnsi="B Zar"/>
+                <w:b w:val="0"/>
+                <w:color w:val="263238"/>
+                <w:sz w:val="17"/>
+              </w:rPr>
+              <w:t>Myket — Fashion Star: https://myket.ir/app/com.gofive.indian.makeup.fashion.dress.up</w:t>
+            </w:r>
+          </w:p>
+        </w:tc>
+      </w:tr>
+      <w:tr>
+        <w:tc>
+          <w:tcPr>
+            <w:tcW w:type="dxa" w:w="1191"/>
+            <w:tcBorders>
+              <w:top w:val="single" w:sz="3" w:space="0" w:color="D9E0E7"/>
+              <w:left w:val="single" w:sz="3" w:space="0" w:color="D9E0E7"/>
+              <w:bottom w:val="single" w:sz="3" w:space="0" w:color="D9E0E7"/>
+              <w:right w:val="single" w:sz="3" w:space="0" w:color="D9E0E7"/>
+            </w:tcBorders>
+            <w:shd w:fill="F5F7FA"/>
+          </w:tcPr>
+          <w:p>
+            <w:pPr>
+              <w:spacing w:after="20" w:line="259" w:lineRule="auto"/>
+              <w:jc w:val="right"/>
+            </w:pPr>
+            <w:r/>
+            <w:r>
+              <w:rPr>
+                <w:rFonts w:ascii="B Zar" w:hAnsi="B Zar"/>
+                <w:b w:val="0"/>
+                <w:color w:val="263238"/>
+                <w:sz w:val="17"/>
+              </w:rPr>
+              <w:t>F07-S08</w:t>
+            </w:r>
+          </w:p>
+        </w:tc>
+        <w:tc>
+          <w:tcPr>
+            <w:tcW w:type="dxa" w:w="1531"/>
+            <w:tcBorders>
+              <w:top w:val="single" w:sz="3" w:space="0" w:color="D9E0E7"/>
+              <w:left w:val="single" w:sz="3" w:space="0" w:color="D9E0E7"/>
+              <w:bottom w:val="single" w:sz="3" w:space="0" w:color="D9E0E7"/>
+              <w:right w:val="single" w:sz="3" w:space="0" w:color="D9E0E7"/>
+            </w:tcBorders>
+            <w:shd w:fill="F5F7FA"/>
+          </w:tcPr>
+          <w:p>
+            <w:pPr>
+              <w:spacing w:after="20" w:line="259" w:lineRule="auto"/>
+              <w:jc w:val="right"/>
+            </w:pPr>
+            <w:r/>
+            <w:r>
+              <w:rPr>
+                <w:rFonts w:ascii="B Zar" w:hAnsi="B Zar"/>
+                <w:b w:val="0"/>
+                <w:color w:val="263238"/>
+                <w:sz w:val="17"/>
+              </w:rPr>
+              <w:t>C / app-store listing</w:t>
+            </w:r>
+          </w:p>
+        </w:tc>
+        <w:tc>
+          <w:tcPr>
+            <w:tcW w:type="dxa" w:w="7143"/>
+            <w:tcBorders>
+              <w:top w:val="single" w:sz="3" w:space="0" w:color="D9E0E7"/>
+              <w:left w:val="single" w:sz="3" w:space="0" w:color="D9E0E7"/>
+              <w:bottom w:val="single" w:sz="3" w:space="0" w:color="D9E0E7"/>
+              <w:right w:val="single" w:sz="3" w:space="0" w:color="D9E0E7"/>
+            </w:tcBorders>
+            <w:shd w:fill="F5F7FA"/>
+          </w:tcPr>
+          <w:p>
+            <w:pPr>
+              <w:spacing w:after="20" w:line="259" w:lineRule="auto"/>
+              <w:jc w:val="right"/>
+            </w:pPr>
+            <w:r/>
+            <w:r>
+              <w:rPr>
+                <w:rFonts w:ascii="B Zar" w:hAnsi="B Zar"/>
+                <w:b w:val="0"/>
+                <w:color w:val="263238"/>
+                <w:sz w:val="17"/>
+              </w:rPr>
+              <w:t>Myket — Fashion Quest: https://myket.ir/app/com.bravestars.fashion.quest.dress.up</w:t>
+            </w:r>
+          </w:p>
+        </w:tc>
+      </w:tr>
+    </w:tbl>
+    <w:p/>
+    <w:p>
+      <w:r>
+        <w:br w:type="page"/>
+      </w:r>
+    </w:p>
+    <w:p>
+      <w:pPr>
+        <w:pStyle w:val="Heading1"/>
+        <w:spacing w:before="280" w:after="160"/>
+        <w:jc w:val="right"/>
+      </w:pPr>
+      <w:r>
+        <w:rPr>
+          <w:rFonts w:ascii="B Zar" w:hAnsi="B Zar"/>
+          <w:color w:val="1F3A5F"/>
+          <w:sz w:val="32"/>
+        </w:rPr>
+        <w:t>به‌روزرسانی نسخه و وضعیت ادامهٔ برنامه</w:t>
+      </w:r>
+    </w:p>
+    <w:p>
+      <w:pPr>
+        <w:spacing w:after="100" w:line="300" w:lineRule="auto"/>
+        <w:jc w:val="right"/>
+      </w:pPr>
+      <w:r>
+        <w:rPr>
+          <w:rFonts w:ascii="B Zar" w:hAnsi="B Zar"/>
+          <w:color w:val="263238"/>
+          <w:sz w:val="22"/>
+        </w:rPr>
+        <w:t>نسخهٔ ۰٫۵ dossier F-07 را ثبت می‌کند. Pause کاربر بدون تغییر حفظ شده است؛ F-07 نه Pass است و نه candidate فعال. F-01 تا F-04 همچنان تنها مسیرهای دارای گیت primary research/pilot هستند.</w:t>
+      </w:r>
+    </w:p>
+    <w:tbl>
+      <w:tblPr>
+        <w:bidiVisual w:val="1"/>
+        <w:tblW w:type="auto" w:w="0"/>
+        <w:tblLayout w:type="autofit"/>
+        <w:tblLook w:firstColumn="1" w:firstRow="1" w:lastColumn="0" w:lastRow="0" w:noHBand="0" w:noVBand="1" w:val="04A0"/>
+      </w:tblPr>
+      <w:tblGrid>
+        <w:gridCol w:w="2409"/>
+        <w:gridCol w:w="2409"/>
+        <w:gridCol w:w="2409"/>
+        <w:gridCol w:w="2409"/>
+      </w:tblGrid>
+      <w:tr>
+        <w:tc>
+          <w:tcPr>
+            <w:tcW w:type="dxa" w:w="1361"/>
+            <w:tcBorders>
+              <w:top w:val="single" w:sz="4" w:space="0" w:color="1F3A5F"/>
+              <w:left w:val="single" w:sz="4" w:space="0" w:color="1F3A5F"/>
+              <w:bottom w:val="single" w:sz="4" w:space="0" w:color="1F3A5F"/>
+              <w:right w:val="single" w:sz="4" w:space="0" w:color="1F3A5F"/>
+            </w:tcBorders>
+            <w:shd w:fill="1F3A5F"/>
+          </w:tcPr>
+          <w:p>
+            <w:pPr>
+              <w:spacing w:after="20" w:line="259" w:lineRule="auto"/>
+              <w:jc w:val="center"/>
+            </w:pPr>
+            <w:r/>
+            <w:r>
+              <w:rPr>
+                <w:rFonts w:ascii="B Zar" w:hAnsi="B Zar"/>
+                <w:b/>
+                <w:color w:val="FFFFFF"/>
+                <w:sz w:val="17"/>
+              </w:rPr>
+              <w:t>نسخه</w:t>
+            </w:r>
+          </w:p>
+        </w:tc>
+        <w:tc>
+          <w:tcPr>
+            <w:tcW w:type="dxa" w:w="1701"/>
+            <w:tcBorders>
+              <w:top w:val="single" w:sz="4" w:space="0" w:color="1F3A5F"/>
+              <w:left w:val="single" w:sz="4" w:space="0" w:color="1F3A5F"/>
+              <w:bottom w:val="single" w:sz="4" w:space="0" w:color="1F3A5F"/>
+              <w:right w:val="single" w:sz="4" w:space="0" w:color="1F3A5F"/>
+            </w:tcBorders>
+            <w:shd w:fill="1F3A5F"/>
+          </w:tcPr>
+          <w:p>
+            <w:pPr>
+              <w:spacing w:after="20" w:line="259" w:lineRule="auto"/>
+              <w:jc w:val="center"/>
+            </w:pPr>
+            <w:r/>
+            <w:r>
+              <w:rPr>
+                <w:rFonts w:ascii="B Zar" w:hAnsi="B Zar"/>
+                <w:b/>
+                <w:color w:val="FFFFFF"/>
+                <w:sz w:val="17"/>
+              </w:rPr>
+              <w:t>تاریخ</w:t>
+            </w:r>
+          </w:p>
+        </w:tc>
+        <w:tc>
+          <w:tcPr>
+            <w:tcW w:type="dxa" w:w="5669"/>
+            <w:tcBorders>
+              <w:top w:val="single" w:sz="4" w:space="0" w:color="1F3A5F"/>
+              <w:left w:val="single" w:sz="4" w:space="0" w:color="1F3A5F"/>
+              <w:bottom w:val="single" w:sz="4" w:space="0" w:color="1F3A5F"/>
+              <w:right w:val="single" w:sz="4" w:space="0" w:color="1F3A5F"/>
+            </w:tcBorders>
+            <w:shd w:fill="1F3A5F"/>
+          </w:tcPr>
+          <w:p>
+            <w:pPr>
+              <w:spacing w:after="20" w:line="259" w:lineRule="auto"/>
+              <w:jc w:val="center"/>
+            </w:pPr>
+            <w:r/>
+            <w:r>
+              <w:rPr>
+                <w:rFonts w:ascii="B Zar" w:hAnsi="B Zar"/>
+                <w:b/>
+                <w:color w:val="FFFFFF"/>
+                <w:sz w:val="17"/>
+              </w:rPr>
+              <w:t>افزوده‌شده</w:t>
+            </w:r>
+          </w:p>
+        </w:tc>
+        <w:tc>
+          <w:tcPr>
+            <w:tcW w:type="dxa" w:w="1701"/>
+            <w:tcBorders>
+              <w:top w:val="single" w:sz="4" w:space="0" w:color="1F3A5F"/>
+              <w:left w:val="single" w:sz="4" w:space="0" w:color="1F3A5F"/>
+              <w:bottom w:val="single" w:sz="4" w:space="0" w:color="1F3A5F"/>
+              <w:right w:val="single" w:sz="4" w:space="0" w:color="1F3A5F"/>
+            </w:tcBorders>
+            <w:shd w:fill="1F3A5F"/>
+          </w:tcPr>
+          <w:p>
+            <w:pPr>
+              <w:spacing w:after="20" w:line="259" w:lineRule="auto"/>
+              <w:jc w:val="center"/>
+            </w:pPr>
+            <w:r/>
+            <w:r>
+              <w:rPr>
+                <w:rFonts w:ascii="B Zar" w:hAnsi="B Zar"/>
+                <w:b/>
+                <w:color w:val="FFFFFF"/>
+                <w:sz w:val="17"/>
+              </w:rPr>
+              <w:t>وضعیت</w:t>
+            </w:r>
+          </w:p>
+        </w:tc>
+      </w:tr>
+      <w:tr>
+        <w:tc>
+          <w:tcPr>
+            <w:tcW w:type="dxa" w:w="1361"/>
+            <w:tcBorders>
+              <w:top w:val="single" w:sz="3" w:space="0" w:color="D9E0E7"/>
+              <w:left w:val="single" w:sz="3" w:space="0" w:color="D9E0E7"/>
+              <w:bottom w:val="single" w:sz="3" w:space="0" w:color="D9E0E7"/>
+              <w:right w:val="single" w:sz="3" w:space="0" w:color="D9E0E7"/>
+            </w:tcBorders>
+            <w:shd w:fill="FFFFFF"/>
+          </w:tcPr>
+          <w:p>
+            <w:pPr>
+              <w:spacing w:after="20" w:line="259" w:lineRule="auto"/>
+              <w:jc w:val="right"/>
+            </w:pPr>
+            <w:r/>
+            <w:r>
+              <w:rPr>
+                <w:rFonts w:ascii="B Zar" w:hAnsi="B Zar"/>
+                <w:b w:val="0"/>
+                <w:color w:val="263238"/>
+                <w:sz w:val="17"/>
+              </w:rPr>
+              <w:t>۰٫۵</w:t>
+            </w:r>
+          </w:p>
+        </w:tc>
+        <w:tc>
+          <w:tcPr>
+            <w:tcW w:type="dxa" w:w="1701"/>
+            <w:tcBorders>
+              <w:top w:val="single" w:sz="3" w:space="0" w:color="D9E0E7"/>
+              <w:left w:val="single" w:sz="3" w:space="0" w:color="D9E0E7"/>
+              <w:bottom w:val="single" w:sz="3" w:space="0" w:color="D9E0E7"/>
+              <w:right w:val="single" w:sz="3" w:space="0" w:color="D9E0E7"/>
+            </w:tcBorders>
+            <w:shd w:fill="FFFFFF"/>
+          </w:tcPr>
+          <w:p>
+            <w:pPr>
+              <w:spacing w:after="20" w:line="259" w:lineRule="auto"/>
+              <w:jc w:val="right"/>
+            </w:pPr>
+            <w:r/>
+            <w:r>
+              <w:rPr>
+                <w:rFonts w:ascii="B Zar" w:hAnsi="B Zar"/>
+                <w:b w:val="0"/>
+                <w:color w:val="263238"/>
+                <w:sz w:val="17"/>
+              </w:rPr>
+              <w:t>۱۲ مهر ۱۴۰۵</w:t>
+            </w:r>
+          </w:p>
+        </w:tc>
+        <w:tc>
+          <w:tcPr>
+            <w:tcW w:type="dxa" w:w="5669"/>
+            <w:tcBorders>
+              <w:top w:val="single" w:sz="3" w:space="0" w:color="D9E0E7"/>
+              <w:left w:val="single" w:sz="3" w:space="0" w:color="D9E0E7"/>
+              <w:bottom w:val="single" w:sz="3" w:space="0" w:color="D9E0E7"/>
+              <w:right w:val="single" w:sz="3" w:space="0" w:color="D9E0E7"/>
+            </w:tcBorders>
+            <w:shd w:fill="FFFFFF"/>
+          </w:tcPr>
+          <w:p>
+            <w:pPr>
+              <w:spacing w:after="20" w:line="259" w:lineRule="auto"/>
+              <w:jc w:val="right"/>
+            </w:pPr>
+            <w:r/>
+            <w:r>
+              <w:rPr>
+                <w:rFonts w:ascii="B Zar" w:hAnsi="B Zar"/>
+                <w:b w:val="0"/>
+                <w:color w:val="263238"/>
+                <w:sz w:val="17"/>
+              </w:rPr>
+              <w:t>F-07: فشن‌گیم اجتماعی بومی؛ benchmark، substitute، risk، reversal gate و evidence ledger ثبت شد.</w:t>
+            </w:r>
+          </w:p>
+        </w:tc>
+        <w:tc>
+          <w:tcPr>
+            <w:tcW w:type="dxa" w:w="1701"/>
+            <w:tcBorders>
+              <w:top w:val="single" w:sz="3" w:space="0" w:color="D9E0E7"/>
+              <w:left w:val="single" w:sz="3" w:space="0" w:color="D9E0E7"/>
+              <w:bottom w:val="single" w:sz="3" w:space="0" w:color="D9E0E7"/>
+              <w:right w:val="single" w:sz="3" w:space="0" w:color="D9E0E7"/>
+            </w:tcBorders>
+            <w:shd w:fill="FFFFFF"/>
+          </w:tcPr>
+          <w:p>
+            <w:pPr>
+              <w:spacing w:after="20" w:line="259" w:lineRule="auto"/>
+              <w:jc w:val="right"/>
+            </w:pPr>
+            <w:r/>
+            <w:r>
+              <w:rPr>
+                <w:rFonts w:ascii="B Zar" w:hAnsi="B Zar"/>
+                <w:b w:val="0"/>
+                <w:color w:val="263238"/>
+                <w:sz w:val="17"/>
+              </w:rPr>
+              <w:t>Pause / منتشرشده</w:t>
+            </w:r>
+          </w:p>
+        </w:tc>
+      </w:tr>
+      <w:tr>
+        <w:tc>
+          <w:tcPr>
+            <w:tcW w:type="dxa" w:w="1361"/>
+            <w:tcBorders>
+              <w:top w:val="single" w:sz="3" w:space="0" w:color="D9E0E7"/>
+              <w:left w:val="single" w:sz="3" w:space="0" w:color="D9E0E7"/>
+              <w:bottom w:val="single" w:sz="3" w:space="0" w:color="D9E0E7"/>
+              <w:right w:val="single" w:sz="3" w:space="0" w:color="D9E0E7"/>
+            </w:tcBorders>
+            <w:shd w:fill="F5F7FA"/>
+          </w:tcPr>
+          <w:p>
+            <w:pPr>
+              <w:spacing w:after="20" w:line="259" w:lineRule="auto"/>
+              <w:jc w:val="right"/>
+            </w:pPr>
+            <w:r/>
+            <w:r>
+              <w:rPr>
+                <w:rFonts w:ascii="B Zar" w:hAnsi="B Zar"/>
+                <w:b w:val="0"/>
+                <w:color w:val="263238"/>
+                <w:sz w:val="17"/>
+              </w:rPr>
+              <w:t>۰٫۶</w:t>
+            </w:r>
+          </w:p>
+        </w:tc>
+        <w:tc>
+          <w:tcPr>
+            <w:tcW w:type="dxa" w:w="1701"/>
+            <w:tcBorders>
+              <w:top w:val="single" w:sz="3" w:space="0" w:color="D9E0E7"/>
+              <w:left w:val="single" w:sz="3" w:space="0" w:color="D9E0E7"/>
+              <w:bottom w:val="single" w:sz="3" w:space="0" w:color="D9E0E7"/>
+              <w:right w:val="single" w:sz="3" w:space="0" w:color="D9E0E7"/>
+            </w:tcBorders>
+            <w:shd w:fill="F5F7FA"/>
+          </w:tcPr>
+          <w:p>
+            <w:pPr>
+              <w:spacing w:after="20" w:line="259" w:lineRule="auto"/>
+              <w:jc w:val="right"/>
+            </w:pPr>
+            <w:r/>
+            <w:r>
+              <w:rPr>
+                <w:rFonts w:ascii="B Zar" w:hAnsi="B Zar"/>
+                <w:b w:val="0"/>
+                <w:color w:val="263238"/>
+                <w:sz w:val="17"/>
+              </w:rPr>
+              <w:t>پس از پژوهش بعدی</w:t>
+            </w:r>
+          </w:p>
+        </w:tc>
+        <w:tc>
+          <w:tcPr>
+            <w:tcW w:type="dxa" w:w="5669"/>
+            <w:tcBorders>
+              <w:top w:val="single" w:sz="3" w:space="0" w:color="D9E0E7"/>
+              <w:left w:val="single" w:sz="3" w:space="0" w:color="D9E0E7"/>
+              <w:bottom w:val="single" w:sz="3" w:space="0" w:color="D9E0E7"/>
+              <w:right w:val="single" w:sz="3" w:space="0" w:color="D9E0E7"/>
+            </w:tcBorders>
+            <w:shd w:fill="F5F7FA"/>
+          </w:tcPr>
+          <w:p>
+            <w:pPr>
+              <w:spacing w:after="20" w:line="259" w:lineRule="auto"/>
+              <w:jc w:val="right"/>
+            </w:pPr>
+            <w:r/>
+            <w:r>
+              <w:rPr>
+                <w:rFonts w:ascii="B Zar" w:hAnsi="B Zar"/>
+                <w:b w:val="0"/>
+                <w:color w:val="263238"/>
+                <w:sz w:val="17"/>
+              </w:rPr>
+              <w:t>پروندهٔ بعدی یا نتایج primary research/pilot بر مبنای شواهد واقعی.</w:t>
+            </w:r>
+          </w:p>
+        </w:tc>
+        <w:tc>
+          <w:tcPr>
+            <w:tcW w:type="dxa" w:w="1701"/>
+            <w:tcBorders>
+              <w:top w:val="single" w:sz="3" w:space="0" w:color="D9E0E7"/>
+              <w:left w:val="single" w:sz="3" w:space="0" w:color="D9E0E7"/>
+              <w:bottom w:val="single" w:sz="3" w:space="0" w:color="D9E0E7"/>
+              <w:right w:val="single" w:sz="3" w:space="0" w:color="D9E0E7"/>
+            </w:tcBorders>
+            <w:shd w:fill="F5F7FA"/>
+          </w:tcPr>
+          <w:p>
+            <w:pPr>
+              <w:spacing w:after="20" w:line="259" w:lineRule="auto"/>
+              <w:jc w:val="right"/>
+            </w:pPr>
+            <w:r/>
+            <w:r>
+              <w:rPr>
+                <w:rFonts w:ascii="B Zar" w:hAnsi="B Zar"/>
+                <w:b w:val="0"/>
+                <w:color w:val="263238"/>
+                <w:sz w:val="17"/>
+              </w:rPr>
+              <w:t>برنامه‌ریزی‌شده</w:t>
+            </w:r>
+          </w:p>
+        </w:tc>
+      </w:tr>
+    </w:tbl>
+    <w:p/>
+    <w:tbl>
+      <w:tblPr>
+        <w:bidiVisual w:val="1"/>
+        <w:tblW w:type="auto" w:w="0"/>
+        <w:tblLook w:firstColumn="1" w:firstRow="1" w:lastColumn="0" w:lastRow="0" w:noHBand="0" w:noVBand="1" w:val="04A0"/>
+      </w:tblPr>
+      <w:tblGrid>
+        <w:gridCol w:w="9638"/>
+      </w:tblGrid>
+      <w:tr>
+        <w:tc>
+          <w:tcPr>
+            <w:tcW w:type="dxa" w:w="9638"/>
+            <w:tcBorders>
+              <w:top w:val="single" w:sz="6" w:space="0" w:color="8A6100"/>
+              <w:left w:val="single" w:sz="6" w:space="0" w:color="8A6100"/>
+              <w:bottom w:val="single" w:sz="6" w:space="0" w:color="8A6100"/>
+              <w:right w:val="single" w:sz="6" w:space="0" w:color="8A6100"/>
+            </w:tcBorders>
+            <w:shd w:fill="FFF3D6"/>
+          </w:tcPr>
+          <w:p>
+            <w:pPr>
+              <w:jc w:val="right"/>
+            </w:pPr>
+            <w:r/>
+            <w:r>
+              <w:rPr>
+                <w:rFonts w:ascii="B Zar" w:hAnsi="B Zar"/>
+                <w:b/>
+                <w:color w:val="8A6100"/>
+                <w:sz w:val="21"/>
+              </w:rPr>
+              <w:t>نتیجه</w:t>
+            </w:r>
+          </w:p>
+          <w:p>
+            <w:pPr>
+              <w:spacing w:line="288" w:lineRule="auto"/>
+              <w:jc w:val="right"/>
+            </w:pPr>
+            <w:r>
+              <w:rPr>
+                <w:rFonts w:ascii="B Zar" w:hAnsi="B Zar"/>
+                <w:b w:val="0"/>
+                <w:color w:val="263238"/>
+                <w:sz w:val="19"/>
+              </w:rPr>
+              <w:t>F-07 فقط به درخواست صریح کاربر باز می‌شود. هیچ مسیر جدیدی Pass نشده و primary research/pilot برای F-01 تا F-04 همچنان باز است.</w:t>
             </w:r>
           </w:p>
         </w:tc>

</xml_diff>

<commit_message>
Standardize F-01 to F-07 market research structure
</commit_message>
<xml_diff>
--- a/reports/fashion_market_research_master_v0.docx
+++ b/reports/fashion_market_research_master_v0.docx
@@ -29,14 +29,7 @@
               <w:spacing w:after="20" w:line="259" w:lineRule="auto"/>
               <w:jc w:val="right"/>
             </w:pPr>
-            <w:r/>
-            <w:r>
-              <w:rPr>
-                <w:rFonts w:ascii="B Zar" w:hAnsi="B Zar"/>
-                <w:b/>
-                <w:color w:val="7FD6CB"/>
-                <w:sz w:val="31"/>
-              </w:rPr>
+            <w:r>
               <w:br/>
               <w:br/>
               <w:br/>
@@ -54,7 +47,7 @@
               <w:br/>
               <w:br/>
               <w:br/>
-              <w:t>نسخهٔ ۰٫۵ | سند زنده و محرمانه</w:t>
+              <w:t>نسخهٔ ۰٫۶ | سند زنده و محرمانه</w:t>
               <w:br/>
               <w:t>۱۲ مهر ۱۴۰۵  |  ۴ اکتبر ۲۰۲۶</w:t>
               <w:br/>
@@ -368,15 +361,8 @@
               <w:spacing w:after="20" w:line="259" w:lineRule="auto"/>
               <w:jc w:val="right"/>
             </w:pPr>
-            <w:r/>
-            <w:r>
-              <w:rPr>
-                <w:rFonts w:ascii="B Zar" w:hAnsi="B Zar"/>
-                <w:b w:val="0"/>
-                <w:color w:val="263238"/>
-                <w:sz w:val="17"/>
-              </w:rPr>
-              <w:t>۰٫۵ — هفت پروندهٔ desk-research افزوده شد؛ F-07 به درخواست کاربر Pause است و پژوهش اولیه/پایلوت فقط برای F-01 تا F-04 باز است.</w:t>
+            <w:r>
+              <w:t>۰٫۶ — hierarchy و عنوان‌های F-01 تا F-07 به ساختار استاندارد گزارش تحقیقات بازار بازآرایی شد؛ وضعیت‌های تصمیم تغییری نکرده‌اند.</w:t>
             </w:r>
           </w:p>
         </w:tc>
@@ -642,15 +628,8 @@
               <w:spacing w:after="40"/>
               <w:jc w:val="right"/>
             </w:pPr>
-            <w:r/>
-            <w:r>
-              <w:rPr>
-                <w:rFonts w:ascii="B Zar" w:hAnsi="B Zar"/>
-                <w:b/>
-                <w:color w:val="1F7A70"/>
-                <w:sz w:val="21"/>
-              </w:rPr>
-              <w:t>یادداشت اعتبار نسخهٔ ۰٫۵</w:t>
+            <w:r>
+              <w:t>یادداشت اعتبار نسخهٔ ۰٫۶</w:t>
             </w:r>
           </w:p>
           <w:p>
@@ -861,12 +840,7 @@
         <w:jc w:val="right"/>
       </w:pPr>
       <w:r>
-        <w:rPr>
-          <w:rFonts w:ascii="B Zar" w:hAnsi="B Zar"/>
-          <w:color w:val="8A94A3"/>
-          <w:sz w:val="18"/>
-        </w:rPr>
-        <w:t>• ۶. قالب ثابت هر پروندهٔ تحقیق بازار</w:t>
+        <w:t>• ۶. ساختار استاندارد گزارش‌های تحقیقات بازار</w:t>
       </w:r>
     </w:p>
     <w:p>
@@ -2916,13 +2890,7 @@
               <w:jc w:val="right"/>
             </w:pPr>
             <w:r>
-              <w:rPr>
-                <w:rFonts w:ascii="B Zar" w:hAnsi="B Zar"/>
-                <w:b w:val="0"/>
-                <w:color w:val="263238"/>
-                <w:sz w:val="19"/>
-              </w:rPr>
-              <w:t>هیچ نمودار اندازهٔ بازار، سهم بازار، درآمد یا رضایت با دادهٔ نمونه یا عدد بی‌منبع وارد این گزارش نمی‌شود. نمودارهای نسخهٔ ۰٫۵ فقط وضعیت واقعی برنامهٔ پژوهش را نمایش می‌دهند. نمودارهای هر پرونده پس از ثبت منبع، تعریف، واحد و روش ایجاد می‌شوند.</w:t>
+              <w:t>هیچ نمودار اندازهٔ بازار، سهم بازار، درآمد یا رضایت با دادهٔ نمونه یا عدد بی‌منبع وارد این گزارش نمی‌شود. نمودارهای نسخهٔ ۰٫۶ فقط وضعیت واقعی برنامهٔ پژوهش را نمایش می‌دهند. نمودارهای هر پرونده پس از ثبت منبع، تعریف، واحد و روش ایجاد می‌شوند.</w:t>
             </w:r>
           </w:p>
         </w:tc>
@@ -5377,15 +5345,8 @@
               <w:spacing w:after="20" w:line="259" w:lineRule="auto"/>
               <w:jc w:val="right"/>
             </w:pPr>
-            <w:r/>
-            <w:r>
-              <w:rPr>
-                <w:rFonts w:ascii="B Zar" w:hAnsi="B Zar"/>
-                <w:b w:val="0"/>
-                <w:color w:val="263238"/>
-                <w:sz w:val="17"/>
-              </w:rPr>
-              <w:t>پروندهٔ عمیق نسخهٔ ۰٫۵؛ بازگشایی فقط با درخواست صریح.</w:t>
+            <w:r>
+              <w:t>پروندهٔ عمیق نسخهٔ ۰٫۶؛ بازگشایی فقط با درخواست صریح.</w:t>
             </w:r>
           </w:p>
         </w:tc>
@@ -11064,12 +11025,7 @@
         <w:jc w:val="right"/>
       </w:pPr>
       <w:r>
-        <w:rPr>
-          <w:rFonts w:ascii="B Zar" w:hAnsi="B Zar"/>
-          <w:color w:val="1F3A5F"/>
-          <w:sz w:val="32"/>
-        </w:rPr>
-        <w:t>۶. قالب ثابت هر پروندهٔ تحقیق بازار</w:t>
+        <w:t>۶. ساختار استاندارد گزارش‌های تحقیقات بازار</w:t>
       </w:r>
     </w:p>
     <w:p>
@@ -11078,12 +11034,7 @@
         <w:jc w:val="right"/>
       </w:pPr>
       <w:r>
-        <w:rPr>
-          <w:rFonts w:ascii="B Zar" w:hAnsi="B Zar"/>
-          <w:color w:val="263238"/>
-          <w:sz w:val="22"/>
-        </w:rPr>
-        <w:t>برای جلوگیری از گزارش‌های صرفاً توصیفی، هر پرونده با «کارت تصمیم» آغاز و با گیت اعتبارسنجی یا توصیهٔ صریح پایان می‌یابد. تیترهای زیر در همهٔ پرونده‌ها حفظ می‌شوند؛ عمق هر بخش تابع سطح بلوغ و کیفیت داده است.</w:t>
+        <w:t>هر پروندهٔ F-01 تا F-07 از این نسخه با hierarchy حرفه‌ای و ثابت تحقیقات بازار نوشته می‌شود: Executive Summary، Introduction، Methodology، Findings، Analysis، Conclusions &amp; Recommendations و Appendices. موضوع‌های بازار، تقاضا، مشتری، رقابت، قیمت‌گذاری، امکان‌سنجی و ریسک در فصل‌های استاندارد زیر قرار می‌گیرند، نه به‌عنوان عنوان اول مستقل. متن کامل هر پرونده در dossier متناظر حفظ و این سند مادر با آن همگام شده است.</w:t>
       </w:r>
     </w:p>
     <w:tbl>
@@ -11201,71 +11152,50 @@
               <w:spacing w:after="20" w:line="259" w:lineRule="auto"/>
               <w:jc w:val="right"/>
             </w:pPr>
-            <w:r/>
-            <w:r>
-              <w:rPr>
-                <w:rFonts w:ascii="B Zar" w:hAnsi="B Zar"/>
-                <w:b w:val="0"/>
-                <w:color w:val="263238"/>
-                <w:sz w:val="17"/>
-              </w:rPr>
-              <w:t>۱. کارت تصمیم</w:t>
-            </w:r>
-          </w:p>
-        </w:tc>
-        <w:tc>
-          <w:tcPr>
-            <w:tcW w:type="dxa" w:w="3213"/>
-            <w:tcBorders>
-              <w:top w:val="single" w:sz="3" w:space="0" w:color="D9E0E7"/>
-              <w:left w:val="single" w:sz="3" w:space="0" w:color="D9E0E7"/>
-              <w:bottom w:val="single" w:sz="3" w:space="0" w:color="D9E0E7"/>
-              <w:right w:val="single" w:sz="3" w:space="0" w:color="D9E0E7"/>
-            </w:tcBorders>
-            <w:shd w:fill="FFFFFF"/>
-          </w:tcPr>
-          <w:p>
-            <w:pPr>
-              <w:spacing w:after="20" w:line="259" w:lineRule="auto"/>
-              <w:jc w:val="right"/>
-            </w:pPr>
-            <w:r/>
-            <w:r>
-              <w:rPr>
-                <w:rFonts w:ascii="B Zar" w:hAnsi="B Zar"/>
-                <w:b w:val="0"/>
-                <w:color w:val="263238"/>
-                <w:sz w:val="17"/>
-              </w:rPr>
-              <w:t>این مسیر چیست و اکنون چه تصمیمی نیاز دارد؟</w:t>
-            </w:r>
-          </w:p>
-        </w:tc>
-        <w:tc>
-          <w:tcPr>
-            <w:tcW w:type="dxa" w:w="3213"/>
-            <w:tcBorders>
-              <w:top w:val="single" w:sz="3" w:space="0" w:color="D9E0E7"/>
-              <w:left w:val="single" w:sz="3" w:space="0" w:color="D9E0E7"/>
-              <w:bottom w:val="single" w:sz="3" w:space="0" w:color="D9E0E7"/>
-              <w:right w:val="single" w:sz="3" w:space="0" w:color="D9E0E7"/>
-            </w:tcBorders>
-            <w:shd w:fill="FFFFFF"/>
-          </w:tcPr>
-          <w:p>
-            <w:pPr>
-              <w:spacing w:after="20" w:line="259" w:lineRule="auto"/>
-              <w:jc w:val="right"/>
-            </w:pPr>
-            <w:r/>
-            <w:r>
-              <w:rPr>
-                <w:rFonts w:ascii="B Zar" w:hAnsi="B Zar"/>
-                <w:b w:val="0"/>
-                <w:color w:val="263238"/>
-                <w:sz w:val="17"/>
-              </w:rPr>
-              <w:t>تعریف، status، ICP، مرز، سه شاهد، سه شکاف، next step</w:t>
+            <w:r>
+              <w:t>۱. خلاصهٔ مدیریتی</w:t>
+            </w:r>
+          </w:p>
+        </w:tc>
+        <w:tc>
+          <w:tcPr>
+            <w:tcW w:type="dxa" w:w="3213"/>
+            <w:tcBorders>
+              <w:top w:val="single" w:sz="3" w:space="0" w:color="D9E0E7"/>
+              <w:left w:val="single" w:sz="3" w:space="0" w:color="D9E0E7"/>
+              <w:bottom w:val="single" w:sz="3" w:space="0" w:color="D9E0E7"/>
+              <w:right w:val="single" w:sz="3" w:space="0" w:color="D9E0E7"/>
+            </w:tcBorders>
+            <w:shd w:fill="FFFFFF"/>
+          </w:tcPr>
+          <w:p>
+            <w:pPr>
+              <w:spacing w:after="20" w:line="259" w:lineRule="auto"/>
+              <w:jc w:val="right"/>
+            </w:pPr>
+            <w:r>
+              <w:t>تصمیم و نکات کلیدی چیست؟</w:t>
+            </w:r>
+          </w:p>
+        </w:tc>
+        <w:tc>
+          <w:tcPr>
+            <w:tcW w:type="dxa" w:w="3213"/>
+            <w:tcBorders>
+              <w:top w:val="single" w:sz="3" w:space="0" w:color="D9E0E7"/>
+              <w:left w:val="single" w:sz="3" w:space="0" w:color="D9E0E7"/>
+              <w:bottom w:val="single" w:sz="3" w:space="0" w:color="D9E0E7"/>
+              <w:right w:val="single" w:sz="3" w:space="0" w:color="D9E0E7"/>
+            </w:tcBorders>
+            <w:shd w:fill="FFFFFF"/>
+          </w:tcPr>
+          <w:p>
+            <w:pPr>
+              <w:spacing w:after="20" w:line="259" w:lineRule="auto"/>
+              <w:jc w:val="right"/>
+            </w:pPr>
+            <w:r>
+              <w:t>وضعیت، یافته‌های اصلی، implication، شکاف evidence و اقدام توصیه‌شده.</w:t>
             </w:r>
           </w:p>
         </w:tc>
@@ -11287,71 +11217,50 @@
               <w:spacing w:after="20" w:line="259" w:lineRule="auto"/>
               <w:jc w:val="right"/>
             </w:pPr>
-            <w:r/>
-            <w:r>
-              <w:rPr>
-                <w:rFonts w:ascii="B Zar" w:hAnsi="B Zar"/>
-                <w:b w:val="0"/>
-                <w:color w:val="263238"/>
-                <w:sz w:val="17"/>
-              </w:rPr>
-              <w:t>۲. مسئله و JTBD</w:t>
-            </w:r>
-          </w:p>
-        </w:tc>
-        <w:tc>
-          <w:tcPr>
-            <w:tcW w:type="dxa" w:w="3213"/>
-            <w:tcBorders>
-              <w:top w:val="single" w:sz="3" w:space="0" w:color="D9E0E7"/>
-              <w:left w:val="single" w:sz="3" w:space="0" w:color="D9E0E7"/>
-              <w:bottom w:val="single" w:sz="3" w:space="0" w:color="D9E0E7"/>
-              <w:right w:val="single" w:sz="3" w:space="0" w:color="D9E0E7"/>
-            </w:tcBorders>
-            <w:shd w:fill="F5F7FA"/>
-          </w:tcPr>
-          <w:p>
-            <w:pPr>
-              <w:spacing w:after="20" w:line="259" w:lineRule="auto"/>
-              <w:jc w:val="right"/>
-            </w:pPr>
-            <w:r/>
-            <w:r>
-              <w:rPr>
-                <w:rFonts w:ascii="B Zar" w:hAnsi="B Zar"/>
-                <w:b w:val="0"/>
-                <w:color w:val="263238"/>
-                <w:sz w:val="17"/>
-              </w:rPr>
-              <w:t>کدام جریان کاری یا رفتار واقعاً دچار اصطکاک است؟</w:t>
-            </w:r>
-          </w:p>
-        </w:tc>
-        <w:tc>
-          <w:tcPr>
-            <w:tcW w:type="dxa" w:w="3213"/>
-            <w:tcBorders>
-              <w:top w:val="single" w:sz="3" w:space="0" w:color="D9E0E7"/>
-              <w:left w:val="single" w:sz="3" w:space="0" w:color="D9E0E7"/>
-              <w:bottom w:val="single" w:sz="3" w:space="0" w:color="D9E0E7"/>
-              <w:right w:val="single" w:sz="3" w:space="0" w:color="D9E0E7"/>
-            </w:tcBorders>
-            <w:shd w:fill="F5F7FA"/>
-          </w:tcPr>
-          <w:p>
-            <w:pPr>
-              <w:spacing w:after="20" w:line="259" w:lineRule="auto"/>
-              <w:jc w:val="right"/>
-            </w:pPr>
-            <w:r/>
-            <w:r>
-              <w:rPr>
-                <w:rFonts w:ascii="B Zar" w:hAnsi="B Zar"/>
-                <w:b w:val="0"/>
-                <w:color w:val="263238"/>
-                <w:sz w:val="17"/>
-              </w:rPr>
-              <w:t>workflow، pain، frequency، cost of failure و workaround</w:t>
+            <w:r>
+              <w:t>۲. مقدمه، زمینه و اهداف پژوهش</w:t>
+            </w:r>
+          </w:p>
+        </w:tc>
+        <w:tc>
+          <w:tcPr>
+            <w:tcW w:type="dxa" w:w="3213"/>
+            <w:tcBorders>
+              <w:top w:val="single" w:sz="3" w:space="0" w:color="D9E0E7"/>
+              <w:left w:val="single" w:sz="3" w:space="0" w:color="D9E0E7"/>
+              <w:bottom w:val="single" w:sz="3" w:space="0" w:color="D9E0E7"/>
+              <w:right w:val="single" w:sz="3" w:space="0" w:color="D9E0E7"/>
+            </w:tcBorders>
+            <w:shd w:fill="F5F7FA"/>
+          </w:tcPr>
+          <w:p>
+            <w:pPr>
+              <w:spacing w:after="20" w:line="259" w:lineRule="auto"/>
+              <w:jc w:val="right"/>
+            </w:pPr>
+            <w:r>
+              <w:t>تصمیم، دامنه و تعریف بازار چیست؟</w:t>
+            </w:r>
+          </w:p>
+        </w:tc>
+        <w:tc>
+          <w:tcPr>
+            <w:tcW w:type="dxa" w:w="3213"/>
+            <w:tcBorders>
+              <w:top w:val="single" w:sz="3" w:space="0" w:color="D9E0E7"/>
+              <w:left w:val="single" w:sz="3" w:space="0" w:color="D9E0E7"/>
+              <w:bottom w:val="single" w:sz="3" w:space="0" w:color="D9E0E7"/>
+              <w:right w:val="single" w:sz="3" w:space="0" w:color="D9E0E7"/>
+            </w:tcBorders>
+            <w:shd w:fill="F5F7FA"/>
+          </w:tcPr>
+          <w:p>
+            <w:pPr>
+              <w:spacing w:after="20" w:line="259" w:lineRule="auto"/>
+              <w:jc w:val="right"/>
+            </w:pPr>
+            <w:r>
+              <w:t>business context، objective/question، scope، market definition و exclusions.</w:t>
             </w:r>
           </w:p>
         </w:tc>
@@ -11373,71 +11282,50 @@
               <w:spacing w:after="20" w:line="259" w:lineRule="auto"/>
               <w:jc w:val="right"/>
             </w:pPr>
-            <w:r/>
-            <w:r>
-              <w:rPr>
-                <w:rFonts w:ascii="B Zar" w:hAnsi="B Zar"/>
-                <w:b w:val="0"/>
-                <w:color w:val="263238"/>
-                <w:sz w:val="17"/>
-              </w:rPr>
-              <w:t>۳. بازار و تقاضا</w:t>
-            </w:r>
-          </w:p>
-        </w:tc>
-        <w:tc>
-          <w:tcPr>
-            <w:tcW w:type="dxa" w:w="3213"/>
-            <w:tcBorders>
-              <w:top w:val="single" w:sz="3" w:space="0" w:color="D9E0E7"/>
-              <w:left w:val="single" w:sz="3" w:space="0" w:color="D9E0E7"/>
-              <w:bottom w:val="single" w:sz="3" w:space="0" w:color="D9E0E7"/>
-              <w:right w:val="single" w:sz="3" w:space="0" w:color="D9E0E7"/>
-            </w:tcBorders>
-            <w:shd w:fill="FFFFFF"/>
-          </w:tcPr>
-          <w:p>
-            <w:pPr>
-              <w:spacing w:after="20" w:line="259" w:lineRule="auto"/>
-              <w:jc w:val="right"/>
-            </w:pPr>
-            <w:r/>
-            <w:r>
-              <w:rPr>
-                <w:rFonts w:ascii="B Zar" w:hAnsi="B Zar"/>
-                <w:b w:val="0"/>
-                <w:color w:val="263238"/>
-                <w:sz w:val="17"/>
-              </w:rPr>
-              <w:t>چه مشتری/بخشی، در کجا و با چه budgetی دارد؟</w:t>
-            </w:r>
-          </w:p>
-        </w:tc>
-        <w:tc>
-          <w:tcPr>
-            <w:tcW w:type="dxa" w:w="3213"/>
-            <w:tcBorders>
-              <w:top w:val="single" w:sz="3" w:space="0" w:color="D9E0E7"/>
-              <w:left w:val="single" w:sz="3" w:space="0" w:color="D9E0E7"/>
-              <w:bottom w:val="single" w:sz="3" w:space="0" w:color="D9E0E7"/>
-              <w:right w:val="single" w:sz="3" w:space="0" w:color="D9E0E7"/>
-            </w:tcBorders>
-            <w:shd w:fill="FFFFFF"/>
-          </w:tcPr>
-          <w:p>
-            <w:pPr>
-              <w:spacing w:after="20" w:line="259" w:lineRule="auto"/>
-              <w:jc w:val="right"/>
-            </w:pPr>
-            <w:r/>
-            <w:r>
-              <w:rPr>
-                <w:rFonts w:ascii="B Zar" w:hAnsi="B Zar"/>
-                <w:b w:val="0"/>
-                <w:color w:val="263238"/>
-                <w:sz w:val="17"/>
-              </w:rPr>
-              <w:t>segment، buyer journey، WTP evidence، TAM/SAM/SOM یا data gap</w:t>
+            <w:r>
+              <w:t>۳. روش‌شناسی و محدودیت‌ها</w:t>
+            </w:r>
+          </w:p>
+        </w:tc>
+        <w:tc>
+          <w:tcPr>
+            <w:tcW w:type="dxa" w:w="3213"/>
+            <w:tcBorders>
+              <w:top w:val="single" w:sz="3" w:space="0" w:color="D9E0E7"/>
+              <w:left w:val="single" w:sz="3" w:space="0" w:color="D9E0E7"/>
+              <w:bottom w:val="single" w:sz="3" w:space="0" w:color="D9E0E7"/>
+              <w:right w:val="single" w:sz="3" w:space="0" w:color="D9E0E7"/>
+            </w:tcBorders>
+            <w:shd w:fill="FFFFFF"/>
+          </w:tcPr>
+          <w:p>
+            <w:pPr>
+              <w:spacing w:after="20" w:line="259" w:lineRule="auto"/>
+              <w:jc w:val="right"/>
+            </w:pPr>
+            <w:r>
+              <w:t>شواهد چگونه تولید و ارزیابی شده‌اند؟</w:t>
+            </w:r>
+          </w:p>
+        </w:tc>
+        <w:tc>
+          <w:tcPr>
+            <w:tcW w:type="dxa" w:w="3213"/>
+            <w:tcBorders>
+              <w:top w:val="single" w:sz="3" w:space="0" w:color="D9E0E7"/>
+              <w:left w:val="single" w:sz="3" w:space="0" w:color="D9E0E7"/>
+              <w:bottom w:val="single" w:sz="3" w:space="0" w:color="D9E0E7"/>
+              <w:right w:val="single" w:sz="3" w:space="0" w:color="D9E0E7"/>
+            </w:tcBorders>
+            <w:shd w:fill="FFFFFF"/>
+          </w:tcPr>
+          <w:p>
+            <w:pPr>
+              <w:spacing w:after="20" w:line="259" w:lineRule="auto"/>
+              <w:jc w:val="right"/>
+            </w:pPr>
+            <w:r>
+              <w:t>design، منبع، sample/fieldwork، روش تحلیل، bias و limitation.</w:t>
             </w:r>
           </w:p>
         </w:tc>
@@ -11459,71 +11347,50 @@
               <w:spacing w:after="20" w:line="259" w:lineRule="auto"/>
               <w:jc w:val="right"/>
             </w:pPr>
-            <w:r/>
-            <w:r>
-              <w:rPr>
-                <w:rFonts w:ascii="B Zar" w:hAnsi="B Zar"/>
-                <w:b w:val="0"/>
-                <w:color w:val="263238"/>
-                <w:sz w:val="17"/>
-              </w:rPr>
-              <w:t>۴. شواهد جهانی</w:t>
-            </w:r>
-          </w:p>
-        </w:tc>
-        <w:tc>
-          <w:tcPr>
-            <w:tcW w:type="dxa" w:w="3213"/>
-            <w:tcBorders>
-              <w:top w:val="single" w:sz="3" w:space="0" w:color="D9E0E7"/>
-              <w:left w:val="single" w:sz="3" w:space="0" w:color="D9E0E7"/>
-              <w:bottom w:val="single" w:sz="3" w:space="0" w:color="D9E0E7"/>
-              <w:right w:val="single" w:sz="3" w:space="0" w:color="D9E0E7"/>
-            </w:tcBorders>
-            <w:shd w:fill="F5F7FA"/>
-          </w:tcPr>
-          <w:p>
-            <w:pPr>
-              <w:spacing w:after="20" w:line="259" w:lineRule="auto"/>
-              <w:jc w:val="right"/>
-            </w:pPr>
-            <w:r/>
-            <w:r>
-              <w:rPr>
-                <w:rFonts w:ascii="B Zar" w:hAnsi="B Zar"/>
-                <w:b w:val="0"/>
-                <w:color w:val="263238"/>
-                <w:sz w:val="17"/>
-              </w:rPr>
-              <w:t>آیا category در بازارهای دیگر واقعا خریدار دارد؟</w:t>
-            </w:r>
-          </w:p>
-        </w:tc>
-        <w:tc>
-          <w:tcPr>
-            <w:tcW w:type="dxa" w:w="3213"/>
-            <w:tcBorders>
-              <w:top w:val="single" w:sz="3" w:space="0" w:color="D9E0E7"/>
-              <w:left w:val="single" w:sz="3" w:space="0" w:color="D9E0E7"/>
-              <w:bottom w:val="single" w:sz="3" w:space="0" w:color="D9E0E7"/>
-              <w:right w:val="single" w:sz="3" w:space="0" w:color="D9E0E7"/>
-            </w:tcBorders>
-            <w:shd w:fill="F5F7FA"/>
-          </w:tcPr>
-          <w:p>
-            <w:pPr>
-              <w:spacing w:after="20" w:line="259" w:lineRule="auto"/>
-              <w:jc w:val="right"/>
-            </w:pPr>
-            <w:r/>
-            <w:r>
-              <w:rPr>
-                <w:rFonts w:ascii="B Zar" w:hAnsi="B Zar"/>
-                <w:b w:val="0"/>
-                <w:color w:val="263238"/>
-                <w:sz w:val="17"/>
-              </w:rPr>
-              <w:t>benchmark، scale، revenue model، transferability limits</w:t>
+            <w:r>
+              <w:t>۴. نمای کلی بازار و صنعت</w:t>
+            </w:r>
+          </w:p>
+        </w:tc>
+        <w:tc>
+          <w:tcPr>
+            <w:tcW w:type="dxa" w:w="3213"/>
+            <w:tcBorders>
+              <w:top w:val="single" w:sz="3" w:space="0" w:color="D9E0E7"/>
+              <w:left w:val="single" w:sz="3" w:space="0" w:color="D9E0E7"/>
+              <w:bottom w:val="single" w:sz="3" w:space="0" w:color="D9E0E7"/>
+              <w:right w:val="single" w:sz="3" w:space="0" w:color="D9E0E7"/>
+            </w:tcBorders>
+            <w:shd w:fill="F5F7FA"/>
+          </w:tcPr>
+          <w:p>
+            <w:pPr>
+              <w:spacing w:after="20" w:line="259" w:lineRule="auto"/>
+              <w:jc w:val="right"/>
+            </w:pPr>
+            <w:r>
+              <w:t>category، value chain و driver/restraint چیست؟</w:t>
+            </w:r>
+          </w:p>
+        </w:tc>
+        <w:tc>
+          <w:tcPr>
+            <w:tcW w:type="dxa" w:w="3213"/>
+            <w:tcBorders>
+              <w:top w:val="single" w:sz="3" w:space="0" w:color="D9E0E7"/>
+              <w:left w:val="single" w:sz="3" w:space="0" w:color="D9E0E7"/>
+              <w:bottom w:val="single" w:sz="3" w:space="0" w:color="D9E0E7"/>
+              <w:right w:val="single" w:sz="3" w:space="0" w:color="D9E0E7"/>
+            </w:tcBorders>
+            <w:shd w:fill="F5F7FA"/>
+          </w:tcPr>
+          <w:p>
+            <w:pPr>
+              <w:spacing w:after="20" w:line="259" w:lineRule="auto"/>
+              <w:jc w:val="right"/>
+            </w:pPr>
+            <w:r>
+              <w:t>industry overview، trend، benchmark جهانی، مقررات و انتقال‌پذیری.</w:t>
             </w:r>
           </w:p>
         </w:tc>
@@ -11545,71 +11412,50 @@
               <w:spacing w:after="20" w:line="259" w:lineRule="auto"/>
               <w:jc w:val="right"/>
             </w:pPr>
-            <w:r/>
-            <w:r>
-              <w:rPr>
-                <w:rFonts w:ascii="B Zar" w:hAnsi="B Zar"/>
-                <w:b w:val="0"/>
-                <w:color w:val="263238"/>
-                <w:sz w:val="17"/>
-              </w:rPr>
-              <w:t>۵. ایران و جایگزین‌ها</w:t>
-            </w:r>
-          </w:p>
-        </w:tc>
-        <w:tc>
-          <w:tcPr>
-            <w:tcW w:type="dxa" w:w="3213"/>
-            <w:tcBorders>
-              <w:top w:val="single" w:sz="3" w:space="0" w:color="D9E0E7"/>
-              <w:left w:val="single" w:sz="3" w:space="0" w:color="D9E0E7"/>
-              <w:bottom w:val="single" w:sz="3" w:space="0" w:color="D9E0E7"/>
-              <w:right w:val="single" w:sz="3" w:space="0" w:color="D9E0E7"/>
-            </w:tcBorders>
-            <w:shd w:fill="FFFFFF"/>
-          </w:tcPr>
-          <w:p>
-            <w:pPr>
-              <w:spacing w:after="20" w:line="259" w:lineRule="auto"/>
-              <w:jc w:val="right"/>
-            </w:pPr>
-            <w:r/>
-            <w:r>
-              <w:rPr>
-                <w:rFonts w:ascii="B Zar" w:hAnsi="B Zar"/>
-                <w:b w:val="0"/>
-                <w:color w:val="263238"/>
-                <w:sz w:val="17"/>
-              </w:rPr>
-              <w:t>وضع موجود و تمام substituteهای واقعی ایران چیست؟</w:t>
-            </w:r>
-          </w:p>
-        </w:tc>
-        <w:tc>
-          <w:tcPr>
-            <w:tcW w:type="dxa" w:w="3213"/>
-            <w:tcBorders>
-              <w:top w:val="single" w:sz="3" w:space="0" w:color="D9E0E7"/>
-              <w:left w:val="single" w:sz="3" w:space="0" w:color="D9E0E7"/>
-              <w:bottom w:val="single" w:sz="3" w:space="0" w:color="D9E0E7"/>
-              <w:right w:val="single" w:sz="3" w:space="0" w:color="D9E0E7"/>
-            </w:tcBorders>
-            <w:shd w:fill="FFFFFF"/>
-          </w:tcPr>
-          <w:p>
-            <w:pPr>
-              <w:spacing w:after="20" w:line="259" w:lineRule="auto"/>
-              <w:jc w:val="right"/>
-            </w:pPr>
-            <w:r/>
-            <w:r>
-              <w:rPr>
-                <w:rFonts w:ascii="B Zar" w:hAnsi="B Zar"/>
-                <w:b w:val="0"/>
-                <w:color w:val="263238"/>
-                <w:sz w:val="17"/>
-              </w:rPr>
-              <w:t>competitor map، manual workflow، service و regulation</w:t>
+            <w:r>
+              <w:t>۵. اندازه، ساختار و تقاضای بازار</w:t>
+            </w:r>
+          </w:p>
+        </w:tc>
+        <w:tc>
+          <w:tcPr>
+            <w:tcW w:type="dxa" w:w="3213"/>
+            <w:tcBorders>
+              <w:top w:val="single" w:sz="3" w:space="0" w:color="D9E0E7"/>
+              <w:left w:val="single" w:sz="3" w:space="0" w:color="D9E0E7"/>
+              <w:bottom w:val="single" w:sz="3" w:space="0" w:color="D9E0E7"/>
+              <w:right w:val="single" w:sz="3" w:space="0" w:color="D9E0E7"/>
+            </w:tcBorders>
+            <w:shd w:fill="FFFFFF"/>
+          </w:tcPr>
+          <w:p>
+            <w:pPr>
+              <w:spacing w:after="20" w:line="259" w:lineRule="auto"/>
+              <w:jc w:val="right"/>
+            </w:pPr>
+            <w:r>
+              <w:t>تقاضا و اندازهٔ قابل دفاع چقدر است؟</w:t>
+            </w:r>
+          </w:p>
+        </w:tc>
+        <w:tc>
+          <w:tcPr>
+            <w:tcW w:type="dxa" w:w="3213"/>
+            <w:tcBorders>
+              <w:top w:val="single" w:sz="3" w:space="0" w:color="D9E0E7"/>
+              <w:left w:val="single" w:sz="3" w:space="0" w:color="D9E0E7"/>
+              <w:bottom w:val="single" w:sz="3" w:space="0" w:color="D9E0E7"/>
+              <w:right w:val="single" w:sz="3" w:space="0" w:color="D9E0E7"/>
+            </w:tcBorders>
+            <w:shd w:fill="FFFFFF"/>
+          </w:tcPr>
+          <w:p>
+            <w:pPr>
+              <w:spacing w:after="20" w:line="259" w:lineRule="auto"/>
+              <w:jc w:val="right"/>
+            </w:pPr>
+            <w:r>
+              <w:t>market-size indicators، TAM/SAM/SOM یا data gap، assumptions و sensitivity.</w:t>
             </w:r>
           </w:p>
         </w:tc>
@@ -11631,71 +11477,50 @@
               <w:spacing w:after="20" w:line="259" w:lineRule="auto"/>
               <w:jc w:val="right"/>
             </w:pPr>
-            <w:r/>
-            <w:r>
-              <w:rPr>
-                <w:rFonts w:ascii="B Zar" w:hAnsi="B Zar"/>
-                <w:b w:val="0"/>
-                <w:color w:val="263238"/>
-                <w:sz w:val="17"/>
-              </w:rPr>
-              <w:t>۶. رقابت و تمایز</w:t>
-            </w:r>
-          </w:p>
-        </w:tc>
-        <w:tc>
-          <w:tcPr>
-            <w:tcW w:type="dxa" w:w="3213"/>
-            <w:tcBorders>
-              <w:top w:val="single" w:sz="3" w:space="0" w:color="D9E0E7"/>
-              <w:left w:val="single" w:sz="3" w:space="0" w:color="D9E0E7"/>
-              <w:bottom w:val="single" w:sz="3" w:space="0" w:color="D9E0E7"/>
-              <w:right w:val="single" w:sz="3" w:space="0" w:color="D9E0E7"/>
-            </w:tcBorders>
-            <w:shd w:fill="F5F7FA"/>
-          </w:tcPr>
-          <w:p>
-            <w:pPr>
-              <w:spacing w:after="20" w:line="259" w:lineRule="auto"/>
-              <w:jc w:val="right"/>
-            </w:pPr>
-            <w:r/>
-            <w:r>
-              <w:rPr>
-                <w:rFonts w:ascii="B Zar" w:hAnsi="B Zar"/>
-                <w:b w:val="0"/>
-                <w:color w:val="263238"/>
-                <w:sz w:val="17"/>
-              </w:rPr>
-              <w:t>چه white space باقی می‌ماند و چه چیزی آن را از بین می‌برد؟</w:t>
-            </w:r>
-          </w:p>
-        </w:tc>
-        <w:tc>
-          <w:tcPr>
-            <w:tcW w:type="dxa" w:w="3213"/>
-            <w:tcBorders>
-              <w:top w:val="single" w:sz="3" w:space="0" w:color="D9E0E7"/>
-              <w:left w:val="single" w:sz="3" w:space="0" w:color="D9E0E7"/>
-              <w:bottom w:val="single" w:sz="3" w:space="0" w:color="D9E0E7"/>
-              <w:right w:val="single" w:sz="3" w:space="0" w:color="D9E0E7"/>
-            </w:tcBorders>
-            <w:shd w:fill="F5F7FA"/>
-          </w:tcPr>
-          <w:p>
-            <w:pPr>
-              <w:spacing w:after="20" w:line="259" w:lineRule="auto"/>
-              <w:jc w:val="right"/>
-            </w:pPr>
-            <w:r/>
-            <w:r>
-              <w:rPr>
-                <w:rFonts w:ascii="B Zar" w:hAnsi="B Zar"/>
-                <w:b w:val="0"/>
-                <w:color w:val="263238"/>
-                <w:sz w:val="17"/>
-              </w:rPr>
-              <w:t>matrix، positioning، switching cost، counter-thesis</w:t>
+            <w:r>
+              <w:t>۶. بازار هدف، بخش‌بندی و مشتری</w:t>
+            </w:r>
+          </w:p>
+        </w:tc>
+        <w:tc>
+          <w:tcPr>
+            <w:tcW w:type="dxa" w:w="3213"/>
+            <w:tcBorders>
+              <w:top w:val="single" w:sz="3" w:space="0" w:color="D9E0E7"/>
+              <w:left w:val="single" w:sz="3" w:space="0" w:color="D9E0E7"/>
+              <w:bottom w:val="single" w:sz="3" w:space="0" w:color="D9E0E7"/>
+              <w:right w:val="single" w:sz="3" w:space="0" w:color="D9E0E7"/>
+            </w:tcBorders>
+            <w:shd w:fill="F5F7FA"/>
+          </w:tcPr>
+          <w:p>
+            <w:pPr>
+              <w:spacing w:after="20" w:line="259" w:lineRule="auto"/>
+              <w:jc w:val="right"/>
+            </w:pPr>
+            <w:r>
+              <w:t>کدام segment و نقش خرید اولویت دارد؟</w:t>
+            </w:r>
+          </w:p>
+        </w:tc>
+        <w:tc>
+          <w:tcPr>
+            <w:tcW w:type="dxa" w:w="3213"/>
+            <w:tcBorders>
+              <w:top w:val="single" w:sz="3" w:space="0" w:color="D9E0E7"/>
+              <w:left w:val="single" w:sz="3" w:space="0" w:color="D9E0E7"/>
+              <w:bottom w:val="single" w:sz="3" w:space="0" w:color="D9E0E7"/>
+              <w:right w:val="single" w:sz="3" w:space="0" w:color="D9E0E7"/>
+            </w:tcBorders>
+            <w:shd w:fill="F5F7FA"/>
+          </w:tcPr>
+          <w:p>
+            <w:pPr>
+              <w:spacing w:after="20" w:line="259" w:lineRule="auto"/>
+              <w:jc w:val="right"/>
+            </w:pPr>
+            <w:r>
+              <w:t>B2B/B2C جدا، ICP، buyer/user، trigger و customer journey.</w:t>
             </w:r>
           </w:p>
         </w:tc>
@@ -11717,71 +11542,50 @@
               <w:spacing w:after="20" w:line="259" w:lineRule="auto"/>
               <w:jc w:val="right"/>
             </w:pPr>
-            <w:r/>
-            <w:r>
-              <w:rPr>
-                <w:rFonts w:ascii="B Zar" w:hAnsi="B Zar"/>
-                <w:b w:val="0"/>
-                <w:color w:val="263238"/>
-                <w:sz w:val="17"/>
-              </w:rPr>
-              <w:t>۷. مدل کسب‌وکار و اجرا</w:t>
-            </w:r>
-          </w:p>
-        </w:tc>
-        <w:tc>
-          <w:tcPr>
-            <w:tcW w:type="dxa" w:w="3213"/>
-            <w:tcBorders>
-              <w:top w:val="single" w:sz="3" w:space="0" w:color="D9E0E7"/>
-              <w:left w:val="single" w:sz="3" w:space="0" w:color="D9E0E7"/>
-              <w:bottom w:val="single" w:sz="3" w:space="0" w:color="D9E0E7"/>
-              <w:right w:val="single" w:sz="3" w:space="0" w:color="D9E0E7"/>
-            </w:tcBorders>
-            <w:shd w:fill="FFFFFF"/>
-          </w:tcPr>
-          <w:p>
-            <w:pPr>
-              <w:spacing w:after="20" w:line="259" w:lineRule="auto"/>
-              <w:jc w:val="right"/>
-            </w:pPr>
-            <w:r/>
-            <w:r>
-              <w:rPr>
-                <w:rFonts w:ascii="B Zar" w:hAnsi="B Zar"/>
-                <w:b w:val="0"/>
-                <w:color w:val="263238"/>
-                <w:sz w:val="17"/>
-              </w:rPr>
-              <w:t>چگونه درآمد، توزیع و delivery بدون عملیات نامطلوب ممکن است؟</w:t>
-            </w:r>
-          </w:p>
-        </w:tc>
-        <w:tc>
-          <w:tcPr>
-            <w:tcW w:type="dxa" w:w="3213"/>
-            <w:tcBorders>
-              <w:top w:val="single" w:sz="3" w:space="0" w:color="D9E0E7"/>
-              <w:left w:val="single" w:sz="3" w:space="0" w:color="D9E0E7"/>
-              <w:bottom w:val="single" w:sz="3" w:space="0" w:color="D9E0E7"/>
-              <w:right w:val="single" w:sz="3" w:space="0" w:color="D9E0E7"/>
-            </w:tcBorders>
-            <w:shd w:fill="FFFFFF"/>
-          </w:tcPr>
-          <w:p>
-            <w:pPr>
-              <w:spacing w:after="20" w:line="259" w:lineRule="auto"/>
-              <w:jc w:val="right"/>
-            </w:pPr>
-            <w:r/>
-            <w:r>
-              <w:rPr>
-                <w:rFonts w:ascii="B Zar" w:hAnsi="B Zar"/>
-                <w:b w:val="0"/>
-                <w:color w:val="263238"/>
-                <w:sz w:val="17"/>
-              </w:rPr>
-              <w:t>pricing، GTM، unit economics، dependencies و product boundary</w:t>
+            <w:r>
+              <w:t>۷. بینش مشتری و قیمت‌پذیری</w:t>
+            </w:r>
+          </w:p>
+        </w:tc>
+        <w:tc>
+          <w:tcPr>
+            <w:tcW w:type="dxa" w:w="3213"/>
+            <w:tcBorders>
+              <w:top w:val="single" w:sz="3" w:space="0" w:color="D9E0E7"/>
+              <w:left w:val="single" w:sz="3" w:space="0" w:color="D9E0E7"/>
+              <w:bottom w:val="single" w:sz="3" w:space="0" w:color="D9E0E7"/>
+              <w:right w:val="single" w:sz="3" w:space="0" w:color="D9E0E7"/>
+            </w:tcBorders>
+            <w:shd w:fill="FFFFFF"/>
+          </w:tcPr>
+          <w:p>
+            <w:pPr>
+              <w:spacing w:after="20" w:line="259" w:lineRule="auto"/>
+              <w:jc w:val="right"/>
+            </w:pPr>
+            <w:r>
+              <w:t>pain، رفتار، WTP و alternative چیست؟</w:t>
+            </w:r>
+          </w:p>
+        </w:tc>
+        <w:tc>
+          <w:tcPr>
+            <w:tcW w:type="dxa" w:w="3213"/>
+            <w:tcBorders>
+              <w:top w:val="single" w:sz="3" w:space="0" w:color="D9E0E7"/>
+              <w:left w:val="single" w:sz="3" w:space="0" w:color="D9E0E7"/>
+              <w:bottom w:val="single" w:sz="3" w:space="0" w:color="D9E0E7"/>
+              <w:right w:val="single" w:sz="3" w:space="0" w:color="D9E0E7"/>
+            </w:tcBorders>
+            <w:shd w:fill="FFFFFF"/>
+          </w:tcPr>
+          <w:p>
+            <w:pPr>
+              <w:spacing w:after="20" w:line="259" w:lineRule="auto"/>
+              <w:jc w:val="right"/>
+            </w:pPr>
+            <w:r>
+              <w:t>need evidence، behaviour، budget/price anchor و research gap.</w:t>
             </w:r>
           </w:p>
         </w:tc>
@@ -11803,71 +11607,50 @@
               <w:spacing w:after="20" w:line="259" w:lineRule="auto"/>
               <w:jc w:val="right"/>
             </w:pPr>
-            <w:r/>
-            <w:r>
-              <w:rPr>
-                <w:rFonts w:ascii="B Zar" w:hAnsi="B Zar"/>
-                <w:b w:val="0"/>
-                <w:color w:val="263238"/>
-                <w:sz w:val="17"/>
-              </w:rPr>
-              <w:t>۸. ریسک و اعتبارسنجی</w:t>
-            </w:r>
-          </w:p>
-        </w:tc>
-        <w:tc>
-          <w:tcPr>
-            <w:tcW w:type="dxa" w:w="3213"/>
-            <w:tcBorders>
-              <w:top w:val="single" w:sz="3" w:space="0" w:color="D9E0E7"/>
-              <w:left w:val="single" w:sz="3" w:space="0" w:color="D9E0E7"/>
-              <w:bottom w:val="single" w:sz="3" w:space="0" w:color="D9E0E7"/>
-              <w:right w:val="single" w:sz="3" w:space="0" w:color="D9E0E7"/>
-            </w:tcBorders>
-            <w:shd w:fill="F5F7FA"/>
-          </w:tcPr>
-          <w:p>
-            <w:pPr>
-              <w:spacing w:after="20" w:line="259" w:lineRule="auto"/>
-              <w:jc w:val="right"/>
-            </w:pPr>
-            <w:r/>
-            <w:r>
-              <w:rPr>
-                <w:rFonts w:ascii="B Zar" w:hAnsi="B Zar"/>
-                <w:b w:val="0"/>
-                <w:color w:val="263238"/>
-                <w:sz w:val="17"/>
-              </w:rPr>
-              <w:t>چه چیزی thesis را رد می‌کند و چگونه زود می‌فهمیم؟</w:t>
-            </w:r>
-          </w:p>
-        </w:tc>
-        <w:tc>
-          <w:tcPr>
-            <w:tcW w:type="dxa" w:w="3213"/>
-            <w:tcBorders>
-              <w:top w:val="single" w:sz="3" w:space="0" w:color="D9E0E7"/>
-              <w:left w:val="single" w:sz="3" w:space="0" w:color="D9E0E7"/>
-              <w:bottom w:val="single" w:sz="3" w:space="0" w:color="D9E0E7"/>
-              <w:right w:val="single" w:sz="3" w:space="0" w:color="D9E0E7"/>
-            </w:tcBorders>
-            <w:shd w:fill="F5F7FA"/>
-          </w:tcPr>
-          <w:p>
-            <w:pPr>
-              <w:spacing w:after="20" w:line="259" w:lineRule="auto"/>
-              <w:jc w:val="right"/>
-            </w:pPr>
-            <w:r/>
-            <w:r>
-              <w:rPr>
-                <w:rFonts w:ascii="B Zar" w:hAnsi="B Zar"/>
-                <w:b w:val="0"/>
-                <w:color w:val="263238"/>
-                <w:sz w:val="17"/>
-              </w:rPr>
-              <w:t>risk register، pilot، KPI، hard kill و go/no-go</w:t>
+            <w:r>
+              <w:t>۸. چشم‌انداز رقابتی و جایگزین‌ها</w:t>
+            </w:r>
+          </w:p>
+        </w:tc>
+        <w:tc>
+          <w:tcPr>
+            <w:tcW w:type="dxa" w:w="3213"/>
+            <w:tcBorders>
+              <w:top w:val="single" w:sz="3" w:space="0" w:color="D9E0E7"/>
+              <w:left w:val="single" w:sz="3" w:space="0" w:color="D9E0E7"/>
+              <w:bottom w:val="single" w:sz="3" w:space="0" w:color="D9E0E7"/>
+              <w:right w:val="single" w:sz="3" w:space="0" w:color="D9E0E7"/>
+            </w:tcBorders>
+            <w:shd w:fill="F5F7FA"/>
+          </w:tcPr>
+          <w:p>
+            <w:pPr>
+              <w:spacing w:after="20" w:line="259" w:lineRule="auto"/>
+              <w:jc w:val="right"/>
+            </w:pPr>
+            <w:r>
+              <w:t>رقیب مستقیم، غیرمستقیم و workaround چیست؟</w:t>
+            </w:r>
+          </w:p>
+        </w:tc>
+        <w:tc>
+          <w:tcPr>
+            <w:tcW w:type="dxa" w:w="3213"/>
+            <w:tcBorders>
+              <w:top w:val="single" w:sz="3" w:space="0" w:color="D9E0E7"/>
+              <w:left w:val="single" w:sz="3" w:space="0" w:color="D9E0E7"/>
+              <w:bottom w:val="single" w:sz="3" w:space="0" w:color="D9E0E7"/>
+              <w:right w:val="single" w:sz="3" w:space="0" w:color="D9E0E7"/>
+            </w:tcBorders>
+            <w:shd w:fill="F5F7FA"/>
+          </w:tcPr>
+          <w:p>
+            <w:pPr>
+              <w:spacing w:after="20" w:line="259" w:lineRule="auto"/>
+              <w:jc w:val="right"/>
+            </w:pPr>
+            <w:r>
+              <w:t>Iran/global matrix، substitute، barrier، positioning و counter-thesis.</w:t>
             </w:r>
           </w:p>
         </w:tc>
@@ -11889,71 +11672,360 @@
               <w:spacing w:after="20" w:line="259" w:lineRule="auto"/>
               <w:jc w:val="right"/>
             </w:pPr>
-            <w:r/>
-            <w:r>
-              <w:rPr>
-                <w:rFonts w:ascii="B Zar" w:hAnsi="B Zar"/>
-                <w:b w:val="0"/>
-                <w:color w:val="263238"/>
-                <w:sz w:val="17"/>
-              </w:rPr>
-              <w:t>۹. پیوست و منابع</w:t>
-            </w:r>
-          </w:p>
-        </w:tc>
-        <w:tc>
-          <w:tcPr>
-            <w:tcW w:type="dxa" w:w="3213"/>
-            <w:tcBorders>
-              <w:top w:val="single" w:sz="3" w:space="0" w:color="D9E0E7"/>
-              <w:left w:val="single" w:sz="3" w:space="0" w:color="D9E0E7"/>
-              <w:bottom w:val="single" w:sz="3" w:space="0" w:color="D9E0E7"/>
-              <w:right w:val="single" w:sz="3" w:space="0" w:color="D9E0E7"/>
-            </w:tcBorders>
-            <w:shd w:fill="FFFFFF"/>
-          </w:tcPr>
-          <w:p>
-            <w:pPr>
-              <w:spacing w:after="20" w:line="259" w:lineRule="auto"/>
-              <w:jc w:val="right"/>
-            </w:pPr>
-            <w:r/>
-            <w:r>
-              <w:rPr>
-                <w:rFonts w:ascii="B Zar" w:hAnsi="B Zar"/>
-                <w:b w:val="0"/>
-                <w:color w:val="263238"/>
-                <w:sz w:val="17"/>
-              </w:rPr>
-              <w:t>آیا ادعاها قابل حسابرسی‌اند؟</w:t>
-            </w:r>
-          </w:p>
-        </w:tc>
-        <w:tc>
-          <w:tcPr>
-            <w:tcW w:type="dxa" w:w="3213"/>
-            <w:tcBorders>
-              <w:top w:val="single" w:sz="3" w:space="0" w:color="D9E0E7"/>
-              <w:left w:val="single" w:sz="3" w:space="0" w:color="D9E0E7"/>
-              <w:bottom w:val="single" w:sz="3" w:space="0" w:color="D9E0E7"/>
-              <w:right w:val="single" w:sz="3" w:space="0" w:color="D9E0E7"/>
-            </w:tcBorders>
-            <w:shd w:fill="FFFFFF"/>
-          </w:tcPr>
-          <w:p>
-            <w:pPr>
-              <w:spacing w:after="20" w:line="259" w:lineRule="auto"/>
-              <w:jc w:val="right"/>
-            </w:pPr>
-            <w:r/>
-            <w:r>
-              <w:rPr>
-                <w:rFonts w:ascii="B Zar" w:hAnsi="B Zar"/>
-                <w:b w:val="0"/>
-                <w:color w:val="263238"/>
-                <w:sz w:val="17"/>
-              </w:rPr>
-              <w:t>evidence ledger، source log، محاسبات و instruments</w:t>
+            <w:r>
+              <w:t>۹. مفهوم، مدل کسب‌وکار و قیمت‌گذاری</w:t>
+            </w:r>
+          </w:p>
+        </w:tc>
+        <w:tc>
+          <w:tcPr>
+            <w:tcW w:type="dxa" w:w="3213"/>
+            <w:tcBorders>
+              <w:top w:val="single" w:sz="3" w:space="0" w:color="D9E0E7"/>
+              <w:left w:val="single" w:sz="3" w:space="0" w:color="D9E0E7"/>
+              <w:bottom w:val="single" w:sz="3" w:space="0" w:color="D9E0E7"/>
+              <w:right w:val="single" w:sz="3" w:space="0" w:color="D9E0E7"/>
+            </w:tcBorders>
+            <w:shd w:fill="FFFFFF"/>
+          </w:tcPr>
+          <w:p>
+            <w:pPr>
+              <w:spacing w:after="20" w:line="259" w:lineRule="auto"/>
+              <w:jc w:val="right"/>
+            </w:pPr>
+            <w:r>
+              <w:t>راه‌حل و کسب درآمد چگونه سنجیده می‌شود؟</w:t>
+            </w:r>
+          </w:p>
+        </w:tc>
+        <w:tc>
+          <w:tcPr>
+            <w:tcW w:type="dxa" w:w="3213"/>
+            <w:tcBorders>
+              <w:top w:val="single" w:sz="3" w:space="0" w:color="D9E0E7"/>
+              <w:left w:val="single" w:sz="3" w:space="0" w:color="D9E0E7"/>
+              <w:bottom w:val="single" w:sz="3" w:space="0" w:color="D9E0E7"/>
+              <w:right w:val="single" w:sz="3" w:space="0" w:color="D9E0E7"/>
+            </w:tcBorders>
+            <w:shd w:fill="FFFFFF"/>
+          </w:tcPr>
+          <w:p>
+            <w:pPr>
+              <w:spacing w:after="20" w:line="259" w:lineRule="auto"/>
+              <w:jc w:val="right"/>
+            </w:pPr>
+            <w:r>
+              <w:t>concept boundary، business model، pricing/billing، GTM و assumptions.</w:t>
+            </w:r>
+          </w:p>
+        </w:tc>
+      </w:tr>
+      <w:tr>
+        <w:tc>
+          <w:tcPr>
+            <w:tcPr>
+              <w:tcW w:type="dxa" w:w="3213"/>
+              <w:tcBorders>
+                <w:top w:val="single" w:sz="3" w:space="0" w:color="D9E0E7"/>
+                <w:left w:val="single" w:sz="3" w:space="0" w:color="D9E0E7"/>
+                <w:bottom w:val="single" w:sz="3" w:space="0" w:color="D9E0E7"/>
+                <w:right w:val="single" w:sz="3" w:space="0" w:color="D9E0E7"/>
+              </w:tcBorders>
+              <w:shd w:fill="FFFFFF"/>
+            </w:tcPr>
+          </w:tcPr>
+          <w:p>
+            <w:pPr/>
+            <w:r>
+              <w:t>۱۰. امکان‌سنجی اجرایی، حقوقی و عملیاتی</w:t>
+            </w:r>
+          </w:p>
+        </w:tc>
+        <w:tc>
+          <w:tcPr>
+            <w:tcPr>
+              <w:tcW w:type="dxa" w:w="3213"/>
+              <w:tcBorders>
+                <w:top w:val="single" w:sz="3" w:space="0" w:color="D9E0E7"/>
+                <w:left w:val="single" w:sz="3" w:space="0" w:color="D9E0E7"/>
+                <w:bottom w:val="single" w:sz="3" w:space="0" w:color="D9E0E7"/>
+                <w:right w:val="single" w:sz="3" w:space="0" w:color="D9E0E7"/>
+              </w:tcBorders>
+              <w:shd w:fill="FFFFFF"/>
+            </w:tcPr>
+          </w:tcPr>
+          <w:p>
+            <w:pPr/>
+            <w:r>
+              <w:t>وابستگی و امکان اجرای platform-first چیست؟</w:t>
+            </w:r>
+          </w:p>
+        </w:tc>
+        <w:tc>
+          <w:tcPr>
+            <w:tcPr>
+              <w:tcW w:type="dxa" w:w="3213"/>
+              <w:tcBorders>
+                <w:top w:val="single" w:sz="3" w:space="0" w:color="D9E0E7"/>
+                <w:left w:val="single" w:sz="3" w:space="0" w:color="D9E0E7"/>
+                <w:bottom w:val="single" w:sz="3" w:space="0" w:color="D9E0E7"/>
+                <w:right w:val="single" w:sz="3" w:space="0" w:color="D9E0E7"/>
+              </w:tcBorders>
+              <w:shd w:fill="FFFFFF"/>
+            </w:tcPr>
+          </w:tcPr>
+          <w:p>
+            <w:pPr/>
+            <w:r>
+              <w:t>data/integration، operations، logistics boundary، legal/regulatory و risk.</w:t>
+            </w:r>
+          </w:p>
+        </w:tc>
+      </w:tr>
+      <w:tr>
+        <w:tc>
+          <w:tcPr>
+            <w:tcPr>
+              <w:tcW w:type="dxa" w:w="3213"/>
+              <w:tcBorders>
+                <w:top w:val="single" w:sz="3" w:space="0" w:color="D9E0E7"/>
+                <w:left w:val="single" w:sz="3" w:space="0" w:color="D9E0E7"/>
+                <w:bottom w:val="single" w:sz="3" w:space="0" w:color="D9E0E7"/>
+                <w:right w:val="single" w:sz="3" w:space="0" w:color="D9E0E7"/>
+              </w:tcBorders>
+              <w:shd w:fill="FFFFFF"/>
+            </w:tcPr>
+          </w:tcPr>
+          <w:p>
+            <w:pPr/>
+            <w:r>
+              <w:t>۱۱. یافته‌ها، تحلیل و ارزیابی فرصت</w:t>
+            </w:r>
+          </w:p>
+        </w:tc>
+        <w:tc>
+          <w:tcPr>
+            <w:tcPr>
+              <w:tcW w:type="dxa" w:w="3213"/>
+              <w:tcBorders>
+                <w:top w:val="single" w:sz="3" w:space="0" w:color="D9E0E7"/>
+                <w:left w:val="single" w:sz="3" w:space="0" w:color="D9E0E7"/>
+                <w:bottom w:val="single" w:sz="3" w:space="0" w:color="D9E0E7"/>
+                <w:right w:val="single" w:sz="3" w:space="0" w:color="D9E0E7"/>
+              </w:tcBorders>
+              <w:shd w:fill="FFFFFF"/>
+            </w:tcPr>
+          </w:tcPr>
+          <w:p>
+            <w:pPr/>
+            <w:r>
+              <w:t>شواهد چه می‌گویند و تفسیر چیست؟</w:t>
+            </w:r>
+          </w:p>
+        </w:tc>
+        <w:tc>
+          <w:tcPr>
+            <w:tcPr>
+              <w:tcW w:type="dxa" w:w="3213"/>
+              <w:tcBorders>
+                <w:top w:val="single" w:sz="3" w:space="0" w:color="D9E0E7"/>
+                <w:left w:val="single" w:sz="3" w:space="0" w:color="D9E0E7"/>
+                <w:bottom w:val="single" w:sz="3" w:space="0" w:color="D9E0E7"/>
+                <w:right w:val="single" w:sz="3" w:space="0" w:color="D9E0E7"/>
+              </w:tcBorders>
+              <w:shd w:fill="FFFFFF"/>
+            </w:tcPr>
+          </w:tcPr>
+          <w:p>
+            <w:pPr/>
+            <w:r>
+              <w:t>تفکیک F/I/E، scenario، opportunity assessment، confidence و risk register.</w:t>
+            </w:r>
+          </w:p>
+        </w:tc>
+      </w:tr>
+      <w:tr>
+        <w:tc>
+          <w:tcPr>
+            <w:tcPr>
+              <w:tcW w:type="dxa" w:w="3213"/>
+              <w:tcBorders>
+                <w:top w:val="single" w:sz="3" w:space="0" w:color="D9E0E7"/>
+                <w:left w:val="single" w:sz="3" w:space="0" w:color="D9E0E7"/>
+                <w:bottom w:val="single" w:sz="3" w:space="0" w:color="D9E0E7"/>
+                <w:right w:val="single" w:sz="3" w:space="0" w:color="D9E0E7"/>
+              </w:tcBorders>
+              <w:shd w:fill="FFFFFF"/>
+            </w:tcPr>
+          </w:tcPr>
+          <w:p>
+            <w:pPr/>
+            <w:r>
+              <w:t>۱۲. نتیجه‌گیری و توصیهٔ راهبردی</w:t>
+            </w:r>
+          </w:p>
+        </w:tc>
+        <w:tc>
+          <w:tcPr>
+            <w:tcPr>
+              <w:tcW w:type="dxa" w:w="3213"/>
+              <w:tcBorders>
+                <w:top w:val="single" w:sz="3" w:space="0" w:color="D9E0E7"/>
+                <w:left w:val="single" w:sz="3" w:space="0" w:color="D9E0E7"/>
+                <w:bottom w:val="single" w:sz="3" w:space="0" w:color="D9E0E7"/>
+                <w:right w:val="single" w:sz="3" w:space="0" w:color="D9E0E7"/>
+              </w:tcBorders>
+              <w:shd w:fill="FFFFFF"/>
+            </w:tcPr>
+          </w:tcPr>
+          <w:p>
+            <w:pPr/>
+            <w:r>
+              <w:t>پاسخ تصمیم و وضعیت چیست؟</w:t>
+            </w:r>
+          </w:p>
+        </w:tc>
+        <w:tc>
+          <w:tcPr>
+            <w:tcPr>
+              <w:tcW w:type="dxa" w:w="3213"/>
+              <w:tcBorders>
+                <w:top w:val="single" w:sz="3" w:space="0" w:color="D9E0E7"/>
+                <w:left w:val="single" w:sz="3" w:space="0" w:color="D9E0E7"/>
+                <w:bottom w:val="single" w:sz="3" w:space="0" w:color="D9E0E7"/>
+                <w:right w:val="single" w:sz="3" w:space="0" w:color="D9E0E7"/>
+              </w:tcBorders>
+              <w:shd w:fill="FFFFFF"/>
+            </w:tcPr>
+          </w:tcPr>
+          <w:p>
+            <w:pPr/>
+            <w:r>
+              <w:t>Pass/Watch/Pause/Reject، recommendation و دلیل مبتنی بر evidence.</w:t>
+            </w:r>
+          </w:p>
+        </w:tc>
+      </w:tr>
+      <w:tr>
+        <w:tc>
+          <w:tcPr>
+            <w:tcPr>
+              <w:tcW w:type="dxa" w:w="3213"/>
+              <w:tcBorders>
+                <w:top w:val="single" w:sz="3" w:space="0" w:color="D9E0E7"/>
+                <w:left w:val="single" w:sz="3" w:space="0" w:color="D9E0E7"/>
+                <w:bottom w:val="single" w:sz="3" w:space="0" w:color="D9E0E7"/>
+                <w:right w:val="single" w:sz="3" w:space="0" w:color="D9E0E7"/>
+              </w:tcBorders>
+              <w:shd w:fill="FFFFFF"/>
+            </w:tcPr>
+          </w:tcPr>
+          <w:p>
+            <w:pPr/>
+            <w:r>
+              <w:t>۱۳. برنامهٔ اعتبارسنجی و گیت تصمیم</w:t>
+            </w:r>
+          </w:p>
+        </w:tc>
+        <w:tc>
+          <w:tcPr>
+            <w:tcPr>
+              <w:tcW w:type="dxa" w:w="3213"/>
+              <w:tcBorders>
+                <w:top w:val="single" w:sz="3" w:space="0" w:color="D9E0E7"/>
+                <w:left w:val="single" w:sz="3" w:space="0" w:color="D9E0E7"/>
+                <w:bottom w:val="single" w:sz="3" w:space="0" w:color="D9E0E7"/>
+                <w:right w:val="single" w:sz="3" w:space="0" w:color="D9E0E7"/>
+              </w:tcBorders>
+              <w:shd w:fill="FFFFFF"/>
+            </w:tcPr>
+          </w:tcPr>
+          <w:p>
+            <w:pPr/>
+            <w:r>
+              <w:t>کدام evidence بعدی لازم است؟</w:t>
+            </w:r>
+          </w:p>
+        </w:tc>
+        <w:tc>
+          <w:tcPr>
+            <w:tcPr>
+              <w:tcW w:type="dxa" w:w="3213"/>
+              <w:tcBorders>
+                <w:top w:val="single" w:sz="3" w:space="0" w:color="D9E0E7"/>
+                <w:left w:val="single" w:sz="3" w:space="0" w:color="D9E0E7"/>
+                <w:bottom w:val="single" w:sz="3" w:space="0" w:color="D9E0E7"/>
+                <w:right w:val="single" w:sz="3" w:space="0" w:color="D9E0E7"/>
+              </w:tcBorders>
+              <w:shd w:fill="FFFFFF"/>
+            </w:tcPr>
+          </w:tcPr>
+          <w:p>
+            <w:pPr/>
+            <w:r>
+              <w:t>hypothesis، sample، method، owner، KPI، deadline و hard kill.</w:t>
+            </w:r>
+          </w:p>
+        </w:tc>
+      </w:tr>
+      <w:tr>
+        <w:tc>
+          <w:tcPr>
+            <w:tcPr>
+              <w:tcW w:type="dxa" w:w="3213"/>
+              <w:tcBorders>
+                <w:top w:val="single" w:sz="3" w:space="0" w:color="D9E0E7"/>
+                <w:left w:val="single" w:sz="3" w:space="0" w:color="D9E0E7"/>
+                <w:bottom w:val="single" w:sz="3" w:space="0" w:color="D9E0E7"/>
+                <w:right w:val="single" w:sz="3" w:space="0" w:color="D9E0E7"/>
+              </w:tcBorders>
+              <w:shd w:fill="FFFFFF"/>
+            </w:tcPr>
+          </w:tcPr>
+          <w:p>
+            <w:pPr/>
+            <w:r>
+              <w:t>۱۴. پیوست‌ها</w:t>
+            </w:r>
+          </w:p>
+        </w:tc>
+        <w:tc>
+          <w:tcPr>
+            <w:tcPr>
+              <w:tcW w:type="dxa" w:w="3213"/>
+              <w:tcBorders>
+                <w:top w:val="single" w:sz="3" w:space="0" w:color="D9E0E7"/>
+                <w:left w:val="single" w:sz="3" w:space="0" w:color="D9E0E7"/>
+                <w:bottom w:val="single" w:sz="3" w:space="0" w:color="D9E0E7"/>
+                <w:right w:val="single" w:sz="3" w:space="0" w:color="D9E0E7"/>
+              </w:tcBorders>
+              <w:shd w:fill="FFFFFF"/>
+            </w:tcPr>
+          </w:tcPr>
+          <w:p>
+            <w:pPr/>
+            <w:r>
+              <w:t>آیا گزارش قابل audit است؟</w:t>
+            </w:r>
+          </w:p>
+        </w:tc>
+        <w:tc>
+          <w:tcPr>
+            <w:tcPr>
+              <w:tcW w:type="dxa" w:w="3213"/>
+              <w:tcBorders>
+                <w:top w:val="single" w:sz="3" w:space="0" w:color="D9E0E7"/>
+                <w:left w:val="single" w:sz="3" w:space="0" w:color="D9E0E7"/>
+                <w:bottom w:val="single" w:sz="3" w:space="0" w:color="D9E0E7"/>
+                <w:right w:val="single" w:sz="3" w:space="0" w:color="D9E0E7"/>
+              </w:tcBorders>
+              <w:shd w:fill="FFFFFF"/>
+            </w:tcPr>
+          </w:tcPr>
+          <w:p>
+            <w:pPr/>
+            <w:r>
+              <w:t>evidence ledger، calculations، matrices، instruments، glossary و changelog.</w:t>
             </w:r>
           </w:p>
         </w:tc>
@@ -15457,6 +15529,88 @@
           </w:p>
         </w:tc>
       </w:tr>
+      <w:tr>
+        <w:tc>
+          <w:tcPr>
+            <w:tcPr>
+              <w:tcW w:type="dxa" w:w="2409"/>
+              <w:tcBorders>
+                <w:top w:val="single" w:sz="3" w:space="0" w:color="D9E0E7"/>
+                <w:left w:val="single" w:sz="3" w:space="0" w:color="D9E0E7"/>
+                <w:bottom w:val="single" w:sz="3" w:space="0" w:color="D9E0E7"/>
+                <w:right w:val="single" w:sz="3" w:space="0" w:color="D9E0E7"/>
+              </w:tcBorders>
+              <w:shd w:fill="FFFFFF"/>
+            </w:tcPr>
+          </w:tcPr>
+          <w:p>
+            <w:pPr/>
+            <w:r>
+              <w:t>۰٫۶</w:t>
+            </w:r>
+          </w:p>
+        </w:tc>
+        <w:tc>
+          <w:tcPr>
+            <w:tcPr>
+              <w:tcW w:type="dxa" w:w="2409"/>
+              <w:tcBorders>
+                <w:top w:val="single" w:sz="3" w:space="0" w:color="D9E0E7"/>
+                <w:left w:val="single" w:sz="3" w:space="0" w:color="D9E0E7"/>
+                <w:bottom w:val="single" w:sz="3" w:space="0" w:color="D9E0E7"/>
+                <w:right w:val="single" w:sz="3" w:space="0" w:color="D9E0E7"/>
+              </w:tcBorders>
+              <w:shd w:fill="FFFFFF"/>
+            </w:tcPr>
+          </w:tcPr>
+          <w:p>
+            <w:pPr/>
+            <w:r>
+              <w:t>۱۲ مهر ۱۴۰۵</w:t>
+            </w:r>
+          </w:p>
+        </w:tc>
+        <w:tc>
+          <w:tcPr>
+            <w:tcPr>
+              <w:tcW w:type="dxa" w:w="2409"/>
+              <w:tcBorders>
+                <w:top w:val="single" w:sz="3" w:space="0" w:color="D9E0E7"/>
+                <w:left w:val="single" w:sz="3" w:space="0" w:color="D9E0E7"/>
+                <w:bottom w:val="single" w:sz="3" w:space="0" w:color="D9E0E7"/>
+                <w:right w:val="single" w:sz="3" w:space="0" w:color="D9E0E7"/>
+              </w:tcBorders>
+              <w:shd w:fill="FFFFFF"/>
+            </w:tcPr>
+          </w:tcPr>
+          <w:p>
+            <w:pPr/>
+            <w:r>
+              <w:t>بازآرایی استاندارد hierarchy و عنوان‌های dossierهای F-01 تا F-07؛ روش، شواهد و وضعیت تصمیم بدون ادعای پژوهش اولیه حفظ شد.</w:t>
+            </w:r>
+          </w:p>
+        </w:tc>
+        <w:tc>
+          <w:tcPr>
+            <w:tcPr>
+              <w:tcW w:type="dxa" w:w="2409"/>
+              <w:tcBorders>
+                <w:top w:val="single" w:sz="3" w:space="0" w:color="D9E0E7"/>
+                <w:left w:val="single" w:sz="3" w:space="0" w:color="D9E0E7"/>
+                <w:bottom w:val="single" w:sz="3" w:space="0" w:color="D9E0E7"/>
+                <w:right w:val="single" w:sz="3" w:space="0" w:color="D9E0E7"/>
+              </w:tcBorders>
+              <w:shd w:fill="FFFFFF"/>
+            </w:tcPr>
+          </w:tcPr>
+          <w:p>
+            <w:pPr/>
+            <w:r>
+              <w:t>منتشرشده</w:t>
+            </w:r>
+          </w:p>
+        </w:tc>
+      </w:tr>
     </w:tbl>
     <w:p/>
     <w:tbl>
@@ -15540,12 +15694,7 @@
         <w:jc w:val="right"/>
       </w:pPr>
       <w:r>
-        <w:rPr>
-          <w:rFonts w:ascii="B Zar" w:hAnsi="B Zar"/>
-          <w:color w:val="263238"/>
-          <w:sz w:val="22"/>
-        </w:rPr>
-        <w:t>این بخش، پنج پروندهٔ desk-research را به سند مادر می‌افزاید. هر پرونده از نظر category جهانی، workflow، جایگزین‌های ایران، model، execution، risk و گیت تصمیم بررسی شده است؛ اما تا پیش از primary research/pilot، هیچ مسیرِ Watch به توصیهٔ سرمایه‌گذاری تبدیل نمی‌شود. F-05 با وجود category معتبر جهانی، پس از مشاهدهٔ substituteهای نزدیک ایران رد/آرشیوی شده است.</w:t>
+        <w:t>این بخش، گزیدهٔ مدیریتی هفت پروندهٔ desk-research است. متن کامل هر پرونده در dossier متناظر با ساختار ۱۴فصلی استاندارد نگهداری می‌شود. تا پیش از primary research یا pilot، هیچ مسیرِ فعال/Watch توصیهٔ سرمایه‌گذاری تلقی نمی‌شود؛ F-05 و F-06 آرشیوی‌اند و F-07 به درخواست کاربر Pause است.</w:t>
       </w:r>
     </w:p>
     <w:tbl>
@@ -15687,12 +15836,7 @@
         <w:jc w:val="right"/>
       </w:pPr>
       <w:r>
-        <w:rPr>
-          <w:rFonts w:ascii="B Zar" w:hAnsi="B Zar"/>
-          <w:color w:val="1F7A70"/>
-          <w:sz w:val="26"/>
-        </w:rPr>
-        <w:t>۱. مسئله و جریان کاری</w:t>
+        <w:t>۲. مقدمه، زمینه و هدف پژوهش — گزیده</w:t>
       </w:r>
     </w:p>
     <w:p>
@@ -16260,12 +16404,7 @@
         <w:jc w:val="right"/>
       </w:pPr>
       <w:r>
-        <w:rPr>
-          <w:rFonts w:ascii="B Zar" w:hAnsi="B Zar"/>
-          <w:color w:val="1F7A70"/>
-          <w:sz w:val="26"/>
-        </w:rPr>
-        <w:t>۲. شواهد جهانی و category proof</w:t>
+        <w:t>۴. نمای کلی بازار و صنعت — گزیده</w:t>
       </w:r>
     </w:p>
     <w:p>
@@ -16747,12 +16886,7 @@
         <w:jc w:val="right"/>
       </w:pPr>
       <w:r>
-        <w:rPr>
-          <w:rFonts w:ascii="B Zar" w:hAnsi="B Zar"/>
-          <w:color w:val="1F7A70"/>
-          <w:sz w:val="26"/>
-        </w:rPr>
-        <w:t>۳. ایران، رقابت و جایگزین واقعی</w:t>
+        <w:t>۸. چشم‌انداز رقابتی و جایگزین‌ها — گزیده</w:t>
       </w:r>
     </w:p>
     <w:p>
@@ -17220,12 +17354,7 @@
         <w:jc w:val="right"/>
       </w:pPr>
       <w:r>
-        <w:rPr>
-          <w:rFonts w:ascii="B Zar" w:hAnsi="B Zar"/>
-          <w:color w:val="1F7A70"/>
-          <w:sz w:val="26"/>
-        </w:rPr>
-        <w:t>۴. بازار، ICP و مدل کسب‌وکار</w:t>
+        <w:t>۵. اندازه، ساختار و پویایی تقاضای بازار — گزیده</w:t>
       </w:r>
     </w:p>
     <w:p>
@@ -17621,12 +17750,7 @@
         <w:jc w:val="right"/>
       </w:pPr>
       <w:r>
-        <w:rPr>
-          <w:rFonts w:ascii="B Zar" w:hAnsi="B Zar"/>
-          <w:color w:val="1F7A70"/>
-          <w:sz w:val="26"/>
-        </w:rPr>
-        <w:t>۵. محصول حداقلی، ریسک و گیت اعتبارسنجی</w:t>
+        <w:t>۱۰. امکان‌سنجی اجرایی، حقوقی و عملیاتی — گزیده</w:t>
       </w:r>
     </w:p>
     <w:tbl>
@@ -18139,12 +18263,7 @@
         <w:jc w:val="right"/>
       </w:pPr>
       <w:r>
-        <w:rPr>
-          <w:rFonts w:ascii="B Zar" w:hAnsi="B Zar"/>
-          <w:color w:val="1F7A70"/>
-          <w:sz w:val="26"/>
-        </w:rPr>
-        <w:t>۶. verdict desk-research</w:t>
+        <w:t>۱۲. نتیجه‌گیری و توصیهٔ راهبردی</w:t>
       </w:r>
     </w:p>
     <w:tbl>
@@ -18211,12 +18330,7 @@
         <w:jc w:val="right"/>
       </w:pPr>
       <w:r>
-        <w:rPr>
-          <w:rFonts w:ascii="B Zar" w:hAnsi="B Zar"/>
-          <w:color w:val="1F7A70"/>
-          <w:sz w:val="26"/>
-        </w:rPr>
-        <w:t>منابع پرونده F-01</w:t>
+        <w:t>۱۴. پیوست‌ها: منابع پرونده F-01</w:t>
       </w:r>
     </w:p>
     <w:tbl>
@@ -19089,12 +19203,7 @@
         <w:jc w:val="right"/>
       </w:pPr>
       <w:r>
-        <w:rPr>
-          <w:rFonts w:ascii="B Zar" w:hAnsi="B Zar"/>
-          <w:color w:val="1F7A70"/>
-          <w:sz w:val="26"/>
-        </w:rPr>
-        <w:t>۱. مسئله و جریان کاری</w:t>
+        <w:t>۲. مقدمه، زمینه و هدف پژوهش — گزیده</w:t>
       </w:r>
     </w:p>
     <w:p>
@@ -19648,12 +19757,7 @@
         <w:jc w:val="right"/>
       </w:pPr>
       <w:r>
-        <w:rPr>
-          <w:rFonts w:ascii="B Zar" w:hAnsi="B Zar"/>
-          <w:color w:val="1F7A70"/>
-          <w:sz w:val="26"/>
-        </w:rPr>
-        <w:t>۲. شواهد جهانی و category proof</w:t>
+        <w:t>۴. نمای کلی بازار و صنعت — گزیده</w:t>
       </w:r>
     </w:p>
     <w:p>
@@ -20035,12 +20139,7 @@
         <w:jc w:val="right"/>
       </w:pPr>
       <w:r>
-        <w:rPr>
-          <w:rFonts w:ascii="B Zar" w:hAnsi="B Zar"/>
-          <w:color w:val="1F7A70"/>
-          <w:sz w:val="26"/>
-        </w:rPr>
-        <w:t>۳. ایران و جایگزین واقعی</w:t>
+        <w:t>۸. چشم‌انداز رقابتی و جایگزین‌ها — گزیده</w:t>
       </w:r>
     </w:p>
     <w:p>
@@ -20522,12 +20621,7 @@
         <w:jc w:val="right"/>
       </w:pPr>
       <w:r>
-        <w:rPr>
-          <w:rFonts w:ascii="B Zar" w:hAnsi="B Zar"/>
-          <w:color w:val="1F7A70"/>
-          <w:sz w:val="26"/>
-        </w:rPr>
-        <w:t>۴. بازار، مدل و امکان اجرا</w:t>
+        <w:t>۵. اندازه، ساختار و پویایی تقاضای بازار — گزیده</w:t>
       </w:r>
     </w:p>
     <w:p>
@@ -20909,12 +21003,7 @@
         <w:jc w:val="right"/>
       </w:pPr>
       <w:r>
-        <w:rPr>
-          <w:rFonts w:ascii="B Zar" w:hAnsi="B Zar"/>
-          <w:color w:val="1F7A70"/>
-          <w:sz w:val="26"/>
-        </w:rPr>
-        <w:t>۵. MVP، ریسک و اعتبارسنجی</w:t>
+        <w:t>۹. ارزیابی مفهوم محصول، مدل کسب‌وکار و قیمت‌گذاری — گزیده</w:t>
       </w:r>
     </w:p>
     <w:tbl>
@@ -21485,12 +21574,7 @@
         <w:jc w:val="right"/>
       </w:pPr>
       <w:r>
-        <w:rPr>
-          <w:rFonts w:ascii="B Zar" w:hAnsi="B Zar"/>
-          <w:color w:val="1F7A70"/>
-          <w:sz w:val="26"/>
-        </w:rPr>
-        <w:t>۶. verdict desk-research</w:t>
+        <w:t>۱۲. نتیجه‌گیری و توصیهٔ راهبردی</w:t>
       </w:r>
     </w:p>
     <w:tbl>
@@ -21557,12 +21641,7 @@
         <w:jc w:val="right"/>
       </w:pPr>
       <w:r>
-        <w:rPr>
-          <w:rFonts w:ascii="B Zar" w:hAnsi="B Zar"/>
-          <w:color w:val="1F7A70"/>
-          <w:sz w:val="26"/>
-        </w:rPr>
-        <w:t>منابع پرونده F-02</w:t>
+        <w:t>۱۴. پیوست‌ها: منابع پرونده F-02</w:t>
       </w:r>
     </w:p>
     <w:tbl>
@@ -22349,12 +22428,7 @@
         <w:jc w:val="right"/>
       </w:pPr>
       <w:r>
-        <w:rPr>
-          <w:rFonts w:ascii="B Zar" w:hAnsi="B Zar"/>
-          <w:color w:val="1F7A70"/>
-          <w:sz w:val="26"/>
-        </w:rPr>
-        <w:t>۱. مسئله و نقطهٔ handoff</w:t>
+        <w:t>۲. مقدمه، زمینه و هدف پژوهش — گزیده</w:t>
       </w:r>
     </w:p>
     <w:p>
@@ -22822,12 +22896,7 @@
         <w:jc w:val="right"/>
       </w:pPr>
       <w:r>
-        <w:rPr>
-          <w:rFonts w:ascii="B Zar" w:hAnsi="B Zar"/>
-          <w:color w:val="1F7A70"/>
-          <w:sz w:val="26"/>
-        </w:rPr>
-        <w:t>۲. شواهد جهانی و spectrum محصول</w:t>
+        <w:t>۴. نمای کلی بازار و صنعت — گزیده</w:t>
       </w:r>
     </w:p>
     <w:p>
@@ -23336,12 +23405,7 @@
         <w:jc w:val="right"/>
       </w:pPr>
       <w:r>
-        <w:rPr>
-          <w:rFonts w:ascii="B Zar" w:hAnsi="B Zar"/>
-          <w:color w:val="1F7A70"/>
-          <w:sz w:val="26"/>
-        </w:rPr>
-        <w:t>۳. ایران و جایگزین واقعی</w:t>
+        <w:t>۸. چشم‌انداز رقابتی و جایگزین‌ها — گزیده</w:t>
       </w:r>
     </w:p>
     <w:p>
@@ -23895,12 +23959,7 @@
         <w:jc w:val="right"/>
       </w:pPr>
       <w:r>
-        <w:rPr>
-          <w:rFonts w:ascii="B Zar" w:hAnsi="B Zar"/>
-          <w:color w:val="1F7A70"/>
-          <w:sz w:val="26"/>
-        </w:rPr>
-        <w:t>۴. ICP، بازار و مدل</w:t>
+        <w:t>۵. اندازه، ساختار و پویایی تقاضای بازار — گزیده</w:t>
       </w:r>
     </w:p>
     <w:p>
@@ -24296,12 +24355,7 @@
         <w:jc w:val="right"/>
       </w:pPr>
       <w:r>
-        <w:rPr>
-          <w:rFonts w:ascii="B Zar" w:hAnsi="B Zar"/>
-          <w:color w:val="1F7A70"/>
-          <w:sz w:val="26"/>
-        </w:rPr>
-        <w:t>۵. MVP، ریسک و validation</w:t>
+        <w:t>۹. ارزیابی مفهوم محصول، مدل کسب‌وکار و قیمت‌گذاری — گزیده</w:t>
       </w:r>
     </w:p>
     <w:tbl>
@@ -24872,12 +24926,7 @@
         <w:jc w:val="right"/>
       </w:pPr>
       <w:r>
-        <w:rPr>
-          <w:rFonts w:ascii="B Zar" w:hAnsi="B Zar"/>
-          <w:color w:val="1F7A70"/>
-          <w:sz w:val="26"/>
-        </w:rPr>
-        <w:t>۶. verdict desk-research</w:t>
+        <w:t>۱۲. نتیجه‌گیری و توصیهٔ راهبردی</w:t>
       </w:r>
     </w:p>
     <w:tbl>
@@ -24944,12 +24993,7 @@
         <w:jc w:val="right"/>
       </w:pPr>
       <w:r>
-        <w:rPr>
-          <w:rFonts w:ascii="B Zar" w:hAnsi="B Zar"/>
-          <w:color w:val="1F7A70"/>
-          <w:sz w:val="26"/>
-        </w:rPr>
-        <w:t>منابع پرونده F-03</w:t>
+        <w:t>۱۴. پیوست‌ها: منابع پرونده F-03</w:t>
       </w:r>
     </w:p>
     <w:tbl>
@@ -26712,12 +26756,7 @@
         <w:jc w:val="right"/>
       </w:pPr>
       <w:r>
-        <w:rPr>
-          <w:rFonts w:ascii="B Zar" w:hAnsi="B Zar"/>
-          <w:color w:val="1F7A70"/>
-          <w:sz w:val="26"/>
-        </w:rPr>
-        <w:t>۱. مسئله، JTBD و workflow</w:t>
+        <w:t>۲. مقدمه، زمینه و هدف پژوهش — گزیده</w:t>
       </w:r>
     </w:p>
     <w:p>
@@ -27271,12 +27310,7 @@
         <w:jc w:val="right"/>
       </w:pPr>
       <w:r>
-        <w:rPr>
-          <w:rFonts w:ascii="B Zar" w:hAnsi="B Zar"/>
-          <w:color w:val="1F7A70"/>
-          <w:sz w:val="26"/>
-        </w:rPr>
-        <w:t>۲. benchmark جهانی و مدل‌های عملیاتی</w:t>
+        <w:t>۴. نمای کلی بازار و صنعت — گزیده</w:t>
       </w:r>
     </w:p>
     <w:p>
@@ -27658,12 +27692,7 @@
         <w:jc w:val="right"/>
       </w:pPr>
       <w:r>
-        <w:rPr>
-          <w:rFonts w:ascii="B Zar" w:hAnsi="B Zar"/>
-          <w:color w:val="1F7A70"/>
-          <w:sz w:val="26"/>
-        </w:rPr>
-        <w:t>۳. ایران، رقابت و substituteهای واقعی</w:t>
+        <w:t>۸. چشم‌انداز رقابتی و جایگزین‌ها — گزیده</w:t>
       </w:r>
     </w:p>
     <w:p>
@@ -28131,12 +28160,7 @@
         <w:jc w:val="right"/>
       </w:pPr>
       <w:r>
-        <w:rPr>
-          <w:rFonts w:ascii="B Zar" w:hAnsi="B Zar"/>
-          <w:color w:val="1F7A70"/>
-          <w:sz w:val="26"/>
-        </w:rPr>
-        <w:t>۴. مشتری، بازار و مدل</w:t>
+        <w:t>۵. اندازه، ساختار و پویایی تقاضای بازار — گزیده</w:t>
       </w:r>
     </w:p>
     <w:tbl>
@@ -28631,12 +28655,7 @@
         <w:jc w:val="right"/>
       </w:pPr>
       <w:r>
-        <w:rPr>
-          <w:rFonts w:ascii="B Zar" w:hAnsi="B Zar"/>
-          <w:color w:val="1F7A70"/>
-          <w:sz w:val="26"/>
-        </w:rPr>
-        <w:t>۵. عملیات، حقوق و risk register</w:t>
+        <w:t>۱۰. امکان‌سنجی اجرایی، حقوقی و عملیاتی — گزیده</w:t>
       </w:r>
     </w:p>
     <w:p>
@@ -29021,12 +29040,7 @@
         <w:jc w:val="right"/>
       </w:pPr>
       <w:r>
-        <w:rPr>
-          <w:rFonts w:ascii="B Zar" w:hAnsi="B Zar"/>
-          <w:color w:val="1F7A70"/>
-          <w:sz w:val="26"/>
-        </w:rPr>
-        <w:t>۶. برنامهٔ اعتبارسنجی و hard kill</w:t>
+        <w:t>۱۳. برنامهٔ اعتبارسنجی و گیت تصمیم</w:t>
       </w:r>
     </w:p>
     <w:p>
@@ -29107,12 +29121,7 @@
         <w:jc w:val="right"/>
       </w:pPr>
       <w:r>
-        <w:rPr>
-          <w:rFonts w:ascii="B Zar" w:hAnsi="B Zar"/>
-          <w:color w:val="1F7A70"/>
-          <w:sz w:val="26"/>
-        </w:rPr>
-        <w:t>منابع پرونده F-04</w:t>
+        <w:t>۱۴. پیوست‌ها: منابع پرونده F-04</w:t>
       </w:r>
     </w:p>
     <w:tbl>
@@ -30071,12 +30080,7 @@
         <w:jc w:val="right"/>
       </w:pPr>
       <w:r>
-        <w:rPr>
-          <w:rFonts w:ascii="B Zar" w:hAnsi="B Zar"/>
-          <w:color w:val="1F7A70"/>
-          <w:sz w:val="26"/>
-        </w:rPr>
-        <w:t>۱. مسئله و workflow category</w:t>
+        <w:t>۲. مقدمه، زمینه و هدف پژوهش — گزیده</w:t>
       </w:r>
     </w:p>
     <w:p>
@@ -30458,12 +30462,7 @@
         <w:jc w:val="right"/>
       </w:pPr>
       <w:r>
-        <w:rPr>
-          <w:rFonts w:ascii="B Zar" w:hAnsi="B Zar"/>
-          <w:color w:val="1F7A70"/>
-          <w:sz w:val="26"/>
-        </w:rPr>
-        <w:t>۲. benchmark جهانی</w:t>
+        <w:t>۴. نمای کلی بازار و صنعت — گزیده</w:t>
       </w:r>
     </w:p>
     <w:p>
@@ -30931,12 +30930,7 @@
         <w:jc w:val="right"/>
       </w:pPr>
       <w:r>
-        <w:rPr>
-          <w:rFonts w:ascii="B Zar" w:hAnsi="B Zar"/>
-          <w:color w:val="1F7A70"/>
-          <w:sz w:val="26"/>
-        </w:rPr>
-        <w:t>۳. ایران: جایگزین‌ها و رقابت مستقیم</w:t>
+        <w:t>۸. چشم‌انداز رقابتی و جایگزین‌ها — گزیده</w:t>
       </w:r>
     </w:p>
     <w:p>
@@ -31828,12 +31822,7 @@
         <w:jc w:val="right"/>
       </w:pPr>
       <w:r>
-        <w:rPr>
-          <w:rFonts w:ascii="B Zar" w:hAnsi="B Zar"/>
-          <w:color w:val="1F7A70"/>
-          <w:sz w:val="26"/>
-        </w:rPr>
-        <w:t>۴. مشتری، بازار و مدل؛ چرا اندازه‌گذاری نشد</w:t>
+        <w:t>۵. اندازه، ساختار و پویایی تقاضای بازار — گزیده</w:t>
       </w:r>
     </w:p>
     <w:p>
@@ -31857,12 +31846,7 @@
         <w:jc w:val="right"/>
       </w:pPr>
       <w:r>
-        <w:rPr>
-          <w:rFonts w:ascii="B Zar" w:hAnsi="B Zar"/>
-          <w:color w:val="1F7A70"/>
-          <w:sz w:val="26"/>
-        </w:rPr>
-        <w:t>۵. verdict، counter-thesis و شرط بازگشایی</w:t>
+        <w:t>۱۲. نتیجه‌گیری و توصیهٔ راهبردی</w:t>
       </w:r>
     </w:p>
     <w:tbl>
@@ -32387,12 +32371,7 @@
         <w:jc w:val="right"/>
       </w:pPr>
       <w:r>
-        <w:rPr>
-          <w:rFonts w:ascii="B Zar" w:hAnsi="B Zar"/>
-          <w:color w:val="1F7A70"/>
-          <w:sz w:val="26"/>
-        </w:rPr>
-        <w:t>منابع پرونده F-05</w:t>
+        <w:t>۱۴. پیوست‌ها: منابع پرونده F-05</w:t>
       </w:r>
     </w:p>
     <w:tbl>
@@ -33193,12 +33172,7 @@
         <w:jc w:val="right"/>
       </w:pPr>
       <w:r>
-        <w:rPr>
-          <w:rFonts w:ascii="B Zar" w:hAnsi="B Zar"/>
-          <w:color w:val="1F7A70"/>
-          <w:sz w:val="26"/>
-        </w:rPr>
-        <w:t>۶. عملیات، ریسک و validation record (F-05)</w:t>
+        <w:t>۱۰. امکان‌سنجی اجرایی، حقوقی و عملیاتی — گزیده</w:t>
       </w:r>
     </w:p>
     <w:p>
@@ -34285,12 +34259,7 @@
         <w:jc w:val="right"/>
       </w:pPr>
       <w:r>
-        <w:rPr>
-          <w:rFonts w:ascii="B Zar" w:hAnsi="B Zar"/>
-          <w:color w:val="1F7A70"/>
-          <w:sz w:val="26"/>
-        </w:rPr>
-        <w:t>۱. مسئله و workflow</w:t>
+        <w:t>۲. مقدمه، زمینه و هدف پژوهش — گزیده</w:t>
       </w:r>
     </w:p>
     <w:p>
@@ -34758,12 +34727,7 @@
         <w:jc w:val="right"/>
       </w:pPr>
       <w:r>
-        <w:rPr>
-          <w:rFonts w:ascii="B Zar" w:hAnsi="B Zar"/>
-          <w:color w:val="1F7A70"/>
-          <w:sz w:val="26"/>
-        </w:rPr>
-        <w:t>۲. شواهد جهانی و بلوغ category</w:t>
+        <w:t>۴. نمای کلی بازار و صنعت — گزیده</w:t>
       </w:r>
     </w:p>
     <w:p>
@@ -35145,12 +35109,7 @@
         <w:jc w:val="right"/>
       </w:pPr>
       <w:r>
-        <w:rPr>
-          <w:rFonts w:ascii="B Zar" w:hAnsi="B Zar"/>
-          <w:color w:val="1F7A70"/>
-          <w:sz w:val="26"/>
-        </w:rPr>
-        <w:t>۳. ایران، رقابت و substituteهای واقعی</w:t>
+        <w:t>۸. چشم‌انداز رقابتی و جایگزین‌ها — گزیده</w:t>
       </w:r>
     </w:p>
     <w:p>
@@ -35704,12 +35663,7 @@
         <w:jc w:val="right"/>
       </w:pPr>
       <w:r>
-        <w:rPr>
-          <w:rFonts w:ascii="B Zar" w:hAnsi="B Zar"/>
-          <w:color w:val="1F7A70"/>
-          <w:sz w:val="26"/>
-        </w:rPr>
-        <w:t>۴. مشتری، بازار و مدل</w:t>
+        <w:t>۵. اندازه، ساختار و پویایی تقاضای بازار — گزیده</w:t>
       </w:r>
     </w:p>
     <w:p>
@@ -35747,12 +35701,7 @@
         <w:jc w:val="right"/>
       </w:pPr>
       <w:r>
-        <w:rPr>
-          <w:rFonts w:ascii="B Zar" w:hAnsi="B Zar"/>
-          <w:color w:val="1F7A70"/>
-          <w:sz w:val="26"/>
-        </w:rPr>
-        <w:t>۵. عملیات، ریسک و گیت‌های رد</w:t>
+        <w:t>۱۰. امکان‌سنجی اجرایی، حقوقی و عملیاتی — گزیده</w:t>
       </w:r>
     </w:p>
     <w:tbl>
@@ -36292,12 +36241,7 @@
         <w:jc w:val="right"/>
       </w:pPr>
       <w:r>
-        <w:rPr>
-          <w:rFonts w:ascii="B Zar" w:hAnsi="B Zar"/>
-          <w:color w:val="1F7A70"/>
-          <w:sz w:val="26"/>
-        </w:rPr>
-        <w:t>۶. validation فقط برای trigger بازگشایی</w:t>
+        <w:t>۱۳. برنامهٔ اعتبارسنجی و گیت بازگشایی</w:t>
       </w:r>
     </w:p>
     <w:p>
@@ -36377,12 +36321,7 @@
         <w:jc w:val="right"/>
       </w:pPr>
       <w:r>
-        <w:rPr>
-          <w:rFonts w:ascii="B Zar" w:hAnsi="B Zar"/>
-          <w:color w:val="1F7A70"/>
-          <w:sz w:val="26"/>
-        </w:rPr>
-        <w:t>منابع پرونده F-06</w:t>
+        <w:t>۱۴. پیوست‌ها: منابع پرونده F-06</w:t>
       </w:r>
     </w:p>
     <w:tbl>
@@ -37616,12 +37555,7 @@
         <w:jc w:val="right"/>
       </w:pPr>
       <w:r>
-        <w:rPr>
-          <w:rFonts w:ascii="B Zar" w:hAnsi="B Zar"/>
-          <w:color w:val="1F7A70"/>
-          <w:sz w:val="26"/>
-        </w:rPr>
-        <w:t>۱. مسئله، JTBD و core loop</w:t>
+        <w:t>۲. مقدمه، زمینه و هدف پژوهش — گزیده</w:t>
       </w:r>
     </w:p>
     <w:p>
@@ -38089,12 +38023,7 @@
         <w:jc w:val="right"/>
       </w:pPr>
       <w:r>
-        <w:rPr>
-          <w:rFonts w:ascii="B Zar" w:hAnsi="B Zar"/>
-          <w:color w:val="1F7A70"/>
-          <w:sz w:val="26"/>
-        </w:rPr>
-        <w:t>۲. شواهد جهانی</w:t>
+        <w:t>۴. نمای کلی بازار و صنعت — گزیده</w:t>
       </w:r>
     </w:p>
     <w:p>
@@ -38476,12 +38405,7 @@
         <w:jc w:val="right"/>
       </w:pPr>
       <w:r>
-        <w:rPr>
-          <w:rFonts w:ascii="B Zar" w:hAnsi="B Zar"/>
-          <w:color w:val="1F7A70"/>
-          <w:sz w:val="26"/>
-        </w:rPr>
-        <w:t>۳. ایران و substituteهای واقعی</w:t>
+        <w:t>۸. چشم‌انداز رقابتی و جایگزین‌ها — گزیده</w:t>
       </w:r>
     </w:p>
     <w:p>
@@ -38949,12 +38873,7 @@
         <w:jc w:val="right"/>
       </w:pPr>
       <w:r>
-        <w:rPr>
-          <w:rFonts w:ascii="B Zar" w:hAnsi="B Zar"/>
-          <w:color w:val="1F7A70"/>
-          <w:sz w:val="26"/>
-        </w:rPr>
-        <w:t>۴. مشتری، بازار و مدل</w:t>
+        <w:t>۵. اندازه، ساختار و پویایی تقاضای بازار — گزیده</w:t>
       </w:r>
     </w:p>
     <w:p>
@@ -38978,12 +38897,7 @@
         <w:jc w:val="right"/>
       </w:pPr>
       <w:r>
-        <w:rPr>
-          <w:rFonts w:ascii="B Zar" w:hAnsi="B Zar"/>
-          <w:color w:val="1F7A70"/>
-          <w:sz w:val="26"/>
-        </w:rPr>
-        <w:t>۵. عملیات، ریسک و گیت بازگشایی</w:t>
+        <w:t>۱۰. امکان‌سنجی اجرایی، حقوقی و عملیاتی — گزیده</w:t>
       </w:r>
     </w:p>
     <w:tbl>
@@ -39523,12 +39437,7 @@
         <w:jc w:val="right"/>
       </w:pPr>
       <w:r>
-        <w:rPr>
-          <w:rFonts w:ascii="B Zar" w:hAnsi="B Zar"/>
-          <w:color w:val="1F7A70"/>
-          <w:sz w:val="26"/>
-        </w:rPr>
-        <w:t>۶. validation فقط پس از reversal صریح</w:t>
+        <w:t>۱۳. برنامهٔ اعتبارسنجی و گیت بازگشایی</w:t>
       </w:r>
     </w:p>
     <w:p>
@@ -39607,12 +39516,7 @@
         <w:jc w:val="right"/>
       </w:pPr>
       <w:r>
-        <w:rPr>
-          <w:rFonts w:ascii="B Zar" w:hAnsi="B Zar"/>
-          <w:color w:val="1F7A70"/>
-          <w:sz w:val="26"/>
-        </w:rPr>
-        <w:t>منابع پرونده F-07</w:t>
+        <w:t>۱۴. پیوست‌ها: منابع پرونده F-07</w:t>
       </w:r>
     </w:p>
     <w:tbl>

</xml_diff>

<commit_message>
Deepen desk research for F-01 and F-02
</commit_message>
<xml_diff>
--- a/reports/fashion_market_research_master_v0.docx
+++ b/reports/fashion_market_research_master_v0.docx
@@ -47,7 +47,7 @@
               <w:br/>
               <w:br/>
               <w:br/>
-              <w:t>نسخهٔ ۰٫۶ | سند زنده و محرمانه</w:t>
+              <w:t>نسخهٔ ۰٫۸ | سند زنده و محرمانه</w:t>
               <w:br/>
               <w:t>۱۲ مهر ۱۴۰۵  |  ۴ اکتبر ۲۰۲۶</w:t>
               <w:br/>
@@ -362,7 +362,7 @@
               <w:jc w:val="right"/>
             </w:pPr>
             <w:r>
-              <w:t>۰٫۶ — hierarchy و عنوان‌های F-01 تا F-07 به ساختار استاندارد گزارش تحقیقات بازار بازآرایی شد؛ وضعیت‌های تصمیم تغییری نکرده‌اند.</w:t>
+              <w:t>۰٫۸ — بازبینی واقعی desk-research F-01 و F-02 با منابع رسمی جهانی/ایران و گیت حقوقی/عملیاتی افزوده شد؛ وضعیت‌های تصمیم تغییری نکرده‌اند.</w:t>
             </w:r>
           </w:p>
         </w:tc>
@@ -629,7 +629,7 @@
               <w:jc w:val="right"/>
             </w:pPr>
             <w:r>
-              <w:t>یادداشت اعتبار نسخهٔ ۰٫۶</w:t>
+              <w:t>یادداشت اعتبار نسخهٔ ۰٫۸</w:t>
             </w:r>
           </w:p>
           <w:p>
@@ -2890,7 +2890,7 @@
               <w:jc w:val="right"/>
             </w:pPr>
             <w:r>
-              <w:t>هیچ نمودار اندازهٔ بازار، سهم بازار، درآمد یا رضایت با دادهٔ نمونه یا عدد بی‌منبع وارد این گزارش نمی‌شود. نمودارهای نسخهٔ ۰٫۶ فقط وضعیت واقعی برنامهٔ پژوهش را نمایش می‌دهند. نمودارهای هر پرونده پس از ثبت منبع، تعریف، واحد و روش ایجاد می‌شوند.</w:t>
+              <w:t>هیچ نمودار اندازهٔ بازار، سهم بازار، درآمد یا رضایت با دادهٔ نمونه یا عدد بی‌منبع وارد این گزارش نمی‌شود. نمودارهای نسخهٔ ۰٫۸ فقط وضعیت واقعی برنامهٔ پژوهش را نمایش می‌دهند. نمودارهای هر پرونده پس از ثبت منبع، تعریف، واحد و روش ایجاد می‌شوند.</w:t>
             </w:r>
           </w:p>
         </w:tc>
@@ -15611,6 +15611,186 @@
           </w:p>
         </w:tc>
       </w:tr>
+      <w:tr>
+        <w:tc>
+          <w:tcPr>
+            <w:tcPr>
+              <w:tcPr>
+                <w:tcW w:type="dxa" w:w="2409"/>
+                <w:tcBorders>
+                  <w:top w:val="single" w:sz="3" w:space="0" w:color="D9E0E7"/>
+                  <w:left w:val="single" w:sz="3" w:space="0" w:color="D9E0E7"/>
+                  <w:bottom w:val="single" w:sz="3" w:space="0" w:color="D9E0E7"/>
+                  <w:right w:val="single" w:sz="3" w:space="0" w:color="D9E0E7"/>
+                </w:tcBorders>
+                <w:shd w:fill="FFFFFF"/>
+              </w:tcPr>
+            </w:tcPr>
+          </w:tcPr>
+          <w:p>
+            <w:r>
+              <w:t>۰٫۷</w:t>
+            </w:r>
+          </w:p>
+        </w:tc>
+        <w:tc>
+          <w:tcPr>
+            <w:tcPr>
+              <w:tcPr>
+                <w:tcW w:type="dxa" w:w="2409"/>
+                <w:tcBorders>
+                  <w:top w:val="single" w:sz="3" w:space="0" w:color="D9E0E7"/>
+                  <w:left w:val="single" w:sz="3" w:space="0" w:color="D9E0E7"/>
+                  <w:bottom w:val="single" w:sz="3" w:space="0" w:color="D9E0E7"/>
+                  <w:right w:val="single" w:sz="3" w:space="0" w:color="D9E0E7"/>
+                </w:tcBorders>
+                <w:shd w:fill="FFFFFF"/>
+              </w:tcPr>
+            </w:tcPr>
+          </w:tcPr>
+          <w:p>
+            <w:r>
+              <w:t>۱۲ مهر ۱۴۰۵</w:t>
+            </w:r>
+          </w:p>
+        </w:tc>
+        <w:tc>
+          <w:tcPr>
+            <w:tcPr>
+              <w:tcPr>
+                <w:tcW w:type="dxa" w:w="2409"/>
+                <w:tcBorders>
+                  <w:top w:val="single" w:sz="3" w:space="0" w:color="D9E0E7"/>
+                  <w:left w:val="single" w:sz="3" w:space="0" w:color="D9E0E7"/>
+                  <w:bottom w:val="single" w:sz="3" w:space="0" w:color="D9E0E7"/>
+                  <w:right w:val="single" w:sz="3" w:space="0" w:color="D9E0E7"/>
+                </w:tcBorders>
+                <w:shd w:fill="FFFFFF"/>
+              </w:tcPr>
+            </w:tcPr>
+          </w:tcPr>
+          <w:p>
+            <w:r>
+              <w:t>F-01: بازبینی desk-research با product guide رسمی Launchmetrics، substituteهای رسمی ایران، data/consent و ریسک کانال؛ بدون تغییر status و بدون ادعای primary research.</w:t>
+            </w:r>
+          </w:p>
+        </w:tc>
+        <w:tc>
+          <w:tcPr>
+            <w:tcPr>
+              <w:tcPr>
+                <w:tcW w:type="dxa" w:w="2409"/>
+                <w:tcBorders>
+                  <w:top w:val="single" w:sz="3" w:space="0" w:color="D9E0E7"/>
+                  <w:left w:val="single" w:sz="3" w:space="0" w:color="D9E0E7"/>
+                  <w:bottom w:val="single" w:sz="3" w:space="0" w:color="D9E0E7"/>
+                  <w:right w:val="single" w:sz="3" w:space="0" w:color="D9E0E7"/>
+                </w:tcBorders>
+                <w:shd w:fill="FFFFFF"/>
+              </w:tcPr>
+            </w:tcPr>
+          </w:tcPr>
+          <w:p>
+            <w:r>
+              <w:t>منتشرشده</w:t>
+            </w:r>
+          </w:p>
+        </w:tc>
+      </w:tr>
+      <w:tr>
+        <w:tc>
+          <w:tcPr>
+            <w:tcPr>
+              <w:tcPr>
+                <w:tcPr>
+                  <w:tcW w:type="dxa" w:w="2409"/>
+                  <w:tcBorders>
+                    <w:top w:val="single" w:sz="3" w:space="0" w:color="D9E0E7"/>
+                    <w:left w:val="single" w:sz="3" w:space="0" w:color="D9E0E7"/>
+                    <w:bottom w:val="single" w:sz="3" w:space="0" w:color="D9E0E7"/>
+                    <w:right w:val="single" w:sz="3" w:space="0" w:color="D9E0E7"/>
+                  </w:tcBorders>
+                  <w:shd w:fill="FFFFFF"/>
+                </w:tcPr>
+              </w:tcPr>
+            </w:tcPr>
+          </w:tcPr>
+          <w:p>
+            <w:r>
+              <w:t>۰٫۸</w:t>
+            </w:r>
+          </w:p>
+        </w:tc>
+        <w:tc>
+          <w:tcPr>
+            <w:tcPr>
+              <w:tcPr>
+                <w:tcPr>
+                  <w:tcW w:type="dxa" w:w="2409"/>
+                  <w:tcBorders>
+                    <w:top w:val="single" w:sz="3" w:space="0" w:color="D9E0E7"/>
+                    <w:left w:val="single" w:sz="3" w:space="0" w:color="D9E0E7"/>
+                    <w:bottom w:val="single" w:sz="3" w:space="0" w:color="D9E0E7"/>
+                    <w:right w:val="single" w:sz="3" w:space="0" w:color="D9E0E7"/>
+                  </w:tcBorders>
+                  <w:shd w:fill="FFFFFF"/>
+                </w:tcPr>
+              </w:tcPr>
+            </w:tcPr>
+          </w:tcPr>
+          <w:p>
+            <w:r>
+              <w:t>۱۲ مهر ۱۴۰۵</w:t>
+            </w:r>
+          </w:p>
+        </w:tc>
+        <w:tc>
+          <w:tcPr>
+            <w:tcPr>
+              <w:tcPr>
+                <w:tcPr>
+                  <w:tcW w:type="dxa" w:w="2409"/>
+                  <w:tcBorders>
+                    <w:top w:val="single" w:sz="3" w:space="0" w:color="D9E0E7"/>
+                    <w:left w:val="single" w:sz="3" w:space="0" w:color="D9E0E7"/>
+                    <w:bottom w:val="single" w:sz="3" w:space="0" w:color="D9E0E7"/>
+                    <w:right w:val="single" w:sz="3" w:space="0" w:color="D9E0E7"/>
+                  </w:tcBorders>
+                  <w:shd w:fill="FFFFFF"/>
+                </w:tcPr>
+              </w:tcPr>
+            </w:tcPr>
+          </w:tcPr>
+          <w:p>
+            <w:r>
+              <w:t>F-02: بازبینی desk-research با منابع رسمی SyncOnSet/Dramatify/Ready4Set، discipline sizing، privacy/consent و گیت pilot؛ status تغییر نکرد.</w:t>
+            </w:r>
+          </w:p>
+        </w:tc>
+        <w:tc>
+          <w:tcPr>
+            <w:tcPr>
+              <w:tcPr>
+                <w:tcPr>
+                  <w:tcW w:type="dxa" w:w="2409"/>
+                  <w:tcBorders>
+                    <w:top w:val="single" w:sz="3" w:space="0" w:color="D9E0E7"/>
+                    <w:left w:val="single" w:sz="3" w:space="0" w:color="D9E0E7"/>
+                    <w:bottom w:val="single" w:sz="3" w:space="0" w:color="D9E0E7"/>
+                    <w:right w:val="single" w:sz="3" w:space="0" w:color="D9E0E7"/>
+                  </w:tcBorders>
+                  <w:shd w:fill="FFFFFF"/>
+                </w:tcPr>
+              </w:tcPr>
+            </w:tcPr>
+          </w:tcPr>
+          <w:p>
+            <w:r>
+              <w:t>منتشرشده</w:t>
+            </w:r>
+          </w:p>
+        </w:tc>
+      </w:tr>
     </w:tbl>
     <w:p/>
     <w:tbl>
@@ -16863,6 +17043,65 @@
           </w:p>
         </w:tc>
       </w:tr>
+      <w:tr>
+        <w:tc>
+          <w:tcPr>
+            <w:tcPr>
+              <w:tcW w:type="dxa" w:w="3213"/>
+              <w:tcBorders>
+                <w:top w:val="single" w:sz="3" w:space="0" w:color="D9E0E7"/>
+                <w:left w:val="single" w:sz="3" w:space="0" w:color="D9E0E7"/>
+                <w:bottom w:val="single" w:sz="3" w:space="0" w:color="D9E0E7"/>
+                <w:right w:val="single" w:sz="3" w:space="0" w:color="D9E0E7"/>
+              </w:tcBorders>
+              <w:shd w:fill="FFFFFF"/>
+            </w:tcPr>
+          </w:tcPr>
+          <w:p>
+            <w:r>
+              <w:t>state model، delivery memo و due date</w:t>
+            </w:r>
+          </w:p>
+        </w:tc>
+        <w:tc>
+          <w:tcPr>
+            <w:tcPr>
+              <w:tcW w:type="dxa" w:w="3213"/>
+              <w:tcBorders>
+                <w:top w:val="single" w:sz="3" w:space="0" w:color="D9E0E7"/>
+                <w:left w:val="single" w:sz="3" w:space="0" w:color="D9E0E7"/>
+                <w:bottom w:val="single" w:sz="3" w:space="0" w:color="D9E0E7"/>
+                <w:right w:val="single" w:sz="3" w:space="0" w:color="D9E0E7"/>
+              </w:tcBorders>
+              <w:shd w:fill="FFFFFF"/>
+            </w:tcPr>
+          </w:tcPr>
+          <w:p>
+            <w:r>
+              <w:t>راهنمای رسمی: loan/reservation/transfer/return/archive/write-off/gifting، ثبت تحویل و موعد بازگشت. [F01-S09]</w:t>
+            </w:r>
+          </w:p>
+        </w:tc>
+        <w:tc>
+          <w:tcPr>
+            <w:tcPr>
+              <w:tcW w:type="dxa" w:w="3213"/>
+              <w:tcBorders>
+                <w:top w:val="single" w:sz="3" w:space="0" w:color="D9E0E7"/>
+                <w:left w:val="single" w:sz="3" w:space="0" w:color="D9E0E7"/>
+                <w:bottom w:val="single" w:sz="3" w:space="0" w:color="D9E0E7"/>
+                <w:right w:val="single" w:sz="3" w:space="0" w:color="D9E0E7"/>
+              </w:tcBorders>
+              <w:shd w:fill="FFFFFF"/>
+            </w:tcPr>
+          </w:tcPr>
+          <w:p>
+            <w:r>
+              <w:t>MVP باید state-transition، role، time-stamp و audit trail داشته باشد؛ ادعاهای performance فروشنده مبنای forecast نیست.</w:t>
+            </w:r>
+          </w:p>
+        </w:tc>
+      </w:tr>
     </w:tbl>
     <w:p/>
     <w:p>
@@ -16877,6 +17116,15 @@
           <w:sz w:val="22"/>
         </w:rPr>
         <w:t>Launchmetrics، PLM را از sample tracking جدا می‌داند: PLM specification و تولید محصول را تعریف می‌کند؛ Samples حرکت و activation قطعهٔ فیزیکی موجود را ثبت می‌کند. [F01-S01] این مرز برای اجتناب از بازنام‌گذاری مسیر ردشدهٔ PLM/ERP ضروری است.</w:t>
+      </w:r>
+    </w:p>
+    <w:p>
+      <w:pPr>
+        <w:spacing w:after="100" w:line="300" w:lineRule="auto"/>
+        <w:jc w:val="right"/>
+      </w:pPr>
+      <w:r>
+        <w:t>بازبینی product guide رسمی در ۱۲ مهر ۱۴۰۵، stateهای loan، reservation، transfer، return، archive، write-off و gifting و نیز delivery memo، موعد بازگشت و اسکن موبایلی barcode را تأیید کرد. این‌ها category/workflow proof هستند. ادعاهای همان vendor دربارهٔ کاهش loss، ۱٬۷۰۰+ برند، $5bn ارزش محصول یا صرفه‌جویی زمان، methodology مستقل عمومی ندارند و برای sizing یا forecast ایران به‌کار نرفته‌اند. [F01-S09][F01-S10]</w:t>
       </w:r>
     </w:p>
     <w:p>
@@ -16901,6 +17149,15 @@
           <w:sz w:val="22"/>
         </w:rPr>
         <w:t>پلتفرم‌ها و آژانس‌های ایرانی influencer marketing، discovery، brief، campaign، گزارش و در مواردی payment را پوشش می‌دهند. دیما سوشال سفارش/همکاری/گزارش را مطرح می‌کند؛ نشانت و تگرو نیز network و campaign management عرضه می‌کنند. [F01-S05][F01-S06][F01-S07] در صفحات عمومی بررسی‌شده، workflow صریح برای custody هر لباس، return/condition و asset-right مشاهده نشد. این «عدم مشاهده در desk scan» است، نه ادعای نبود رقیب.</w:t>
+      </w:r>
+    </w:p>
+    <w:p>
+      <w:pPr>
+        <w:spacing w:after="100" w:line="300" w:lineRule="auto"/>
+        <w:jc w:val="right"/>
+      </w:pPr>
+      <w:r>
+        <w:t>بازبینی صفحات رسمی نشان می‌دهد دیما سوشال سفارش، تأیید اجرای محتوا، پرداخت پس از تأیید و گزارش را عرضه می‌کند؛ نشانت به ایجاد کمپین، جست‌وجوی influencer و گزارش مدیریتی/مالی اشاره می‌کند؛ و تگرو معرفی influencer و تحلیل campaign را مطرح می‌سازد. بنابراین campaign workflow یک substitute واقعی است، اما هیچ‌یک به‌تنهایی evidence پرداخت‌پذیری یا نبود record داخلیِ sample-loan نیستند. [F01-S11][F01-S12][F01-S13]</w:t>
       </w:r>
     </w:p>
     <w:tbl>
@@ -18258,6 +18515,15 @@
     </w:p>
     <w:p>
       <w:pPr>
+        <w:spacing w:after="100" w:line="300" w:lineRule="auto"/>
+        <w:jc w:val="right"/>
+      </w:pPr>
+      <w:r>
+        <w:t>کنترل امکان‌سنجی افزوده: product باید purpose/consent، permission و expiry حق استفاده از asset، نقش‌های دسترسی، audit trail و export/delete را از آغاز طراحی کند. قانون تجارت الکترونیکی برای داده‌پیام شخصیِ موضوع مواد ۵۸ و ۵۹، رضایت/هدف روشن و حقوق دسترسی و اصلاح یا حذف را مطرح می‌کند؛ انطباق دقیق پیش از اجرا به نظر حقوقی محلی نیاز دارد. وابستگی flow به یک API یا notification اینستاگرام نیز مردود است؛ استفادهٔ گسترده از platformهای فیلترشده ریسک عملیاتی کانال است، نه evidence بازار. [F01-S14][F01-S15]</w:t>
+      </w:r>
+    </w:p>
+    <w:p>
+      <w:pPr>
         <w:pStyle w:val="Heading2"/>
         <w:spacing w:before="200" w:after="120"/>
         <w:jc w:val="right"/>
@@ -19115,6 +19381,419 @@
                 <w:sz w:val="17"/>
               </w:rPr>
               <w:t>محک، نرم‌افزار حسابداری پوشاک — https://www.mahaksoft.com/garment-accounting-software/</w:t>
+            </w:r>
+          </w:p>
+        </w:tc>
+      </w:tr>
+      <w:tr>
+        <w:tc>
+          <w:tcPr>
+            <w:tcPr>
+              <w:tcW w:type="dxa" w:w="3213"/>
+              <w:tcBorders>
+                <w:top w:val="single" w:sz="3" w:space="0" w:color="D9E0E7"/>
+                <w:left w:val="single" w:sz="3" w:space="0" w:color="D9E0E7"/>
+                <w:bottom w:val="single" w:sz="3" w:space="0" w:color="D9E0E7"/>
+                <w:right w:val="single" w:sz="3" w:space="0" w:color="D9E0E7"/>
+              </w:tcBorders>
+              <w:shd w:fill="FFFFFF"/>
+            </w:tcPr>
+          </w:tcPr>
+          <w:p>
+            <w:r>
+              <w:t>F01-S09</w:t>
+            </w:r>
+          </w:p>
+        </w:tc>
+        <w:tc>
+          <w:tcPr>
+            <w:tcPr>
+              <w:tcW w:type="dxa" w:w="3213"/>
+              <w:tcBorders>
+                <w:top w:val="single" w:sz="3" w:space="0" w:color="D9E0E7"/>
+                <w:left w:val="single" w:sz="3" w:space="0" w:color="D9E0E7"/>
+                <w:bottom w:val="single" w:sz="3" w:space="0" w:color="D9E0E7"/>
+                <w:right w:val="single" w:sz="3" w:space="0" w:color="D9E0E7"/>
+              </w:tcBorders>
+              <w:shd w:fill="FFFFFF"/>
+            </w:tcPr>
+          </w:tcPr>
+          <w:p>
+            <w:r>
+              <w:t>C / vendor product guide</w:t>
+            </w:r>
+          </w:p>
+        </w:tc>
+        <w:tc>
+          <w:tcPr>
+            <w:tcPr>
+              <w:tcW w:type="dxa" w:w="3213"/>
+              <w:tcBorders>
+                <w:top w:val="single" w:sz="3" w:space="0" w:color="D9E0E7"/>
+                <w:left w:val="single" w:sz="3" w:space="0" w:color="D9E0E7"/>
+                <w:bottom w:val="single" w:sz="3" w:space="0" w:color="D9E0E7"/>
+                <w:right w:val="single" w:sz="3" w:space="0" w:color="D9E0E7"/>
+              </w:tcBorders>
+              <w:shd w:fill="FFFFFF"/>
+            </w:tcPr>
+          </w:tcPr>
+          <w:p>
+            <w:r>
+              <w:t>Launchmetrics Sample Tracking Software (2025) — https://www.launchmetrics.com/resources/blog/sample-tracking-software</w:t>
+            </w:r>
+          </w:p>
+        </w:tc>
+      </w:tr>
+      <w:tr>
+        <w:tc>
+          <w:tcPr>
+            <w:tcPr>
+              <w:tcW w:type="dxa" w:w="3213"/>
+              <w:tcBorders>
+                <w:top w:val="single" w:sz="3" w:space="0" w:color="D9E0E7"/>
+                <w:left w:val="single" w:sz="3" w:space="0" w:color="D9E0E7"/>
+                <w:bottom w:val="single" w:sz="3" w:space="0" w:color="D9E0E7"/>
+                <w:right w:val="single" w:sz="3" w:space="0" w:color="D9E0E7"/>
+              </w:tcBorders>
+              <w:shd w:fill="FFFFFF"/>
+            </w:tcPr>
+          </w:tcPr>
+          <w:p>
+            <w:r>
+              <w:t>F01-S10</w:t>
+            </w:r>
+          </w:p>
+        </w:tc>
+        <w:tc>
+          <w:tcPr>
+            <w:tcPr>
+              <w:tcW w:type="dxa" w:w="3213"/>
+              <w:tcBorders>
+                <w:top w:val="single" w:sz="3" w:space="0" w:color="D9E0E7"/>
+                <w:left w:val="single" w:sz="3" w:space="0" w:color="D9E0E7"/>
+                <w:bottom w:val="single" w:sz="3" w:space="0" w:color="D9E0E7"/>
+                <w:right w:val="single" w:sz="3" w:space="0" w:color="D9E0E7"/>
+              </w:tcBorders>
+              <w:shd w:fill="FFFFFF"/>
+            </w:tcPr>
+          </w:tcPr>
+          <w:p>
+            <w:r>
+              <w:t>C / vendor claim</w:t>
+            </w:r>
+          </w:p>
+        </w:tc>
+        <w:tc>
+          <w:tcPr>
+            <w:tcPr>
+              <w:tcW w:type="dxa" w:w="3213"/>
+              <w:tcBorders>
+                <w:top w:val="single" w:sz="3" w:space="0" w:color="D9E0E7"/>
+                <w:left w:val="single" w:sz="3" w:space="0" w:color="D9E0E7"/>
+                <w:bottom w:val="single" w:sz="3" w:space="0" w:color="D9E0E7"/>
+                <w:right w:val="single" w:sz="3" w:space="0" w:color="D9E0E7"/>
+              </w:tcBorders>
+              <w:shd w:fill="FFFFFF"/>
+            </w:tcPr>
+          </w:tcPr>
+          <w:p>
+            <w:r>
+              <w:t>Launchmetrics Sample Management Software — https://www.launchmetrics.com/software/samples-management</w:t>
+            </w:r>
+          </w:p>
+        </w:tc>
+      </w:tr>
+      <w:tr>
+        <w:tc>
+          <w:tcPr>
+            <w:tcPr>
+              <w:tcW w:type="dxa" w:w="3213"/>
+              <w:tcBorders>
+                <w:top w:val="single" w:sz="3" w:space="0" w:color="D9E0E7"/>
+                <w:left w:val="single" w:sz="3" w:space="0" w:color="D9E0E7"/>
+                <w:bottom w:val="single" w:sz="3" w:space="0" w:color="D9E0E7"/>
+                <w:right w:val="single" w:sz="3" w:space="0" w:color="D9E0E7"/>
+              </w:tcBorders>
+              <w:shd w:fill="FFFFFF"/>
+            </w:tcPr>
+          </w:tcPr>
+          <w:p>
+            <w:r>
+              <w:t>F01-S11</w:t>
+            </w:r>
+          </w:p>
+        </w:tc>
+        <w:tc>
+          <w:tcPr>
+            <w:tcPr>
+              <w:tcW w:type="dxa" w:w="3213"/>
+              <w:tcBorders>
+                <w:top w:val="single" w:sz="3" w:space="0" w:color="D9E0E7"/>
+                <w:left w:val="single" w:sz="3" w:space="0" w:color="D9E0E7"/>
+                <w:bottom w:val="single" w:sz="3" w:space="0" w:color="D9E0E7"/>
+                <w:right w:val="single" w:sz="3" w:space="0" w:color="D9E0E7"/>
+              </w:tcBorders>
+              <w:shd w:fill="FFFFFF"/>
+            </w:tcPr>
+          </w:tcPr>
+          <w:p>
+            <w:r>
+              <w:t>C / vendor</w:t>
+            </w:r>
+          </w:p>
+        </w:tc>
+        <w:tc>
+          <w:tcPr>
+            <w:tcPr>
+              <w:tcW w:type="dxa" w:w="3213"/>
+              <w:tcBorders>
+                <w:top w:val="single" w:sz="3" w:space="0" w:color="D9E0E7"/>
+                <w:left w:val="single" w:sz="3" w:space="0" w:color="D9E0E7"/>
+                <w:bottom w:val="single" w:sz="3" w:space="0" w:color="D9E0E7"/>
+                <w:right w:val="single" w:sz="3" w:space="0" w:color="D9E0E7"/>
+              </w:tcBorders>
+              <w:shd w:fill="FFFFFF"/>
+            </w:tcPr>
+          </w:tcPr>
+          <w:p>
+            <w:r>
+              <w:t>دیما سوشال، campaign/approval/payment/reporting — https://deema.agency/deema-social-platform/</w:t>
+            </w:r>
+          </w:p>
+        </w:tc>
+      </w:tr>
+      <w:tr>
+        <w:tc>
+          <w:tcPr>
+            <w:tcPr>
+              <w:tcW w:type="dxa" w:w="3213"/>
+              <w:tcBorders>
+                <w:top w:val="single" w:sz="3" w:space="0" w:color="D9E0E7"/>
+                <w:left w:val="single" w:sz="3" w:space="0" w:color="D9E0E7"/>
+                <w:bottom w:val="single" w:sz="3" w:space="0" w:color="D9E0E7"/>
+                <w:right w:val="single" w:sz="3" w:space="0" w:color="D9E0E7"/>
+              </w:tcBorders>
+              <w:shd w:fill="FFFFFF"/>
+            </w:tcPr>
+          </w:tcPr>
+          <w:p>
+            <w:r>
+              <w:t>F01-S12</w:t>
+            </w:r>
+          </w:p>
+        </w:tc>
+        <w:tc>
+          <w:tcPr>
+            <w:tcPr>
+              <w:tcW w:type="dxa" w:w="3213"/>
+              <w:tcBorders>
+                <w:top w:val="single" w:sz="3" w:space="0" w:color="D9E0E7"/>
+                <w:left w:val="single" w:sz="3" w:space="0" w:color="D9E0E7"/>
+                <w:bottom w:val="single" w:sz="3" w:space="0" w:color="D9E0E7"/>
+                <w:right w:val="single" w:sz="3" w:space="0" w:color="D9E0E7"/>
+              </w:tcBorders>
+              <w:shd w:fill="FFFFFF"/>
+            </w:tcPr>
+          </w:tcPr>
+          <w:p>
+            <w:r>
+              <w:t>C / vendor</w:t>
+            </w:r>
+          </w:p>
+        </w:tc>
+        <w:tc>
+          <w:tcPr>
+            <w:tcPr>
+              <w:tcW w:type="dxa" w:w="3213"/>
+              <w:tcBorders>
+                <w:top w:val="single" w:sz="3" w:space="0" w:color="D9E0E7"/>
+                <w:left w:val="single" w:sz="3" w:space="0" w:color="D9E0E7"/>
+                <w:bottom w:val="single" w:sz="3" w:space="0" w:color="D9E0E7"/>
+                <w:right w:val="single" w:sz="3" w:space="0" w:color="D9E0E7"/>
+              </w:tcBorders>
+              <w:shd w:fill="FFFFFF"/>
+            </w:tcPr>
+          </w:tcPr>
+          <w:p>
+            <w:r>
+              <w:t>نشانت، campaign/network/reporting — https://neshanet.com/</w:t>
+            </w:r>
+          </w:p>
+        </w:tc>
+      </w:tr>
+      <w:tr>
+        <w:tc>
+          <w:tcPr>
+            <w:tcPr>
+              <w:tcW w:type="dxa" w:w="3213"/>
+              <w:tcBorders>
+                <w:top w:val="single" w:sz="3" w:space="0" w:color="D9E0E7"/>
+                <w:left w:val="single" w:sz="3" w:space="0" w:color="D9E0E7"/>
+                <w:bottom w:val="single" w:sz="3" w:space="0" w:color="D9E0E7"/>
+                <w:right w:val="single" w:sz="3" w:space="0" w:color="D9E0E7"/>
+              </w:tcBorders>
+              <w:shd w:fill="FFFFFF"/>
+            </w:tcPr>
+          </w:tcPr>
+          <w:p>
+            <w:r>
+              <w:t>F01-S13</w:t>
+            </w:r>
+          </w:p>
+        </w:tc>
+        <w:tc>
+          <w:tcPr>
+            <w:tcPr>
+              <w:tcW w:type="dxa" w:w="3213"/>
+              <w:tcBorders>
+                <w:top w:val="single" w:sz="3" w:space="0" w:color="D9E0E7"/>
+                <w:left w:val="single" w:sz="3" w:space="0" w:color="D9E0E7"/>
+                <w:bottom w:val="single" w:sz="3" w:space="0" w:color="D9E0E7"/>
+                <w:right w:val="single" w:sz="3" w:space="0" w:color="D9E0E7"/>
+              </w:tcBorders>
+              <w:shd w:fill="FFFFFF"/>
+            </w:tcPr>
+          </w:tcPr>
+          <w:p>
+            <w:r>
+              <w:t>C / vendor + case study</w:t>
+            </w:r>
+          </w:p>
+        </w:tc>
+        <w:tc>
+          <w:tcPr>
+            <w:tcPr>
+              <w:tcW w:type="dxa" w:w="3213"/>
+              <w:tcBorders>
+                <w:top w:val="single" w:sz="3" w:space="0" w:color="D9E0E7"/>
+                <w:left w:val="single" w:sz="3" w:space="0" w:color="D9E0E7"/>
+                <w:bottom w:val="single" w:sz="3" w:space="0" w:color="D9E0E7"/>
+                <w:right w:val="single" w:sz="3" w:space="0" w:color="D9E0E7"/>
+              </w:tcBorders>
+              <w:shd w:fill="FFFFFF"/>
+            </w:tcPr>
+          </w:tcPr>
+          <w:p>
+            <w:r>
+              <w:t>تگرو، influencer/campaign analytics — https://tagrow.net/</w:t>
+            </w:r>
+          </w:p>
+        </w:tc>
+      </w:tr>
+      <w:tr>
+        <w:tc>
+          <w:tcPr>
+            <w:tcPr>
+              <w:tcW w:type="dxa" w:w="3213"/>
+              <w:tcBorders>
+                <w:top w:val="single" w:sz="3" w:space="0" w:color="D9E0E7"/>
+                <w:left w:val="single" w:sz="3" w:space="0" w:color="D9E0E7"/>
+                <w:bottom w:val="single" w:sz="3" w:space="0" w:color="D9E0E7"/>
+                <w:right w:val="single" w:sz="3" w:space="0" w:color="D9E0E7"/>
+              </w:tcBorders>
+              <w:shd w:fill="FFFFFF"/>
+            </w:tcPr>
+          </w:tcPr>
+          <w:p>
+            <w:r>
+              <w:t>F01-S14</w:t>
+            </w:r>
+          </w:p>
+        </w:tc>
+        <w:tc>
+          <w:tcPr>
+            <w:tcPr>
+              <w:tcW w:type="dxa" w:w="3213"/>
+              <w:tcBorders>
+                <w:top w:val="single" w:sz="3" w:space="0" w:color="D9E0E7"/>
+                <w:left w:val="single" w:sz="3" w:space="0" w:color="D9E0E7"/>
+                <w:bottom w:val="single" w:sz="3" w:space="0" w:color="D9E0E7"/>
+                <w:right w:val="single" w:sz="3" w:space="0" w:color="D9E0E7"/>
+              </w:tcBorders>
+              <w:shd w:fill="FFFFFF"/>
+            </w:tcPr>
+          </w:tcPr>
+          <w:p>
+            <w:r>
+              <w:t>A / متن قانون رسمی منتشرشده</w:t>
+            </w:r>
+          </w:p>
+        </w:tc>
+        <w:tc>
+          <w:tcPr>
+            <w:tcPr>
+              <w:tcW w:type="dxa" w:w="3213"/>
+              <w:tcBorders>
+                <w:top w:val="single" w:sz="3" w:space="0" w:color="D9E0E7"/>
+                <w:left w:val="single" w:sz="3" w:space="0" w:color="D9E0E7"/>
+                <w:bottom w:val="single" w:sz="3" w:space="0" w:color="D9E0E7"/>
+                <w:right w:val="single" w:sz="3" w:space="0" w:color="D9E0E7"/>
+              </w:tcBorders>
+              <w:shd w:fill="FFFFFF"/>
+            </w:tcPr>
+          </w:tcPr>
+          <w:p>
+            <w:r>
+              <w:t>پلیس فتا، قانون تجارت الکترونیکی مواد ۵۸ و ۵۹ — https://www.cyberpolice.ir/page/2581</w:t>
+            </w:r>
+          </w:p>
+        </w:tc>
+      </w:tr>
+      <w:tr>
+        <w:tc>
+          <w:tcPr>
+            <w:tcPr>
+              <w:tcW w:type="dxa" w:w="3213"/>
+              <w:tcBorders>
+                <w:top w:val="single" w:sz="3" w:space="0" w:color="D9E0E7"/>
+                <w:left w:val="single" w:sz="3" w:space="0" w:color="D9E0E7"/>
+                <w:bottom w:val="single" w:sz="3" w:space="0" w:color="D9E0E7"/>
+                <w:right w:val="single" w:sz="3" w:space="0" w:color="D9E0E7"/>
+              </w:tcBorders>
+              <w:shd w:fill="FFFFFF"/>
+            </w:tcPr>
+          </w:tcPr>
+          <w:p>
+            <w:r>
+              <w:t>F01-S15</w:t>
+            </w:r>
+          </w:p>
+        </w:tc>
+        <w:tc>
+          <w:tcPr>
+            <w:tcPr>
+              <w:tcW w:type="dxa" w:w="3213"/>
+              <w:tcBorders>
+                <w:top w:val="single" w:sz="3" w:space="0" w:color="D9E0E7"/>
+                <w:left w:val="single" w:sz="3" w:space="0" w:color="D9E0E7"/>
+                <w:bottom w:val="single" w:sz="3" w:space="0" w:color="D9E0E7"/>
+                <w:right w:val="single" w:sz="3" w:space="0" w:color="D9E0E7"/>
+              </w:tcBorders>
+              <w:shd w:fill="FFFFFF"/>
+            </w:tcPr>
+          </w:tcPr>
+          <w:p>
+            <w:r>
+              <w:t>B / source government secondary</w:t>
+            </w:r>
+          </w:p>
+        </w:tc>
+        <w:tc>
+          <w:tcPr>
+            <w:tcPr>
+              <w:tcW w:type="dxa" w:w="3213"/>
+              <w:tcBorders>
+                <w:top w:val="single" w:sz="3" w:space="0" w:color="D9E0E7"/>
+                <w:left w:val="single" w:sz="3" w:space="0" w:color="D9E0E7"/>
+                <w:bottom w:val="single" w:sz="3" w:space="0" w:color="D9E0E7"/>
+                <w:right w:val="single" w:sz="3" w:space="0" w:color="D9E0E7"/>
+              </w:tcBorders>
+              <w:shd w:fill="FFFFFF"/>
+            </w:tcPr>
+          </w:tcPr>
+          <w:p>
+            <w:r>
+              <w:t>GOV.UK, Iran social media policy note (2025) — https://www.gov.uk/government/publications/iran-country-policy-and-information-notes/country-policy-and-information-note-social-media-surveillance-and-sur-place-activities-iran-april-2025-accessible</w:t>
             </w:r>
           </w:p>
         </w:tc>
@@ -19774,6 +20453,15 @@
         <w:t>SyncOnSet برای costume department، breakdown، digital continuity book، photo upload، inventory، budget، measurement و wrap report عرضه می‌شود و mobile offline را برای set مطرح می‌کند. [F02-S01][F02-S02] Variety در ۲۰۱۶ استفادهٔ آن در ۲٬۵۰۰ feature/TV series و نمونهٔ Game of Thrones را گزارش کرد؛ این داده تاریخی است و برای market sizing فعلی استفاده نمی‌شود. [F02-S03]</w:t>
       </w:r>
     </w:p>
+    <w:p>
+      <w:pPr>
+        <w:spacing w:after="100" w:line="300" w:lineRule="auto"/>
+        <w:jc w:val="right"/>
+      </w:pPr>
+      <w:r>
+        <w:t>بازبینی رسمی جدید، تفاوت سه الگو را روشن‌تر می‌کند: SyncOnSet mobile-offline و prep-to-wrap را صریحاً عرضه می‌کند؛ Dramatify wardrobe را در suite برنامه‌ریزی/scene/stripboard قرار می‌دهد؛ Ready4Set costume-first اما در FAQ خود web-based بودن فعلی و برنامهٔ آینده برای offline را اعلام می‌کند. این‌ها proof قابلیت‌اند، نه evidence قیمت، سهم بازار یا نیاز ایران. [F02-S01][F02-S04][F02-S05][F02-S08][F02-S09]</w:t>
+      </w:r>
+    </w:p>
     <w:tbl>
       <w:tblPr>
         <w:bidiVisual w:val="1"/>
@@ -20126,6 +20814,65 @@
                 <w:sz w:val="17"/>
               </w:rPr>
               <w:t>موجودیت‌های costume asset و look، category مجزا از inventory عمومی می‌سازند.</w:t>
+            </w:r>
+          </w:p>
+        </w:tc>
+      </w:tr>
+      <w:tr>
+        <w:tc>
+          <w:tcPr>
+            <w:tcPr>
+              <w:tcW w:type="dxa" w:w="3213"/>
+              <w:tcBorders>
+                <w:top w:val="single" w:sz="3" w:space="0" w:color="D9E0E7"/>
+                <w:left w:val="single" w:sz="3" w:space="0" w:color="D9E0E7"/>
+                <w:bottom w:val="single" w:sz="3" w:space="0" w:color="D9E0E7"/>
+                <w:right w:val="single" w:sz="3" w:space="0" w:color="D9E0E7"/>
+              </w:tcBorders>
+              <w:shd w:fill="FFFFFF"/>
+            </w:tcPr>
+          </w:tcPr>
+          <w:p>
+            <w:r>
+              <w:t>حریم داده و mobile/offline</w:t>
+            </w:r>
+          </w:p>
+        </w:tc>
+        <w:tc>
+          <w:tcPr>
+            <w:tcPr>
+              <w:tcW w:type="dxa" w:w="3213"/>
+              <w:tcBorders>
+                <w:top w:val="single" w:sz="3" w:space="0" w:color="D9E0E7"/>
+                <w:left w:val="single" w:sz="3" w:space="0" w:color="D9E0E7"/>
+                <w:bottom w:val="single" w:sz="3" w:space="0" w:color="D9E0E7"/>
+                <w:right w:val="single" w:sz="3" w:space="0" w:color="D9E0E7"/>
+              </w:tcBorders>
+              <w:shd w:fill="FFFFFF"/>
+            </w:tcPr>
+          </w:tcPr>
+          <w:p>
+            <w:r>
+              <w:t>دادهٔ اندازه/آلرژی/تصویر و استفادهٔ set بدون شبکه، گیت product است. [F02-S01][F02-S09][F02-S10]</w:t>
+            </w:r>
+          </w:p>
+        </w:tc>
+        <w:tc>
+          <w:tcPr>
+            <w:tcPr>
+              <w:tcW w:type="dxa" w:w="3213"/>
+              <w:tcBorders>
+                <w:top w:val="single" w:sz="3" w:space="0" w:color="D9E0E7"/>
+                <w:left w:val="single" w:sz="3" w:space="0" w:color="D9E0E7"/>
+                <w:bottom w:val="single" w:sz="3" w:space="0" w:color="D9E0E7"/>
+                <w:right w:val="single" w:sz="3" w:space="0" w:color="D9E0E7"/>
+              </w:tcBorders>
+              <w:shd w:fill="FFFFFF"/>
+            </w:tcPr>
+          </w:tcPr>
+          <w:p>
+            <w:r>
+              <w:t>consent/role/retention و offline adoption باید در pilot اثبات شود؛ نه feature list فرضی.</w:t>
             </w:r>
           </w:p>
         </w:tc>
@@ -20154,6 +20901,15 @@
           <w:sz w:val="22"/>
         </w:rPr>
         <w:t>یک خبر محلی در ۱۴۰۴ به بیش از ۳۰ برنامه/سریال/رئالیتی‌شو شبکهٔ نمایش خانگی اشاره کرده است؛ این فقط signal عرضهٔ تولید است و برای اندازه‌گذاری بازار یا بودجه اعتبار کافی ندارد. [F02-S06] منبع شغلی داخلی نیز وظیفهٔ منشی صحنه در ثبت پیوستگی لباس/صحنه و همکاری با مسئول لباس را توضیح می‌دهد. [F02-S07]</w:t>
+      </w:r>
+    </w:p>
+    <w:p>
+      <w:pPr>
+        <w:spacing w:after="100" w:line="300" w:lineRule="auto"/>
+        <w:jc w:val="right"/>
+      </w:pPr>
+      <w:r>
+        <w:t>نتیجهٔ desk-research: production signal و نقش عملیاتی، شروع خوبی برای sampling هستند؛ اما نه تعداد پروژه‌های واجد wardrobe complexity، نه decision-maker و نه software budget را نشان نمی‌دهند. بنابراین TAM/SAM/SOM عمدی خالی مانده و account map شرط شروع financial model است.</w:t>
       </w:r>
     </w:p>
     <w:tbl>
@@ -21569,6 +22325,15 @@
     </w:p>
     <w:p>
       <w:pPr>
+        <w:spacing w:after="100" w:line="300" w:lineRule="auto"/>
+        <w:jc w:val="right"/>
+      </w:pPr>
+      <w:r>
+        <w:t>حداقل feasibility gate: role-based access، consent/retention برای اندازه، allergy و تصویر بازیگر، offline queue واقعی، export و audit trail باید پیش از pilot تعریف شوند. مواد ۵۸ و ۵۹ قانون تجارت الکترونیکی، پردازش برخی داده‌های حساس بدون رضایت صریح را غیرقانونی و در پردازش با رضایت، هدف روشن و حقوق دسترسی/اصلاح/حذف را مقرر می‌کنند؛ تفسیر اختصاصی و قرارداد محلی پیش از اجرا لازم است. [F02-S10]</w:t>
+      </w:r>
+    </w:p>
+    <w:p>
+      <w:pPr>
         <w:pStyle w:val="Heading2"/>
         <w:spacing w:before="200" w:after="120"/>
         <w:jc w:val="right"/>
@@ -22340,6 +23105,183 @@
                 <w:sz w:val="17"/>
               </w:rPr>
               <w:t>مسیر ایرانی، منشی صحنه — https://iranianpath.com/jobs/Secretary-scene/شغل-منشی-صحنه-درآمد-بازارکار-حقوق-استخدام2300.html</w:t>
+            </w:r>
+          </w:p>
+        </w:tc>
+      </w:tr>
+      <w:tr>
+        <w:tc>
+          <w:tcPr>
+            <w:tcPr>
+              <w:tcW w:type="dxa" w:w="3213"/>
+              <w:tcBorders>
+                <w:top w:val="single" w:sz="3" w:space="0" w:color="D9E0E7"/>
+                <w:left w:val="single" w:sz="3" w:space="0" w:color="D9E0E7"/>
+                <w:bottom w:val="single" w:sz="3" w:space="0" w:color="D9E0E7"/>
+                <w:right w:val="single" w:sz="3" w:space="0" w:color="D9E0E7"/>
+              </w:tcBorders>
+              <w:shd w:fill="FFFFFF"/>
+            </w:tcPr>
+          </w:tcPr>
+          <w:p>
+            <w:r>
+              <w:t>F02-S08</w:t>
+            </w:r>
+          </w:p>
+        </w:tc>
+        <w:tc>
+          <w:tcPr>
+            <w:tcPr>
+              <w:tcW w:type="dxa" w:w="3213"/>
+              <w:tcBorders>
+                <w:top w:val="single" w:sz="3" w:space="0" w:color="D9E0E7"/>
+                <w:left w:val="single" w:sz="3" w:space="0" w:color="D9E0E7"/>
+                <w:bottom w:val="single" w:sz="3" w:space="0" w:color="D9E0E7"/>
+                <w:right w:val="single" w:sz="3" w:space="0" w:color="D9E0E7"/>
+              </w:tcBorders>
+              <w:shd w:fill="FFFFFF"/>
+            </w:tcPr>
+          </w:tcPr>
+          <w:p>
+            <w:r>
+              <w:t>C / vendor</w:t>
+            </w:r>
+          </w:p>
+        </w:tc>
+        <w:tc>
+          <w:tcPr>
+            <w:tcPr>
+              <w:tcW w:type="dxa" w:w="3213"/>
+              <w:tcBorders>
+                <w:top w:val="single" w:sz="3" w:space="0" w:color="D9E0E7"/>
+                <w:left w:val="single" w:sz="3" w:space="0" w:color="D9E0E7"/>
+                <w:bottom w:val="single" w:sz="3" w:space="0" w:color="D9E0E7"/>
+                <w:right w:val="single" w:sz="3" w:space="0" w:color="D9E0E7"/>
+              </w:tcBorders>
+              <w:shd w:fill="FFFFFF"/>
+            </w:tcPr>
+          </w:tcPr>
+          <w:p>
+            <w:r>
+              <w:t>Dramatify Creative Production Platform — https://dramatify.com/creative-production-platform</w:t>
+            </w:r>
+          </w:p>
+        </w:tc>
+      </w:tr>
+      <w:tr>
+        <w:tc>
+          <w:tcPr>
+            <w:tcPr>
+              <w:tcW w:type="dxa" w:w="3213"/>
+              <w:tcBorders>
+                <w:top w:val="single" w:sz="3" w:space="0" w:color="D9E0E7"/>
+                <w:left w:val="single" w:sz="3" w:space="0" w:color="D9E0E7"/>
+                <w:bottom w:val="single" w:sz="3" w:space="0" w:color="D9E0E7"/>
+                <w:right w:val="single" w:sz="3" w:space="0" w:color="D9E0E7"/>
+              </w:tcBorders>
+              <w:shd w:fill="FFFFFF"/>
+            </w:tcPr>
+          </w:tcPr>
+          <w:p>
+            <w:r>
+              <w:t>F02-S09</w:t>
+            </w:r>
+          </w:p>
+        </w:tc>
+        <w:tc>
+          <w:tcPr>
+            <w:tcPr>
+              <w:tcW w:type="dxa" w:w="3213"/>
+              <w:tcBorders>
+                <w:top w:val="single" w:sz="3" w:space="0" w:color="D9E0E7"/>
+                <w:left w:val="single" w:sz="3" w:space="0" w:color="D9E0E7"/>
+                <w:bottom w:val="single" w:sz="3" w:space="0" w:color="D9E0E7"/>
+                <w:right w:val="single" w:sz="3" w:space="0" w:color="D9E0E7"/>
+              </w:tcBorders>
+              <w:shd w:fill="FFFFFF"/>
+            </w:tcPr>
+          </w:tcPr>
+          <w:p>
+            <w:r>
+              <w:t>C / vendor</w:t>
+            </w:r>
+          </w:p>
+        </w:tc>
+        <w:tc>
+          <w:tcPr>
+            <w:tcPr>
+              <w:tcW w:type="dxa" w:w="3213"/>
+              <w:tcBorders>
+                <w:top w:val="single" w:sz="3" w:space="0" w:color="D9E0E7"/>
+                <w:left w:val="single" w:sz="3" w:space="0" w:color="D9E0E7"/>
+                <w:bottom w:val="single" w:sz="3" w:space="0" w:color="D9E0E7"/>
+                <w:right w:val="single" w:sz="3" w:space="0" w:color="D9E0E7"/>
+              </w:tcBorders>
+              <w:shd w:fill="FFFFFF"/>
+            </w:tcPr>
+          </w:tcPr>
+          <w:p>
+            <w:r>
+              <w:t>Ready4Set Product / FAQ — https://ready4set.com/</w:t>
+            </w:r>
+          </w:p>
+        </w:tc>
+      </w:tr>
+      <w:tr>
+        <w:tc>
+          <w:tcPr>
+            <w:tcPr>
+              <w:tcW w:type="dxa" w:w="3213"/>
+              <w:tcBorders>
+                <w:top w:val="single" w:sz="3" w:space="0" w:color="D9E0E7"/>
+                <w:left w:val="single" w:sz="3" w:space="0" w:color="D9E0E7"/>
+                <w:bottom w:val="single" w:sz="3" w:space="0" w:color="D9E0E7"/>
+                <w:right w:val="single" w:sz="3" w:space="0" w:color="D9E0E7"/>
+              </w:tcBorders>
+              <w:shd w:fill="FFFFFF"/>
+            </w:tcPr>
+          </w:tcPr>
+          <w:p>
+            <w:r>
+              <w:t>F02-S10</w:t>
+            </w:r>
+          </w:p>
+        </w:tc>
+        <w:tc>
+          <w:tcPr>
+            <w:tcPr>
+              <w:tcW w:type="dxa" w:w="3213"/>
+              <w:tcBorders>
+                <w:top w:val="single" w:sz="3" w:space="0" w:color="D9E0E7"/>
+                <w:left w:val="single" w:sz="3" w:space="0" w:color="D9E0E7"/>
+                <w:bottom w:val="single" w:sz="3" w:space="0" w:color="D9E0E7"/>
+                <w:right w:val="single" w:sz="3" w:space="0" w:color="D9E0E7"/>
+              </w:tcBorders>
+              <w:shd w:fill="FFFFFF"/>
+            </w:tcPr>
+          </w:tcPr>
+          <w:p>
+            <w:r>
+              <w:t>A / متن قانون رسمی منتشرشده</w:t>
+            </w:r>
+          </w:p>
+        </w:tc>
+        <w:tc>
+          <w:tcPr>
+            <w:tcPr>
+              <w:tcW w:type="dxa" w:w="3213"/>
+              <w:tcBorders>
+                <w:top w:val="single" w:sz="3" w:space="0" w:color="D9E0E7"/>
+                <w:left w:val="single" w:sz="3" w:space="0" w:color="D9E0E7"/>
+                <w:bottom w:val="single" w:sz="3" w:space="0" w:color="D9E0E7"/>
+                <w:right w:val="single" w:sz="3" w:space="0" w:color="D9E0E7"/>
+              </w:tcBorders>
+              <w:shd w:fill="FFFFFF"/>
+            </w:tcPr>
+          </w:tcPr>
+          <w:p>
+            <w:r>
+              <w:t>پلیس فتا، قانون تجارت الکترونیکی مواد ۵۸ و ۵۹ — https://www.cyberpolice.ir/page/2581</w:t>
             </w:r>
           </w:p>
         </w:tc>

</xml_diff>

<commit_message>
Deepen desk research for F-03 to F-07
</commit_message>
<xml_diff>
--- a/reports/fashion_market_research_master_v0.docx
+++ b/reports/fashion_market_research_master_v0.docx
@@ -47,7 +47,7 @@
               <w:br/>
               <w:br/>
               <w:br/>
-              <w:t>نسخهٔ ۰٫۸ | سند زنده و محرمانه</w:t>
+              <w:t>نسخهٔ ۰٫۹ | سند زنده و محرمانه</w:t>
               <w:br/>
               <w:t>۱۲ مهر ۱۴۰۵  |  ۴ اکتبر ۲۰۲۶</w:t>
               <w:br/>
@@ -362,7 +362,7 @@
               <w:jc w:val="right"/>
             </w:pPr>
             <w:r>
-              <w:t>۰٫۸ — بازبینی واقعی desk-research F-01 و F-02 با منابع رسمی جهانی/ایران و گیت حقوقی/عملیاتی افزوده شد؛ وضعیت‌های تصمیم تغییری نکرده‌اند.</w:t>
+              <w:t>۰٫۹ — بازبینی واقعی desk-research F-01 تا F-07 با منابع رسمی/محلی، limitation و گیت‌های تصمیم تکمیل‌تر شد؛ وضعیت‌های تصمیم تغییری نکرده‌اند.</w:t>
             </w:r>
           </w:p>
         </w:tc>
@@ -629,7 +629,7 @@
               <w:jc w:val="right"/>
             </w:pPr>
             <w:r>
-              <w:t>یادداشت اعتبار نسخهٔ ۰٫۸</w:t>
+              <w:t>یادداشت اعتبار نسخهٔ ۰٫۹</w:t>
             </w:r>
           </w:p>
           <w:p>
@@ -2890,7 +2890,7 @@
               <w:jc w:val="right"/>
             </w:pPr>
             <w:r>
-              <w:t>هیچ نمودار اندازهٔ بازار، سهم بازار، درآمد یا رضایت با دادهٔ نمونه یا عدد بی‌منبع وارد این گزارش نمی‌شود. نمودارهای نسخهٔ ۰٫۸ فقط وضعیت واقعی برنامهٔ پژوهش را نمایش می‌دهند. نمودارهای هر پرونده پس از ثبت منبع، تعریف، واحد و روش ایجاد می‌شوند.</w:t>
+              <w:t>هیچ نمودار اندازهٔ بازار، سهم بازار، درآمد یا رضایت با دادهٔ نمونه یا عدد بی‌منبع وارد این گزارش نمی‌شود. نمودارهای نسخهٔ ۰٫۹ فقط وضعیت واقعی برنامهٔ پژوهش را نمایش می‌دهند. نمودارهای هر پرونده پس از ثبت منبع، تعریف، واحد و روش ایجاد می‌شوند.</w:t>
             </w:r>
           </w:p>
         </w:tc>
@@ -15791,6 +15791,108 @@
           </w:p>
         </w:tc>
       </w:tr>
+      <w:tr>
+        <w:tc>
+          <w:tcPr>
+            <w:tcPr>
+              <w:tcPr>
+                <w:tcPr>
+                  <w:tcPr>
+                    <w:tcW w:type="dxa" w:w="2409"/>
+                    <w:tcBorders>
+                      <w:top w:val="single" w:sz="3" w:space="0" w:color="D9E0E7"/>
+                      <w:left w:val="single" w:sz="3" w:space="0" w:color="D9E0E7"/>
+                      <w:bottom w:val="single" w:sz="3" w:space="0" w:color="D9E0E7"/>
+                      <w:right w:val="single" w:sz="3" w:space="0" w:color="D9E0E7"/>
+                    </w:tcBorders>
+                    <w:shd w:fill="FFFFFF"/>
+                  </w:tcPr>
+                </w:tcPr>
+              </w:tcPr>
+            </w:tcPr>
+          </w:tcPr>
+          <w:p>
+            <w:r>
+              <w:t>۰٫۹</w:t>
+            </w:r>
+          </w:p>
+        </w:tc>
+        <w:tc>
+          <w:tcPr>
+            <w:tcPr>
+              <w:tcPr>
+                <w:tcPr>
+                  <w:tcPr>
+                    <w:tcW w:type="dxa" w:w="2409"/>
+                    <w:tcBorders>
+                      <w:top w:val="single" w:sz="3" w:space="0" w:color="D9E0E7"/>
+                      <w:left w:val="single" w:sz="3" w:space="0" w:color="D9E0E7"/>
+                      <w:bottom w:val="single" w:sz="3" w:space="0" w:color="D9E0E7"/>
+                      <w:right w:val="single" w:sz="3" w:space="0" w:color="D9E0E7"/>
+                    </w:tcBorders>
+                    <w:shd w:fill="FFFFFF"/>
+                  </w:tcPr>
+                </w:tcPr>
+              </w:tcPr>
+            </w:tcPr>
+          </w:tcPr>
+          <w:p>
+            <w:r>
+              <w:t>۱۲ مهر ۱۴۰۵</w:t>
+            </w:r>
+          </w:p>
+        </w:tc>
+        <w:tc>
+          <w:tcPr>
+            <w:tcPr>
+              <w:tcPr>
+                <w:tcPr>
+                  <w:tcPr>
+                    <w:tcW w:type="dxa" w:w="2409"/>
+                    <w:tcBorders>
+                      <w:top w:val="single" w:sz="3" w:space="0" w:color="D9E0E7"/>
+                      <w:left w:val="single" w:sz="3" w:space="0" w:color="D9E0E7"/>
+                      <w:bottom w:val="single" w:sz="3" w:space="0" w:color="D9E0E7"/>
+                      <w:right w:val="single" w:sz="3" w:space="0" w:color="D9E0E7"/>
+                    </w:tcBorders>
+                    <w:shd w:fill="FFFFFF"/>
+                  </w:tcPr>
+                </w:tcPr>
+              </w:tcPr>
+            </w:tcPr>
+          </w:tcPr>
+          <w:p>
+            <w:r>
+              <w:t>F-03 تا F-07: بازبینی واقعی benchmarkهای رسمی، source ledger و counter-thesis/limitation؛ بدون تغییر status و بدون ادعای primary research.</w:t>
+            </w:r>
+          </w:p>
+        </w:tc>
+        <w:tc>
+          <w:tcPr>
+            <w:tcPr>
+              <w:tcPr>
+                <w:tcPr>
+                  <w:tcPr>
+                    <w:tcW w:type="dxa" w:w="2409"/>
+                    <w:tcBorders>
+                      <w:top w:val="single" w:sz="3" w:space="0" w:color="D9E0E7"/>
+                      <w:left w:val="single" w:sz="3" w:space="0" w:color="D9E0E7"/>
+                      <w:bottom w:val="single" w:sz="3" w:space="0" w:color="D9E0E7"/>
+                      <w:right w:val="single" w:sz="3" w:space="0" w:color="D9E0E7"/>
+                    </w:tcBorders>
+                    <w:shd w:fill="FFFFFF"/>
+                  </w:tcPr>
+                </w:tcPr>
+              </w:tcPr>
+            </w:tcPr>
+          </w:tcPr>
+          <w:p>
+            <w:r>
+              <w:t>منتشرشده</w:t>
+            </w:r>
+          </w:p>
+        </w:tc>
+      </w:tr>
     </w:tbl>
     <w:p/>
     <w:tbl>
@@ -24342,6 +24444,15 @@
     </w:p>
     <w:p>
       <w:pPr>
+        <w:spacing w:after="100" w:line="300" w:lineRule="auto"/>
+        <w:jc w:val="right"/>
+      </w:pPr>
+      <w:r>
+        <w:t>بازبینی جدید Techpacker و Uphance، current-version، BOM/POM، supplier collaboration، approval و release را با منابع رسمی دقیق‌تر مستند کرد. قیمت‌های منتشرشدهٔ Techpacker فقط مدل قیمت خارجی‌اند و به ایران تبدیل یا برای forecast استفاده نشده‌اند. [F03-S13–S15]</w:t>
+      </w:r>
+    </w:p>
+    <w:p>
+      <w:pPr>
         <w:pStyle w:val="Heading2"/>
         <w:spacing w:before="200" w:after="120"/>
         <w:jc w:val="right"/>
@@ -27068,6 +27179,183 @@
           </w:p>
         </w:tc>
       </w:tr>
+      <w:tr>
+        <w:tc>
+          <w:tcPr>
+            <w:tcPr>
+              <w:tcW w:type="dxa" w:w="3213"/>
+              <w:tcBorders>
+                <w:top w:val="single" w:sz="3" w:space="0" w:color="D9E0E7"/>
+                <w:left w:val="single" w:sz="3" w:space="0" w:color="D9E0E7"/>
+                <w:bottom w:val="single" w:sz="3" w:space="0" w:color="D9E0E7"/>
+                <w:right w:val="single" w:sz="3" w:space="0" w:color="D9E0E7"/>
+              </w:tcBorders>
+              <w:shd w:fill="FFFFFF"/>
+            </w:tcPr>
+          </w:tcPr>
+          <w:p>
+            <w:r>
+              <w:t>F03-S13</w:t>
+            </w:r>
+          </w:p>
+        </w:tc>
+        <w:tc>
+          <w:tcPr>
+            <w:tcPr>
+              <w:tcW w:type="dxa" w:w="3213"/>
+              <w:tcBorders>
+                <w:top w:val="single" w:sz="3" w:space="0" w:color="D9E0E7"/>
+                <w:left w:val="single" w:sz="3" w:space="0" w:color="D9E0E7"/>
+                <w:bottom w:val="single" w:sz="3" w:space="0" w:color="D9E0E7"/>
+                <w:right w:val="single" w:sz="3" w:space="0" w:color="D9E0E7"/>
+              </w:tcBorders>
+              <w:shd w:fill="FFFFFF"/>
+            </w:tcPr>
+          </w:tcPr>
+          <w:p>
+            <w:r>
+              <w:t>C / vendor documentation</w:t>
+            </w:r>
+          </w:p>
+        </w:tc>
+        <w:tc>
+          <w:tcPr>
+            <w:tcPr>
+              <w:tcW w:type="dxa" w:w="3213"/>
+              <w:tcBorders>
+                <w:top w:val="single" w:sz="3" w:space="0" w:color="D9E0E7"/>
+                <w:left w:val="single" w:sz="3" w:space="0" w:color="D9E0E7"/>
+                <w:bottom w:val="single" w:sz="3" w:space="0" w:color="D9E0E7"/>
+                <w:right w:val="single" w:sz="3" w:space="0" w:color="D9E0E7"/>
+              </w:tcBorders>
+              <w:shd w:fill="FFFFFF"/>
+            </w:tcPr>
+          </w:tcPr>
+          <w:p>
+            <w:r>
+              <w:t>Techpacker Help Center — https://helpcenter.techpacker.com/hc/en-us/articles/360016021274-What-is-Techpacker-</w:t>
+            </w:r>
+          </w:p>
+        </w:tc>
+      </w:tr>
+      <w:tr>
+        <w:tc>
+          <w:tcPr>
+            <w:tcPr>
+              <w:tcW w:type="dxa" w:w="3213"/>
+              <w:tcBorders>
+                <w:top w:val="single" w:sz="3" w:space="0" w:color="D9E0E7"/>
+                <w:left w:val="single" w:sz="3" w:space="0" w:color="D9E0E7"/>
+                <w:bottom w:val="single" w:sz="3" w:space="0" w:color="D9E0E7"/>
+                <w:right w:val="single" w:sz="3" w:space="0" w:color="D9E0E7"/>
+              </w:tcBorders>
+              <w:shd w:fill="FFFFFF"/>
+            </w:tcPr>
+          </w:tcPr>
+          <w:p>
+            <w:r>
+              <w:t>F03-S14</w:t>
+            </w:r>
+          </w:p>
+        </w:tc>
+        <w:tc>
+          <w:tcPr>
+            <w:tcPr>
+              <w:tcW w:type="dxa" w:w="3213"/>
+              <w:tcBorders>
+                <w:top w:val="single" w:sz="3" w:space="0" w:color="D9E0E7"/>
+                <w:left w:val="single" w:sz="3" w:space="0" w:color="D9E0E7"/>
+                <w:bottom w:val="single" w:sz="3" w:space="0" w:color="D9E0E7"/>
+                <w:right w:val="single" w:sz="3" w:space="0" w:color="D9E0E7"/>
+              </w:tcBorders>
+              <w:shd w:fill="FFFFFF"/>
+            </w:tcPr>
+          </w:tcPr>
+          <w:p>
+            <w:r>
+              <w:t>C / vendor pricing</w:t>
+            </w:r>
+          </w:p>
+        </w:tc>
+        <w:tc>
+          <w:tcPr>
+            <w:tcPr>
+              <w:tcW w:type="dxa" w:w="3213"/>
+              <w:tcBorders>
+                <w:top w:val="single" w:sz="3" w:space="0" w:color="D9E0E7"/>
+                <w:left w:val="single" w:sz="3" w:space="0" w:color="D9E0E7"/>
+                <w:bottom w:val="single" w:sz="3" w:space="0" w:color="D9E0E7"/>
+                <w:right w:val="single" w:sz="3" w:space="0" w:color="D9E0E7"/>
+              </w:tcBorders>
+              <w:shd w:fill="FFFFFF"/>
+            </w:tcPr>
+          </w:tcPr>
+          <w:p>
+            <w:r>
+              <w:t>Techpacker Pricing — https://techpacker.com/pricing/</w:t>
+            </w:r>
+          </w:p>
+        </w:tc>
+      </w:tr>
+      <w:tr>
+        <w:tc>
+          <w:tcPr>
+            <w:tcPr>
+              <w:tcW w:type="dxa" w:w="3213"/>
+              <w:tcBorders>
+                <w:top w:val="single" w:sz="3" w:space="0" w:color="D9E0E7"/>
+                <w:left w:val="single" w:sz="3" w:space="0" w:color="D9E0E7"/>
+                <w:bottom w:val="single" w:sz="3" w:space="0" w:color="D9E0E7"/>
+                <w:right w:val="single" w:sz="3" w:space="0" w:color="D9E0E7"/>
+              </w:tcBorders>
+              <w:shd w:fill="FFFFFF"/>
+            </w:tcPr>
+          </w:tcPr>
+          <w:p>
+            <w:r>
+              <w:t>F03-S15</w:t>
+            </w:r>
+          </w:p>
+        </w:tc>
+        <w:tc>
+          <w:tcPr>
+            <w:tcPr>
+              <w:tcW w:type="dxa" w:w="3213"/>
+              <w:tcBorders>
+                <w:top w:val="single" w:sz="3" w:space="0" w:color="D9E0E7"/>
+                <w:left w:val="single" w:sz="3" w:space="0" w:color="D9E0E7"/>
+                <w:bottom w:val="single" w:sz="3" w:space="0" w:color="D9E0E7"/>
+                <w:right w:val="single" w:sz="3" w:space="0" w:color="D9E0E7"/>
+              </w:tcBorders>
+              <w:shd w:fill="FFFFFF"/>
+            </w:tcPr>
+          </w:tcPr>
+          <w:p>
+            <w:r>
+              <w:t>C / vendor</w:t>
+            </w:r>
+          </w:p>
+        </w:tc>
+        <w:tc>
+          <w:tcPr>
+            <w:tcPr>
+              <w:tcW w:type="dxa" w:w="3213"/>
+              <w:tcBorders>
+                <w:top w:val="single" w:sz="3" w:space="0" w:color="D9E0E7"/>
+                <w:left w:val="single" w:sz="3" w:space="0" w:color="D9E0E7"/>
+                <w:bottom w:val="single" w:sz="3" w:space="0" w:color="D9E0E7"/>
+                <w:right w:val="single" w:sz="3" w:space="0" w:color="D9E0E7"/>
+              </w:tcBorders>
+              <w:shd w:fill="FFFFFF"/>
+            </w:tcPr>
+          </w:tcPr>
+          <w:p>
+            <w:r>
+              <w:t>Uphance, Mastering the Tech Pack — https://www.uphance.com/insights/mastering-tech-pack/</w:t>
+            </w:r>
+          </w:p>
+        </w:tc>
+      </w:tr>
     </w:tbl>
     <w:p/>
     <w:p>
@@ -28267,6 +28555,15 @@
           <w:sz w:val="22"/>
         </w:rPr>
         <w:t>LegitApp، عکس هدایت‌شده، تحلیل AI همراه با دست‌کم دو expert و گواهی دیجیتال را عرضه می‌کند؛ وب‌سایت آن از ۲٫۵ میلیون+ کاربر و ۳ میلیون+ case و قیمت sneaker از ۳ دلار می‌گوید. همهٔ اعداد scale/accuracy، ادعای فروشنده‌اند. [F04-S01][F04-S02] CheckCheck نیز review دو authenticator مستقل، COA دیجیتال و قیمت شروع ۶ دلار را اعلام می‌کند. [F04-S03] این‌ها category proof برای مدل B2C per-case هستند، نه شاهد تقاضا یا قیمت ایران.</w:t>
+      </w:r>
+    </w:p>
+    <w:p>
+      <w:pPr>
+        <w:spacing w:after="100" w:line="300" w:lineRule="auto"/>
+        <w:jc w:val="right"/>
+      </w:pPr>
+      <w:r>
+        <w:t>بازبینی رسمی LegitApp، limitation مهم photo-first را روشن می‌کند: نتیجه بر مبنای عکس‌های ارسال‌شده است و ممکن است عکس اضافه یا verdict inconclusive لازم شود. بنابراین claim دقت فروشنده، معادل quality system ایران یا guarantee حقوقی نیست. [F04-S10]</w:t>
       </w:r>
     </w:p>
     <w:tbl>
@@ -30938,6 +31235,65 @@
           </w:p>
         </w:tc>
       </w:tr>
+      <w:tr>
+        <w:tc>
+          <w:tcPr>
+            <w:tcPr>
+              <w:tcW w:type="dxa" w:w="3213"/>
+              <w:tcBorders>
+                <w:top w:val="single" w:sz="3" w:space="0" w:color="D9E0E7"/>
+                <w:left w:val="single" w:sz="3" w:space="0" w:color="D9E0E7"/>
+                <w:bottom w:val="single" w:sz="3" w:space="0" w:color="D9E0E7"/>
+                <w:right w:val="single" w:sz="3" w:space="0" w:color="D9E0E7"/>
+              </w:tcBorders>
+              <w:shd w:fill="FFFFFF"/>
+            </w:tcPr>
+          </w:tcPr>
+          <w:p>
+            <w:r>
+              <w:t>F04-S10</w:t>
+            </w:r>
+          </w:p>
+        </w:tc>
+        <w:tc>
+          <w:tcPr>
+            <w:tcPr>
+              <w:tcW w:type="dxa" w:w="3213"/>
+              <w:tcBorders>
+                <w:top w:val="single" w:sz="3" w:space="0" w:color="D9E0E7"/>
+                <w:left w:val="single" w:sz="3" w:space="0" w:color="D9E0E7"/>
+                <w:bottom w:val="single" w:sz="3" w:space="0" w:color="D9E0E7"/>
+                <w:right w:val="single" w:sz="3" w:space="0" w:color="D9E0E7"/>
+              </w:tcBorders>
+              <w:shd w:fill="FFFFFF"/>
+            </w:tcPr>
+          </w:tcPr>
+          <w:p>
+            <w:r>
+              <w:t>C / vendor</w:t>
+            </w:r>
+          </w:p>
+        </w:tc>
+        <w:tc>
+          <w:tcPr>
+            <w:tcPr>
+              <w:tcW w:type="dxa" w:w="3213"/>
+              <w:tcBorders>
+                <w:top w:val="single" w:sz="3" w:space="0" w:color="D9E0E7"/>
+                <w:left w:val="single" w:sz="3" w:space="0" w:color="D9E0E7"/>
+                <w:bottom w:val="single" w:sz="3" w:space="0" w:color="D9E0E7"/>
+                <w:right w:val="single" w:sz="3" w:space="0" w:color="D9E0E7"/>
+              </w:tcBorders>
+              <w:shd w:fill="FFFFFF"/>
+            </w:tcPr>
+          </w:tcPr>
+          <w:p>
+            <w:r>
+              <w:t>LegitApp Sneaker Authentication + FAQ — https://legitapp.com/what-we-authenticate/category/sneakers</w:t>
+            </w:r>
+          </w:p>
+        </w:tc>
+      </w:tr>
     </w:tbl>
     <w:p/>
     <w:p>
@@ -31419,6 +31775,15 @@
           <w:sz w:val="22"/>
         </w:rPr>
         <w:t>YOOBIC در use case Visual Merchandising، mission، guideline تصویری، checklist، photo proof، annotation/approval و real-time visibility ستاد را عرضه می‌کند. [F05-S01] case studyهای Lacoste و Longchamp مسیر communication → learning → task → photo validation را نشان می‌دهند؛ هر metric اعلام‌شده vendor-reported است. [F05-S02][F05-S03] نتیجه: مسئله و category واقعی‌اند، اما وجود category جهانی به معنی فرصت محلیِ بدون رقابت نیست.</w:t>
+      </w:r>
+    </w:p>
+    <w:p>
+      <w:pPr>
+        <w:spacing w:after="100" w:line="300" w:lineRule="auto"/>
+        <w:jc w:val="right"/>
+      </w:pPr>
+      <w:r>
+        <w:t>بازبینی صفحهٔ fashion/luxury رسمی YOOBIC، guideline → role/task → photo proof → feedback → dashboard را تأیید کرد؛ همین بستهٔ کامل، overlap F-05 با task/photo/approval/reporting local را تقویت می‌کند، نه thesis ورود را. benefitها vendor claim هستند. [F05-S09]</w:t>
       </w:r>
     </w:p>
     <w:tbl>
@@ -34098,6 +34463,65 @@
                 <w:sz w:val="17"/>
               </w:rPr>
               <w:t>همکاران سیستم، فروشگاه زنجیره‌ای — https://www.systemgroup.net/knowledge-network/all-about-chainstore/</w:t>
+            </w:r>
+          </w:p>
+        </w:tc>
+      </w:tr>
+      <w:tr>
+        <w:tc>
+          <w:tcPr>
+            <w:tcPr>
+              <w:tcW w:type="dxa" w:w="3213"/>
+              <w:tcBorders>
+                <w:top w:val="single" w:sz="3" w:space="0" w:color="D9E0E7"/>
+                <w:left w:val="single" w:sz="3" w:space="0" w:color="D9E0E7"/>
+                <w:bottom w:val="single" w:sz="3" w:space="0" w:color="D9E0E7"/>
+                <w:right w:val="single" w:sz="3" w:space="0" w:color="D9E0E7"/>
+              </w:tcBorders>
+              <w:shd w:fill="FFFFFF"/>
+            </w:tcPr>
+          </w:tcPr>
+          <w:p>
+            <w:r>
+              <w:t>F05-S09</w:t>
+            </w:r>
+          </w:p>
+        </w:tc>
+        <w:tc>
+          <w:tcPr>
+            <w:tcPr>
+              <w:tcW w:type="dxa" w:w="3213"/>
+              <w:tcBorders>
+                <w:top w:val="single" w:sz="3" w:space="0" w:color="D9E0E7"/>
+                <w:left w:val="single" w:sz="3" w:space="0" w:color="D9E0E7"/>
+                <w:bottom w:val="single" w:sz="3" w:space="0" w:color="D9E0E7"/>
+                <w:right w:val="single" w:sz="3" w:space="0" w:color="D9E0E7"/>
+              </w:tcBorders>
+              <w:shd w:fill="FFFFFF"/>
+            </w:tcPr>
+          </w:tcPr>
+          <w:p>
+            <w:r>
+              <w:t>C / vendor</w:t>
+            </w:r>
+          </w:p>
+        </w:tc>
+        <w:tc>
+          <w:tcPr>
+            <w:tcPr>
+              <w:tcW w:type="dxa" w:w="3213"/>
+              <w:tcBorders>
+                <w:top w:val="single" w:sz="3" w:space="0" w:color="D9E0E7"/>
+                <w:left w:val="single" w:sz="3" w:space="0" w:color="D9E0E7"/>
+                <w:bottom w:val="single" w:sz="3" w:space="0" w:color="D9E0E7"/>
+                <w:right w:val="single" w:sz="3" w:space="0" w:color="D9E0E7"/>
+              </w:tcBorders>
+              <w:shd w:fill="FFFFFF"/>
+            </w:tcPr>
+          </w:tcPr>
+          <w:p>
+            <w:r>
+              <w:t>YOOBIC Fashion &amp; Luxury — https://yoobic.com/industries/fashion/</w:t>
             </w:r>
           </w:p>
         </w:tc>
@@ -35684,6 +36108,15 @@
           <w:sz w:val="22"/>
         </w:rPr>
         <w:t>Axiell Collections طبق Collections Trust، audit trail، workflow loan، task، barcode-based location update، media ingest، rights و انتشار آنلاین را پوشش می‌دهد. [F06-S01] همان مرجع، Object Entry/Exit، acquisition، location/movement control، loans in/out، condition assessment، conservation، valuation/insurance و damage/loss را در procedureهای پوشش‌داده‌شده می‌آورد. [F06-S02] eHive و دیگر CMSهای موزه‌ای نیز location، condition report و loan management را در category عرضه می‌کنند. [F06-S03] این‌ها category proof هستند، نه شاهد تقاضا در ایران.</w:t>
+      </w:r>
+    </w:p>
+    <w:p>
+      <w:pPr>
+        <w:spacing w:after="100" w:line="300" w:lineRule="auto"/>
+        <w:jc w:val="right"/>
+      </w:pPr>
+      <w:r>
+        <w:t>بازبینی رسمی EMu/Axiell، loan/movement را با borrower، approval، contract، insurance، transport، condition/conservation و rights در یک CMS واحد توضیح می‌دهد. این گستره standards/procurement پیچیدگی category و دلیل رد F-06 را تقویت می‌کند. [F06-S08]</w:t>
       </w:r>
     </w:p>
     <w:tbl>
@@ -37966,6 +38399,65 @@
           </w:p>
         </w:tc>
       </w:tr>
+      <w:tr>
+        <w:tc>
+          <w:tcPr>
+            <w:tcPr>
+              <w:tcW w:type="dxa" w:w="1191"/>
+              <w:tcBorders>
+                <w:top w:val="single" w:sz="3" w:space="0" w:color="D9E0E7"/>
+                <w:left w:val="single" w:sz="3" w:space="0" w:color="D9E0E7"/>
+                <w:bottom w:val="single" w:sz="3" w:space="0" w:color="D9E0E7"/>
+                <w:right w:val="single" w:sz="3" w:space="0" w:color="D9E0E7"/>
+              </w:tcBorders>
+              <w:shd w:fill="FFFFFF"/>
+            </w:tcPr>
+          </w:tcPr>
+          <w:p>
+            <w:r>
+              <w:t>F06-S08</w:t>
+            </w:r>
+          </w:p>
+        </w:tc>
+        <w:tc>
+          <w:tcPr>
+            <w:tcPr>
+              <w:tcW w:type="dxa" w:w="1531"/>
+              <w:tcBorders>
+                <w:top w:val="single" w:sz="3" w:space="0" w:color="D9E0E7"/>
+                <w:left w:val="single" w:sz="3" w:space="0" w:color="D9E0E7"/>
+                <w:bottom w:val="single" w:sz="3" w:space="0" w:color="D9E0E7"/>
+                <w:right w:val="single" w:sz="3" w:space="0" w:color="D9E0E7"/>
+              </w:tcBorders>
+              <w:shd w:fill="FFFFFF"/>
+            </w:tcPr>
+          </w:tcPr>
+          <w:p>
+            <w:r>
+              <w:t>C / vendor documentation</w:t>
+            </w:r>
+          </w:p>
+        </w:tc>
+        <w:tc>
+          <w:tcPr>
+            <w:tcPr>
+              <w:tcW w:type="dxa" w:w="7143"/>
+              <w:tcBorders>
+                <w:top w:val="single" w:sz="3" w:space="0" w:color="D9E0E7"/>
+                <w:left w:val="single" w:sz="3" w:space="0" w:color="D9E0E7"/>
+                <w:bottom w:val="single" w:sz="3" w:space="0" w:color="D9E0E7"/>
+                <w:right w:val="single" w:sz="3" w:space="0" w:color="D9E0E7"/>
+              </w:tcBorders>
+              <w:shd w:fill="FFFFFF"/>
+            </w:tcPr>
+          </w:tcPr>
+          <w:p>
+            <w:r>
+              <w:t>Axiell EMu Collections Management — https://help.emu.axiell.com/v6.5/en/Topics/EMu/Collections%20Management.htm</w:t>
+            </w:r>
+          </w:p>
+        </w:tc>
+      </w:tr>
     </w:tbl>
     <w:p/>
     <w:p>
@@ -38982,6 +39474,15 @@
         <w:t>Covet Fashion در Google Play ۵۰M+ download، challenge، competition، رأی و virtual-currency IAP را نمایش می‌دهد. [F07-S01] SuitU در App Store، customization، competition/voting، feed، chat/social، OOTD sharing و disclosureهای IAP/UGC/loot box را معرفی می‌کند. [F07-S02] Nikki category را با story، collection و dress-up ادامه‌دار نشان می‌دهد. [F07-S03][F07-S04] این‌ها category proof هستند؛ دانلود/درآمد/مقیاس آنها به ایران تعمیم داده نمی‌شود.</w:t>
       </w:r>
     </w:p>
+    <w:p>
+      <w:pPr>
+        <w:spacing w:after="100" w:line="300" w:lineRule="auto"/>
+        <w:jc w:val="right"/>
+      </w:pPr>
+      <w:r>
+        <w:t>بازبینی Google Play، Covet و SuitU را با challenge، voting، social/community، interaction و IAP تأیید می‌کند؛ Myket نیز دسترسی محلی Love Nikki را نشان می‌دهد. این‌ها category/distribution signal هستند، نه retention، payer conversion یا market-size ایران. [F07-S09–S11]</w:t>
+      </w:r>
+    </w:p>
     <w:tbl>
       <w:tblPr>
         <w:bidiVisual w:val="1"/>
@@ -41243,6 +41744,183 @@
                 <w:sz w:val="17"/>
               </w:rPr>
               <w:t>Myket — Fashion Quest: https://myket.ir/app/com.bravestars.fashion.quest.dress.up</w:t>
+            </w:r>
+          </w:p>
+        </w:tc>
+      </w:tr>
+      <w:tr>
+        <w:tc>
+          <w:tcPr>
+            <w:tcPr>
+              <w:tcW w:type="dxa" w:w="1191"/>
+              <w:tcBorders>
+                <w:top w:val="single" w:sz="3" w:space="0" w:color="D9E0E7"/>
+                <w:left w:val="single" w:sz="3" w:space="0" w:color="D9E0E7"/>
+                <w:bottom w:val="single" w:sz="3" w:space="0" w:color="D9E0E7"/>
+                <w:right w:val="single" w:sz="3" w:space="0" w:color="D9E0E7"/>
+              </w:tcBorders>
+              <w:shd w:fill="FFFFFF"/>
+            </w:tcPr>
+          </w:tcPr>
+          <w:p>
+            <w:r>
+              <w:t>F07-S09</w:t>
+            </w:r>
+          </w:p>
+        </w:tc>
+        <w:tc>
+          <w:tcPr>
+            <w:tcPr>
+              <w:tcW w:type="dxa" w:w="1531"/>
+              <w:tcBorders>
+                <w:top w:val="single" w:sz="3" w:space="0" w:color="D9E0E7"/>
+                <w:left w:val="single" w:sz="3" w:space="0" w:color="D9E0E7"/>
+                <w:bottom w:val="single" w:sz="3" w:space="0" w:color="D9E0E7"/>
+                <w:right w:val="single" w:sz="3" w:space="0" w:color="D9E0E7"/>
+              </w:tcBorders>
+              <w:shd w:fill="FFFFFF"/>
+            </w:tcPr>
+          </w:tcPr>
+          <w:p>
+            <w:r>
+              <w:t>B / app-store listing</w:t>
+            </w:r>
+          </w:p>
+        </w:tc>
+        <w:tc>
+          <w:tcPr>
+            <w:tcPr>
+              <w:tcW w:type="dxa" w:w="7143"/>
+              <w:tcBorders>
+                <w:top w:val="single" w:sz="3" w:space="0" w:color="D9E0E7"/>
+                <w:left w:val="single" w:sz="3" w:space="0" w:color="D9E0E7"/>
+                <w:bottom w:val="single" w:sz="3" w:space="0" w:color="D9E0E7"/>
+                <w:right w:val="single" w:sz="3" w:space="0" w:color="D9E0E7"/>
+              </w:tcBorders>
+              <w:shd w:fill="FFFFFF"/>
+            </w:tcPr>
+          </w:tcPr>
+          <w:p>
+            <w:r>
+              <w:t>Google Play, Covet Fashion — https://play.google.com/store/apps/details?id=com.crowdstar.covetfashion&amp;hl=en</w:t>
+            </w:r>
+          </w:p>
+        </w:tc>
+      </w:tr>
+      <w:tr>
+        <w:tc>
+          <w:tcPr>
+            <w:tcPr>
+              <w:tcW w:type="dxa" w:w="1191"/>
+              <w:tcBorders>
+                <w:top w:val="single" w:sz="3" w:space="0" w:color="D9E0E7"/>
+                <w:left w:val="single" w:sz="3" w:space="0" w:color="D9E0E7"/>
+                <w:bottom w:val="single" w:sz="3" w:space="0" w:color="D9E0E7"/>
+                <w:right w:val="single" w:sz="3" w:space="0" w:color="D9E0E7"/>
+              </w:tcBorders>
+              <w:shd w:fill="FFFFFF"/>
+            </w:tcPr>
+          </w:tcPr>
+          <w:p>
+            <w:r>
+              <w:t>F07-S10</w:t>
+            </w:r>
+          </w:p>
+        </w:tc>
+        <w:tc>
+          <w:tcPr>
+            <w:tcPr>
+              <w:tcW w:type="dxa" w:w="1531"/>
+              <w:tcBorders>
+                <w:top w:val="single" w:sz="3" w:space="0" w:color="D9E0E7"/>
+                <w:left w:val="single" w:sz="3" w:space="0" w:color="D9E0E7"/>
+                <w:bottom w:val="single" w:sz="3" w:space="0" w:color="D9E0E7"/>
+                <w:right w:val="single" w:sz="3" w:space="0" w:color="D9E0E7"/>
+              </w:tcBorders>
+              <w:shd w:fill="FFFFFF"/>
+            </w:tcPr>
+          </w:tcPr>
+          <w:p>
+            <w:r>
+              <w:t>B / app-store listing</w:t>
+            </w:r>
+          </w:p>
+        </w:tc>
+        <w:tc>
+          <w:tcPr>
+            <w:tcPr>
+              <w:tcW w:type="dxa" w:w="7143"/>
+              <w:tcBorders>
+                <w:top w:val="single" w:sz="3" w:space="0" w:color="D9E0E7"/>
+                <w:left w:val="single" w:sz="3" w:space="0" w:color="D9E0E7"/>
+                <w:bottom w:val="single" w:sz="3" w:space="0" w:color="D9E0E7"/>
+                <w:right w:val="single" w:sz="3" w:space="0" w:color="D9E0E7"/>
+              </w:tcBorders>
+              <w:shd w:fill="FFFFFF"/>
+            </w:tcPr>
+          </w:tcPr>
+          <w:p>
+            <w:r>
+              <w:t>Google Play, SuitU — https://play.google.com/store/apps/details?id=com.libii.march&amp;hl=en_US</w:t>
+            </w:r>
+          </w:p>
+        </w:tc>
+      </w:tr>
+      <w:tr>
+        <w:tc>
+          <w:tcPr>
+            <w:tcPr>
+              <w:tcW w:type="dxa" w:w="1191"/>
+              <w:tcBorders>
+                <w:top w:val="single" w:sz="3" w:space="0" w:color="D9E0E7"/>
+                <w:left w:val="single" w:sz="3" w:space="0" w:color="D9E0E7"/>
+                <w:bottom w:val="single" w:sz="3" w:space="0" w:color="D9E0E7"/>
+                <w:right w:val="single" w:sz="3" w:space="0" w:color="D9E0E7"/>
+              </w:tcBorders>
+              <w:shd w:fill="FFFFFF"/>
+            </w:tcPr>
+          </w:tcPr>
+          <w:p>
+            <w:r>
+              <w:t>F07-S11</w:t>
+            </w:r>
+          </w:p>
+        </w:tc>
+        <w:tc>
+          <w:tcPr>
+            <w:tcPr>
+              <w:tcW w:type="dxa" w:w="1531"/>
+              <w:tcBorders>
+                <w:top w:val="single" w:sz="3" w:space="0" w:color="D9E0E7"/>
+                <w:left w:val="single" w:sz="3" w:space="0" w:color="D9E0E7"/>
+                <w:bottom w:val="single" w:sz="3" w:space="0" w:color="D9E0E7"/>
+                <w:right w:val="single" w:sz="3" w:space="0" w:color="D9E0E7"/>
+              </w:tcBorders>
+              <w:shd w:fill="FFFFFF"/>
+            </w:tcPr>
+          </w:tcPr>
+          <w:p>
+            <w:r>
+              <w:t>C / app-store listing</w:t>
+            </w:r>
+          </w:p>
+        </w:tc>
+        <w:tc>
+          <w:tcPr>
+            <w:tcPr>
+              <w:tcW w:type="dxa" w:w="7143"/>
+              <w:tcBorders>
+                <w:top w:val="single" w:sz="3" w:space="0" w:color="D9E0E7"/>
+                <w:left w:val="single" w:sz="3" w:space="0" w:color="D9E0E7"/>
+                <w:bottom w:val="single" w:sz="3" w:space="0" w:color="D9E0E7"/>
+                <w:right w:val="single" w:sz="3" w:space="0" w:color="D9E0E7"/>
+              </w:tcBorders>
+              <w:shd w:fill="FFFFFF"/>
+            </w:tcPr>
+          </w:tcPr>
+          <w:p>
+            <w:r>
+              <w:t>Myket, Love Nikki — https://myket.ir/app/com.elex.nikkigp</w:t>
             </w:r>
           </w:p>
         </w:tc>

</xml_diff>

<commit_message>
Add verifiable local evidence to fashion dossiers
</commit_message>
<xml_diff>
--- a/reports/fashion_market_research_master_v0.docx
+++ b/reports/fashion_market_research_master_v0.docx
@@ -47,7 +47,7 @@
               <w:br/>
               <w:br/>
               <w:br/>
-              <w:t>نسخهٔ ۰٫۹ | سند زنده و محرمانه</w:t>
+              <w:t>نسخهٔ ۱٫۰ | سند زنده و محرمانه</w:t>
               <w:br/>
               <w:t>۱۲ مهر ۱۴۰۵  |  ۴ اکتبر ۲۰۲۶</w:t>
               <w:br/>
@@ -362,7 +362,7 @@
               <w:jc w:val="right"/>
             </w:pPr>
             <w:r>
-              <w:t>۰٫۹ — بازبینی واقعی desk-research F-01 تا F-07 با منابع رسمی/محلی، limitation و گیت‌های تصمیم تکمیل‌تر شد؛ وضعیت‌های تصمیم تغییری نکرده‌اند.</w:t>
+              <w:t>۱٫۰ — شواهد محلیِ قابل راستی‌آزمایی برای F-01، F-02، F-03، F-04 و F-07 افزوده شد؛ desk-research کامل‌تر است اما primary evidence هنوز وجود ندارد.</w:t>
             </w:r>
           </w:p>
         </w:tc>
@@ -629,7 +629,7 @@
               <w:jc w:val="right"/>
             </w:pPr>
             <w:r>
-              <w:t>یادداشت اعتبار نسخهٔ ۰٫۹</w:t>
+              <w:t>یادداشت اعتبار نسخهٔ ۱٫۰</w:t>
             </w:r>
           </w:p>
           <w:p>
@@ -2890,7 +2890,7 @@
               <w:jc w:val="right"/>
             </w:pPr>
             <w:r>
-              <w:t>هیچ نمودار اندازهٔ بازار، سهم بازار، درآمد یا رضایت با دادهٔ نمونه یا عدد بی‌منبع وارد این گزارش نمی‌شود. نمودارهای نسخهٔ ۰٫۹ فقط وضعیت واقعی برنامهٔ پژوهش را نمایش می‌دهند. نمودارهای هر پرونده پس از ثبت منبع، تعریف، واحد و روش ایجاد می‌شوند.</w:t>
+              <w:t>هیچ نمودار اندازهٔ بازار، سهم بازار، درآمد یا رضایت با دادهٔ نمونه یا عدد بی‌منبع وارد این گزارش نمی‌شود. نمودارهای نسخهٔ ۱٫۰ فقط وضعیت واقعی برنامهٔ پژوهش را نمایش می‌دهند. نمودارهای هر پرونده پس از ثبت منبع، تعریف، واحد و روش ایجاد می‌شوند.</w:t>
             </w:r>
           </w:p>
         </w:tc>
@@ -15893,6 +15893,116 @@
           </w:p>
         </w:tc>
       </w:tr>
+      <w:tr>
+        <w:tc>
+          <w:tcPr>
+            <w:tcPr>
+              <w:tcPr>
+                <w:tcPr>
+                  <w:tcPr>
+                    <w:tcPr>
+                      <w:tcW w:type="dxa" w:w="2409"/>
+                      <w:tcBorders>
+                        <w:top w:val="single" w:sz="3" w:space="0" w:color="D9E0E7"/>
+                        <w:left w:val="single" w:sz="3" w:space="0" w:color="D9E0E7"/>
+                        <w:bottom w:val="single" w:sz="3" w:space="0" w:color="D9E0E7"/>
+                        <w:right w:val="single" w:sz="3" w:space="0" w:color="D9E0E7"/>
+                      </w:tcBorders>
+                      <w:shd w:fill="FFFFFF"/>
+                    </w:tcPr>
+                  </w:tcPr>
+                </w:tcPr>
+              </w:tcPr>
+            </w:tcPr>
+          </w:tcPr>
+          <w:p>
+            <w:r>
+              <w:t>۱٫۰</w:t>
+            </w:r>
+          </w:p>
+        </w:tc>
+        <w:tc>
+          <w:tcPr>
+            <w:tcPr>
+              <w:tcPr>
+                <w:tcPr>
+                  <w:tcPr>
+                    <w:tcPr>
+                      <w:tcW w:type="dxa" w:w="2409"/>
+                      <w:tcBorders>
+                        <w:top w:val="single" w:sz="3" w:space="0" w:color="D9E0E7"/>
+                        <w:left w:val="single" w:sz="3" w:space="0" w:color="D9E0E7"/>
+                        <w:bottom w:val="single" w:sz="3" w:space="0" w:color="D9E0E7"/>
+                        <w:right w:val="single" w:sz="3" w:space="0" w:color="D9E0E7"/>
+                      </w:tcBorders>
+                      <w:shd w:fill="FFFFFF"/>
+                    </w:tcPr>
+                  </w:tcPr>
+                </w:tcPr>
+              </w:tcPr>
+            </w:tcPr>
+          </w:tcPr>
+          <w:p>
+            <w:r>
+              <w:t>۱۲ مهر ۱۴۰۵</w:t>
+            </w:r>
+          </w:p>
+        </w:tc>
+        <w:tc>
+          <w:tcPr>
+            <w:tcPr>
+              <w:tcPr>
+                <w:tcPr>
+                  <w:tcPr>
+                    <w:tcPr>
+                      <w:tcW w:type="dxa" w:w="2409"/>
+                      <w:tcBorders>
+                        <w:top w:val="single" w:sz="3" w:space="0" w:color="D9E0E7"/>
+                        <w:left w:val="single" w:sz="3" w:space="0" w:color="D9E0E7"/>
+                        <w:bottom w:val="single" w:sz="3" w:space="0" w:color="D9E0E7"/>
+                        <w:right w:val="single" w:sz="3" w:space="0" w:color="D9E0E7"/>
+                      </w:tcBorders>
+                      <w:shd w:fill="FFFFFF"/>
+                    </w:tcPr>
+                  </w:tcPr>
+                </w:tcPr>
+              </w:tcPr>
+            </w:tcPr>
+          </w:tcPr>
+          <w:p>
+            <w:r>
+              <w:t>افزودن شواهد محلی قابل راستی‌آزمایی و source ledger برای F-01، F-02، F-03، F-04 و F-07؛ ارقام غیرقابل انتقال به‌عنوان limitation ثبت شدند.</w:t>
+            </w:r>
+          </w:p>
+        </w:tc>
+        <w:tc>
+          <w:tcPr>
+            <w:tcPr>
+              <w:tcPr>
+                <w:tcPr>
+                  <w:tcPr>
+                    <w:tcPr>
+                      <w:tcW w:type="dxa" w:w="2409"/>
+                      <w:tcBorders>
+                        <w:top w:val="single" w:sz="3" w:space="0" w:color="D9E0E7"/>
+                        <w:left w:val="single" w:sz="3" w:space="0" w:color="D9E0E7"/>
+                        <w:bottom w:val="single" w:sz="3" w:space="0" w:color="D9E0E7"/>
+                        <w:right w:val="single" w:sz="3" w:space="0" w:color="D9E0E7"/>
+                      </w:tcBorders>
+                      <w:shd w:fill="FFFFFF"/>
+                    </w:tcPr>
+                  </w:tcPr>
+                </w:tcPr>
+              </w:tcPr>
+            </w:tcPr>
+          </w:tcPr>
+          <w:p>
+            <w:r>
+              <w:t>منتشرشده</w:t>
+            </w:r>
+          </w:p>
+        </w:tc>
+      </w:tr>
     </w:tbl>
     <w:p/>
     <w:tbl>
@@ -17262,6 +17372,15 @@
         <w:t>بازبینی صفحات رسمی نشان می‌دهد دیما سوشال سفارش، تأیید اجرای محتوا، پرداخت پس از تأیید و گزارش را عرضه می‌کند؛ نشانت به ایجاد کمپین، جست‌وجوی influencer و گزارش مدیریتی/مالی اشاره می‌کند؛ و تگرو معرفی influencer و تحلیل campaign را مطرح می‌سازد. بنابراین campaign workflow یک substitute واقعی است، اما هیچ‌یک به‌تنهایی evidence پرداخت‌پذیری یا نبود record داخلیِ sample-loan نیستند. [F01-S11][F01-S12][F01-S13]</w:t>
       </w:r>
     </w:p>
+    <w:p>
+      <w:pPr>
+        <w:spacing w:after="100" w:line="300" w:lineRule="auto"/>
+        <w:jc w:val="right"/>
+      </w:pPr>
+      <w:r>
+        <w:t>دیما افیلیت در بخش پوشاک نیز link/commission creator را عرضه می‌کند؛ این شاهد دقیق‌تر می‌گوید marketplace/affiliate لایه‌ای با substitute موجود است، نه راه‌حل circulation نمونه. [F01-S16]</w:t>
+      </w:r>
+    </w:p>
     <w:tbl>
       <w:tblPr>
         <w:bidiVisual w:val="1"/>
@@ -19896,6 +20015,65 @@
           <w:p>
             <w:r>
               <w:t>GOV.UK, Iran social media policy note (2025) — https://www.gov.uk/government/publications/iran-country-policy-and-information-notes/country-policy-and-information-note-social-media-surveillance-and-sur-place-activities-iran-april-2025-accessible</w:t>
+            </w:r>
+          </w:p>
+        </w:tc>
+      </w:tr>
+      <w:tr>
+        <w:tc>
+          <w:tcPr>
+            <w:tcPr>
+              <w:tcW w:type="dxa" w:w="3213"/>
+              <w:tcBorders>
+                <w:top w:val="single" w:sz="3" w:space="0" w:color="D9E0E7"/>
+                <w:left w:val="single" w:sz="3" w:space="0" w:color="D9E0E7"/>
+                <w:bottom w:val="single" w:sz="3" w:space="0" w:color="D9E0E7"/>
+                <w:right w:val="single" w:sz="3" w:space="0" w:color="D9E0E7"/>
+              </w:tcBorders>
+              <w:shd w:fill="FFFFFF"/>
+            </w:tcPr>
+          </w:tcPr>
+          <w:p>
+            <w:r>
+              <w:t>F01-S16</w:t>
+            </w:r>
+          </w:p>
+        </w:tc>
+        <w:tc>
+          <w:tcPr>
+            <w:tcPr>
+              <w:tcW w:type="dxa" w:w="3213"/>
+              <w:tcBorders>
+                <w:top w:val="single" w:sz="3" w:space="0" w:color="D9E0E7"/>
+                <w:left w:val="single" w:sz="3" w:space="0" w:color="D9E0E7"/>
+                <w:bottom w:val="single" w:sz="3" w:space="0" w:color="D9E0E7"/>
+                <w:right w:val="single" w:sz="3" w:space="0" w:color="D9E0E7"/>
+              </w:tcBorders>
+              <w:shd w:fill="FFFFFF"/>
+            </w:tcPr>
+          </w:tcPr>
+          <w:p>
+            <w:r>
+              <w:t>C / vendor</w:t>
+            </w:r>
+          </w:p>
+        </w:tc>
+        <w:tc>
+          <w:tcPr>
+            <w:tcPr>
+              <w:tcW w:type="dxa" w:w="3213"/>
+              <w:tcBorders>
+                <w:top w:val="single" w:sz="3" w:space="0" w:color="D9E0E7"/>
+                <w:left w:val="single" w:sz="3" w:space="0" w:color="D9E0E7"/>
+                <w:bottom w:val="single" w:sz="3" w:space="0" w:color="D9E0E7"/>
+                <w:right w:val="single" w:sz="3" w:space="0" w:color="D9E0E7"/>
+              </w:tcBorders>
+              <w:shd w:fill="FFFFFF"/>
+            </w:tcPr>
+          </w:tcPr>
+          <w:p>
+            <w:r>
+              <w:t>دیما افیلیت پوشاک — https://deema.agency/همکاری-در-فروش-لباس/</w:t>
             </w:r>
           </w:p>
         </w:tc>
@@ -21012,6 +21190,15 @@
       </w:pPr>
       <w:r>
         <w:t>نتیجهٔ desk-research: production signal و نقش عملیاتی، شروع خوبی برای sampling هستند؛ اما نه تعداد پروژه‌های واجد wardrobe complexity، نه decision-maker و نه software budget را نشان نمی‌دهند. بنابراین TAM/SAM/SOM عمدی خالی مانده و account map شرط شروع financial model است.</w:t>
+      </w:r>
+    </w:p>
+    <w:p>
+      <w:pPr>
+        <w:spacing w:after="100" w:line="300" w:lineRule="auto"/>
+        <w:jc w:val="right"/>
+      </w:pPr>
+      <w:r>
+        <w:t>یک گزارش رسانه‌ای نقل‌کنندهٔ سازمان سینمایی از ۱۸۰ پروانهٔ فیلم‌سازی و ۳۴۷ پروانهٔ غیرسینمایی خبر می‌دهد؛ این فقط proxy مجوز/عرضه است، نه تعداد project اجراشده یا buyer نرم‌افزار costume. [F02-S11]</w:t>
       </w:r>
     </w:p>
     <w:tbl>
@@ -23388,6 +23575,65 @@
           </w:p>
         </w:tc>
       </w:tr>
+      <w:tr>
+        <w:tc>
+          <w:tcPr>
+            <w:tcPr>
+              <w:tcW w:type="dxa" w:w="3213"/>
+              <w:tcBorders>
+                <w:top w:val="single" w:sz="3" w:space="0" w:color="D9E0E7"/>
+                <w:left w:val="single" w:sz="3" w:space="0" w:color="D9E0E7"/>
+                <w:bottom w:val="single" w:sz="3" w:space="0" w:color="D9E0E7"/>
+                <w:right w:val="single" w:sz="3" w:space="0" w:color="D9E0E7"/>
+              </w:tcBorders>
+              <w:shd w:fill="FFFFFF"/>
+            </w:tcPr>
+          </w:tcPr>
+          <w:p>
+            <w:r>
+              <w:t>F02-S11</w:t>
+            </w:r>
+          </w:p>
+        </w:tc>
+        <w:tc>
+          <w:tcPr>
+            <w:tcPr>
+              <w:tcW w:type="dxa" w:w="3213"/>
+              <w:tcBorders>
+                <w:top w:val="single" w:sz="3" w:space="0" w:color="D9E0E7"/>
+                <w:left w:val="single" w:sz="3" w:space="0" w:color="D9E0E7"/>
+                <w:bottom w:val="single" w:sz="3" w:space="0" w:color="D9E0E7"/>
+                <w:right w:val="single" w:sz="3" w:space="0" w:color="D9E0E7"/>
+              </w:tcBorders>
+              <w:shd w:fill="FFFFFF"/>
+            </w:tcPr>
+          </w:tcPr>
+          <w:p>
+            <w:r>
+              <w:t>C / media quoting official</w:t>
+            </w:r>
+          </w:p>
+        </w:tc>
+        <w:tc>
+          <w:tcPr>
+            <w:tcPr>
+              <w:tcW w:type="dxa" w:w="3213"/>
+              <w:tcBorders>
+                <w:top w:val="single" w:sz="3" w:space="0" w:color="D9E0E7"/>
+                <w:left w:val="single" w:sz="3" w:space="0" w:color="D9E0E7"/>
+                <w:bottom w:val="single" w:sz="3" w:space="0" w:color="D9E0E7"/>
+                <w:right w:val="single" w:sz="3" w:space="0" w:color="D9E0E7"/>
+              </w:tcBorders>
+              <w:shd w:fill="FFFFFF"/>
+            </w:tcPr>
+          </w:tcPr>
+          <w:p>
+            <w:r>
+              <w:t>نورنیوز، ۱۸۰ پروانه فیلم‌سازی — https://nournews.ir/fa/news/337505/سینمای-ایران-در-مسیر-عدالت-فرهنگی-صدور-180-پروانه-فیلمسازی</w:t>
+            </w:r>
+          </w:p>
+        </w:tc>
+      </w:tr>
     </w:tbl>
     <w:p/>
     <w:p>
@@ -24453,6 +24699,15 @@
     </w:p>
     <w:p>
       <w:pPr>
+        <w:spacing w:after="100" w:line="300" w:lineRule="auto"/>
+        <w:jc w:val="right"/>
+      </w:pPr>
+      <w:r>
+        <w:t>یک منبع تخصصی ایران نیز sequence tech pack/CAD → pattern → sample → QC → bulk را توصیف می‌کند؛ این صرفاً process evidence است و WTP یا SaaS gap را ثابت نمی‌کند. [F03-S16]</w:t>
+      </w:r>
+    </w:p>
+    <w:p>
+      <w:pPr>
         <w:pStyle w:val="Heading2"/>
         <w:spacing w:before="200" w:after="120"/>
         <w:jc w:val="right"/>
@@ -27356,6 +27611,65 @@
           </w:p>
         </w:tc>
       </w:tr>
+      <w:tr>
+        <w:tc>
+          <w:tcPr>
+            <w:tcPr>
+              <w:tcW w:type="dxa" w:w="3213"/>
+              <w:tcBorders>
+                <w:top w:val="single" w:sz="3" w:space="0" w:color="D9E0E7"/>
+                <w:left w:val="single" w:sz="3" w:space="0" w:color="D9E0E7"/>
+                <w:bottom w:val="single" w:sz="3" w:space="0" w:color="D9E0E7"/>
+                <w:right w:val="single" w:sz="3" w:space="0" w:color="D9E0E7"/>
+              </w:tcBorders>
+              <w:shd w:fill="FFFFFF"/>
+            </w:tcPr>
+          </w:tcPr>
+          <w:p>
+            <w:r>
+              <w:t>F03-S16</w:t>
+            </w:r>
+          </w:p>
+        </w:tc>
+        <w:tc>
+          <w:tcPr>
+            <w:tcPr>
+              <w:tcW w:type="dxa" w:w="3213"/>
+              <w:tcBorders>
+                <w:top w:val="single" w:sz="3" w:space="0" w:color="D9E0E7"/>
+                <w:left w:val="single" w:sz="3" w:space="0" w:color="D9E0E7"/>
+                <w:bottom w:val="single" w:sz="3" w:space="0" w:color="D9E0E7"/>
+                <w:right w:val="single" w:sz="3" w:space="0" w:color="D9E0E7"/>
+              </w:tcBorders>
+              <w:shd w:fill="FFFFFF"/>
+            </w:tcPr>
+          </w:tcPr>
+          <w:p>
+            <w:r>
+              <w:t>C / sector explainer</w:t>
+            </w:r>
+          </w:p>
+        </w:tc>
+        <w:tc>
+          <w:tcPr>
+            <w:tcPr>
+              <w:tcW w:type="dxa" w:w="3213"/>
+              <w:tcBorders>
+                <w:top w:val="single" w:sz="3" w:space="0" w:color="D9E0E7"/>
+                <w:left w:val="single" w:sz="3" w:space="0" w:color="D9E0E7"/>
+                <w:bottom w:val="single" w:sz="3" w:space="0" w:color="D9E0E7"/>
+                <w:right w:val="single" w:sz="3" w:space="0" w:color="D9E0E7"/>
+              </w:tcBorders>
+              <w:shd w:fill="FFFFFF"/>
+            </w:tcPr>
+          </w:tcPr>
+          <w:p>
+            <w:r>
+              <w:t>نساجی دات‌کام، مراحل تولید لباس — https://nasaji.com/دانشنامه-نساجی/مراحل-تولید-لباس/</w:t>
+            </w:r>
+          </w:p>
+        </w:tc>
+      </w:tr>
     </w:tbl>
     <w:p/>
     <w:p>
@@ -28564,6 +28878,15 @@
       </w:pPr>
       <w:r>
         <w:t>بازبینی رسمی LegitApp، limitation مهم photo-first را روشن می‌کند: نتیجه بر مبنای عکس‌های ارسال‌شده است و ممکن است عکس اضافه یا verdict inconclusive لازم شود. بنابراین claim دقت فروشنده، معادل quality system ایران یا guarantee حقوقی نیست. [F04-S10]</w:t>
+      </w:r>
+    </w:p>
+    <w:p>
+      <w:pPr>
+        <w:spacing w:after="100" w:line="300" w:lineRule="auto"/>
+        <w:jc w:val="right"/>
+      </w:pPr>
+      <w:r>
+        <w:t>منبع آموزشی فروشگاه اسنیکر ایران نیز Legit Check و check تصویر/label/SKU را توضیح می‌دهد؛ signal زبان/DIY است، نه fraud rate، حجم معامله یا تقاضای پرداختی برای verdict مستقل. [F04-S11]</w:t>
       </w:r>
     </w:p>
     <w:tbl>
@@ -31290,6 +31613,65 @@
           <w:p>
             <w:r>
               <w:t>LegitApp Sneaker Authentication + FAQ — https://legitapp.com/what-we-authenticate/category/sneakers</w:t>
+            </w:r>
+          </w:p>
+        </w:tc>
+      </w:tr>
+      <w:tr>
+        <w:tc>
+          <w:tcPr>
+            <w:tcPr>
+              <w:tcW w:type="dxa" w:w="3213"/>
+              <w:tcBorders>
+                <w:top w:val="single" w:sz="3" w:space="0" w:color="D9E0E7"/>
+                <w:left w:val="single" w:sz="3" w:space="0" w:color="D9E0E7"/>
+                <w:bottom w:val="single" w:sz="3" w:space="0" w:color="D9E0E7"/>
+                <w:right w:val="single" w:sz="3" w:space="0" w:color="D9E0E7"/>
+              </w:tcBorders>
+              <w:shd w:fill="FFFFFF"/>
+            </w:tcPr>
+          </w:tcPr>
+          <w:p>
+            <w:r>
+              <w:t>F04-S11</w:t>
+            </w:r>
+          </w:p>
+        </w:tc>
+        <w:tc>
+          <w:tcPr>
+            <w:tcPr>
+              <w:tcW w:type="dxa" w:w="3213"/>
+              <w:tcBorders>
+                <w:top w:val="single" w:sz="3" w:space="0" w:color="D9E0E7"/>
+                <w:left w:val="single" w:sz="3" w:space="0" w:color="D9E0E7"/>
+                <w:bottom w:val="single" w:sz="3" w:space="0" w:color="D9E0E7"/>
+                <w:right w:val="single" w:sz="3" w:space="0" w:color="D9E0E7"/>
+              </w:tcBorders>
+              <w:shd w:fill="FFFFFF"/>
+            </w:tcPr>
+          </w:tcPr>
+          <w:p>
+            <w:r>
+              <w:t>C / retailer education</w:t>
+            </w:r>
+          </w:p>
+        </w:tc>
+        <w:tc>
+          <w:tcPr>
+            <w:tcPr>
+              <w:tcW w:type="dxa" w:w="3213"/>
+              <w:tcBorders>
+                <w:top w:val="single" w:sz="3" w:space="0" w:color="D9E0E7"/>
+                <w:left w:val="single" w:sz="3" w:space="0" w:color="D9E0E7"/>
+                <w:bottom w:val="single" w:sz="3" w:space="0" w:color="D9E0E7"/>
+                <w:right w:val="single" w:sz="3" w:space="0" w:color="D9E0E7"/>
+              </w:tcBorders>
+              <w:shd w:fill="FFFFFF"/>
+            </w:tcPr>
+          </w:tcPr>
+          <w:p>
+            <w:r>
+              <w:t>Redkicks، Legit Check — https://redkicks.ir/blog/sneakers-terminology-guide/</w:t>
             </w:r>
           </w:p>
         </w:tc>
@@ -39483,6 +39865,15 @@
         <w:t>بازبینی Google Play، Covet و SuitU را با challenge، voting، social/community، interaction و IAP تأیید می‌کند؛ Myket نیز دسترسی محلی Love Nikki را نشان می‌دهد. این‌ها category/distribution signal هستند، نه retention، payer conversion یا market-size ایران. [F07-S09–S11]</w:t>
       </w:r>
     </w:p>
+    <w:p>
+      <w:pPr>
+        <w:spacing w:after="100" w:line="300" w:lineRule="auto"/>
+        <w:jc w:val="right"/>
+      </w:pPr>
+      <w:r>
+        <w:t>پیمایش رسمی بنیاد ملی بازی‌های رایانه‌ای تا پایان ۱۴۰۰، ۳۴ میلیون بازیکن، ۹۶٪ استفاده از موبایل و ۵۱۲ میلیارد تومان هزینه‌کرد software بازی موبایل گزارش می‌کند؛ این عدد historical و کل-category است، نه TAM فشن‌گیم. [F07-S12]</w:t>
+      </w:r>
+    </w:p>
     <w:tbl>
       <w:tblPr>
         <w:bidiVisual w:val="1"/>
@@ -41921,6 +42312,65 @@
           <w:p>
             <w:r>
               <w:t>Myket, Love Nikki — https://myket.ir/app/com.elex.nikkigp</w:t>
+            </w:r>
+          </w:p>
+        </w:tc>
+      </w:tr>
+      <w:tr>
+        <w:tc>
+          <w:tcPr>
+            <w:tcPr>
+              <w:tcW w:type="dxa" w:w="1191"/>
+              <w:tcBorders>
+                <w:top w:val="single" w:sz="3" w:space="0" w:color="D9E0E7"/>
+                <w:left w:val="single" w:sz="3" w:space="0" w:color="D9E0E7"/>
+                <w:bottom w:val="single" w:sz="3" w:space="0" w:color="D9E0E7"/>
+                <w:right w:val="single" w:sz="3" w:space="0" w:color="D9E0E7"/>
+              </w:tcBorders>
+              <w:shd w:fill="FFFFFF"/>
+            </w:tcPr>
+          </w:tcPr>
+          <w:p>
+            <w:r>
+              <w:t>F07-S12</w:t>
+            </w:r>
+          </w:p>
+        </w:tc>
+        <w:tc>
+          <w:tcPr>
+            <w:tcPr>
+              <w:tcW w:type="dxa" w:w="1531"/>
+              <w:tcBorders>
+                <w:top w:val="single" w:sz="3" w:space="0" w:color="D9E0E7"/>
+                <w:left w:val="single" w:sz="3" w:space="0" w:color="D9E0E7"/>
+                <w:bottom w:val="single" w:sz="3" w:space="0" w:color="D9E0E7"/>
+                <w:right w:val="single" w:sz="3" w:space="0" w:color="D9E0E7"/>
+              </w:tcBorders>
+              <w:shd w:fill="FFFFFF"/>
+            </w:tcPr>
+          </w:tcPr>
+          <w:p>
+            <w:r>
+              <w:t>A/B / official sector report</w:t>
+            </w:r>
+          </w:p>
+        </w:tc>
+        <w:tc>
+          <w:tcPr>
+            <w:tcPr>
+              <w:tcW w:type="dxa" w:w="7143"/>
+              <w:tcBorders>
+                <w:top w:val="single" w:sz="3" w:space="0" w:color="D9E0E7"/>
+                <w:left w:val="single" w:sz="3" w:space="0" w:color="D9E0E7"/>
+                <w:bottom w:val="single" w:sz="3" w:space="0" w:color="D9E0E7"/>
+                <w:right w:val="single" w:sz="3" w:space="0" w:color="D9E0E7"/>
+              </w:tcBorders>
+              <w:shd w:fill="FFFFFF"/>
+            </w:tcPr>
+          </w:tcPr>
+          <w:p>
+            <w:r>
+              <w:t>بنیاد ملی بازی‌های رایانه‌ای، پیمایش ۱۴۰۰ — https://www.ircg.ir/fa/-news/5514/مجموع-هزینه-کرد-19-هزار-میلیاردی-بازیکنان-ایرانی-برای-نرم-افزار-و-سخت-افزار-بازی-های-دیجیتال</w:t>
             </w:r>
           </w:p>
         </w:tc>

</xml_diff>

<commit_message>
Deepen source-level research for all fashion dossiers
</commit_message>
<xml_diff>
--- a/reports/fashion_market_research_master_v0.docx
+++ b/reports/fashion_market_research_master_v0.docx
@@ -47,7 +47,7 @@
               <w:br/>
               <w:br/>
               <w:br/>
-              <w:t>نسخهٔ ۱٫۰ | سند زنده و محرمانه</w:t>
+              <w:t>نسخهٔ ۱٫۱ | سند زنده و محرمانه</w:t>
               <w:br/>
               <w:t>۱۲ مهر ۱۴۰۵  |  ۴ اکتبر ۲۰۲۶</w:t>
               <w:br/>
@@ -362,7 +362,7 @@
               <w:jc w:val="right"/>
             </w:pPr>
             <w:r>
-              <w:t>۱٫۰ — شواهد محلیِ قابل راستی‌آزمایی برای F-01، F-02، F-03، F-04 و F-07 افزوده شد؛ desk-research کامل‌تر است اما primary evidence هنوز وجود ندارد.</w:t>
+              <w:t>۱٫۱ — برای هر هفت پرونده یک شاهد محلی/رسمی تازه با implication و limitation ثبت شد؛ primary evidence هنوز وجود ندارد.</w:t>
             </w:r>
           </w:p>
         </w:tc>
@@ -629,7 +629,7 @@
               <w:jc w:val="right"/>
             </w:pPr>
             <w:r>
-              <w:t>یادداشت اعتبار نسخهٔ ۱٫۰</w:t>
+              <w:t>یادداشت اعتبار نسخهٔ ۱٫۱</w:t>
             </w:r>
           </w:p>
           <w:p>
@@ -2890,7 +2890,7 @@
               <w:jc w:val="right"/>
             </w:pPr>
             <w:r>
-              <w:t>هیچ نمودار اندازهٔ بازار، سهم بازار، درآمد یا رضایت با دادهٔ نمونه یا عدد بی‌منبع وارد این گزارش نمی‌شود. نمودارهای نسخهٔ ۱٫۰ فقط وضعیت واقعی برنامهٔ پژوهش را نمایش می‌دهند. نمودارهای هر پرونده پس از ثبت منبع، تعریف، واحد و روش ایجاد می‌شوند.</w:t>
+              <w:t>هیچ نمودار اندازهٔ بازار، سهم بازار، درآمد یا رضایت با دادهٔ نمونه یا عدد بی‌منبع وارد این گزارش نمی‌شود. نمودارهای نسخهٔ ۱٫۱ فقط وضعیت واقعی برنامهٔ پژوهش را نمایش می‌دهند. نمودارهای هر پرونده پس از ثبت منبع، تعریف، واحد و روش ایجاد می‌شوند.</w:t>
             </w:r>
           </w:p>
         </w:tc>
@@ -16003,6 +16003,124 @@
           </w:p>
         </w:tc>
       </w:tr>
+      <w:tr>
+        <w:tc>
+          <w:tcPr>
+            <w:tcPr>
+              <w:tcPr>
+                <w:tcPr>
+                  <w:tcPr>
+                    <w:tcPr>
+                      <w:tcPr>
+                        <w:tcW w:type="dxa" w:w="2409"/>
+                        <w:tcBorders>
+                          <w:top w:val="single" w:sz="3" w:space="0" w:color="D9E0E7"/>
+                          <w:left w:val="single" w:sz="3" w:space="0" w:color="D9E0E7"/>
+                          <w:bottom w:val="single" w:sz="3" w:space="0" w:color="D9E0E7"/>
+                          <w:right w:val="single" w:sz="3" w:space="0" w:color="D9E0E7"/>
+                        </w:tcBorders>
+                        <w:shd w:fill="FFFFFF"/>
+                      </w:tcPr>
+                    </w:tcPr>
+                  </w:tcPr>
+                </w:tcPr>
+              </w:tcPr>
+            </w:tcPr>
+          </w:tcPr>
+          <w:p>
+            <w:r>
+              <w:t>۱٫۱</w:t>
+            </w:r>
+          </w:p>
+        </w:tc>
+        <w:tc>
+          <w:tcPr>
+            <w:tcPr>
+              <w:tcPr>
+                <w:tcPr>
+                  <w:tcPr>
+                    <w:tcPr>
+                      <w:tcPr>
+                        <w:tcW w:type="dxa" w:w="2409"/>
+                        <w:tcBorders>
+                          <w:top w:val="single" w:sz="3" w:space="0" w:color="D9E0E7"/>
+                          <w:left w:val="single" w:sz="3" w:space="0" w:color="D9E0E7"/>
+                          <w:bottom w:val="single" w:sz="3" w:space="0" w:color="D9E0E7"/>
+                          <w:right w:val="single" w:sz="3" w:space="0" w:color="D9E0E7"/>
+                        </w:tcBorders>
+                        <w:shd w:fill="FFFFFF"/>
+                      </w:tcPr>
+                    </w:tcPr>
+                  </w:tcPr>
+                </w:tcPr>
+              </w:tcPr>
+            </w:tcPr>
+          </w:tcPr>
+          <w:p>
+            <w:r>
+              <w:t>۱۲ مهر ۱۴۰۵</w:t>
+            </w:r>
+          </w:p>
+        </w:tc>
+        <w:tc>
+          <w:tcPr>
+            <w:tcPr>
+              <w:tcPr>
+                <w:tcPr>
+                  <w:tcPr>
+                    <w:tcPr>
+                      <w:tcPr>
+                        <w:tcW w:type="dxa" w:w="2409"/>
+                        <w:tcBorders>
+                          <w:top w:val="single" w:sz="3" w:space="0" w:color="D9E0E7"/>
+                          <w:left w:val="single" w:sz="3" w:space="0" w:color="D9E0E7"/>
+                          <w:bottom w:val="single" w:sz="3" w:space="0" w:color="D9E0E7"/>
+                          <w:right w:val="single" w:sz="3" w:space="0" w:color="D9E0E7"/>
+                        </w:tcBorders>
+                        <w:shd w:fill="FFFFFF"/>
+                      </w:tcPr>
+                    </w:tcPr>
+                  </w:tcPr>
+                </w:tcPr>
+              </w:tcPr>
+            </w:tcPr>
+          </w:tcPr>
+          <w:p>
+            <w:r>
+              <w:t>deep desk-research برای F-01 تا F-07: شواهد رسمی/محلی تازه، counter-evidence و limitation افزوده شد؛ هیچ verdictی بدون evidence اولیه ارتقا نیافت.</w:t>
+            </w:r>
+          </w:p>
+        </w:tc>
+        <w:tc>
+          <w:tcPr>
+            <w:tcPr>
+              <w:tcPr>
+                <w:tcPr>
+                  <w:tcPr>
+                    <w:tcPr>
+                      <w:tcPr>
+                        <w:tcW w:type="dxa" w:w="2409"/>
+                        <w:tcBorders>
+                          <w:top w:val="single" w:sz="3" w:space="0" w:color="D9E0E7"/>
+                          <w:left w:val="single" w:sz="3" w:space="0" w:color="D9E0E7"/>
+                          <w:bottom w:val="single" w:sz="3" w:space="0" w:color="D9E0E7"/>
+                          <w:right w:val="single" w:sz="3" w:space="0" w:color="D9E0E7"/>
+                        </w:tcBorders>
+                        <w:shd w:fill="FFFFFF"/>
+                      </w:tcPr>
+                    </w:tcPr>
+                  </w:tcPr>
+                </w:tcPr>
+              </w:tcPr>
+            </w:tcPr>
+          </w:tcPr>
+          <w:p>
+            <w:r>
+              <w:t>منتشرشده</w:t>
+            </w:r>
+          </w:p>
+        </w:tc>
+      </w:tr>
     </w:tbl>
     <w:p/>
     <w:tbl>
@@ -17381,6 +17499,15 @@
         <w:t>دیما افیلیت در بخش پوشاک نیز link/commission creator را عرضه می‌کند؛ این شاهد دقیق‌تر می‌گوید marketplace/affiliate لایه‌ای با substitute موجود است، نه راه‌حل circulation نمونه. [F01-S16]</w:t>
       </w:r>
     </w:p>
+    <w:p>
+      <w:pPr>
+        <w:spacing w:after="100" w:line="300" w:lineRule="auto"/>
+        <w:jc w:val="right"/>
+      </w:pPr>
+      <w:r>
+        <w:t>برای F-01، FAQ رسمی اینماد می‌گوید کسب‌وکارهای شبکه‌های اجتماعی/پیام‌رسان‌ها نیز می‌توانند اینماد بگیرند و اطلاعیهٔ رسمی آن درج شناسهٔ کالا برای عرضهٔ پوشاک/منسوجات در وب، شبکهٔ اجتماعی و app را الزام می‌داند. این evidence commerce/regulatory boundary است: محصول circulation نباید به seller/marketplace یا attribution rail تبدیل شود؛ منبع نرخ گردش نمونه یا WTP را نشان نمی‌دهد. [F01-S17]</w:t>
+      </w:r>
+    </w:p>
     <w:tbl>
       <w:tblPr>
         <w:bidiVisual w:val="1"/>
@@ -20074,6 +20201,71 @@
           <w:p>
             <w:r>
               <w:t>دیما افیلیت پوشاک — https://deema.agency/همکاری-در-فروش-لباس/</w:t>
+            </w:r>
+          </w:p>
+        </w:tc>
+      </w:tr>
+      <w:tr>
+        <w:tc>
+          <w:tcPr>
+            <w:tcPr>
+              <w:tcPr>
+                <w:tcW w:type="dxa" w:w="3213"/>
+                <w:tcBorders>
+                  <w:top w:val="single" w:sz="3" w:space="0" w:color="D9E0E7"/>
+                  <w:left w:val="single" w:sz="3" w:space="0" w:color="D9E0E7"/>
+                  <w:bottom w:val="single" w:sz="3" w:space="0" w:color="D9E0E7"/>
+                  <w:right w:val="single" w:sz="3" w:space="0" w:color="D9E0E7"/>
+                </w:tcBorders>
+                <w:shd w:fill="FFFFFF"/>
+              </w:tcPr>
+            </w:tcPr>
+          </w:tcPr>
+          <w:p>
+            <w:r>
+              <w:t>F01-S17</w:t>
+            </w:r>
+          </w:p>
+        </w:tc>
+        <w:tc>
+          <w:tcPr>
+            <w:tcPr>
+              <w:tcPr>
+                <w:tcW w:type="dxa" w:w="3213"/>
+                <w:tcBorders>
+                  <w:top w:val="single" w:sz="3" w:space="0" w:color="D9E0E7"/>
+                  <w:left w:val="single" w:sz="3" w:space="0" w:color="D9E0E7"/>
+                  <w:bottom w:val="single" w:sz="3" w:space="0" w:color="D9E0E7"/>
+                  <w:right w:val="single" w:sz="3" w:space="0" w:color="D9E0E7"/>
+                </w:tcBorders>
+                <w:shd w:fill="FFFFFF"/>
+              </w:tcPr>
+            </w:tcPr>
+          </w:tcPr>
+          <w:p>
+            <w:r>
+              <w:t>A / official e-commerce authority</w:t>
+            </w:r>
+          </w:p>
+        </w:tc>
+        <w:tc>
+          <w:tcPr>
+            <w:tcPr>
+              <w:tcPr>
+                <w:tcW w:type="dxa" w:w="3213"/>
+                <w:tcBorders>
+                  <w:top w:val="single" w:sz="3" w:space="0" w:color="D9E0E7"/>
+                  <w:left w:val="single" w:sz="3" w:space="0" w:color="D9E0E7"/>
+                  <w:bottom w:val="single" w:sz="3" w:space="0" w:color="D9E0E7"/>
+                  <w:right w:val="single" w:sz="3" w:space="0" w:color="D9E0E7"/>
+                </w:tcBorders>
+                <w:shd w:fill="FFFFFF"/>
+              </w:tcPr>
+            </w:tcPr>
+          </w:tcPr>
+          <w:p>
+            <w:r>
+              <w:t>اینماد — FAQ + شناسهٔ کالای پوشاک — https://www.enamad.ir/Faq ; https://www.enamad.ir/News/NewsShow?Newsid=68</w:t>
             </w:r>
           </w:p>
         </w:tc>
@@ -21199,6 +21391,15 @@
       </w:pPr>
       <w:r>
         <w:t>یک گزارش رسانه‌ای نقل‌کنندهٔ سازمان سینمایی از ۱۸۰ پروانهٔ فیلم‌سازی و ۳۴۷ پروانهٔ غیرسینمایی خبر می‌دهد؛ این فقط proxy مجوز/عرضه است، نه تعداد project اجراشده یا buyer نرم‌افزار costume. [F02-S11]</w:t>
+      </w:r>
+    </w:p>
+    <w:p>
+      <w:pPr>
+        <w:spacing w:after="100" w:line="300" w:lineRule="auto"/>
+        <w:jc w:val="right"/>
+      </w:pPr>
+      <w:r>
+        <w:t>سازمان سینمایی در صفحهٔ موزهٔ سینمای ایران، costume و production documents را در collection/archive ذکر می‌کند. این فقط category evidence برای object/documentation است و بیشتر به archive نزدیک است: نه تعداد پروژهٔ فعال، نه continuity error و نه buyer/WTP را نشان می‌دهد. [F02-S12]</w:t>
       </w:r>
     </w:p>
     <w:tbl>
@@ -23634,6 +23835,71 @@
           </w:p>
         </w:tc>
       </w:tr>
+      <w:tr>
+        <w:tc>
+          <w:tcPr>
+            <w:tcPr>
+              <w:tcPr>
+                <w:tcW w:type="dxa" w:w="3213"/>
+                <w:tcBorders>
+                  <w:top w:val="single" w:sz="3" w:space="0" w:color="D9E0E7"/>
+                  <w:left w:val="single" w:sz="3" w:space="0" w:color="D9E0E7"/>
+                  <w:bottom w:val="single" w:sz="3" w:space="0" w:color="D9E0E7"/>
+                  <w:right w:val="single" w:sz="3" w:space="0" w:color="D9E0E7"/>
+                </w:tcBorders>
+                <w:shd w:fill="FFFFFF"/>
+              </w:tcPr>
+            </w:tcPr>
+          </w:tcPr>
+          <w:p>
+            <w:r>
+              <w:t>F02-S12</w:t>
+            </w:r>
+          </w:p>
+        </w:tc>
+        <w:tc>
+          <w:tcPr>
+            <w:tcPr>
+              <w:tcPr>
+                <w:tcW w:type="dxa" w:w="3213"/>
+                <w:tcBorders>
+                  <w:top w:val="single" w:sz="3" w:space="0" w:color="D9E0E7"/>
+                  <w:left w:val="single" w:sz="3" w:space="0" w:color="D9E0E7"/>
+                  <w:bottom w:val="single" w:sz="3" w:space="0" w:color="D9E0E7"/>
+                  <w:right w:val="single" w:sz="3" w:space="0" w:color="D9E0E7"/>
+                </w:tcBorders>
+                <w:shd w:fill="FFFFFF"/>
+              </w:tcPr>
+            </w:tcPr>
+          </w:tcPr>
+          <w:p>
+            <w:r>
+              <w:t>A / Cinema Organization</w:t>
+            </w:r>
+          </w:p>
+        </w:tc>
+        <w:tc>
+          <w:tcPr>
+            <w:tcPr>
+              <w:tcPr>
+                <w:tcW w:type="dxa" w:w="3213"/>
+                <w:tcBorders>
+                  <w:top w:val="single" w:sz="3" w:space="0" w:color="D9E0E7"/>
+                  <w:left w:val="single" w:sz="3" w:space="0" w:color="D9E0E7"/>
+                  <w:bottom w:val="single" w:sz="3" w:space="0" w:color="D9E0E7"/>
+                  <w:right w:val="single" w:sz="3" w:space="0" w:color="D9E0E7"/>
+                </w:tcBorders>
+                <w:shd w:fill="FFFFFF"/>
+              </w:tcPr>
+            </w:tcPr>
+          </w:tcPr>
+          <w:p>
+            <w:r>
+              <w:t>CinemaOrg — Iranian Cinema Museum — https://www.cinemaorg.ir/en/institutions/iraniancinemamuseum</w:t>
+            </w:r>
+          </w:p>
+        </w:tc>
+      </w:tr>
     </w:tbl>
     <w:p/>
     <w:p>
@@ -24708,6 +24974,15 @@
     </w:p>
     <w:p>
       <w:pPr>
+        <w:spacing w:after="100" w:line="300" w:lineRule="auto"/>
+        <w:jc w:val="right"/>
+      </w:pPr>
+      <w:r>
+        <w:t>«آرمان تدبیر پوشاک» برای کارگاه/کارخانه، زمان‌بندی، QC، پیگیری سفارش، موجودی و BOM/شناسنامهٔ طاقه را عرضه می‌کند. vendor evidence است، اما counter-evidence مهمی است: F-03 فقط در pre-production spec/version/approval hand-off می‌تواند wedge داشته باشد، نه control-production عمومی. [F03-S17]</w:t>
+      </w:r>
+    </w:p>
+    <w:p>
+      <w:pPr>
         <w:pStyle w:val="Heading2"/>
         <w:spacing w:before="200" w:after="120"/>
         <w:jc w:val="right"/>
@@ -27666,6 +27941,71 @@
           <w:p>
             <w:r>
               <w:t>نساجی دات‌کام، مراحل تولید لباس — https://nasaji.com/دانشنامه-نساجی/مراحل-تولید-لباس/</w:t>
+            </w:r>
+          </w:p>
+        </w:tc>
+      </w:tr>
+      <w:tr>
+        <w:tc>
+          <w:tcPr>
+            <w:tcPr>
+              <w:tcPr>
+                <w:tcW w:type="dxa" w:w="3213"/>
+                <w:tcBorders>
+                  <w:top w:val="single" w:sz="3" w:space="0" w:color="D9E0E7"/>
+                  <w:left w:val="single" w:sz="3" w:space="0" w:color="D9E0E7"/>
+                  <w:bottom w:val="single" w:sz="3" w:space="0" w:color="D9E0E7"/>
+                  <w:right w:val="single" w:sz="3" w:space="0" w:color="D9E0E7"/>
+                </w:tcBorders>
+                <w:shd w:fill="FFFFFF"/>
+              </w:tcPr>
+            </w:tcPr>
+          </w:tcPr>
+          <w:p>
+            <w:r>
+              <w:t>F03-S17</w:t>
+            </w:r>
+          </w:p>
+        </w:tc>
+        <w:tc>
+          <w:tcPr>
+            <w:tcPr>
+              <w:tcPr>
+                <w:tcW w:type="dxa" w:w="3213"/>
+                <w:tcBorders>
+                  <w:top w:val="single" w:sz="3" w:space="0" w:color="D9E0E7"/>
+                  <w:left w:val="single" w:sz="3" w:space="0" w:color="D9E0E7"/>
+                  <w:bottom w:val="single" w:sz="3" w:space="0" w:color="D9E0E7"/>
+                  <w:right w:val="single" w:sz="3" w:space="0" w:color="D9E0E7"/>
+                </w:tcBorders>
+                <w:shd w:fill="FFFFFF"/>
+              </w:tcPr>
+            </w:tcPr>
+          </w:tcPr>
+          <w:p>
+            <w:r>
+              <w:t>C / local vendor</w:t>
+            </w:r>
+          </w:p>
+        </w:tc>
+        <w:tc>
+          <w:tcPr>
+            <w:tcPr>
+              <w:tcPr>
+                <w:tcW w:type="dxa" w:w="3213"/>
+                <w:tcBorders>
+                  <w:top w:val="single" w:sz="3" w:space="0" w:color="D9E0E7"/>
+                  <w:left w:val="single" w:sz="3" w:space="0" w:color="D9E0E7"/>
+                  <w:bottom w:val="single" w:sz="3" w:space="0" w:color="D9E0E7"/>
+                  <w:right w:val="single" w:sz="3" w:space="0" w:color="D9E0E7"/>
+                </w:tcBorders>
+                <w:shd w:fill="FFFFFF"/>
+              </w:tcPr>
+            </w:tcPr>
+          </w:tcPr>
+          <w:p>
+            <w:r>
+              <w:t>آرمان تدبیر پوشاک — کنترل تولید — https://gctco.ir/arman-tadbir-pooshak/</w:t>
             </w:r>
           </w:p>
         </w:tc>
@@ -28887,6 +29227,15 @@
       </w:pPr>
       <w:r>
         <w:t>منبع آموزشی فروشگاه اسنیکر ایران نیز Legit Check و check تصویر/label/SKU را توضیح می‌دهد؛ signal زبان/DIY است، نه fraud rate، حجم معامله یا تقاضای پرداختی برای verdict مستقل. [F04-S11]</w:t>
+      </w:r>
+    </w:p>
+    <w:p>
+      <w:pPr>
+        <w:spacing w:after="100" w:line="300" w:lineRule="auto"/>
+        <w:jc w:val="right"/>
+      </w:pPr>
+      <w:r>
+        <w:t>WIPO Lex قانون حمایت از مالکیت صنعتی ۲۰۲۴ ایران را با قلمرو trademark/trade name/competition/enforcement و متن فارسی منبع مجلس ثبت کرده است. نتیجهٔ product-level این است که verdict/certificate نباید تضمین حقوقی یا جایگزین مرجع رسمی معرفی شود؛ این record نه fraud rate و نه رویهٔ enforcement را اندازه نمی‌گیرد. [F04-S12]</w:t>
       </w:r>
     </w:p>
     <w:tbl>
@@ -31676,6 +32025,71 @@
           </w:p>
         </w:tc>
       </w:tr>
+      <w:tr>
+        <w:tc>
+          <w:tcPr>
+            <w:tcPr>
+              <w:tcPr>
+                <w:tcW w:type="dxa" w:w="3213"/>
+                <w:tcBorders>
+                  <w:top w:val="single" w:sz="3" w:space="0" w:color="D9E0E7"/>
+                  <w:left w:val="single" w:sz="3" w:space="0" w:color="D9E0E7"/>
+                  <w:bottom w:val="single" w:sz="3" w:space="0" w:color="D9E0E7"/>
+                  <w:right w:val="single" w:sz="3" w:space="0" w:color="D9E0E7"/>
+                </w:tcBorders>
+                <w:shd w:fill="FFFFFF"/>
+              </w:tcPr>
+            </w:tcPr>
+          </w:tcPr>
+          <w:p>
+            <w:r>
+              <w:t>F04-S12</w:t>
+            </w:r>
+          </w:p>
+        </w:tc>
+        <w:tc>
+          <w:tcPr>
+            <w:tcPr>
+              <w:tcPr>
+                <w:tcW w:type="dxa" w:w="3213"/>
+                <w:tcBorders>
+                  <w:top w:val="single" w:sz="3" w:space="0" w:color="D9E0E7"/>
+                  <w:left w:val="single" w:sz="3" w:space="0" w:color="D9E0E7"/>
+                  <w:bottom w:val="single" w:sz="3" w:space="0" w:color="D9E0E7"/>
+                  <w:right w:val="single" w:sz="3" w:space="0" w:color="D9E0E7"/>
+                </w:tcBorders>
+                <w:shd w:fill="FFFFFF"/>
+              </w:tcPr>
+            </w:tcPr>
+          </w:tcPr>
+          <w:p>
+            <w:r>
+              <w:t>A / WIPO Lex legal record</w:t>
+            </w:r>
+          </w:p>
+        </w:tc>
+        <w:tc>
+          <w:tcPr>
+            <w:tcPr>
+              <w:tcPr>
+                <w:tcW w:type="dxa" w:w="3213"/>
+                <w:tcBorders>
+                  <w:top w:val="single" w:sz="3" w:space="0" w:color="D9E0E7"/>
+                  <w:left w:val="single" w:sz="3" w:space="0" w:color="D9E0E7"/>
+                  <w:bottom w:val="single" w:sz="3" w:space="0" w:color="D9E0E7"/>
+                  <w:right w:val="single" w:sz="3" w:space="0" w:color="D9E0E7"/>
+                </w:tcBorders>
+                <w:shd w:fill="FFFFFF"/>
+              </w:tcPr>
+            </w:tcPr>
+          </w:tcPr>
+          <w:p>
+            <w:r>
+              <w:t>WIPO Lex — Iran Industrial Property Protection Act 2024 — https://www.wipo.int/wipolex/en/legislation/details/23341</w:t>
+            </w:r>
+          </w:p>
+        </w:tc>
+      </w:tr>
     </w:tbl>
     <w:p/>
     <w:p>
@@ -32166,6 +32580,15 @@
       </w:pPr>
       <w:r>
         <w:t>بازبینی صفحهٔ fashion/luxury رسمی YOOBIC، guideline → role/task → photo proof → feedback → dashboard را تأیید کرد؛ همین بستهٔ کامل، overlap F-05 با task/photo/approval/reporting local را تقویت می‌کند، نه thesis ورود را. benefitها vendor claim هستند. [F05-S09]</w:t>
+      </w:r>
+    </w:p>
+    <w:p>
+      <w:pPr>
+        <w:spacing w:after="100" w:line="300" w:lineRule="auto"/>
+        <w:jc w:val="right"/>
+      </w:pPr>
+      <w:r>
+        <w:t>کیان در customer-story خود می‌گوید چرم منط با بیش از ۲۰ شعبه و فروش آنلاین از ۱۳۹۸ برای مدیریت یکپارچه شعب/online store از کیان استفاده می‌کند. حتی با فرض vendor-claim بودن، cohort چندشعبه‌ای و incumbent محلی دیده می‌شود؛ این evidence برای VM failure mode یا WTP مستقل نیست. [F05-S10]</w:t>
       </w:r>
     </w:p>
     <w:tbl>
@@ -34904,6 +35327,71 @@
           <w:p>
             <w:r>
               <w:t>YOOBIC Fashion &amp; Luxury — https://yoobic.com/industries/fashion/</w:t>
+            </w:r>
+          </w:p>
+        </w:tc>
+      </w:tr>
+      <w:tr>
+        <w:tc>
+          <w:tcPr>
+            <w:tcPr>
+              <w:tcPr>
+                <w:tcW w:type="dxa" w:w="3213"/>
+                <w:tcBorders>
+                  <w:top w:val="single" w:sz="3" w:space="0" w:color="D9E0E7"/>
+                  <w:left w:val="single" w:sz="3" w:space="0" w:color="D9E0E7"/>
+                  <w:bottom w:val="single" w:sz="3" w:space="0" w:color="D9E0E7"/>
+                  <w:right w:val="single" w:sz="3" w:space="0" w:color="D9E0E7"/>
+                </w:tcBorders>
+                <w:shd w:fill="FFFFFF"/>
+              </w:tcPr>
+            </w:tcPr>
+          </w:tcPr>
+          <w:p>
+            <w:r>
+              <w:t>F05-S10</w:t>
+            </w:r>
+          </w:p>
+        </w:tc>
+        <w:tc>
+          <w:tcPr>
+            <w:tcPr>
+              <w:tcPr>
+                <w:tcW w:type="dxa" w:w="3213"/>
+                <w:tcBorders>
+                  <w:top w:val="single" w:sz="3" w:space="0" w:color="D9E0E7"/>
+                  <w:left w:val="single" w:sz="3" w:space="0" w:color="D9E0E7"/>
+                  <w:bottom w:val="single" w:sz="3" w:space="0" w:color="D9E0E7"/>
+                  <w:right w:val="single" w:sz="3" w:space="0" w:color="D9E0E7"/>
+                </w:tcBorders>
+                <w:shd w:fill="FFFFFF"/>
+              </w:tcPr>
+            </w:tcPr>
+          </w:tcPr>
+          <w:p>
+            <w:r>
+              <w:t>C / vendor customer-story</w:t>
+            </w:r>
+          </w:p>
+        </w:tc>
+        <w:tc>
+          <w:tcPr>
+            <w:tcPr>
+              <w:tcPr>
+                <w:tcW w:type="dxa" w:w="3213"/>
+                <w:tcBorders>
+                  <w:top w:val="single" w:sz="3" w:space="0" w:color="D9E0E7"/>
+                  <w:left w:val="single" w:sz="3" w:space="0" w:color="D9E0E7"/>
+                  <w:bottom w:val="single" w:sz="3" w:space="0" w:color="D9E0E7"/>
+                  <w:right w:val="single" w:sz="3" w:space="0" w:color="D9E0E7"/>
+                </w:tcBorders>
+                <w:shd w:fill="FFFFFF"/>
+              </w:tcPr>
+            </w:tcPr>
+          </w:tcPr>
+          <w:p>
+            <w:r>
+              <w:t>کیان نور رایانه — چرم منط — https://kyansoftco.com/mante-chainstore/</w:t>
             </w:r>
           </w:p>
         </w:tc>
@@ -36499,6 +36987,15 @@
       </w:pPr>
       <w:r>
         <w:t>بازبینی رسمی EMu/Axiell، loan/movement را با borrower، approval، contract، insurance، transport، condition/conservation و rights در یک CMS واحد توضیح می‌دهد. این گستره standards/procurement پیچیدگی category و دلیل رد F-06 را تقویت می‌کند. [F06-S08]</w:t>
+      </w:r>
+    </w:p>
+    <w:p>
+      <w:pPr>
+        <w:spacing w:after="100" w:line="300" w:lineRule="auto"/>
+        <w:jc w:val="right"/>
+      </w:pPr>
+      <w:r>
+        <w:t>تاریخچهٔ رسمی اداره‌کل موزه‌ها، ثبت آثار، آرشیو فنی، حفاظت اموال و حوزهٔ تخصصی اموال فرهنگی‌ـ‌تاریخی را بیان می‌کند. این evidence governance complexity است و counter-thesis F-06 را تقویت می‌کند؛ نرخ استفاده از سامانه‌ها، private-fashion collections یا WTP SaaS را نمی‌سنجد. [F06-S09]</w:t>
       </w:r>
     </w:p>
     <w:tbl>
@@ -38840,6 +39337,71 @@
           </w:p>
         </w:tc>
       </w:tr>
+      <w:tr>
+        <w:tc>
+          <w:tcPr>
+            <w:tcPr>
+              <w:tcPr>
+                <w:tcW w:type="dxa" w:w="1191"/>
+                <w:tcBorders>
+                  <w:top w:val="single" w:sz="3" w:space="0" w:color="D9E0E7"/>
+                  <w:left w:val="single" w:sz="3" w:space="0" w:color="D9E0E7"/>
+                  <w:bottom w:val="single" w:sz="3" w:space="0" w:color="D9E0E7"/>
+                  <w:right w:val="single" w:sz="3" w:space="0" w:color="D9E0E7"/>
+                </w:tcBorders>
+                <w:shd w:fill="FFFFFF"/>
+              </w:tcPr>
+            </w:tcPr>
+          </w:tcPr>
+          <w:p>
+            <w:r>
+              <w:t>F06-S09</w:t>
+            </w:r>
+          </w:p>
+        </w:tc>
+        <w:tc>
+          <w:tcPr>
+            <w:tcPr>
+              <w:tcPr>
+                <w:tcW w:type="dxa" w:w="1531"/>
+                <w:tcBorders>
+                  <w:top w:val="single" w:sz="3" w:space="0" w:color="D9E0E7"/>
+                  <w:left w:val="single" w:sz="3" w:space="0" w:color="D9E0E7"/>
+                  <w:bottom w:val="single" w:sz="3" w:space="0" w:color="D9E0E7"/>
+                  <w:right w:val="single" w:sz="3" w:space="0" w:color="D9E0E7"/>
+                </w:tcBorders>
+                <w:shd w:fill="FFFFFF"/>
+              </w:tcPr>
+            </w:tcPr>
+          </w:tcPr>
+          <w:p>
+            <w:r>
+              <w:t>A / Cultural Heritage Ministry</w:t>
+            </w:r>
+          </w:p>
+        </w:tc>
+        <w:tc>
+          <w:tcPr>
+            <w:tcPr>
+              <w:tcPr>
+                <w:tcW w:type="dxa" w:w="7143"/>
+                <w:tcBorders>
+                  <w:top w:val="single" w:sz="3" w:space="0" w:color="D9E0E7"/>
+                  <w:left w:val="single" w:sz="3" w:space="0" w:color="D9E0E7"/>
+                  <w:bottom w:val="single" w:sz="3" w:space="0" w:color="D9E0E7"/>
+                  <w:right w:val="single" w:sz="3" w:space="0" w:color="D9E0E7"/>
+                </w:tcBorders>
+                <w:shd w:fill="FFFFFF"/>
+              </w:tcPr>
+            </w:tcPr>
+          </w:tcPr>
+          <w:p>
+            <w:r>
+              <w:t>اداره‌کل موزه‌ها — تاریخچه و ساختار — https://iranmuseums.mcth.ir/history</w:t>
+            </w:r>
+          </w:p>
+        </w:tc>
+      </w:tr>
     </w:tbl>
     <w:p/>
     <w:p>
@@ -39874,6 +40436,15 @@
         <w:t>پیمایش رسمی بنیاد ملی بازی‌های رایانه‌ای تا پایان ۱۴۰۰، ۳۴ میلیون بازیکن، ۹۶٪ استفاده از موبایل و ۵۱۲ میلیارد تومان هزینه‌کرد software بازی موبایل گزارش می‌کند؛ این عدد historical و کل-category است، نه TAM فشن‌گیم. [F07-S12]</w:t>
       </w:r>
     </w:p>
+    <w:p>
+      <w:pPr>
+        <w:spacing w:after="100" w:line="300" w:lineRule="auto"/>
+        <w:jc w:val="right"/>
+      </w:pPr>
+      <w:r>
+        <w:t>دادهٔ تازه‌تر دایرک برای سال ۱۴۰۲ بر ۶٬۵۲۱ خانوار/۲۰٬۹۰۱ نفر، نمونه‌گیری خوشه‌ای‌ـ‌طبقه‌ای و ۳۴٫۳٪ بازیکن پس از وزن‌دهی تکیه دارد؛ گزارش موبایل همان پیمایش ۹۴٪+ mobile use، سن میانگین ۲۹ و ۶۱ دقیقه بازی روزانه را می‌گوید. market context قوی‌تر است، اما genre فشن، payer conversion، retention یا moderation economics را اندازه نمی‌گیرد. [F07-S13]</w:t>
+      </w:r>
+    </w:p>
     <w:tbl>
       <w:tblPr>
         <w:bidiVisual w:val="1"/>
@@ -42371,6 +42942,71 @@
           <w:p>
             <w:r>
               <w:t>بنیاد ملی بازی‌های رایانه‌ای، پیمایش ۱۴۰۰ — https://www.ircg.ir/fa/-news/5514/مجموع-هزینه-کرد-19-هزار-میلیاردی-بازیکنان-ایرانی-برای-نرم-افزار-و-سخت-افزار-بازی-های-دیجیتال</w:t>
+            </w:r>
+          </w:p>
+        </w:tc>
+      </w:tr>
+      <w:tr>
+        <w:tc>
+          <w:tcPr>
+            <w:tcPr>
+              <w:tcPr>
+                <w:tcW w:type="dxa" w:w="1191"/>
+                <w:tcBorders>
+                  <w:top w:val="single" w:sz="3" w:space="0" w:color="D9E0E7"/>
+                  <w:left w:val="single" w:sz="3" w:space="0" w:color="D9E0E7"/>
+                  <w:bottom w:val="single" w:sz="3" w:space="0" w:color="D9E0E7"/>
+                  <w:right w:val="single" w:sz="3" w:space="0" w:color="D9E0E7"/>
+                </w:tcBorders>
+                <w:shd w:fill="FFFFFF"/>
+              </w:tcPr>
+            </w:tcPr>
+          </w:tcPr>
+          <w:p>
+            <w:r>
+              <w:t>F07-S13</w:t>
+            </w:r>
+          </w:p>
+        </w:tc>
+        <w:tc>
+          <w:tcPr>
+            <w:tcPr>
+              <w:tcPr>
+                <w:tcW w:type="dxa" w:w="1531"/>
+                <w:tcBorders>
+                  <w:top w:val="single" w:sz="3" w:space="0" w:color="D9E0E7"/>
+                  <w:left w:val="single" w:sz="3" w:space="0" w:color="D9E0E7"/>
+                  <w:bottom w:val="single" w:sz="3" w:space="0" w:color="D9E0E7"/>
+                  <w:right w:val="single" w:sz="3" w:space="0" w:color="D9E0E7"/>
+                </w:tcBorders>
+                <w:shd w:fill="FFFFFF"/>
+              </w:tcPr>
+            </w:tcPr>
+          </w:tcPr>
+          <w:p>
+            <w:r>
+              <w:t>A/B / official national survey</w:t>
+            </w:r>
+          </w:p>
+        </w:tc>
+        <w:tc>
+          <w:tcPr>
+            <w:tcPr>
+              <w:tcPr>
+                <w:tcW w:type="dxa" w:w="7143"/>
+                <w:tcBorders>
+                  <w:top w:val="single" w:sz="3" w:space="0" w:color="D9E0E7"/>
+                  <w:left w:val="single" w:sz="3" w:space="0" w:color="D9E0E7"/>
+                  <w:bottom w:val="single" w:sz="3" w:space="0" w:color="D9E0E7"/>
+                  <w:right w:val="single" w:sz="3" w:space="0" w:color="D9E0E7"/>
+                </w:tcBorders>
+                <w:shd w:fill="FFFFFF"/>
+              </w:tcPr>
+            </w:tcPr>
+          </w:tcPr>
+          <w:p>
+            <w:r>
+              <w:t>دایرک/بنیاد — نمای باز و نمای نزدیک ۱۴۰۲ — https://direc.ircg.ir/27136/گزارش-نمای-باز-۱۴۰۲-شاخص‌ترین-اطلاع/ ; https://direc.ircg.ir/27616/گزارش-نمای-نزدیک-۱۴۰۲-پلتفرم-موبایل/</w:t>
             </w:r>
           </w:p>
         </w:tc>

</xml_diff>

<commit_message>
Add evidence-first market sizing and primary research protocol
</commit_message>
<xml_diff>
--- a/reports/fashion_market_research_master_v0.docx
+++ b/reports/fashion_market_research_master_v0.docx
@@ -358,11 +358,16 @@
           </w:tcPr>
           <w:p>
             <w:pPr>
-              <w:spacing w:after="20" w:line="259" w:lineRule="auto"/>
-              <w:jc w:val="right"/>
-            </w:pPr>
-            <w:r>
-              <w:t>۱٫۱ — برای هر هفت پرونده یک شاهد محلی/رسمی تازه با implication و limitation ثبت شد؛ primary evidence هنوز وجود ندارد.</w:t>
+              <w:jc w:val="right"/>
+              <w:bidi w:val="1"/>
+            </w:pPr>
+            <w:r>
+              <w:rPr>
+                <w:rFonts w:ascii="B Zar" w:hAnsi="B Zar" w:eastAsia="B Zar"/>
+                <w:b w:val="0"/>
+                <w:sz w:val="20"/>
+              </w:rPr>
+              <w:t>۱٫۲ — دفتر evidence-first برای TAM/SAM/SOM، price anchor خارجی و primary-research plan افزوده شد؛ ارقام پولی فقط در صورت denominator + قیمت محلی معتبر محاسبه می‌شوند.</w:t>
             </w:r>
           </w:p>
         </w:tc>
@@ -625,26 +630,18 @@
           </w:tcPr>
           <w:p>
             <w:pPr>
-              <w:spacing w:after="40"/>
-              <w:jc w:val="right"/>
-            </w:pPr>
-            <w:r>
-              <w:t>یادداشت اعتبار نسخهٔ ۱٫۱</w:t>
-            </w:r>
-          </w:p>
-          <w:p>
-            <w:pPr>
-              <w:spacing w:after="40" w:line="288" w:lineRule="auto"/>
-              <w:jc w:val="right"/>
-            </w:pPr>
-            <w:r>
-              <w:rPr>
-                <w:rFonts w:ascii="B Zar" w:hAnsi="B Zar"/>
-                <w:b w:val="0"/>
-                <w:color w:val="263238"/>
-                <w:sz w:val="19"/>
-              </w:rPr>
-              <w:t>این سند در این مرحله، روش، مرز تصمیم، سبد پرونده‌ها، ترتیب پژوهش و استاندارد بصری را تثبیت می‌کند. market size، willingness-to-pay، سهم بازار یا forecast هیچ پرونده‌ای بدون منبع و روش معتبر در این نسخه قطعی تلقی نمی‌شود.</w:t>
+              <w:jc w:val="right"/>
+              <w:bidi w:val="1"/>
+            </w:pPr>
+            <w:r>
+              <w:rPr>
+                <w:rFonts w:ascii="B Zar" w:hAnsi="B Zar" w:eastAsia="B Zar"/>
+                <w:b w:val="0"/>
+                <w:sz w:val="20"/>
+              </w:rPr>
+              <w:t>یادداشت اعتبار نسخهٔ ۱٫۲</w:t>
+              <w:br/>
+              <w:t>این سند همچنان حکم سرمایه‌گذاری یا گزارش نهایی بازار نیست. نسخهٔ ۱٫۲ دفتر فرمول/شواهد TAM، SAM و SOM و plan تحقیق اولیه را اضافه می‌کند: بدون شمارندهٔ واجد شرایط و قیمت/ARPA خالص محلی، خروجی پولی «محاسبه‌نشده» است. benchmark خارجی هرگز با تبدیل ارز، جای evidence ایران را نمی‌گیرد.</w:t>
             </w:r>
           </w:p>
         </w:tc>
@@ -12889,6 +12886,20 @@
         <w:t>۸. شکاف داده و برنامهٔ تکمیل شواهد</w:t>
       </w:r>
     </w:p>
+    <w:p>
+      <w:pPr>
+        <w:jc w:val="right"/>
+        <w:bidi w:val="1"/>
+      </w:pPr>
+      <w:r>
+        <w:rPr>
+          <w:rFonts w:ascii="B Zar" w:hAnsi="B Zar" w:eastAsia="B Zar"/>
+          <w:b w:val="0"/>
+          <w:sz w:val="22"/>
+        </w:rPr>
+        <w:t>دفتر تکمیلی TAM/SAM/SOM (نسخهٔ ۱٫۲) — این جدول جایگزین پرونده‌ها نیست؛ مرز محاسبهٔ مجاز را در سطح portfolio ثبت می‌کند.</w:t>
+      </w:r>
+    </w:p>
     <w:tbl>
       <w:tblPr>
         <w:bidiVisual w:val="1"/>
@@ -14832,6 +14843,20 @@
         <w:t>پیوست ب. تغییرنگار سند</w:t>
       </w:r>
     </w:p>
+    <w:p>
+      <w:pPr>
+        <w:jc w:val="right"/>
+        <w:bidi w:val="1"/>
+      </w:pPr>
+      <w:r>
+        <w:rPr>
+          <w:rFonts w:ascii="B Zar" w:hAnsi="B Zar" w:eastAsia="B Zar"/>
+          <w:b w:val="0"/>
+          <w:sz w:val="20"/>
+        </w:rPr>
+        <w:t>نسخهٔ ۱٫۲ | ۱۲ مهر ۱۴۰۵ / ۴ اکتبر ۲۰۲۶ | دفتر شفاف TAM/SAM/SOM، price anchorهای خارجی، دو proxy محدود F-07 و primary-research plan افزوده شد. هیچ پژوهش اولیه، survey یا pilot اجراشده ادعا نشده است.</w:t>
+      </w:r>
+    </w:p>
     <w:tbl>
       <w:tblPr>
         <w:bidiVisual w:val="1"/>
@@ -16280,6 +16305,34 @@
           <w:sz w:val="32"/>
         </w:rPr>
         <w:t>F-01. مدیریت گردش نمونهٔ لباس و Creator Seeding</w:t>
+      </w:r>
+    </w:p>
+    <w:p>
+      <w:pPr>
+        <w:jc w:val="right"/>
+        <w:bidi w:val="1"/>
+      </w:pPr>
+      <w:r>
+        <w:rPr>
+          <w:rFonts w:ascii="B Zar" w:hAnsi="B Zar" w:eastAsia="B Zar"/>
+          <w:b/>
+          <w:sz w:val="24"/>
+        </w:rPr>
+        <w:t>۵-الف. دفتر اندازهٔ بازار و قیمت — نسخهٔ ۱٫۲</w:t>
+      </w:r>
+    </w:p>
+    <w:p>
+      <w:pPr>
+        <w:jc w:val="right"/>
+        <w:bidi w:val="1"/>
+      </w:pPr>
+      <w:r>
+        <w:rPr>
+          <w:rFonts w:ascii="B Zar" w:hAnsi="B Zar" w:eastAsia="B Zar"/>
+          <w:b w:val="0"/>
+          <w:sz w:val="20"/>
+        </w:rPr>
+        <w:t>مدل: account واجدِ گردش نمونه × ARPA اعتبارسنجی‌شده. هیچ شمارنده یا ARPA ایران وجود ندارد؛ TAM/SAM/SOM پولی عمداً «محاسبه‌نشده» است. Launchmetrics از ۷۸۰ یورو/ماه و Sample Management می‌گوید [F01-S18]؛ فقط anchor خارجی category است و نباید به ریال، WTP یا TAM ایران تبدیل شود.</w:t>
       </w:r>
     </w:p>
     <w:tbl>
@@ -20290,6 +20343,34 @@
         <w:t>F-02. تداوم لباس و مدیریت دارایی برای تولیدات تصویری</w:t>
       </w:r>
     </w:p>
+    <w:p>
+      <w:pPr>
+        <w:jc w:val="right"/>
+        <w:bidi w:val="1"/>
+      </w:pPr>
+      <w:r>
+        <w:rPr>
+          <w:rFonts w:ascii="B Zar" w:hAnsi="B Zar" w:eastAsia="B Zar"/>
+          <w:b/>
+          <w:sz w:val="24"/>
+        </w:rPr>
+        <w:t>۵-الف. دفتر اندازهٔ بازار و قیمت — نسخهٔ ۱٫۲</w:t>
+      </w:r>
+    </w:p>
+    <w:p>
+      <w:pPr>
+        <w:jc w:val="right"/>
+        <w:bidi w:val="1"/>
+      </w:pPr>
+      <w:r>
+        <w:rPr>
+          <w:rFonts w:ascii="B Zar" w:hAnsi="B Zar" w:eastAsia="B Zar"/>
+          <w:b w:val="0"/>
+          <w:sz w:val="20"/>
+        </w:rPr>
+        <w:t>مدل: پروژهٔ تصویریِ دارای costume workflow × fee پروژه/سال؛ inputهای count، complexity و fee ایران موجود نیست. SyncOnSet Lite، ۲۵۰ دلار برای ۴ هفته (و ۱۰۰ دلار برای هفتهٔ اضافه) اعلام می‌کند [F02-S13]؛ benchmark خارجی project-fee است، نه قیمت پیشنهادی ایران.</w:t>
+      </w:r>
+    </w:p>
     <w:tbl>
       <w:tblPr>
         <w:bidiVisual w:val="1"/>
@@ -23918,6 +23999,34 @@
           <w:sz w:val="32"/>
         </w:rPr>
         <w:t>F-03. Tech Pack تا تأیید نمونه و قفل انتشار تولید انبوه</w:t>
+      </w:r>
+    </w:p>
+    <w:p>
+      <w:pPr>
+        <w:jc w:val="right"/>
+        <w:bidi w:val="1"/>
+      </w:pPr>
+      <w:r>
+        <w:rPr>
+          <w:rFonts w:ascii="B Zar" w:hAnsi="B Zar" w:eastAsia="B Zar"/>
+          <w:b/>
+          <w:sz w:val="24"/>
+        </w:rPr>
+        <w:t>۵-الف. دفتر اندازهٔ بازار و قیمت — نسخهٔ ۱٫۲</w:t>
+      </w:r>
+    </w:p>
+    <w:p>
+      <w:pPr>
+        <w:jc w:val="right"/>
+        <w:bidi w:val="1"/>
+      </w:pPr>
+      <w:r>
+        <w:rPr>
+          <w:rFonts w:ascii="B Zar" w:hAnsi="B Zar" w:eastAsia="B Zar"/>
+          <w:b w:val="0"/>
+          <w:sz w:val="20"/>
+        </w:rPr>
+        <w:t>مدل: workspace برندِ دارای product-development ساختاریافته × seat/workspace ARPA. شمار brand واجد، style cadence و price acceptance ایران مفقود است. Techpacker tierهای ۳۵/۹۵/۱۲۵ دلار per user/month با annual billing دارد [F03-S18]؛ این architecture خارجی، ARPA ایران نیست.</w:t>
       </w:r>
     </w:p>
     <w:tbl>
@@ -28576,6 +28685,34 @@
         <w:t>F-04. اصالت‌سنجی مستقل پوشاک و اسنیکر برند پیش از معامله</w:t>
       </w:r>
     </w:p>
+    <w:p>
+      <w:pPr>
+        <w:jc w:val="right"/>
+        <w:bidi w:val="1"/>
+      </w:pPr>
+      <w:r>
+        <w:rPr>
+          <w:rFonts w:ascii="B Zar" w:hAnsi="B Zar" w:eastAsia="B Zar"/>
+          <w:b/>
+          <w:sz w:val="24"/>
+        </w:rPr>
+        <w:t>۵-الف. دفتر اندازهٔ بازار و قیمت — نسخهٔ ۱٫۲</w:t>
+      </w:r>
+    </w:p>
+    <w:p>
+      <w:pPr>
+        <w:jc w:val="right"/>
+        <w:bidi w:val="1"/>
+      </w:pPr>
+      <w:r>
+        <w:rPr>
+          <w:rFonts w:ascii="B Zar" w:hAnsi="B Zar" w:eastAsia="B Zar"/>
+          <w:b w:val="0"/>
+          <w:sz w:val="20"/>
+        </w:rPr>
+        <w:t>مدل: معامله/مالک item واجد value threshold × احتمال نیاز به verdict × fee خالص. حجم معامله، fraud، brand coverage و fee acceptance ایران معلوم نیست. LegitApp از ۳ دلار برای sneaker و از ۱۰ دلار برای clothing/shoes می‌گوید [F04-S13]؛ conversion ارزی و تعمیم حقوقی ممنوع است.</w:t>
+      </w:r>
+    </w:p>
     <w:tbl>
       <w:tblPr>
         <w:bidiVisual w:val="1"/>
@@ -32110,6 +32247,34 @@
         <w:t>F-05. اجرای Visual Merchandising چندشعبه‌ای</w:t>
       </w:r>
     </w:p>
+    <w:p>
+      <w:pPr>
+        <w:jc w:val="right"/>
+        <w:bidi w:val="1"/>
+      </w:pPr>
+      <w:r>
+        <w:rPr>
+          <w:rFonts w:ascii="B Zar" w:hAnsi="B Zar" w:eastAsia="B Zar"/>
+          <w:b/>
+          <w:sz w:val="24"/>
+        </w:rPr>
+        <w:t>۵-الف. دفتر اندازهٔ بازار و قیمت — نسخهٔ ۱٫۲</w:t>
+      </w:r>
+    </w:p>
+    <w:p>
+      <w:pPr>
+        <w:jc w:val="right"/>
+        <w:bidi w:val="1"/>
+      </w:pPr>
+      <w:r>
+        <w:rPr>
+          <w:rFonts w:ascii="B Zar" w:hAnsi="B Zar" w:eastAsia="B Zar"/>
+          <w:b w:val="0"/>
+          <w:sz w:val="20"/>
+        </w:rPr>
+        <w:t>مدل مشروط: زنجیره/فرنچایزِ دارای شعبه و campaign cadence × fee store/user. نمونهٔ ۲۰+ شعبه denominator نیست؛ تا account map، failure mode و buyer مستقل ساخته نشود، TAM/SAM/SOM و per-store price «محاسبه‌نشده» می‌مانند. وضعیت آرشیوی و منع بازپیشنهاد پابرجاست.</w:t>
+      </w:r>
+    </w:p>
     <w:tbl>
       <w:tblPr>
         <w:bidiVisual w:val="1"/>
@@ -36430,6 +36595,34 @@
           <w:sz w:val="32"/>
         </w:rPr>
         <w:t>F-06. آرشیو، امانت و Condition Report لباس</w:t>
+      </w:r>
+    </w:p>
+    <w:p>
+      <w:pPr>
+        <w:jc w:val="right"/>
+        <w:bidi w:val="1"/>
+      </w:pPr>
+      <w:r>
+        <w:rPr>
+          <w:rFonts w:ascii="B Zar" w:hAnsi="B Zar" w:eastAsia="B Zar"/>
+          <w:b/>
+          <w:sz w:val="24"/>
+        </w:rPr>
+        <w:t>۵-الف. دفتر اندازهٔ بازار و قیمت — نسخهٔ ۱٫۲</w:t>
+      </w:r>
+    </w:p>
+    <w:p>
+      <w:pPr>
+        <w:jc w:val="right"/>
+        <w:bidi w:val="1"/>
+      </w:pPr>
+      <w:r>
+        <w:rPr>
+          <w:rFonts w:ascii="B Zar" w:hAnsi="B Zar" w:eastAsia="B Zar"/>
+          <w:b w:val="0"/>
+          <w:sz w:val="20"/>
+        </w:rPr>
+        <w:t>مدل: مجموعهٔ واجد collection/loan/condition × fee سالانه CMS. Axiell در بازار دولتی بریتانیا ۵٬۵۰۰ پوند/سال برای دو concurrent licence درج کرده است [F06-S10]؛ فقط شاهد complexity/procurement خارجی است. شمار موزه یا شیء، price و TAM ایران نیست.</w:t>
       </w:r>
     </w:p>
     <w:tbl>
@@ -39869,6 +40062,34 @@
           <w:sz w:val="32"/>
         </w:rPr>
         <w:t>F-07. فشن‌گیم اجتماعی بومی</w:t>
+      </w:r>
+    </w:p>
+    <w:p>
+      <w:pPr>
+        <w:jc w:val="right"/>
+        <w:bidi w:val="1"/>
+      </w:pPr>
+      <w:r>
+        <w:rPr>
+          <w:rFonts w:ascii="B Zar" w:hAnsi="B Zar" w:eastAsia="B Zar"/>
+          <w:b/>
+          <w:sz w:val="24"/>
+        </w:rPr>
+        <w:t>۵-الف. دفتر اندازهٔ بازار و قیمت — نسخهٔ ۱٫۲</w:t>
+      </w:r>
+    </w:p>
+    <w:p>
+      <w:pPr>
+        <w:jc w:val="right"/>
+        <w:bidi w:val="1"/>
+      </w:pPr>
+      <w:r>
+        <w:rPr>
+          <w:rFonts w:ascii="B Zar" w:hAnsi="B Zar" w:eastAsia="B Zar"/>
+          <w:b w:val="0"/>
+          <w:sz w:val="20"/>
+        </w:rPr>
+        <w:t>۳۴٫۳٪ × جمعیت WHO ۲۰۲۳ (۹۰٬۶۰۸٬۷۰۷) ≈ ۳۱٫۱ میلیون gamer context [F07-S13][F07-S15]؛ نه TAM فشن‌گیم. دادهٔ مایکت: ۵M خرید × ۱۰۴هزار تومان = حدود ۵۲۰B تومان ارزش تراکنش بازی در همان platform [F07-S14]؛ نه کل بازار، revenue developer یا forecast. genre fit، payer و retention نامعلوم‌اند؛ TAM/SAM/SOM پولی گزارش نمی‌شود.</w:t>
       </w:r>
     </w:p>
     <w:tbl>
@@ -43459,6 +43680,1869 @@
       </w:tr>
     </w:tbl>
     <w:p/>
+    <w:tbl>
+      <w:tblPr>
+        <w:tblW w:type="auto" w:w="0"/>
+        <w:jc w:val="center"/>
+        <w:tblLook w:firstColumn="1" w:firstRow="1" w:lastColumn="0" w:lastRow="0" w:noHBand="0" w:noVBand="1" w:val="04A0"/>
+      </w:tblPr>
+      <w:tblGrid>
+        <w:gridCol w:w="1928"/>
+        <w:gridCol w:w="1928"/>
+        <w:gridCol w:w="1928"/>
+        <w:gridCol w:w="1928"/>
+        <w:gridCol w:w="1928"/>
+      </w:tblGrid>
+      <w:tr>
+        <w:tc>
+          <w:tcPr>
+            <w:tcW w:type="dxa" w:w="1928"/>
+            <w:vAlign w:val="center"/>
+            <w:shd w:fill="1F4E78"/>
+          </w:tcPr>
+          <w:p>
+            <w:pPr>
+              <w:jc w:val="right"/>
+              <w:bidi w:val="1"/>
+            </w:pPr>
+            <w:r>
+              <w:rPr>
+                <w:color w:val="FFFFFF"/>
+              </w:rPr>
+            </w:r>
+            <w:r>
+              <w:rPr>
+                <w:rFonts w:ascii="B Zar" w:hAnsi="B Zar" w:eastAsia="B Zar"/>
+                <w:b/>
+                <w:color w:val="FFFFFF"/>
+                <w:sz w:val="20"/>
+              </w:rPr>
+              <w:t>پرونده</w:t>
+            </w:r>
+          </w:p>
+        </w:tc>
+        <w:tc>
+          <w:tcPr>
+            <w:tcW w:type="dxa" w:w="1928"/>
+            <w:vAlign w:val="center"/>
+            <w:shd w:fill="1F4E78"/>
+          </w:tcPr>
+          <w:p>
+            <w:pPr>
+              <w:jc w:val="right"/>
+              <w:bidi w:val="1"/>
+            </w:pPr>
+            <w:r>
+              <w:rPr>
+                <w:color w:val="FFFFFF"/>
+              </w:rPr>
+            </w:r>
+            <w:r>
+              <w:rPr>
+                <w:rFonts w:ascii="B Zar" w:hAnsi="B Zar" w:eastAsia="B Zar"/>
+                <w:b/>
+                <w:color w:val="FFFFFF"/>
+                <w:sz w:val="20"/>
+              </w:rPr>
+              <w:t>وضعیت TAM/SAM/SOM پولی</w:t>
+            </w:r>
+          </w:p>
+        </w:tc>
+        <w:tc>
+          <w:tcPr>
+            <w:tcW w:type="dxa" w:w="1928"/>
+            <w:vAlign w:val="center"/>
+            <w:shd w:fill="1F4E78"/>
+          </w:tcPr>
+          <w:p>
+            <w:pPr>
+              <w:jc w:val="right"/>
+              <w:bidi w:val="1"/>
+            </w:pPr>
+            <w:r>
+              <w:rPr>
+                <w:color w:val="FFFFFF"/>
+              </w:rPr>
+            </w:r>
+            <w:r>
+              <w:rPr>
+                <w:rFonts w:ascii="B Zar" w:hAnsi="B Zar" w:eastAsia="B Zar"/>
+                <w:b/>
+                <w:color w:val="FFFFFF"/>
+                <w:sz w:val="20"/>
+              </w:rPr>
+              <w:t>شاهد عددیِ مجاز</w:t>
+            </w:r>
+          </w:p>
+        </w:tc>
+        <w:tc>
+          <w:tcPr>
+            <w:tcW w:type="dxa" w:w="1928"/>
+            <w:vAlign w:val="center"/>
+            <w:shd w:fill="1F4E78"/>
+          </w:tcPr>
+          <w:p>
+            <w:pPr>
+              <w:jc w:val="right"/>
+              <w:bidi w:val="1"/>
+            </w:pPr>
+            <w:r>
+              <w:rPr>
+                <w:color w:val="FFFFFF"/>
+              </w:rPr>
+            </w:r>
+            <w:r>
+              <w:rPr>
+                <w:rFonts w:ascii="B Zar" w:hAnsi="B Zar" w:eastAsia="B Zar"/>
+                <w:b/>
+                <w:color w:val="FFFFFF"/>
+                <w:sz w:val="20"/>
+              </w:rPr>
+              <w:t>گیت اولیه</w:t>
+            </w:r>
+          </w:p>
+        </w:tc>
+        <w:tc>
+          <w:tcPr>
+            <w:tcW w:type="dxa" w:w="1928"/>
+            <w:vAlign w:val="center"/>
+            <w:shd w:fill="1F4E78"/>
+          </w:tcPr>
+          <w:p>
+            <w:pPr>
+              <w:jc w:val="right"/>
+              <w:bidi w:val="1"/>
+            </w:pPr>
+            <w:r>
+              <w:rPr>
+                <w:color w:val="FFFFFF"/>
+              </w:rPr>
+            </w:r>
+            <w:r>
+              <w:rPr>
+                <w:rFonts w:ascii="B Zar" w:hAnsi="B Zar" w:eastAsia="B Zar"/>
+                <w:b/>
+                <w:color w:val="FFFFFF"/>
+                <w:sz w:val="20"/>
+              </w:rPr>
+              <w:t>اقدام مجاز</w:t>
+            </w:r>
+          </w:p>
+        </w:tc>
+      </w:tr>
+      <w:tr>
+        <w:tc>
+          <w:tcPr>
+            <w:tcW w:type="dxa" w:w="1928"/>
+            <w:vAlign w:val="center"/>
+            <w:shd w:fill="EAF2F8"/>
+          </w:tcPr>
+          <w:p>
+            <w:pPr>
+              <w:jc w:val="right"/>
+              <w:bidi w:val="1"/>
+            </w:pPr>
+            <w:r/>
+            <w:r>
+              <w:rPr>
+                <w:rFonts w:ascii="B Zar" w:hAnsi="B Zar" w:eastAsia="B Zar"/>
+                <w:b w:val="0"/>
+                <w:sz w:val="20"/>
+              </w:rPr>
+              <w:t>F-01</w:t>
+            </w:r>
+          </w:p>
+        </w:tc>
+        <w:tc>
+          <w:tcPr>
+            <w:tcW w:type="dxa" w:w="1928"/>
+            <w:vAlign w:val="center"/>
+            <w:shd w:fill="EAF2F8"/>
+          </w:tcPr>
+          <w:p>
+            <w:pPr>
+              <w:jc w:val="right"/>
+              <w:bidi w:val="1"/>
+            </w:pPr>
+            <w:r/>
+            <w:r>
+              <w:rPr>
+                <w:rFonts w:ascii="B Zar" w:hAnsi="B Zar" w:eastAsia="B Zar"/>
+                <w:b w:val="0"/>
+                <w:sz w:val="20"/>
+              </w:rPr>
+              <w:t>محاسبه‌نشده</w:t>
+            </w:r>
+          </w:p>
+        </w:tc>
+        <w:tc>
+          <w:tcPr>
+            <w:tcW w:type="dxa" w:w="1928"/>
+            <w:vAlign w:val="center"/>
+            <w:shd w:fill="EAF2F8"/>
+          </w:tcPr>
+          <w:p>
+            <w:pPr>
+              <w:jc w:val="right"/>
+              <w:bidi w:val="1"/>
+            </w:pPr>
+            <w:r/>
+            <w:r>
+              <w:rPr>
+                <w:rFonts w:ascii="B Zar" w:hAnsi="B Zar" w:eastAsia="B Zar"/>
+                <w:b w:val="0"/>
+                <w:sz w:val="20"/>
+              </w:rPr>
+              <w:t>ندارد؛ €780/mo فقط anchor خارجی</w:t>
+            </w:r>
+          </w:p>
+        </w:tc>
+        <w:tc>
+          <w:tcPr>
+            <w:tcW w:type="dxa" w:w="1928"/>
+            <w:vAlign w:val="center"/>
+            <w:shd w:fill="EAF2F8"/>
+          </w:tcPr>
+          <w:p>
+            <w:pPr>
+              <w:jc w:val="right"/>
+              <w:bidi w:val="1"/>
+            </w:pPr>
+            <w:r/>
+            <w:r>
+              <w:rPr>
+                <w:rFonts w:ascii="B Zar" w:hAnsi="B Zar" w:eastAsia="B Zar"/>
+                <w:b w:val="0"/>
+                <w:sz w:val="20"/>
+              </w:rPr>
+              <w:t>account map + ARPA ایران</w:t>
+            </w:r>
+          </w:p>
+        </w:tc>
+        <w:tc>
+          <w:tcPr>
+            <w:tcW w:type="dxa" w:w="1928"/>
+            <w:vAlign w:val="center"/>
+            <w:shd w:fill="EAF2F8"/>
+          </w:tcPr>
+          <w:p>
+            <w:pPr>
+              <w:jc w:val="right"/>
+              <w:bidi w:val="1"/>
+            </w:pPr>
+            <w:r/>
+            <w:r>
+              <w:rPr>
+                <w:rFonts w:ascii="B Zar" w:hAnsi="B Zar" w:eastAsia="B Zar"/>
+                <w:b w:val="0"/>
+                <w:sz w:val="20"/>
+              </w:rPr>
+              <w:t>artifact-led discovery</w:t>
+            </w:r>
+          </w:p>
+        </w:tc>
+      </w:tr>
+      <w:tr>
+        <w:tc>
+          <w:tcPr>
+            <w:tcW w:type="dxa" w:w="1928"/>
+            <w:vAlign w:val="center"/>
+          </w:tcPr>
+          <w:p>
+            <w:pPr>
+              <w:jc w:val="right"/>
+              <w:bidi w:val="1"/>
+            </w:pPr>
+            <w:r/>
+            <w:r>
+              <w:rPr>
+                <w:rFonts w:ascii="B Zar" w:hAnsi="B Zar" w:eastAsia="B Zar"/>
+                <w:b w:val="0"/>
+                <w:sz w:val="20"/>
+              </w:rPr>
+              <w:t>F-02</w:t>
+            </w:r>
+          </w:p>
+        </w:tc>
+        <w:tc>
+          <w:tcPr>
+            <w:tcW w:type="dxa" w:w="1928"/>
+            <w:vAlign w:val="center"/>
+          </w:tcPr>
+          <w:p>
+            <w:pPr>
+              <w:jc w:val="right"/>
+              <w:bidi w:val="1"/>
+            </w:pPr>
+            <w:r/>
+            <w:r>
+              <w:rPr>
+                <w:rFonts w:ascii="B Zar" w:hAnsi="B Zar" w:eastAsia="B Zar"/>
+                <w:b w:val="0"/>
+                <w:sz w:val="20"/>
+              </w:rPr>
+              <w:t>محاسبه‌نشده</w:t>
+            </w:r>
+          </w:p>
+        </w:tc>
+        <w:tc>
+          <w:tcPr>
+            <w:tcW w:type="dxa" w:w="1928"/>
+            <w:vAlign w:val="center"/>
+          </w:tcPr>
+          <w:p>
+            <w:pPr>
+              <w:jc w:val="right"/>
+              <w:bidi w:val="1"/>
+            </w:pPr>
+            <w:r/>
+            <w:r>
+              <w:rPr>
+                <w:rFonts w:ascii="B Zar" w:hAnsi="B Zar" w:eastAsia="B Zar"/>
+                <w:b w:val="0"/>
+                <w:sz w:val="20"/>
+              </w:rPr>
+              <w:t>$250/4wk خارجی فقط</w:t>
+            </w:r>
+          </w:p>
+        </w:tc>
+        <w:tc>
+          <w:tcPr>
+            <w:tcW w:type="dxa" w:w="1928"/>
+            <w:vAlign w:val="center"/>
+          </w:tcPr>
+          <w:p>
+            <w:pPr>
+              <w:jc w:val="right"/>
+              <w:bidi w:val="1"/>
+            </w:pPr>
+            <w:r/>
+            <w:r>
+              <w:rPr>
+                <w:rFonts w:ascii="B Zar" w:hAnsi="B Zar" w:eastAsia="B Zar"/>
+                <w:b w:val="0"/>
+                <w:sz w:val="20"/>
+              </w:rPr>
+              <w:t>project/costume census + fee</w:t>
+            </w:r>
+          </w:p>
+        </w:tc>
+        <w:tc>
+          <w:tcPr>
+            <w:tcW w:type="dxa" w:w="1928"/>
+            <w:vAlign w:val="center"/>
+          </w:tcPr>
+          <w:p>
+            <w:pPr>
+              <w:jc w:val="right"/>
+              <w:bidi w:val="1"/>
+            </w:pPr>
+            <w:r/>
+            <w:r>
+              <w:rPr>
+                <w:rFonts w:ascii="B Zar" w:hAnsi="B Zar" w:eastAsia="B Zar"/>
+                <w:b w:val="0"/>
+                <w:sz w:val="20"/>
+              </w:rPr>
+              <w:t>pilot project</w:t>
+            </w:r>
+          </w:p>
+        </w:tc>
+      </w:tr>
+      <w:tr>
+        <w:tc>
+          <w:tcPr>
+            <w:tcW w:type="dxa" w:w="1928"/>
+            <w:vAlign w:val="center"/>
+            <w:shd w:fill="EAF2F8"/>
+          </w:tcPr>
+          <w:p>
+            <w:pPr>
+              <w:jc w:val="right"/>
+              <w:bidi w:val="1"/>
+            </w:pPr>
+            <w:r/>
+            <w:r>
+              <w:rPr>
+                <w:rFonts w:ascii="B Zar" w:hAnsi="B Zar" w:eastAsia="B Zar"/>
+                <w:b w:val="0"/>
+                <w:sz w:val="20"/>
+              </w:rPr>
+              <w:t>F-03</w:t>
+            </w:r>
+          </w:p>
+        </w:tc>
+        <w:tc>
+          <w:tcPr>
+            <w:tcW w:type="dxa" w:w="1928"/>
+            <w:vAlign w:val="center"/>
+            <w:shd w:fill="EAF2F8"/>
+          </w:tcPr>
+          <w:p>
+            <w:pPr>
+              <w:jc w:val="right"/>
+              <w:bidi w:val="1"/>
+            </w:pPr>
+            <w:r/>
+            <w:r>
+              <w:rPr>
+                <w:rFonts w:ascii="B Zar" w:hAnsi="B Zar" w:eastAsia="B Zar"/>
+                <w:b w:val="0"/>
+                <w:sz w:val="20"/>
+              </w:rPr>
+              <w:t>محاسبه‌نشده</w:t>
+            </w:r>
+          </w:p>
+        </w:tc>
+        <w:tc>
+          <w:tcPr>
+            <w:tcW w:type="dxa" w:w="1928"/>
+            <w:vAlign w:val="center"/>
+            <w:shd w:fill="EAF2F8"/>
+          </w:tcPr>
+          <w:p>
+            <w:pPr>
+              <w:jc w:val="right"/>
+              <w:bidi w:val="1"/>
+            </w:pPr>
+            <w:r/>
+            <w:r>
+              <w:rPr>
+                <w:rFonts w:ascii="B Zar" w:hAnsi="B Zar" w:eastAsia="B Zar"/>
+                <w:b w:val="0"/>
+                <w:sz w:val="20"/>
+              </w:rPr>
+              <w:t>$35/$95/$125 خارجی فقط</w:t>
+            </w:r>
+          </w:p>
+        </w:tc>
+        <w:tc>
+          <w:tcPr>
+            <w:tcW w:type="dxa" w:w="1928"/>
+            <w:vAlign w:val="center"/>
+            <w:shd w:fill="EAF2F8"/>
+          </w:tcPr>
+          <w:p>
+            <w:pPr>
+              <w:jc w:val="right"/>
+              <w:bidi w:val="1"/>
+            </w:pPr>
+            <w:r/>
+            <w:r>
+              <w:rPr>
+                <w:rFonts w:ascii="B Zar" w:hAnsi="B Zar" w:eastAsia="B Zar"/>
+                <w:b w:val="0"/>
+                <w:sz w:val="20"/>
+              </w:rPr>
+              <w:t>brand/style/workshop + ARPA</w:t>
+            </w:r>
+          </w:p>
+        </w:tc>
+        <w:tc>
+          <w:tcPr>
+            <w:tcW w:type="dxa" w:w="1928"/>
+            <w:vAlign w:val="center"/>
+            <w:shd w:fill="EAF2F8"/>
+          </w:tcPr>
+          <w:p>
+            <w:pPr>
+              <w:jc w:val="right"/>
+              <w:bidi w:val="1"/>
+            </w:pPr>
+            <w:r/>
+            <w:r>
+              <w:rPr>
+                <w:rFonts w:ascii="B Zar" w:hAnsi="B Zar" w:eastAsia="B Zar"/>
+                <w:b w:val="0"/>
+                <w:sz w:val="20"/>
+              </w:rPr>
+              <w:t>workflow/pilot</w:t>
+            </w:r>
+          </w:p>
+        </w:tc>
+      </w:tr>
+      <w:tr>
+        <w:tc>
+          <w:tcPr>
+            <w:tcW w:type="dxa" w:w="1928"/>
+            <w:vAlign w:val="center"/>
+          </w:tcPr>
+          <w:p>
+            <w:pPr>
+              <w:jc w:val="right"/>
+              <w:bidi w:val="1"/>
+            </w:pPr>
+            <w:r/>
+            <w:r>
+              <w:rPr>
+                <w:rFonts w:ascii="B Zar" w:hAnsi="B Zar" w:eastAsia="B Zar"/>
+                <w:b w:val="0"/>
+                <w:sz w:val="20"/>
+              </w:rPr>
+              <w:t>F-04</w:t>
+            </w:r>
+          </w:p>
+        </w:tc>
+        <w:tc>
+          <w:tcPr>
+            <w:tcW w:type="dxa" w:w="1928"/>
+            <w:vAlign w:val="center"/>
+          </w:tcPr>
+          <w:p>
+            <w:pPr>
+              <w:jc w:val="right"/>
+              <w:bidi w:val="1"/>
+            </w:pPr>
+            <w:r/>
+            <w:r>
+              <w:rPr>
+                <w:rFonts w:ascii="B Zar" w:hAnsi="B Zar" w:eastAsia="B Zar"/>
+                <w:b w:val="0"/>
+                <w:sz w:val="20"/>
+              </w:rPr>
+              <w:t>محاسبه‌نشده</w:t>
+            </w:r>
+          </w:p>
+        </w:tc>
+        <w:tc>
+          <w:tcPr>
+            <w:tcW w:type="dxa" w:w="1928"/>
+            <w:vAlign w:val="center"/>
+          </w:tcPr>
+          <w:p>
+            <w:pPr>
+              <w:jc w:val="right"/>
+              <w:bidi w:val="1"/>
+            </w:pPr>
+            <w:r/>
+            <w:r>
+              <w:rPr>
+                <w:rFonts w:ascii="B Zar" w:hAnsi="B Zar" w:eastAsia="B Zar"/>
+                <w:b w:val="0"/>
+                <w:sz w:val="20"/>
+              </w:rPr>
+              <w:t>$3/$4/$10 خارجی فقط</w:t>
+            </w:r>
+          </w:p>
+        </w:tc>
+        <w:tc>
+          <w:tcPr>
+            <w:tcW w:type="dxa" w:w="1928"/>
+            <w:vAlign w:val="center"/>
+          </w:tcPr>
+          <w:p>
+            <w:pPr>
+              <w:jc w:val="right"/>
+              <w:bidi w:val="1"/>
+            </w:pPr>
+            <w:r/>
+            <w:r>
+              <w:rPr>
+                <w:rFonts w:ascii="B Zar" w:hAnsi="B Zar" w:eastAsia="B Zar"/>
+                <w:b w:val="0"/>
+                <w:sz w:val="20"/>
+              </w:rPr>
+              <w:t>transaction + fraud + fee</w:t>
+            </w:r>
+          </w:p>
+        </w:tc>
+        <w:tc>
+          <w:tcPr>
+            <w:tcW w:type="dxa" w:w="1928"/>
+            <w:vAlign w:val="center"/>
+          </w:tcPr>
+          <w:p>
+            <w:pPr>
+              <w:jc w:val="right"/>
+              <w:bidi w:val="1"/>
+            </w:pPr>
+            <w:r/>
+            <w:r>
+              <w:rPr>
+                <w:rFonts w:ascii="B Zar" w:hAnsi="B Zar" w:eastAsia="B Zar"/>
+                <w:b w:val="0"/>
+                <w:sz w:val="20"/>
+              </w:rPr>
+              <w:t>case-level test</w:t>
+            </w:r>
+          </w:p>
+        </w:tc>
+      </w:tr>
+      <w:tr>
+        <w:tc>
+          <w:tcPr>
+            <w:tcW w:type="dxa" w:w="1928"/>
+            <w:vAlign w:val="center"/>
+            <w:shd w:fill="EAF2F8"/>
+          </w:tcPr>
+          <w:p>
+            <w:pPr>
+              <w:jc w:val="right"/>
+              <w:bidi w:val="1"/>
+            </w:pPr>
+            <w:r/>
+            <w:r>
+              <w:rPr>
+                <w:rFonts w:ascii="B Zar" w:hAnsi="B Zar" w:eastAsia="B Zar"/>
+                <w:b w:val="0"/>
+                <w:sz w:val="20"/>
+              </w:rPr>
+              <w:t>F-05</w:t>
+            </w:r>
+          </w:p>
+        </w:tc>
+        <w:tc>
+          <w:tcPr>
+            <w:tcW w:type="dxa" w:w="1928"/>
+            <w:vAlign w:val="center"/>
+            <w:shd w:fill="EAF2F8"/>
+          </w:tcPr>
+          <w:p>
+            <w:pPr>
+              <w:jc w:val="right"/>
+              <w:bidi w:val="1"/>
+            </w:pPr>
+            <w:r/>
+            <w:r>
+              <w:rPr>
+                <w:rFonts w:ascii="B Zar" w:hAnsi="B Zar" w:eastAsia="B Zar"/>
+                <w:b w:val="0"/>
+                <w:sz w:val="20"/>
+              </w:rPr>
+              <w:t>محاسبه‌نشده</w:t>
+            </w:r>
+          </w:p>
+        </w:tc>
+        <w:tc>
+          <w:tcPr>
+            <w:tcW w:type="dxa" w:w="1928"/>
+            <w:vAlign w:val="center"/>
+            <w:shd w:fill="EAF2F8"/>
+          </w:tcPr>
+          <w:p>
+            <w:pPr>
+              <w:jc w:val="right"/>
+              <w:bidi w:val="1"/>
+            </w:pPr>
+            <w:r/>
+            <w:r>
+              <w:rPr>
+                <w:rFonts w:ascii="B Zar" w:hAnsi="B Zar" w:eastAsia="B Zar"/>
+                <w:b w:val="0"/>
+                <w:sz w:val="20"/>
+              </w:rPr>
+              <w:t>ندارد</w:t>
+            </w:r>
+          </w:p>
+        </w:tc>
+        <w:tc>
+          <w:tcPr>
+            <w:tcW w:type="dxa" w:w="1928"/>
+            <w:vAlign w:val="center"/>
+            <w:shd w:fill="EAF2F8"/>
+          </w:tcPr>
+          <w:p>
+            <w:pPr>
+              <w:jc w:val="right"/>
+              <w:bidi w:val="1"/>
+            </w:pPr>
+            <w:r/>
+            <w:r>
+              <w:rPr>
+                <w:rFonts w:ascii="B Zar" w:hAnsi="B Zar" w:eastAsia="B Zar"/>
+                <w:b w:val="0"/>
+                <w:sz w:val="20"/>
+              </w:rPr>
+              <w:t>chain map + VM failure + buyer</w:t>
+            </w:r>
+          </w:p>
+        </w:tc>
+        <w:tc>
+          <w:tcPr>
+            <w:tcW w:type="dxa" w:w="1928"/>
+            <w:vAlign w:val="center"/>
+            <w:shd w:fill="EAF2F8"/>
+          </w:tcPr>
+          <w:p>
+            <w:pPr>
+              <w:jc w:val="right"/>
+              <w:bidi w:val="1"/>
+            </w:pPr>
+            <w:r/>
+            <w:r>
+              <w:rPr>
+                <w:rFonts w:ascii="B Zar" w:hAnsi="B Zar" w:eastAsia="B Zar"/>
+                <w:b w:val="0"/>
+                <w:sz w:val="20"/>
+              </w:rPr>
+              <w:t>فقط با reversal</w:t>
+            </w:r>
+          </w:p>
+        </w:tc>
+      </w:tr>
+      <w:tr>
+        <w:tc>
+          <w:tcPr>
+            <w:tcW w:type="dxa" w:w="1928"/>
+            <w:vAlign w:val="center"/>
+          </w:tcPr>
+          <w:p>
+            <w:pPr>
+              <w:jc w:val="right"/>
+              <w:bidi w:val="1"/>
+            </w:pPr>
+            <w:r/>
+            <w:r>
+              <w:rPr>
+                <w:rFonts w:ascii="B Zar" w:hAnsi="B Zar" w:eastAsia="B Zar"/>
+                <w:b w:val="0"/>
+                <w:sz w:val="20"/>
+              </w:rPr>
+              <w:t>F-06</w:t>
+            </w:r>
+          </w:p>
+        </w:tc>
+        <w:tc>
+          <w:tcPr>
+            <w:tcW w:type="dxa" w:w="1928"/>
+            <w:vAlign w:val="center"/>
+          </w:tcPr>
+          <w:p>
+            <w:pPr>
+              <w:jc w:val="right"/>
+              <w:bidi w:val="1"/>
+            </w:pPr>
+            <w:r/>
+            <w:r>
+              <w:rPr>
+                <w:rFonts w:ascii="B Zar" w:hAnsi="B Zar" w:eastAsia="B Zar"/>
+                <w:b w:val="0"/>
+                <w:sz w:val="20"/>
+              </w:rPr>
+              <w:t>محاسبه‌نشده</w:t>
+            </w:r>
+          </w:p>
+        </w:tc>
+        <w:tc>
+          <w:tcPr>
+            <w:tcW w:type="dxa" w:w="1928"/>
+            <w:vAlign w:val="center"/>
+          </w:tcPr>
+          <w:p>
+            <w:pPr>
+              <w:jc w:val="right"/>
+              <w:bidi w:val="1"/>
+            </w:pPr>
+            <w:r/>
+            <w:r>
+              <w:rPr>
+                <w:rFonts w:ascii="B Zar" w:hAnsi="B Zar" w:eastAsia="B Zar"/>
+                <w:b w:val="0"/>
+                <w:sz w:val="20"/>
+              </w:rPr>
+              <w:t>£5,500/yr خارجی فقط</w:t>
+            </w:r>
+          </w:p>
+        </w:tc>
+        <w:tc>
+          <w:tcPr>
+            <w:tcW w:type="dxa" w:w="1928"/>
+            <w:vAlign w:val="center"/>
+          </w:tcPr>
+          <w:p>
+            <w:pPr>
+              <w:jc w:val="right"/>
+              <w:bidi w:val="1"/>
+            </w:pPr>
+            <w:r/>
+            <w:r>
+              <w:rPr>
+                <w:rFonts w:ascii="B Zar" w:hAnsi="B Zar" w:eastAsia="B Zar"/>
+                <w:b w:val="0"/>
+                <w:sz w:val="20"/>
+              </w:rPr>
+              <w:t>qualified collection + procurement</w:t>
+            </w:r>
+          </w:p>
+        </w:tc>
+        <w:tc>
+          <w:tcPr>
+            <w:tcW w:type="dxa" w:w="1928"/>
+            <w:vAlign w:val="center"/>
+          </w:tcPr>
+          <w:p>
+            <w:pPr>
+              <w:jc w:val="right"/>
+              <w:bidi w:val="1"/>
+            </w:pPr>
+            <w:r/>
+            <w:r>
+              <w:rPr>
+                <w:rFonts w:ascii="B Zar" w:hAnsi="B Zar" w:eastAsia="B Zar"/>
+                <w:b w:val="0"/>
+                <w:sz w:val="20"/>
+              </w:rPr>
+              <w:t>فقط با trigger</w:t>
+            </w:r>
+          </w:p>
+        </w:tc>
+      </w:tr>
+      <w:tr>
+        <w:tc>
+          <w:tcPr>
+            <w:tcW w:type="dxa" w:w="1928"/>
+            <w:vAlign w:val="center"/>
+            <w:shd w:fill="EAF2F8"/>
+          </w:tcPr>
+          <w:p>
+            <w:pPr>
+              <w:jc w:val="right"/>
+              <w:bidi w:val="1"/>
+            </w:pPr>
+            <w:r/>
+            <w:r>
+              <w:rPr>
+                <w:rFonts w:ascii="B Zar" w:hAnsi="B Zar" w:eastAsia="B Zar"/>
+                <w:b w:val="0"/>
+                <w:sz w:val="20"/>
+              </w:rPr>
+              <w:t>F-07</w:t>
+            </w:r>
+          </w:p>
+        </w:tc>
+        <w:tc>
+          <w:tcPr>
+            <w:tcW w:type="dxa" w:w="1928"/>
+            <w:vAlign w:val="center"/>
+            <w:shd w:fill="EAF2F8"/>
+          </w:tcPr>
+          <w:p>
+            <w:pPr>
+              <w:jc w:val="right"/>
+              <w:bidi w:val="1"/>
+            </w:pPr>
+            <w:r/>
+            <w:r>
+              <w:rPr>
+                <w:rFonts w:ascii="B Zar" w:hAnsi="B Zar" w:eastAsia="B Zar"/>
+                <w:b w:val="0"/>
+                <w:sz w:val="20"/>
+              </w:rPr>
+              <w:t>محاسبه‌نشده</w:t>
+            </w:r>
+          </w:p>
+        </w:tc>
+        <w:tc>
+          <w:tcPr>
+            <w:tcW w:type="dxa" w:w="1928"/>
+            <w:vAlign w:val="center"/>
+            <w:shd w:fill="EAF2F8"/>
+          </w:tcPr>
+          <w:p>
+            <w:pPr>
+              <w:jc w:val="right"/>
+              <w:bidi w:val="1"/>
+            </w:pPr>
+            <w:r/>
+            <w:r>
+              <w:rPr>
+                <w:rFonts w:ascii="B Zar" w:hAnsi="B Zar" w:eastAsia="B Zar"/>
+                <w:b w:val="0"/>
+                <w:sz w:val="20"/>
+              </w:rPr>
+              <w:t>~31.1M gamer context؛ 520B Myket proxy</w:t>
+            </w:r>
+          </w:p>
+        </w:tc>
+        <w:tc>
+          <w:tcPr>
+            <w:tcW w:type="dxa" w:w="1928"/>
+            <w:vAlign w:val="center"/>
+            <w:shd w:fill="EAF2F8"/>
+          </w:tcPr>
+          <w:p>
+            <w:pPr>
+              <w:jc w:val="right"/>
+              <w:bidi w:val="1"/>
+            </w:pPr>
+            <w:r/>
+            <w:r>
+              <w:rPr>
+                <w:rFonts w:ascii="B Zar" w:hAnsi="B Zar" w:eastAsia="B Zar"/>
+                <w:b w:val="0"/>
+                <w:sz w:val="20"/>
+              </w:rPr>
+              <w:t>genre/payer/retention</w:t>
+            </w:r>
+          </w:p>
+        </w:tc>
+        <w:tc>
+          <w:tcPr>
+            <w:tcW w:type="dxa" w:w="1928"/>
+            <w:vAlign w:val="center"/>
+            <w:shd w:fill="EAF2F8"/>
+          </w:tcPr>
+          <w:p>
+            <w:pPr>
+              <w:jc w:val="right"/>
+              <w:bidi w:val="1"/>
+            </w:pPr>
+            <w:r/>
+            <w:r>
+              <w:rPr>
+                <w:rFonts w:ascii="B Zar" w:hAnsi="B Zar" w:eastAsia="B Zar"/>
+                <w:b w:val="0"/>
+                <w:sz w:val="20"/>
+              </w:rPr>
+              <w:t>Pause؛ reversal لازم</w:t>
+            </w:r>
+          </w:p>
+        </w:tc>
+      </w:tr>
+    </w:tbl>
+    <w:p>
+      <w:pPr>
+        <w:jc w:val="right"/>
+        <w:bidi w:val="1"/>
+      </w:pPr>
+      <w:r>
+        <w:rPr>
+          <w:rFonts w:ascii="B Zar" w:hAnsi="B Zar" w:eastAsia="B Zar"/>
+          <w:b/>
+          <w:sz w:val="22"/>
+        </w:rPr>
+        <w:t>ledger منابع ۱٫۲ — source/date/limitation برای ارقام یا anchorهای افزوده‌شده</w:t>
+      </w:r>
+    </w:p>
+    <w:tbl>
+      <w:tblPr>
+        <w:tblW w:type="auto" w:w="0"/>
+        <w:jc w:val="center"/>
+        <w:tblLook w:firstColumn="1" w:firstRow="1" w:lastColumn="0" w:lastRow="0" w:noHBand="0" w:noVBand="1" w:val="04A0"/>
+      </w:tblPr>
+      <w:tblGrid>
+        <w:gridCol w:w="1928"/>
+        <w:gridCol w:w="1928"/>
+        <w:gridCol w:w="1928"/>
+        <w:gridCol w:w="1928"/>
+        <w:gridCol w:w="1928"/>
+      </w:tblGrid>
+      <w:tr>
+        <w:tc>
+          <w:tcPr>
+            <w:tcW w:type="dxa" w:w="1928"/>
+            <w:shd w:fill="1F4E78"/>
+            <w:vAlign w:val="center"/>
+          </w:tcPr>
+          <w:p>
+            <w:pPr>
+              <w:jc w:val="right"/>
+              <w:bidi w:val="1"/>
+            </w:pPr>
+            <w:r/>
+            <w:r>
+              <w:rPr>
+                <w:rFonts w:ascii="B Zar" w:hAnsi="B Zar" w:eastAsia="B Zar"/>
+                <w:b/>
+                <w:color w:val="FFFFFF"/>
+                <w:sz w:val="18"/>
+              </w:rPr>
+              <w:t>ID</w:t>
+            </w:r>
+          </w:p>
+        </w:tc>
+        <w:tc>
+          <w:tcPr>
+            <w:tcW w:type="dxa" w:w="1928"/>
+            <w:shd w:fill="1F4E78"/>
+            <w:vAlign w:val="center"/>
+          </w:tcPr>
+          <w:p>
+            <w:pPr>
+              <w:jc w:val="right"/>
+              <w:bidi w:val="1"/>
+            </w:pPr>
+            <w:r/>
+            <w:r>
+              <w:rPr>
+                <w:rFonts w:ascii="B Zar" w:hAnsi="B Zar" w:eastAsia="B Zar"/>
+                <w:b/>
+                <w:color w:val="FFFFFF"/>
+                <w:sz w:val="18"/>
+              </w:rPr>
+              <w:t>منبع، نوع و تاریخ بازیابی</w:t>
+            </w:r>
+          </w:p>
+        </w:tc>
+        <w:tc>
+          <w:tcPr>
+            <w:tcW w:type="dxa" w:w="1928"/>
+            <w:shd w:fill="1F4E78"/>
+            <w:vAlign w:val="center"/>
+          </w:tcPr>
+          <w:p>
+            <w:pPr>
+              <w:jc w:val="right"/>
+              <w:bidi w:val="1"/>
+            </w:pPr>
+            <w:r/>
+            <w:r>
+              <w:rPr>
+                <w:rFonts w:ascii="B Zar" w:hAnsi="B Zar" w:eastAsia="B Zar"/>
+                <w:b/>
+                <w:color w:val="FFFFFF"/>
+                <w:sz w:val="18"/>
+              </w:rPr>
+              <w:t>ادعای محدود</w:t>
+            </w:r>
+          </w:p>
+        </w:tc>
+        <w:tc>
+          <w:tcPr>
+            <w:tcW w:type="dxa" w:w="1928"/>
+            <w:shd w:fill="1F4E78"/>
+            <w:vAlign w:val="center"/>
+          </w:tcPr>
+          <w:p>
+            <w:pPr>
+              <w:jc w:val="right"/>
+              <w:bidi w:val="1"/>
+            </w:pPr>
+            <w:r/>
+            <w:r>
+              <w:rPr>
+                <w:rFonts w:ascii="B Zar" w:hAnsi="B Zar" w:eastAsia="B Zar"/>
+                <w:b/>
+                <w:color w:val="FFFFFF"/>
+                <w:sz w:val="18"/>
+              </w:rPr>
+              <w:t>کاربرد مجاز</w:t>
+            </w:r>
+          </w:p>
+        </w:tc>
+        <w:tc>
+          <w:tcPr>
+            <w:tcW w:type="dxa" w:w="1928"/>
+            <w:shd w:fill="1F4E78"/>
+            <w:vAlign w:val="center"/>
+          </w:tcPr>
+          <w:p>
+            <w:pPr>
+              <w:jc w:val="right"/>
+              <w:bidi w:val="1"/>
+            </w:pPr>
+            <w:r/>
+            <w:r>
+              <w:rPr>
+                <w:rFonts w:ascii="B Zar" w:hAnsi="B Zar" w:eastAsia="B Zar"/>
+                <w:b/>
+                <w:color w:val="FFFFFF"/>
+                <w:sz w:val="18"/>
+              </w:rPr>
+              <w:t>محدودیت تعیین‌کننده</w:t>
+            </w:r>
+          </w:p>
+        </w:tc>
+      </w:tr>
+      <w:tr>
+        <w:tc>
+          <w:tcPr>
+            <w:tcW w:type="dxa" w:w="1928"/>
+            <w:shd w:fill="EAF2F8"/>
+            <w:vAlign w:val="center"/>
+          </w:tcPr>
+          <w:p>
+            <w:pPr>
+              <w:jc w:val="right"/>
+              <w:bidi w:val="1"/>
+            </w:pPr>
+            <w:r/>
+            <w:r>
+              <w:rPr>
+                <w:rFonts w:ascii="B Zar" w:hAnsi="B Zar" w:eastAsia="B Zar"/>
+                <w:b w:val="0"/>
+                <w:sz w:val="18"/>
+              </w:rPr>
+              <w:t>F01-S18</w:t>
+            </w:r>
+          </w:p>
+        </w:tc>
+        <w:tc>
+          <w:tcPr>
+            <w:tcW w:type="dxa" w:w="1928"/>
+            <w:shd w:fill="EAF2F8"/>
+            <w:vAlign w:val="center"/>
+          </w:tcPr>
+          <w:p>
+            <w:pPr>
+              <w:jc w:val="right"/>
+              <w:bidi w:val="1"/>
+            </w:pPr>
+            <w:r/>
+            <w:r>
+              <w:rPr>
+                <w:rFonts w:ascii="B Zar" w:hAnsi="B Zar" w:eastAsia="B Zar"/>
+                <w:b w:val="0"/>
+                <w:sz w:val="18"/>
+              </w:rPr>
+              <w:t>Launchmetrics؛ vendor pricing؛ ۱۲ مهر ۱۴۰۵</w:t>
+            </w:r>
+          </w:p>
+        </w:tc>
+        <w:tc>
+          <w:tcPr>
+            <w:tcW w:type="dxa" w:w="1928"/>
+            <w:shd w:fill="EAF2F8"/>
+            <w:vAlign w:val="center"/>
+          </w:tcPr>
+          <w:p>
+            <w:pPr>
+              <w:jc w:val="right"/>
+              <w:bidi w:val="1"/>
+            </w:pPr>
+            <w:r/>
+            <w:r>
+              <w:rPr>
+                <w:rFonts w:ascii="B Zar" w:hAnsi="B Zar" w:eastAsia="B Zar"/>
+                <w:b w:val="0"/>
+                <w:sz w:val="18"/>
+              </w:rPr>
+              <w:t>Starter از €780/mo؛ Sample Management</w:t>
+            </w:r>
+          </w:p>
+        </w:tc>
+        <w:tc>
+          <w:tcPr>
+            <w:tcW w:type="dxa" w:w="1928"/>
+            <w:shd w:fill="EAF2F8"/>
+            <w:vAlign w:val="center"/>
+          </w:tcPr>
+          <w:p>
+            <w:pPr>
+              <w:jc w:val="right"/>
+              <w:bidi w:val="1"/>
+            </w:pPr>
+            <w:r/>
+            <w:r>
+              <w:rPr>
+                <w:rFonts w:ascii="B Zar" w:hAnsi="B Zar" w:eastAsia="B Zar"/>
+                <w:b w:val="0"/>
+                <w:sz w:val="18"/>
+              </w:rPr>
+              <w:t>anchor خارجی scope/category</w:t>
+            </w:r>
+          </w:p>
+        </w:tc>
+        <w:tc>
+          <w:tcPr>
+            <w:tcW w:type="dxa" w:w="1928"/>
+            <w:shd w:fill="EAF2F8"/>
+            <w:vAlign w:val="center"/>
+          </w:tcPr>
+          <w:p>
+            <w:pPr>
+              <w:jc w:val="right"/>
+              <w:bidi w:val="1"/>
+            </w:pPr>
+            <w:r/>
+            <w:r>
+              <w:rPr>
+                <w:rFonts w:ascii="B Zar" w:hAnsi="B Zar" w:eastAsia="B Zar"/>
+                <w:b w:val="0"/>
+                <w:sz w:val="18"/>
+              </w:rPr>
+              <w:t>bundle خارجی؛ نه price/WTP/TAM ایران</w:t>
+            </w:r>
+          </w:p>
+        </w:tc>
+      </w:tr>
+      <w:tr>
+        <w:tc>
+          <w:tcPr>
+            <w:tcW w:type="dxa" w:w="1928"/>
+            <w:shd w:fill="FFFFFF"/>
+            <w:vAlign w:val="center"/>
+          </w:tcPr>
+          <w:p>
+            <w:pPr>
+              <w:jc w:val="right"/>
+              <w:bidi w:val="1"/>
+            </w:pPr>
+            <w:r/>
+            <w:r>
+              <w:rPr>
+                <w:rFonts w:ascii="B Zar" w:hAnsi="B Zar" w:eastAsia="B Zar"/>
+                <w:b w:val="0"/>
+                <w:sz w:val="18"/>
+              </w:rPr>
+              <w:t>F02-S13</w:t>
+            </w:r>
+          </w:p>
+        </w:tc>
+        <w:tc>
+          <w:tcPr>
+            <w:tcW w:type="dxa" w:w="1928"/>
+            <w:shd w:fill="FFFFFF"/>
+            <w:vAlign w:val="center"/>
+          </w:tcPr>
+          <w:p>
+            <w:pPr>
+              <w:jc w:val="right"/>
+              <w:bidi w:val="1"/>
+            </w:pPr>
+            <w:r/>
+            <w:r>
+              <w:rPr>
+                <w:rFonts w:ascii="B Zar" w:hAnsi="B Zar" w:eastAsia="B Zar"/>
+                <w:b w:val="0"/>
+                <w:sz w:val="18"/>
+              </w:rPr>
+              <w:t>SyncOnSet؛ vendor help/pricing؛ ۱۲ مهر ۱۴۰۵</w:t>
+            </w:r>
+          </w:p>
+        </w:tc>
+        <w:tc>
+          <w:tcPr>
+            <w:tcW w:type="dxa" w:w="1928"/>
+            <w:shd w:fill="FFFFFF"/>
+            <w:vAlign w:val="center"/>
+          </w:tcPr>
+          <w:p>
+            <w:pPr>
+              <w:jc w:val="right"/>
+              <w:bidi w:val="1"/>
+            </w:pPr>
+            <w:r/>
+            <w:r>
+              <w:rPr>
+                <w:rFonts w:ascii="B Zar" w:hAnsi="B Zar" w:eastAsia="B Zar"/>
+                <w:b w:val="0"/>
+                <w:sz w:val="18"/>
+              </w:rPr>
+              <w:t>$250/4wk + $100/week</w:t>
+            </w:r>
+          </w:p>
+        </w:tc>
+        <w:tc>
+          <w:tcPr>
+            <w:tcW w:type="dxa" w:w="1928"/>
+            <w:shd w:fill="FFFFFF"/>
+            <w:vAlign w:val="center"/>
+          </w:tcPr>
+          <w:p>
+            <w:pPr>
+              <w:jc w:val="right"/>
+              <w:bidi w:val="1"/>
+            </w:pPr>
+            <w:r/>
+            <w:r>
+              <w:rPr>
+                <w:rFonts w:ascii="B Zar" w:hAnsi="B Zar" w:eastAsia="B Zar"/>
+                <w:b w:val="0"/>
+                <w:sz w:val="18"/>
+              </w:rPr>
+              <w:t>anchor خارجی project fee</w:t>
+            </w:r>
+          </w:p>
+        </w:tc>
+        <w:tc>
+          <w:tcPr>
+            <w:tcW w:type="dxa" w:w="1928"/>
+            <w:shd w:fill="FFFFFF"/>
+            <w:vAlign w:val="center"/>
+          </w:tcPr>
+          <w:p>
+            <w:pPr>
+              <w:jc w:val="right"/>
+              <w:bidi w:val="1"/>
+            </w:pPr>
+            <w:r/>
+            <w:r>
+              <w:rPr>
+                <w:rFonts w:ascii="B Zar" w:hAnsi="B Zar" w:eastAsia="B Zar"/>
+                <w:b w:val="0"/>
+                <w:sz w:val="18"/>
+              </w:rPr>
+              <w:t>plan محدود؛ نه count/fee ایران</w:t>
+            </w:r>
+          </w:p>
+        </w:tc>
+      </w:tr>
+      <w:tr>
+        <w:tc>
+          <w:tcPr>
+            <w:tcW w:type="dxa" w:w="1928"/>
+            <w:shd w:fill="EAF2F8"/>
+            <w:vAlign w:val="center"/>
+          </w:tcPr>
+          <w:p>
+            <w:pPr>
+              <w:jc w:val="right"/>
+              <w:bidi w:val="1"/>
+            </w:pPr>
+            <w:r/>
+            <w:r>
+              <w:rPr>
+                <w:rFonts w:ascii="B Zar" w:hAnsi="B Zar" w:eastAsia="B Zar"/>
+                <w:b w:val="0"/>
+                <w:sz w:val="18"/>
+              </w:rPr>
+              <w:t>F03-S18</w:t>
+            </w:r>
+          </w:p>
+        </w:tc>
+        <w:tc>
+          <w:tcPr>
+            <w:tcW w:type="dxa" w:w="1928"/>
+            <w:shd w:fill="EAF2F8"/>
+            <w:vAlign w:val="center"/>
+          </w:tcPr>
+          <w:p>
+            <w:pPr>
+              <w:jc w:val="right"/>
+              <w:bidi w:val="1"/>
+            </w:pPr>
+            <w:r/>
+            <w:r>
+              <w:rPr>
+                <w:rFonts w:ascii="B Zar" w:hAnsi="B Zar" w:eastAsia="B Zar"/>
+                <w:b w:val="0"/>
+                <w:sz w:val="18"/>
+              </w:rPr>
+              <w:t>Techpacker؛ vendor pricing؛ ۱۲ مهر ۱۴۰۵</w:t>
+            </w:r>
+          </w:p>
+        </w:tc>
+        <w:tc>
+          <w:tcPr>
+            <w:tcW w:type="dxa" w:w="1928"/>
+            <w:shd w:fill="EAF2F8"/>
+            <w:vAlign w:val="center"/>
+          </w:tcPr>
+          <w:p>
+            <w:pPr>
+              <w:jc w:val="right"/>
+              <w:bidi w:val="1"/>
+            </w:pPr>
+            <w:r/>
+            <w:r>
+              <w:rPr>
+                <w:rFonts w:ascii="B Zar" w:hAnsi="B Zar" w:eastAsia="B Zar"/>
+                <w:b w:val="0"/>
+                <w:sz w:val="18"/>
+              </w:rPr>
+              <w:t>$35/$95/$125 user/mo annual</w:t>
+            </w:r>
+          </w:p>
+        </w:tc>
+        <w:tc>
+          <w:tcPr>
+            <w:tcW w:type="dxa" w:w="1928"/>
+            <w:shd w:fill="EAF2F8"/>
+            <w:vAlign w:val="center"/>
+          </w:tcPr>
+          <w:p>
+            <w:pPr>
+              <w:jc w:val="right"/>
+              <w:bidi w:val="1"/>
+            </w:pPr>
+            <w:r/>
+            <w:r>
+              <w:rPr>
+                <w:rFonts w:ascii="B Zar" w:hAnsi="B Zar" w:eastAsia="B Zar"/>
+                <w:b w:val="0"/>
+                <w:sz w:val="18"/>
+              </w:rPr>
+              <w:t>architecture tier خارجی</w:t>
+            </w:r>
+          </w:p>
+        </w:tc>
+        <w:tc>
+          <w:tcPr>
+            <w:tcW w:type="dxa" w:w="1928"/>
+            <w:shd w:fill="EAF2F8"/>
+            <w:vAlign w:val="center"/>
+          </w:tcPr>
+          <w:p>
+            <w:pPr>
+              <w:jc w:val="right"/>
+              <w:bidi w:val="1"/>
+            </w:pPr>
+            <w:r/>
+            <w:r>
+              <w:rPr>
+                <w:rFonts w:ascii="B Zar" w:hAnsi="B Zar" w:eastAsia="B Zar"/>
+                <w:b w:val="0"/>
+                <w:sz w:val="18"/>
+              </w:rPr>
+              <w:t>نه ARPA/WTP/segment ایران</w:t>
+            </w:r>
+          </w:p>
+        </w:tc>
+      </w:tr>
+      <w:tr>
+        <w:tc>
+          <w:tcPr>
+            <w:tcW w:type="dxa" w:w="1928"/>
+            <w:shd w:fill="FFFFFF"/>
+            <w:vAlign w:val="center"/>
+          </w:tcPr>
+          <w:p>
+            <w:pPr>
+              <w:jc w:val="right"/>
+              <w:bidi w:val="1"/>
+            </w:pPr>
+            <w:r/>
+            <w:r>
+              <w:rPr>
+                <w:rFonts w:ascii="B Zar" w:hAnsi="B Zar" w:eastAsia="B Zar"/>
+                <w:b w:val="0"/>
+                <w:sz w:val="18"/>
+              </w:rPr>
+              <w:t>F04-S13</w:t>
+            </w:r>
+          </w:p>
+        </w:tc>
+        <w:tc>
+          <w:tcPr>
+            <w:tcW w:type="dxa" w:w="1928"/>
+            <w:shd w:fill="FFFFFF"/>
+            <w:vAlign w:val="center"/>
+          </w:tcPr>
+          <w:p>
+            <w:pPr>
+              <w:jc w:val="right"/>
+              <w:bidi w:val="1"/>
+            </w:pPr>
+            <w:r/>
+            <w:r>
+              <w:rPr>
+                <w:rFonts w:ascii="B Zar" w:hAnsi="B Zar" w:eastAsia="B Zar"/>
+                <w:b w:val="0"/>
+                <w:sz w:val="18"/>
+              </w:rPr>
+              <w:t>LegitApp؛ vendor pricing؛ ۱۲ مهر ۱۴۰۵</w:t>
+            </w:r>
+          </w:p>
+        </w:tc>
+        <w:tc>
+          <w:tcPr>
+            <w:tcW w:type="dxa" w:w="1928"/>
+            <w:shd w:fill="FFFFFF"/>
+            <w:vAlign w:val="center"/>
+          </w:tcPr>
+          <w:p>
+            <w:pPr>
+              <w:jc w:val="right"/>
+              <w:bidi w:val="1"/>
+            </w:pPr>
+            <w:r/>
+            <w:r>
+              <w:rPr>
+                <w:rFonts w:ascii="B Zar" w:hAnsi="B Zar" w:eastAsia="B Zar"/>
+                <w:b w:val="0"/>
+                <w:sz w:val="18"/>
+              </w:rPr>
+              <w:t>$3/$4/$10 by category</w:t>
+            </w:r>
+          </w:p>
+        </w:tc>
+        <w:tc>
+          <w:tcPr>
+            <w:tcW w:type="dxa" w:w="1928"/>
+            <w:shd w:fill="FFFFFF"/>
+            <w:vAlign w:val="center"/>
+          </w:tcPr>
+          <w:p>
+            <w:pPr>
+              <w:jc w:val="right"/>
+              <w:bidi w:val="1"/>
+            </w:pPr>
+            <w:r/>
+            <w:r>
+              <w:rPr>
+                <w:rFonts w:ascii="B Zar" w:hAnsi="B Zar" w:eastAsia="B Zar"/>
+                <w:b w:val="0"/>
+                <w:sz w:val="18"/>
+              </w:rPr>
+              <w:t>anchor خارجی per-verdict</w:t>
+            </w:r>
+          </w:p>
+        </w:tc>
+        <w:tc>
+          <w:tcPr>
+            <w:tcW w:type="dxa" w:w="1928"/>
+            <w:shd w:fill="FFFFFF"/>
+            <w:vAlign w:val="center"/>
+          </w:tcPr>
+          <w:p>
+            <w:pPr>
+              <w:jc w:val="right"/>
+              <w:bidi w:val="1"/>
+            </w:pPr>
+            <w:r/>
+            <w:r>
+              <w:rPr>
+                <w:rFonts w:ascii="B Zar" w:hAnsi="B Zar" w:eastAsia="B Zar"/>
+                <w:b w:val="0"/>
+                <w:sz w:val="18"/>
+              </w:rPr>
+              <w:t>نه liability/volume/fee ایران</w:t>
+            </w:r>
+          </w:p>
+        </w:tc>
+      </w:tr>
+      <w:tr>
+        <w:tc>
+          <w:tcPr>
+            <w:tcW w:type="dxa" w:w="1928"/>
+            <w:shd w:fill="EAF2F8"/>
+            <w:vAlign w:val="center"/>
+          </w:tcPr>
+          <w:p>
+            <w:pPr>
+              <w:jc w:val="right"/>
+              <w:bidi w:val="1"/>
+            </w:pPr>
+            <w:r/>
+            <w:r>
+              <w:rPr>
+                <w:rFonts w:ascii="B Zar" w:hAnsi="B Zar" w:eastAsia="B Zar"/>
+                <w:b w:val="0"/>
+                <w:sz w:val="18"/>
+              </w:rPr>
+              <w:t>F05</w:t>
+            </w:r>
+          </w:p>
+        </w:tc>
+        <w:tc>
+          <w:tcPr>
+            <w:tcW w:type="dxa" w:w="1928"/>
+            <w:shd w:fill="EAF2F8"/>
+            <w:vAlign w:val="center"/>
+          </w:tcPr>
+          <w:p>
+            <w:pPr>
+              <w:jc w:val="right"/>
+              <w:bidi w:val="1"/>
+            </w:pPr>
+            <w:r/>
+            <w:r>
+              <w:rPr>
+                <w:rFonts w:ascii="B Zar" w:hAnsi="B Zar" w:eastAsia="B Zar"/>
+                <w:b w:val="0"/>
+                <w:sz w:val="18"/>
+              </w:rPr>
+              <w:t>—</w:t>
+            </w:r>
+          </w:p>
+        </w:tc>
+        <w:tc>
+          <w:tcPr>
+            <w:tcW w:type="dxa" w:w="1928"/>
+            <w:shd w:fill="EAF2F8"/>
+            <w:vAlign w:val="center"/>
+          </w:tcPr>
+          <w:p>
+            <w:pPr>
+              <w:jc w:val="right"/>
+              <w:bidi w:val="1"/>
+            </w:pPr>
+            <w:r/>
+            <w:r>
+              <w:rPr>
+                <w:rFonts w:ascii="B Zar" w:hAnsi="B Zar" w:eastAsia="B Zar"/>
+                <w:b w:val="0"/>
+                <w:sz w:val="18"/>
+              </w:rPr>
+              <w:t>—</w:t>
+            </w:r>
+          </w:p>
+        </w:tc>
+        <w:tc>
+          <w:tcPr>
+            <w:tcW w:type="dxa" w:w="1928"/>
+            <w:shd w:fill="EAF2F8"/>
+            <w:vAlign w:val="center"/>
+          </w:tcPr>
+          <w:p>
+            <w:pPr>
+              <w:jc w:val="right"/>
+              <w:bidi w:val="1"/>
+            </w:pPr>
+            <w:r/>
+            <w:r>
+              <w:rPr>
+                <w:rFonts w:ascii="B Zar" w:hAnsi="B Zar" w:eastAsia="B Zar"/>
+                <w:b w:val="0"/>
+                <w:sz w:val="18"/>
+              </w:rPr>
+              <w:t>formula only</w:t>
+            </w:r>
+          </w:p>
+        </w:tc>
+        <w:tc>
+          <w:tcPr>
+            <w:tcW w:type="dxa" w:w="1928"/>
+            <w:shd w:fill="EAF2F8"/>
+            <w:vAlign w:val="center"/>
+          </w:tcPr>
+          <w:p>
+            <w:pPr>
+              <w:jc w:val="right"/>
+              <w:bidi w:val="1"/>
+            </w:pPr>
+            <w:r/>
+            <w:r>
+              <w:rPr>
+                <w:rFonts w:ascii="B Zar" w:hAnsi="B Zar" w:eastAsia="B Zar"/>
+                <w:b w:val="0"/>
+                <w:sz w:val="18"/>
+              </w:rPr>
+              <w:t>denominator، WTP و price محلی مفقود</w:t>
+            </w:r>
+          </w:p>
+        </w:tc>
+      </w:tr>
+      <w:tr>
+        <w:tc>
+          <w:tcPr>
+            <w:tcW w:type="dxa" w:w="1928"/>
+            <w:shd w:fill="FFFFFF"/>
+            <w:vAlign w:val="center"/>
+          </w:tcPr>
+          <w:p>
+            <w:pPr>
+              <w:jc w:val="right"/>
+              <w:bidi w:val="1"/>
+            </w:pPr>
+            <w:r/>
+            <w:r>
+              <w:rPr>
+                <w:rFonts w:ascii="B Zar" w:hAnsi="B Zar" w:eastAsia="B Zar"/>
+                <w:b w:val="0"/>
+                <w:sz w:val="18"/>
+              </w:rPr>
+              <w:t>F06-S10</w:t>
+            </w:r>
+          </w:p>
+        </w:tc>
+        <w:tc>
+          <w:tcPr>
+            <w:tcW w:type="dxa" w:w="1928"/>
+            <w:shd w:fill="FFFFFF"/>
+            <w:vAlign w:val="center"/>
+          </w:tcPr>
+          <w:p>
+            <w:pPr>
+              <w:jc w:val="right"/>
+              <w:bidi w:val="1"/>
+            </w:pPr>
+            <w:r/>
+            <w:r>
+              <w:rPr>
+                <w:rFonts w:ascii="B Zar" w:hAnsi="B Zar" w:eastAsia="B Zar"/>
+                <w:b w:val="0"/>
+                <w:sz w:val="18"/>
+              </w:rPr>
+              <w:t>UK Digital Marketplace/Axiell؛ A/B؛ ۱۲ مهر ۱۴۰۵</w:t>
+            </w:r>
+          </w:p>
+        </w:tc>
+        <w:tc>
+          <w:tcPr>
+            <w:tcW w:type="dxa" w:w="1928"/>
+            <w:shd w:fill="FFFFFF"/>
+            <w:vAlign w:val="center"/>
+          </w:tcPr>
+          <w:p>
+            <w:pPr>
+              <w:jc w:val="right"/>
+              <w:bidi w:val="1"/>
+            </w:pPr>
+            <w:r/>
+            <w:r>
+              <w:rPr>
+                <w:rFonts w:ascii="B Zar" w:hAnsi="B Zar" w:eastAsia="B Zar"/>
+                <w:b w:val="0"/>
+                <w:sz w:val="18"/>
+              </w:rPr>
+              <w:t>£5,500/yr, two concurrent licences</w:t>
+            </w:r>
+          </w:p>
+        </w:tc>
+        <w:tc>
+          <w:tcPr>
+            <w:tcW w:type="dxa" w:w="1928"/>
+            <w:shd w:fill="FFFFFF"/>
+            <w:vAlign w:val="center"/>
+          </w:tcPr>
+          <w:p>
+            <w:pPr>
+              <w:jc w:val="right"/>
+              <w:bidi w:val="1"/>
+            </w:pPr>
+            <w:r/>
+            <w:r>
+              <w:rPr>
+                <w:rFonts w:ascii="B Zar" w:hAnsi="B Zar" w:eastAsia="B Zar"/>
+                <w:b w:val="0"/>
+                <w:sz w:val="18"/>
+              </w:rPr>
+              <w:t>CMS complexity/procurement anchor</w:t>
+            </w:r>
+          </w:p>
+        </w:tc>
+        <w:tc>
+          <w:tcPr>
+            <w:tcW w:type="dxa" w:w="1928"/>
+            <w:shd w:fill="FFFFFF"/>
+            <w:vAlign w:val="center"/>
+          </w:tcPr>
+          <w:p>
+            <w:pPr>
+              <w:jc w:val="right"/>
+              <w:bidi w:val="1"/>
+            </w:pPr>
+            <w:r/>
+            <w:r>
+              <w:rPr>
+                <w:rFonts w:ascii="B Zar" w:hAnsi="B Zar" w:eastAsia="B Zar"/>
+                <w:b w:val="0"/>
+                <w:sz w:val="18"/>
+              </w:rPr>
+              <w:t>UK scope/procurement ≠ Iran ACV/TAM</w:t>
+            </w:r>
+          </w:p>
+        </w:tc>
+      </w:tr>
+      <w:tr>
+        <w:tc>
+          <w:tcPr>
+            <w:tcW w:type="dxa" w:w="1928"/>
+            <w:shd w:fill="EAF2F8"/>
+            <w:vAlign w:val="center"/>
+          </w:tcPr>
+          <w:p>
+            <w:pPr>
+              <w:jc w:val="right"/>
+              <w:bidi w:val="1"/>
+            </w:pPr>
+            <w:r/>
+            <w:r>
+              <w:rPr>
+                <w:rFonts w:ascii="B Zar" w:hAnsi="B Zar" w:eastAsia="B Zar"/>
+                <w:b w:val="0"/>
+                <w:sz w:val="18"/>
+              </w:rPr>
+              <w:t>F07-S13/14/15</w:t>
+            </w:r>
+          </w:p>
+        </w:tc>
+        <w:tc>
+          <w:tcPr>
+            <w:tcW w:type="dxa" w:w="1928"/>
+            <w:shd w:fill="EAF2F8"/>
+            <w:vAlign w:val="center"/>
+          </w:tcPr>
+          <w:p>
+            <w:pPr>
+              <w:jc w:val="right"/>
+              <w:bidi w:val="1"/>
+            </w:pPr>
+            <w:r/>
+            <w:r>
+              <w:rPr>
+                <w:rFonts w:ascii="B Zar" w:hAnsi="B Zar" w:eastAsia="B Zar"/>
+                <w:b w:val="0"/>
+                <w:sz w:val="18"/>
+              </w:rPr>
+              <w:t>D IREC، DMBoard/مایکت، WHO؛ A/B؛ ۱۲ مهر ۱۴۰۵</w:t>
+            </w:r>
+          </w:p>
+        </w:tc>
+        <w:tc>
+          <w:tcPr>
+            <w:tcW w:type="dxa" w:w="1928"/>
+            <w:shd w:fill="EAF2F8"/>
+            <w:vAlign w:val="center"/>
+          </w:tcPr>
+          <w:p>
+            <w:pPr>
+              <w:jc w:val="right"/>
+              <w:bidi w:val="1"/>
+            </w:pPr>
+            <w:r/>
+            <w:r>
+              <w:rPr>
+                <w:rFonts w:ascii="B Zar" w:hAnsi="B Zar" w:eastAsia="B Zar"/>
+                <w:b w:val="0"/>
+                <w:sz w:val="18"/>
+              </w:rPr>
+              <w:t>34.3%؛ 5M×104K؛ population 2023</w:t>
+            </w:r>
+          </w:p>
+        </w:tc>
+        <w:tc>
+          <w:tcPr>
+            <w:tcW w:type="dxa" w:w="1928"/>
+            <w:shd w:fill="EAF2F8"/>
+            <w:vAlign w:val="center"/>
+          </w:tcPr>
+          <w:p>
+            <w:pPr>
+              <w:jc w:val="right"/>
+              <w:bidi w:val="1"/>
+            </w:pPr>
+            <w:r/>
+            <w:r>
+              <w:rPr>
+                <w:rFonts w:ascii="B Zar" w:hAnsi="B Zar" w:eastAsia="B Zar"/>
+                <w:b w:val="0"/>
+                <w:sz w:val="18"/>
+              </w:rPr>
+              <w:t>دو proxy context/platform</w:t>
+            </w:r>
+          </w:p>
+        </w:tc>
+        <w:tc>
+          <w:tcPr>
+            <w:tcW w:type="dxa" w:w="1928"/>
+            <w:shd w:fill="EAF2F8"/>
+            <w:vAlign w:val="center"/>
+          </w:tcPr>
+          <w:p>
+            <w:pPr>
+              <w:jc w:val="right"/>
+              <w:bidi w:val="1"/>
+            </w:pPr>
+            <w:r/>
+            <w:r>
+              <w:rPr>
+                <w:rFonts w:ascii="B Zar" w:hAnsi="B Zar" w:eastAsia="B Zar"/>
+                <w:b w:val="0"/>
+                <w:sz w:val="18"/>
+              </w:rPr>
+              <w:t>نه genre، payer، retention یا بازار ملی</w:t>
+            </w:r>
+          </w:p>
+        </w:tc>
+      </w:tr>
+    </w:tbl>
+    <w:p>
+      <w:pPr>
+        <w:jc w:val="right"/>
+        <w:bidi w:val="1"/>
+      </w:pPr>
+      <w:r>
+        <w:rPr>
+          <w:rFonts w:ascii="B Zar" w:hAnsi="B Zar" w:eastAsia="B Zar"/>
+          <w:b w:val="0"/>
+          <w:sz w:val="18"/>
+        </w:rPr>
+        <w:t>URL کامل، quotation و ledger تفصیلی در dossierهای F-01 تا F-07 و workbook «portfolio_TAM_SAM_SOM_evidence_register_1405.xlsx» نگهداری شده‌اند.</w:t>
+      </w:r>
+    </w:p>
     <w:sectPr>
       <w:headerReference w:type="default" r:id="rId7"/>
       <w:footerReference w:type="default" r:id="rId8"/>

</xml_diff>